<commit_message>
Fixed divide by zero bug in flame graph and added selection to preferences.  Also updated BeebEm changelist which includes fix for x64 output and intermediate output directories for hardware
</commit_message>
<xml_diff>
--- a/docs/BeebPerf.docx
+++ b/docs/BeebPerf.docx
@@ -412,23 +412,7 @@
           <w:rFonts w:ascii="Aptos" w:hAnsi="Aptos"/>
           <w:color w:val="000000"/>
         </w:rPr>
-        <w:t xml:space="preserve"> (</w:t>
-      </w:r>
-      <w:proofErr w:type="gramStart"/>
-      <w:r>
-        <w:rPr>
-          <w:rFonts w:ascii="Aptos" w:hAnsi="Aptos"/>
-          <w:color w:val="000000"/>
-        </w:rPr>
-        <w:t>see .Perf</w:t>
-      </w:r>
-      <w:proofErr w:type="gramEnd"/>
-      <w:r>
-        <w:rPr>
-          <w:rFonts w:ascii="Aptos" w:hAnsi="Aptos"/>
-          <w:color w:val="000000"/>
-        </w:rPr>
-        <w:t xml:space="preserve"> </w:t>
+        <w:t xml:space="preserve"> (see .Perf </w:t>
       </w:r>
       <w:r>
         <w:rPr>
@@ -905,19 +889,11 @@
         </w:rPr>
         <w:t xml:space="preserve">   </w:t>
       </w:r>
-      <w:proofErr w:type="gramStart"/>
       <w:r>
         <w:rPr>
           <w:color w:val="FFFFFF" w:themeColor="background1"/>
         </w:rPr>
-        <w:t>git</w:t>
-      </w:r>
-      <w:proofErr w:type="gramEnd"/>
-      <w:r>
-        <w:rPr>
-          <w:color w:val="FFFFFF" w:themeColor="background1"/>
-        </w:rPr>
-        <w:t xml:space="preserve"> </w:t>
+        <w:t xml:space="preserve">git </w:t>
       </w:r>
       <w:r>
         <w:rPr>
@@ -1563,15 +1539,7 @@
         <w:t>based</w:t>
       </w:r>
       <w:r>
-        <w:t xml:space="preserve"> </w:t>
-      </w:r>
-      <w:proofErr w:type="gramStart"/>
-      <w:r>
-        <w:t>from</w:t>
-      </w:r>
-      <w:proofErr w:type="gramEnd"/>
-      <w:r>
-        <w:t xml:space="preserve"> Visual Studio</w:t>
+        <w:t xml:space="preserve"> from Visual Studio</w:t>
       </w:r>
       <w:r>
         <w:t>.</w:t>
@@ -1738,77 +1706,61 @@
     </w:p>
     <w:p>
       <w:r>
-        <w:t xml:space="preserve">Here </w:t>
-      </w:r>
-      <w:proofErr w:type="gramStart"/>
-      <w:r>
-        <w:t>is</w:t>
-      </w:r>
-      <w:proofErr w:type="gramEnd"/>
+        <w:t>Here is a more detailed description</w:t>
+      </w:r>
+      <w:r>
+        <w:t>s</w:t>
+      </w:r>
+      <w:r>
+        <w:t xml:space="preserve"> of each section</w:t>
+      </w:r>
+      <w:r>
+        <w:t>:</w:t>
+      </w:r>
+    </w:p>
+    <w:p>
+      <w:pPr>
+        <w:pStyle w:val="Heading3"/>
+      </w:pPr>
+      <w:r>
+        <w:t>Timeline</w:t>
+      </w:r>
+      <w:r>
+        <w:t xml:space="preserve"> panel</w:t>
+      </w:r>
+    </w:p>
+    <w:p>
+      <w:r>
+        <w:t>Show</w:t>
+      </w:r>
+      <w:r>
+        <w:t>s</w:t>
+      </w:r>
       <w:r>
         <w:t xml:space="preserve"> </w:t>
       </w:r>
-      <w:proofErr w:type="gramStart"/>
-      <w:r>
-        <w:t>a more</w:t>
-      </w:r>
-      <w:proofErr w:type="gramEnd"/>
-      <w:r>
-        <w:t xml:space="preserve"> detailed description</w:t>
-      </w:r>
-      <w:r>
-        <w:t>s</w:t>
-      </w:r>
-      <w:r>
-        <w:t xml:space="preserve"> of each section</w:t>
-      </w:r>
-      <w:r>
-        <w:t>:</w:t>
-      </w:r>
-    </w:p>
-    <w:p>
-      <w:pPr>
-        <w:pStyle w:val="Heading3"/>
-      </w:pPr>
-      <w:r>
-        <w:t>Timeline</w:t>
-      </w:r>
-      <w:r>
-        <w:t xml:space="preserve"> panel</w:t>
-      </w:r>
-    </w:p>
-    <w:p>
-      <w:r>
-        <w:t>Show</w:t>
-      </w:r>
-      <w:r>
-        <w:t>s</w:t>
+      <w:r>
+        <w:t xml:space="preserve">the recorded </w:t>
+      </w:r>
+      <w:r>
+        <w:t>timeline</w:t>
+      </w:r>
+      <w:r>
+        <w:t xml:space="preserve"> allowing the user to select a specific time range to analyze</w:t>
+      </w:r>
+      <w:r>
+        <w:t xml:space="preserve"> (shown in blue)</w:t>
+      </w:r>
+      <w:r>
+        <w:t>.</w:t>
       </w:r>
       <w:r>
         <w:t xml:space="preserve"> </w:t>
       </w:r>
       <w:r>
-        <w:t xml:space="preserve">the recorded </w:t>
-      </w:r>
-      <w:r>
-        <w:t>timeline</w:t>
-      </w:r>
-      <w:r>
-        <w:t xml:space="preserve"> allowing the user to select a specific time range to analyze</w:t>
-      </w:r>
-      <w:r>
-        <w:t xml:space="preserve"> (shown in blue)</w:t>
-      </w:r>
-      <w:r>
-        <w:t>.</w:t>
-      </w:r>
-      <w:r>
         <w:t xml:space="preserve"> </w:t>
       </w:r>
       <w:r>
-        <w:t xml:space="preserve"> </w:t>
-      </w:r>
-      <w:r>
         <w:t xml:space="preserve">This can be </w:t>
       </w:r>
       <w:r>
@@ -1847,17 +1799,8 @@
           <w:b/>
           <w:bCs/>
         </w:rPr>
-        <w:t xml:space="preserve">Zoom </w:t>
-      </w:r>
-      <w:proofErr w:type="gramStart"/>
-      <w:r>
-        <w:rPr>
-          <w:b/>
-          <w:bCs/>
-        </w:rPr>
-        <w:t>In</w:t>
-      </w:r>
-      <w:proofErr w:type="gramEnd"/>
+        <w:t>Zoom In</w:t>
+      </w:r>
       <w:r>
         <w:t xml:space="preserve"> and </w:t>
       </w:r>
@@ -2604,23 +2547,10 @@
     </w:p>
     <w:p>
       <w:r>
-        <w:t xml:space="preserve">The call tree </w:t>
-      </w:r>
-      <w:proofErr w:type="gramStart"/>
-      <w:r>
-        <w:t>show</w:t>
-      </w:r>
-      <w:proofErr w:type="gramEnd"/>
-      <w:r>
-        <w:t xml:space="preserve"> all the </w:t>
-      </w:r>
-      <w:proofErr w:type="gramStart"/>
-      <w:r>
-        <w:t>routine’s</w:t>
-      </w:r>
-      <w:proofErr w:type="gramEnd"/>
-      <w:r>
-        <w:t xml:space="preserve"> call </w:t>
+        <w:t xml:space="preserve">The call tree show all the </w:t>
+      </w:r>
+      <w:r>
+        <w:t xml:space="preserve">routine’s call </w:t>
       </w:r>
       <w:r>
         <w:t>paths</w:t>
@@ -4044,30 +3974,20 @@
         <w:t>I considered implementing the analysis portions in C++</w:t>
       </w:r>
       <w:r>
-        <w:t xml:space="preserve">, to keep the memory footprint </w:t>
-      </w:r>
-      <w:proofErr w:type="gramStart"/>
-      <w:r>
-        <w:t xml:space="preserve">low, </w:t>
+        <w:t xml:space="preserve">, to keep the memory footprint low, </w:t>
       </w:r>
       <w:r>
         <w:t xml:space="preserve"> </w:t>
       </w:r>
       <w:r>
-        <w:t>however</w:t>
-      </w:r>
-      <w:proofErr w:type="gramEnd"/>
-      <w:r>
-        <w:t xml:space="preserve"> this </w:t>
-      </w:r>
-      <w:proofErr w:type="gramStart"/>
+        <w:t xml:space="preserve">however this </w:t>
+      </w:r>
       <w:r>
         <w:t>turn</w:t>
       </w:r>
       <w:r>
         <w:t>ed</w:t>
       </w:r>
-      <w:proofErr w:type="gramEnd"/>
       <w:r>
         <w:t xml:space="preserve"> </w:t>
       </w:r>
@@ -4174,15 +4094,7 @@
         <w:t xml:space="preserve"> file loading and analysis, leveraging CPU, memory, and video analysis components (owned by the form)</w:t>
       </w:r>
       <w:r>
-        <w:t xml:space="preserve">.  These components </w:t>
-      </w:r>
-      <w:proofErr w:type="gramStart"/>
-      <w:r>
-        <w:t>are located in</w:t>
-      </w:r>
-      <w:proofErr w:type="gramEnd"/>
-      <w:r>
-        <w:t xml:space="preserve"> the root project folder.</w:t>
+        <w:t>.  These components are located in the root project folder.</w:t>
       </w:r>
     </w:p>
     <w:p>
@@ -4242,15 +4154,7 @@
         <w:t xml:space="preserve">.  Every undoable user action is encapsulated by a corresponding operation. </w:t>
       </w:r>
       <w:r>
-        <w:t xml:space="preserve"> All the operations classes </w:t>
-      </w:r>
-      <w:proofErr w:type="gramStart"/>
-      <w:r>
-        <w:t>are located in</w:t>
-      </w:r>
-      <w:proofErr w:type="gramEnd"/>
-      <w:r>
-        <w:t xml:space="preserve"> the </w:t>
+        <w:t xml:space="preserve"> All the operations classes are located in the </w:t>
       </w:r>
       <w:r>
         <w:rPr>
@@ -4283,13 +4187,8 @@
       <w:r>
         <w:t xml:space="preserve">and </w:t>
       </w:r>
-      <w:proofErr w:type="gramStart"/>
-      <w:r>
-        <w:t>theme</w:t>
-      </w:r>
-      <w:proofErr w:type="gramEnd"/>
-      <w:r>
-        <w:t>).</w:t>
+      <w:r>
+        <w:t>theme).</w:t>
       </w:r>
     </w:p>
     <w:p>
@@ -4355,13 +4254,8 @@
       </w:r>
     </w:p>
     <w:p>
-      <w:proofErr w:type="gramStart"/>
-      <w:r>
-        <w:t>A number of</w:t>
-      </w:r>
-      <w:proofErr w:type="gramEnd"/>
-      <w:r>
-        <w:t xml:space="preserve"> important operations are performed during app startup.  These include:</w:t>
+      <w:r>
+        <w:t>A number of important operations are performed during app startup.  These include:</w:t>
       </w:r>
     </w:p>
     <w:p>
@@ -4831,15 +4725,7 @@
         <w:t xml:space="preserve">All the events and instructions defined across </w:t>
       </w:r>
       <w:r>
-        <w:t xml:space="preserve">the </w:t>
-      </w:r>
-      <w:proofErr w:type="gramStart"/>
-      <w:r>
-        <w:t>read .perf</w:t>
-      </w:r>
-      <w:proofErr w:type="gramEnd"/>
-      <w:r>
-        <w:t xml:space="preserve"> file’s </w:t>
+        <w:t xml:space="preserve">the read .perf file’s </w:t>
       </w:r>
       <w:r>
         <w:t xml:space="preserve">execution chunks are put in a single </w:t>
@@ -5692,15 +5578,7 @@
         </w:numPr>
       </w:pPr>
       <w:r>
-        <w:t xml:space="preserve">Every JSR destination address is </w:t>
-      </w:r>
-      <w:proofErr w:type="gramStart"/>
-      <w:r>
-        <w:t>by definition a</w:t>
-      </w:r>
-      <w:proofErr w:type="gramEnd"/>
-      <w:r>
-        <w:t xml:space="preserve"> routine.</w:t>
+        <w:t>Every JSR destination address is by definition a routine.</w:t>
       </w:r>
     </w:p>
     <w:p>
@@ -5712,15 +5590,7 @@
         </w:numPr>
       </w:pPr>
       <w:r>
-        <w:t xml:space="preserve">Every Interrupt destination address is </w:t>
-      </w:r>
-      <w:proofErr w:type="gramStart"/>
-      <w:r>
-        <w:t>by definition a</w:t>
-      </w:r>
-      <w:proofErr w:type="gramEnd"/>
-      <w:r>
-        <w:t xml:space="preserve"> routine. </w:t>
+        <w:t xml:space="preserve">Every Interrupt destination address is by definition a routine. </w:t>
       </w:r>
     </w:p>
     <w:p>
@@ -5865,23 +5735,7 @@
           <w:rFonts w:ascii="Aptos" w:hAnsi="Aptos"/>
           <w:color w:val="000000"/>
         </w:rPr>
-        <w:t xml:space="preserve">And after the last instruction has been processed, the remaining stack frames are unwound to set the </w:t>
-      </w:r>
-      <w:proofErr w:type="gramStart"/>
-      <w:r>
-        <w:rPr>
-          <w:rFonts w:ascii="Aptos" w:hAnsi="Aptos"/>
-          <w:color w:val="000000"/>
-        </w:rPr>
-        <w:t>final end</w:t>
-      </w:r>
-      <w:proofErr w:type="gramEnd"/>
-      <w:r>
-        <w:rPr>
-          <w:rFonts w:ascii="Aptos" w:hAnsi="Aptos"/>
-          <w:color w:val="000000"/>
-        </w:rPr>
-        <w:t xml:space="preserve"> cycle counts.</w:t>
+        <w:t>And after the last instruction has been processed, the remaining stack frames are unwound to set the final end cycle counts.</w:t>
       </w:r>
     </w:p>
     <w:p>
@@ -7391,19 +7245,9 @@
           <w:numId w:val="62"/>
         </w:numPr>
       </w:pPr>
-      <w:proofErr w:type="gramStart"/>
-      <w:r>
-        <w:t>bool</w:t>
-      </w:r>
-      <w:proofErr w:type="gramEnd"/>
-      <w:r>
-        <w:t xml:space="preserve"> </w:t>
-      </w:r>
-      <w:proofErr w:type="gramStart"/>
-      <w:r>
-        <w:t>Execute(</w:t>
-      </w:r>
-      <w:proofErr w:type="gramEnd"/>
+      <w:r>
+        <w:t>bool Execute(</w:t>
+      </w:r>
       <w:r>
         <w:rPr>
           <w:b/>
@@ -7427,17 +7271,12 @@
         <w:t xml:space="preserve">bool </w:t>
       </w:r>
       <w:proofErr w:type="spellStart"/>
-      <w:proofErr w:type="gramStart"/>
       <w:r>
         <w:t>CanUndo</w:t>
       </w:r>
       <w:proofErr w:type="spellEnd"/>
       <w:r>
-        <w:t>(</w:t>
-      </w:r>
-      <w:proofErr w:type="gramEnd"/>
-      <w:r>
-        <w:t>)</w:t>
+        <w:t>()</w:t>
       </w:r>
     </w:p>
     <w:p>
@@ -7452,17 +7291,12 @@
         <w:t xml:space="preserve">bool </w:t>
       </w:r>
       <w:proofErr w:type="spellStart"/>
-      <w:proofErr w:type="gramStart"/>
       <w:r>
         <w:t>CanRedo</w:t>
       </w:r>
       <w:proofErr w:type="spellEnd"/>
       <w:r>
-        <w:t>(</w:t>
-      </w:r>
-      <w:proofErr w:type="gramEnd"/>
-      <w:r>
-        <w:t>)</w:t>
+        <w:t>()</w:t>
       </w:r>
     </w:p>
     <w:p>
@@ -7474,15 +7308,7 @@
         </w:numPr>
       </w:pPr>
       <w:r>
-        <w:t xml:space="preserve">void </w:t>
-      </w:r>
-      <w:proofErr w:type="gramStart"/>
-      <w:r>
-        <w:t>Undo(</w:t>
-      </w:r>
-      <w:proofErr w:type="gramEnd"/>
-      <w:r>
-        <w:t>)</w:t>
+        <w:t>void Undo()</w:t>
       </w:r>
     </w:p>
     <w:p>
@@ -7494,15 +7320,7 @@
         </w:numPr>
       </w:pPr>
       <w:r>
-        <w:t xml:space="preserve">void </w:t>
-      </w:r>
-      <w:proofErr w:type="gramStart"/>
-      <w:r>
-        <w:t>Redo(</w:t>
-      </w:r>
-      <w:proofErr w:type="gramEnd"/>
-      <w:r>
-        <w:t>)</w:t>
+        <w:t>void Redo()</w:t>
       </w:r>
     </w:p>
     <w:p>
@@ -7513,21 +7331,8 @@
           <w:numId w:val="62"/>
         </w:numPr>
       </w:pPr>
-      <w:proofErr w:type="gramStart"/>
-      <w:r>
-        <w:t>void</w:t>
-      </w:r>
-      <w:proofErr w:type="gramEnd"/>
-      <w:r>
-        <w:t xml:space="preserve"> </w:t>
-      </w:r>
-      <w:proofErr w:type="gramStart"/>
-      <w:r>
-        <w:t>Clear(</w:t>
-      </w:r>
-      <w:proofErr w:type="gramEnd"/>
-      <w:r>
-        <w:t>)</w:t>
+      <w:r>
+        <w:t>void Clear()</w:t>
       </w:r>
     </w:p>
     <w:p>
@@ -7562,21 +7367,8 @@
           <w:numId w:val="62"/>
         </w:numPr>
       </w:pPr>
-      <w:proofErr w:type="gramStart"/>
-      <w:r>
-        <w:t>bool</w:t>
-      </w:r>
-      <w:proofErr w:type="gramEnd"/>
-      <w:r>
-        <w:t xml:space="preserve"> </w:t>
-      </w:r>
-      <w:proofErr w:type="gramStart"/>
-      <w:r>
-        <w:t>Execute(</w:t>
-      </w:r>
-      <w:proofErr w:type="gramEnd"/>
-      <w:r>
-        <w:t>)</w:t>
+      <w:r>
+        <w:t>bool Execute()</w:t>
       </w:r>
     </w:p>
     <w:p>
@@ -7588,15 +7380,7 @@
         </w:numPr>
       </w:pPr>
       <w:r>
-        <w:t xml:space="preserve">void </w:t>
-      </w:r>
-      <w:proofErr w:type="gramStart"/>
-      <w:r>
-        <w:t>Undo(</w:t>
-      </w:r>
-      <w:proofErr w:type="gramEnd"/>
-      <w:r>
-        <w:t>)</w:t>
+        <w:t>void Undo()</w:t>
       </w:r>
     </w:p>
     <w:p>
@@ -7608,15 +7392,7 @@
         </w:numPr>
       </w:pPr>
       <w:r>
-        <w:t xml:space="preserve">void </w:t>
-      </w:r>
-      <w:proofErr w:type="gramStart"/>
-      <w:r>
-        <w:t>Redo(</w:t>
-      </w:r>
-      <w:proofErr w:type="gramEnd"/>
-      <w:r>
-        <w:t>)</w:t>
+        <w:t>void Redo()</w:t>
       </w:r>
     </w:p>
     <w:p>
@@ -7671,21 +7447,12 @@
       <w:r>
         <w:t xml:space="preserve">The </w:t>
       </w:r>
-      <w:proofErr w:type="gramStart"/>
-      <w:r>
-        <w:rPr>
-          <w:b/>
-          <w:bCs/>
-        </w:rPr>
-        <w:t>Execute(</w:t>
-      </w:r>
-      <w:proofErr w:type="gramEnd"/>
-      <w:r>
-        <w:rPr>
-          <w:b/>
-          <w:bCs/>
-        </w:rPr>
-        <w:t>Operation</w:t>
+      <w:r>
+        <w:rPr>
+          <w:b/>
+          <w:bCs/>
+        </w:rPr>
+        <w:t>Execute(Operation</w:t>
       </w:r>
       <w:r>
         <w:t xml:space="preserve"> op)</w:t>
@@ -7848,15 +7615,7 @@
         <w:t>implemented as an operation.</w:t>
       </w:r>
       <w:r>
-        <w:t xml:space="preserve">  These </w:t>
-      </w:r>
-      <w:proofErr w:type="gramStart"/>
-      <w:r>
-        <w:t>are located in</w:t>
-      </w:r>
-      <w:proofErr w:type="gramEnd"/>
-      <w:r>
-        <w:t xml:space="preserve"> the </w:t>
+        <w:t xml:space="preserve">  These are located in the </w:t>
       </w:r>
       <w:r>
         <w:rPr>
@@ -7998,84 +7757,71 @@
         <w:t xml:space="preserve">The </w:t>
       </w:r>
       <w:r>
-        <w:t xml:space="preserve">project </w:t>
-      </w:r>
-      <w:proofErr w:type="gramStart"/>
-      <w:r>
-        <w:t>builds</w:t>
-      </w:r>
-      <w:proofErr w:type="gramEnd"/>
+        <w:t xml:space="preserve">project builds </w:t>
+      </w:r>
+      <w:r>
+        <w:t xml:space="preserve">to create </w:t>
+      </w:r>
+      <w:r>
+        <w:rPr>
+          <w:b/>
+          <w:bCs/>
+        </w:rPr>
+        <w:t>zlib.dll</w:t>
+      </w:r>
+      <w:r>
+        <w:t>.</w:t>
+      </w:r>
+      <w:r>
+        <w:t xml:space="preserve">  </w:t>
+      </w:r>
+    </w:p>
+    <w:p>
+      <w:r>
+        <w:t xml:space="preserve">The </w:t>
+      </w:r>
+      <w:proofErr w:type="spellStart"/>
+      <w:r>
+        <w:rPr>
+          <w:b/>
+          <w:bCs/>
+        </w:rPr>
+        <w:t>PerfReader</w:t>
+      </w:r>
+      <w:proofErr w:type="spellEnd"/>
+      <w:r>
+        <w:t xml:space="preserve"> class calls the </w:t>
+      </w:r>
+      <w:proofErr w:type="spellStart"/>
+      <w:r>
+        <w:t>zlib</w:t>
+      </w:r>
+      <w:proofErr w:type="spellEnd"/>
       <w:r>
         <w:t xml:space="preserve"> </w:t>
       </w:r>
-      <w:r>
-        <w:t xml:space="preserve">to create </w:t>
-      </w:r>
-      <w:r>
-        <w:rPr>
-          <w:b/>
-          <w:bCs/>
-        </w:rPr>
-        <w:t>zlib.dll</w:t>
+      <w:proofErr w:type="spellStart"/>
+      <w:r>
+        <w:t>apis</w:t>
+      </w:r>
+      <w:proofErr w:type="spellEnd"/>
+      <w:r>
+        <w:t xml:space="preserve"> using </w:t>
+      </w:r>
+      <w:r>
+        <w:t>P/Invoke</w:t>
       </w:r>
       <w:r>
         <w:t>.</w:t>
       </w:r>
-      <w:r>
-        <w:t xml:space="preserve">  </w:t>
-      </w:r>
-    </w:p>
-    <w:p>
-      <w:r>
-        <w:t xml:space="preserve">The </w:t>
-      </w:r>
-      <w:proofErr w:type="spellStart"/>
-      <w:r>
-        <w:rPr>
-          <w:b/>
-          <w:bCs/>
-        </w:rPr>
-        <w:t>PerfReader</w:t>
-      </w:r>
-      <w:proofErr w:type="spellEnd"/>
-      <w:r>
-        <w:t xml:space="preserve"> class calls the </w:t>
-      </w:r>
-      <w:proofErr w:type="spellStart"/>
-      <w:r>
-        <w:t>zlib</w:t>
-      </w:r>
-      <w:proofErr w:type="spellEnd"/>
-      <w:r>
-        <w:t xml:space="preserve"> </w:t>
-      </w:r>
-      <w:proofErr w:type="spellStart"/>
-      <w:r>
-        <w:t>apis</w:t>
-      </w:r>
-      <w:proofErr w:type="spellEnd"/>
-      <w:r>
-        <w:t xml:space="preserve"> using </w:t>
-      </w:r>
-      <w:r>
-        <w:t>P/Invoke</w:t>
-      </w:r>
-      <w:r>
-        <w:t>.</w:t>
-      </w:r>
     </w:p>
     <w:p>
       <w:pPr>
         <w:pStyle w:val="Heading1"/>
       </w:pPr>
-      <w:proofErr w:type="gramStart"/>
       <w:r>
         <w:lastRenderedPageBreak/>
-        <w:t>.Perf</w:t>
-      </w:r>
-      <w:proofErr w:type="gramEnd"/>
-      <w:r>
-        <w:t xml:space="preserve"> </w:t>
+        <w:t xml:space="preserve">.Perf </w:t>
       </w:r>
       <w:r>
         <w:t>F</w:t>
@@ -9147,15 +8893,7 @@
     </w:p>
     <w:p>
       <w:r>
-        <w:t xml:space="preserve">The header chunk is the first </w:t>
-      </w:r>
-      <w:proofErr w:type="gramStart"/>
-      <w:r>
-        <w:t>chunk</w:t>
-      </w:r>
-      <w:proofErr w:type="gramEnd"/>
-      <w:r>
-        <w:t xml:space="preserve"> and it contains the file’s version, BBC model, and the total execution count.</w:t>
+        <w:t>The header chunk is the first chunk and it contains the file’s version, BBC model, and the total execution count.</w:t>
       </w:r>
     </w:p>
     <w:p>
@@ -13049,23 +12787,7 @@
                 <w:i/>
                 <w:iCs/>
               </w:rPr>
-              <w:t>&amp;80, &amp;</w:t>
-            </w:r>
-            <w:proofErr w:type="gramStart"/>
-            <w:r>
-              <w:rPr>
-                <w:i/>
-                <w:iCs/>
-              </w:rPr>
-              <w:t>03..</w:t>
-            </w:r>
-            <w:proofErr w:type="gramEnd"/>
-            <w:r>
-              <w:rPr>
-                <w:i/>
-                <w:iCs/>
-              </w:rPr>
-              <w:t>&amp;7F</w:t>
+              <w:t>&amp;80, &amp;03..&amp;7F</w:t>
             </w:r>
           </w:p>
         </w:tc>
@@ -13124,15 +12846,7 @@
         <w:t xml:space="preserve">The </w:t>
       </w:r>
       <w:r>
-        <w:t xml:space="preserve">maskable (IRQ) and non-maskable (NMI) interrupt events signify that an </w:t>
-      </w:r>
-      <w:proofErr w:type="gramStart"/>
-      <w:r>
-        <w:t>interrupt</w:t>
-      </w:r>
-      <w:proofErr w:type="gramEnd"/>
-      <w:r>
-        <w:t xml:space="preserve"> has occurred.  A begin display event signifies that the screen memory read, used to display screen memory, begins.  The screen memory is read every 50</w:t>
+        <w:t>maskable (IRQ) and non-maskable (NMI) interrupt events signify that an interrupt has occurred.  A begin display event signifies that the screen memory read, used to display screen memory, begins.  The screen memory is read every 50</w:t>
       </w:r>
       <w:r>
         <w:rPr>
@@ -13283,16 +12997,11 @@
         <w:t>display_field</w:t>
       </w:r>
       <w:proofErr w:type="spellEnd"/>
-      <w:proofErr w:type="gramStart"/>
       <w:r>
         <w:t>&gt;</w:t>
       </w:r>
       <w:r>
-        <w:t xml:space="preserve">  (</w:t>
-      </w:r>
-      <w:proofErr w:type="gramEnd"/>
-      <w:r>
-        <w:t>1 byte).  0 for even field, 1 for odd field (when interlaced sync is enabled).</w:t>
+        <w:t xml:space="preserve">  (1 byte).  0 for even field, 1 for odd field (when interlaced sync is enabled).</w:t>
       </w:r>
     </w:p>
     <w:p>
@@ -13666,15 +13375,7 @@
               <w:jc w:val="center"/>
             </w:pPr>
             <w:r>
-              <w:t>&amp;</w:t>
-            </w:r>
-            <w:proofErr w:type="gramStart"/>
-            <w:r>
-              <w:t>81..</w:t>
-            </w:r>
-            <w:proofErr w:type="gramEnd"/>
-            <w:r>
-              <w:t>&amp;FF</w:t>
+              <w:t>&amp;81..&amp;FF</w:t>
             </w:r>
           </w:p>
         </w:tc>
@@ -13717,15 +13418,7 @@
           </w:tcPr>
           <w:p>
             <w:r>
-              <w:t>Absolute address: &amp;</w:t>
-            </w:r>
-            <w:proofErr w:type="gramStart"/>
-            <w:r>
-              <w:t>0000..</w:t>
-            </w:r>
-            <w:proofErr w:type="gramEnd"/>
-            <w:r>
-              <w:t>&amp;7FFF</w:t>
+              <w:t>Absolute address: &amp;0000..&amp;7FFF</w:t>
             </w:r>
           </w:p>
         </w:tc>
@@ -13737,13 +13430,8 @@
             <w:pPr>
               <w:jc w:val="center"/>
             </w:pPr>
-            <w:proofErr w:type="gramStart"/>
-            <w:r>
-              <w:t>0..&amp;</w:t>
-            </w:r>
-            <w:proofErr w:type="gramEnd"/>
-            <w:r>
-              <w:t>7F</w:t>
+            <w:r>
+              <w:t>0..&amp;7F</w:t>
             </w:r>
           </w:p>
         </w:tc>
@@ -13755,13 +13443,8 @@
             <w:pPr>
               <w:jc w:val="center"/>
             </w:pPr>
-            <w:proofErr w:type="gramStart"/>
-            <w:r>
-              <w:t>0..&amp;</w:t>
-            </w:r>
-            <w:proofErr w:type="gramEnd"/>
-            <w:r>
-              <w:t>FF</w:t>
+            <w:r>
+              <w:t>0..&amp;FF</w:t>
             </w:r>
           </w:p>
         </w:tc>
@@ -13790,15 +13473,7 @@
           </w:tcPr>
           <w:p>
             <w:r>
-              <w:t>Absolute address: &amp;</w:t>
-            </w:r>
-            <w:proofErr w:type="gramStart"/>
-            <w:r>
-              <w:t>8000..</w:t>
-            </w:r>
-            <w:proofErr w:type="gramEnd"/>
-            <w:r>
-              <w:t>&amp;FFFF</w:t>
+              <w:t>Absolute address: &amp;8000..&amp;FFFF</w:t>
             </w:r>
           </w:p>
         </w:tc>
@@ -13824,15 +13499,7 @@
               <w:jc w:val="center"/>
             </w:pPr>
             <w:r>
-              <w:t>&amp;</w:t>
-            </w:r>
-            <w:proofErr w:type="gramStart"/>
-            <w:r>
-              <w:t>80..</w:t>
-            </w:r>
-            <w:proofErr w:type="gramEnd"/>
-            <w:r>
-              <w:t>&amp;FF</w:t>
+              <w:t>&amp;80..&amp;FF</w:t>
             </w:r>
           </w:p>
         </w:tc>
@@ -13844,13 +13511,8 @@
             <w:pPr>
               <w:jc w:val="center"/>
             </w:pPr>
-            <w:proofErr w:type="gramStart"/>
-            <w:r>
-              <w:t>0..&amp;</w:t>
-            </w:r>
-            <w:proofErr w:type="gramEnd"/>
-            <w:r>
-              <w:t>FF</w:t>
+            <w:r>
+              <w:t>0..&amp;FF</w:t>
             </w:r>
           </w:p>
         </w:tc>
@@ -13919,21 +13581,12 @@
                 <w:iCs/>
               </w:rPr>
             </w:pPr>
-            <w:proofErr w:type="gramStart"/>
             <w:r>
               <w:rPr>
                 <w:i/>
                 <w:iCs/>
               </w:rPr>
-              <w:t>0..&amp;</w:t>
-            </w:r>
-            <w:proofErr w:type="gramEnd"/>
-            <w:r>
-              <w:rPr>
-                <w:i/>
-                <w:iCs/>
-              </w:rPr>
-              <w:t>7F</w:t>
+              <w:t>0..&amp;7F</w:t>
             </w:r>
           </w:p>
         </w:tc>
@@ -14331,15 +13984,7 @@
         <w:ind w:left="720"/>
       </w:pPr>
       <w:r>
-        <w:t xml:space="preserve">&lt;operand&gt; (0, 1, or 2 bytes) The instruction’s operand value.  The number of bytes is defined by the instruction’s </w:t>
-      </w:r>
-      <w:proofErr w:type="gramStart"/>
-      <w:r>
-        <w:t>opcode</w:t>
-      </w:r>
-      <w:proofErr w:type="gramEnd"/>
-      <w:r>
-        <w:t>, per the 6502 &amp; 65C02 instruction set.</w:t>
+        <w:t>&lt;operand&gt; (0, 1, or 2 bytes) The instruction’s operand value.  The number of bytes is defined by the instruction’s opcode, per the 6502 &amp; 65C02 instruction set.</w:t>
       </w:r>
     </w:p>
     <w:p>
@@ -14362,34 +14007,10 @@
           <w:b/>
           <w:bCs/>
         </w:rPr>
-        <w:t xml:space="preserve">bits </w:t>
-      </w:r>
-      <w:proofErr w:type="gramStart"/>
-      <w:r>
-        <w:rPr>
-          <w:b/>
-          <w:bCs/>
-        </w:rPr>
-        <w:t>0..</w:t>
-      </w:r>
-      <w:proofErr w:type="gramEnd"/>
-      <w:r>
-        <w:rPr>
-          <w:b/>
-          <w:bCs/>
-        </w:rPr>
-        <w:t>2</w:t>
-      </w:r>
-      <w:r>
-        <w:t xml:space="preserve"> of next byte) Contains the number of cycles the instruction took to execute.  The value in the range: </w:t>
-      </w:r>
-      <w:proofErr w:type="gramStart"/>
-      <w:r>
-        <w:t>2..</w:t>
-      </w:r>
-      <w:proofErr w:type="gramEnd"/>
-      <w:r>
-        <w:t>7.</w:t>
+        <w:t>bits 0..2</w:t>
+      </w:r>
+      <w:r>
+        <w:t xml:space="preserve"> of next byte) Contains the number of cycles the instruction took to execute.  The value in the range: 2..7.</w:t>
       </w:r>
     </w:p>
     <w:p>
@@ -14533,23 +14154,7 @@
           <w:b/>
           <w:bCs/>
         </w:rPr>
-        <w:t xml:space="preserve">bits </w:t>
-      </w:r>
-      <w:proofErr w:type="gramStart"/>
-      <w:r>
-        <w:rPr>
-          <w:b/>
-          <w:bCs/>
-        </w:rPr>
-        <w:t>3..</w:t>
-      </w:r>
-      <w:proofErr w:type="gramEnd"/>
-      <w:r>
-        <w:rPr>
-          <w:b/>
-          <w:bCs/>
-        </w:rPr>
-        <w:t>7</w:t>
+        <w:t>bits 3..7</w:t>
       </w:r>
       <w:r>
         <w:t xml:space="preserve"> of next byte).  Bit flags indicating which register value(s) the instruction modified.  The table below lists which bits are set for each corresponding modified register.  The bits are only set if the executed instruction changed the contents/value of the corresponding register.</w:t>
@@ -15239,15 +14844,7 @@
         <w:ind w:left="720"/>
       </w:pPr>
       <w:r>
-        <w:t xml:space="preserve">The value is not populated </w:t>
-      </w:r>
-      <w:proofErr w:type="gramStart"/>
-      <w:r>
-        <w:t>for</w:t>
-      </w:r>
-      <w:proofErr w:type="gramEnd"/>
-      <w:r>
-        <w:t xml:space="preserve"> </w:t>
+        <w:t xml:space="preserve">The value is not populated for </w:t>
       </w:r>
       <w:r>
         <w:rPr>
@@ -15601,27 +15198,18 @@
       </w:r>
       <w:proofErr w:type="spellStart"/>
       <w:r>
-        <w:t>PerfWriter_</w:t>
-      </w:r>
-      <w:proofErr w:type="gramStart"/>
-      <w:r>
-        <w:t>WriteInstruction</w:t>
+        <w:t>PerfWriter_WriteInstruction</w:t>
       </w:r>
       <w:proofErr w:type="spellEnd"/>
       <w:r>
         <w:t>(</w:t>
       </w:r>
-      <w:proofErr w:type="gramEnd"/>
       <w:r>
         <w:t xml:space="preserve">…) and </w:t>
       </w:r>
       <w:proofErr w:type="spellStart"/>
       <w:r>
-        <w:t>PerfWriter_</w:t>
-      </w:r>
-      <w:proofErr w:type="gramStart"/>
-      <w:r>
-        <w:t>WriteI</w:t>
+        <w:t>PerfWriter_WriteI</w:t>
       </w:r>
       <w:r>
         <w:t>nterrupt</w:t>
@@ -15630,7 +15218,6 @@
       <w:r>
         <w:t>(</w:t>
       </w:r>
-      <w:proofErr w:type="gramEnd"/>
       <w:r>
         <w:t xml:space="preserve">…) to log instructions and interrupts.  These wrapper functions only invoke the </w:t>
       </w:r>
@@ -15680,17 +15267,12 @@
       </w:r>
       <w:proofErr w:type="spellStart"/>
       <w:r>
-        <w:t>PerfWriter_</w:t>
-      </w:r>
-      <w:proofErr w:type="gramStart"/>
-      <w:r>
-        <w:t>WriteInstruction</w:t>
+        <w:t>PerfWriter_WriteInstruction</w:t>
       </w:r>
       <w:proofErr w:type="spellEnd"/>
       <w:r>
         <w:t>(</w:t>
       </w:r>
-      <w:proofErr w:type="gramEnd"/>
       <w:r>
         <w:t>…).  Added helpers (</w:t>
       </w:r>
@@ -15854,17 +15436,12 @@
         <w:t xml:space="preserve">Added helper to get the emulator’s registers: </w:t>
       </w:r>
       <w:proofErr w:type="spellStart"/>
-      <w:proofErr w:type="gramStart"/>
       <w:r>
         <w:t>GetRegisters</w:t>
       </w:r>
       <w:proofErr w:type="spellEnd"/>
       <w:r>
-        <w:t>(</w:t>
-      </w:r>
-      <w:proofErr w:type="gramEnd"/>
-      <w:r>
-        <w:t>…).  This is called during snapshot chunk serialization.</w:t>
+        <w:t>(…).  This is called during snapshot chunk serialization.</w:t>
       </w:r>
     </w:p>
     <w:p>
@@ -15948,15 +15525,7 @@
         </w:numPr>
       </w:pPr>
       <w:r>
-        <w:t xml:space="preserve">Defined new </w:t>
-      </w:r>
-      <w:proofErr w:type="gramStart"/>
-      <w:r>
-        <w:t>struct</w:t>
-      </w:r>
-      <w:proofErr w:type="gramEnd"/>
-      <w:r>
-        <w:t xml:space="preserve"> (</w:t>
+        <w:t>Defined new struct (</w:t>
       </w:r>
       <w:proofErr w:type="spellStart"/>
       <w:r>
@@ -16001,11 +15570,9 @@
           <w:bCs/>
         </w:rPr>
       </w:pPr>
-      <w:proofErr w:type="gramStart"/>
       <w:r>
         <w:t>Externed</w:t>
       </w:r>
-      <w:proofErr w:type="gramEnd"/>
       <w:r>
         <w:rPr>
           <w:b/>
@@ -16056,16 +15623,11 @@
         </w:rPr>
         <w:t xml:space="preserve"> </w:t>
       </w:r>
-      <w:proofErr w:type="gramStart"/>
       <w:r>
         <w:t>variables</w:t>
       </w:r>
       <w:r>
-        <w:t xml:space="preserve"> so these</w:t>
-      </w:r>
-      <w:proofErr w:type="gramEnd"/>
-      <w:r>
-        <w:t xml:space="preserve"> are accessible during snapshot serialization.</w:t>
+        <w:t xml:space="preserve"> so these are accessible during snapshot serialization.</w:t>
       </w:r>
     </w:p>
     <w:p>
@@ -16139,19 +15701,11 @@
       </w:r>
       <w:proofErr w:type="spellStart"/>
       <w:r>
-        <w:t>PerfWriter_</w:t>
-      </w:r>
-      <w:proofErr w:type="gramStart"/>
-      <w:r>
-        <w:t>WriteBeginDisplayEvent</w:t>
-      </w:r>
-      <w:proofErr w:type="spellEnd"/>
-      <w:r>
-        <w:t>(</w:t>
-      </w:r>
-      <w:proofErr w:type="gramEnd"/>
-      <w:r>
-        <w:t xml:space="preserve">…) to log the start of screen display. </w:t>
+        <w:t>PerfWriter_WriteBeginDisplayEvent</w:t>
+      </w:r>
+      <w:proofErr w:type="spellEnd"/>
+      <w:r>
+        <w:t xml:space="preserve">(…) to log the start of screen display. </w:t>
       </w:r>
       <w:r>
         <w:t xml:space="preserve"> </w:t>
@@ -16299,65 +15853,45 @@
         <w:t xml:space="preserve"> </w:t>
       </w:r>
       <w:proofErr w:type="spellStart"/>
-      <w:proofErr w:type="gramStart"/>
       <w:r>
         <w:t>UpdatePerfCaptureMenu</w:t>
       </w:r>
       <w:proofErr w:type="spellEnd"/>
       <w:r>
-        <w:t>(</w:t>
-      </w:r>
-      <w:proofErr w:type="gramEnd"/>
-      <w:r>
-        <w:t>)</w:t>
+        <w:t>()</w:t>
       </w:r>
       <w:r>
         <w:t xml:space="preserve">, </w:t>
       </w:r>
       <w:proofErr w:type="spellStart"/>
-      <w:proofErr w:type="gramStart"/>
       <w:r>
         <w:t>CapturePerf</w:t>
       </w:r>
       <w:proofErr w:type="spellEnd"/>
       <w:r>
-        <w:t>(</w:t>
-      </w:r>
-      <w:proofErr w:type="gramEnd"/>
-      <w:r>
-        <w:t>)</w:t>
+        <w:t>()</w:t>
       </w:r>
       <w:r>
         <w:t xml:space="preserve">, </w:t>
       </w:r>
       <w:proofErr w:type="spellStart"/>
-      <w:proofErr w:type="gramStart"/>
       <w:r>
         <w:t>EndPerfCapture</w:t>
       </w:r>
       <w:proofErr w:type="spellEnd"/>
       <w:r>
-        <w:t>(</w:t>
-      </w:r>
-      <w:proofErr w:type="gramEnd"/>
-      <w:r>
-        <w:t>)</w:t>
+        <w:t>()</w:t>
       </w:r>
       <w:r>
         <w:t xml:space="preserve">, and </w:t>
       </w:r>
       <w:proofErr w:type="spellStart"/>
-      <w:proofErr w:type="gramStart"/>
       <w:r>
         <w:t>IsCapturingPerf</w:t>
       </w:r>
       <w:proofErr w:type="spellEnd"/>
       <w:r>
-        <w:t>(</w:t>
-      </w:r>
-      <w:proofErr w:type="gramEnd"/>
-      <w:r>
-        <w:t>)</w:t>
+        <w:t>()</w:t>
       </w:r>
       <w:r>
         <w:t xml:space="preserve"> functions</w:t>
@@ -16461,15 +15995,7 @@
         <w:t xml:space="preserve">Added a </w:t>
       </w:r>
       <w:r>
-        <w:t xml:space="preserve">performance </w:t>
-      </w:r>
-      <w:proofErr w:type="gramStart"/>
-      <w:r>
-        <w:t>capture</w:t>
-      </w:r>
-      <w:proofErr w:type="gramEnd"/>
-      <w:r>
-        <w:t xml:space="preserve"> file path preference, used to remember the location of the last written </w:t>
+        <w:t xml:space="preserve">performance capture file path preference, used to remember the location of the last written </w:t>
       </w:r>
       <w:r>
         <w:rPr>
@@ -16610,7 +16136,6 @@
         <w:t>*</w:t>
       </w:r>
       <w:proofErr w:type="spellStart"/>
-      <w:proofErr w:type="gramStart"/>
       <w:r>
         <w:rPr>
           <w:b/>
@@ -16647,7 +16172,6 @@
         <w:t>.filters</w:t>
       </w:r>
       <w:proofErr w:type="spellEnd"/>
-      <w:proofErr w:type="gramEnd"/>
     </w:p>
     <w:p>
       <w:pPr>
@@ -16725,7 +16249,44 @@
         <w:t xml:space="preserve"> to v14</w:t>
       </w:r>
       <w:r>
-        <w:t xml:space="preserve">2.  </w:t>
+        <w:t>2.</w:t>
+      </w:r>
+    </w:p>
+    <w:p>
+      <w:pPr>
+        <w:pStyle w:val="ListParagraph"/>
+        <w:numPr>
+          <w:ilvl w:val="0"/>
+          <w:numId w:val="8"/>
+        </w:numPr>
+      </w:pPr>
+      <w:r>
+        <w:t xml:space="preserve">Updated x64 hardware </w:t>
+      </w:r>
+      <w:r>
+        <w:t xml:space="preserve">configuration </w:t>
+      </w:r>
+      <w:proofErr w:type="spellStart"/>
+      <w:r>
+        <w:t>OutDir</w:t>
+      </w:r>
+      <w:proofErr w:type="spellEnd"/>
+      <w:r>
+        <w:t xml:space="preserve"> &amp; </w:t>
+      </w:r>
+      <w:proofErr w:type="spellStart"/>
+      <w:r>
+        <w:t>IntDir</w:t>
+      </w:r>
+      <w:proofErr w:type="spellEnd"/>
+      <w:r>
+        <w:t xml:space="preserve"> location</w:t>
+      </w:r>
+      <w:r>
+        <w:t>s</w:t>
+      </w:r>
+      <w:r>
+        <w:t xml:space="preserve"> to include \Hardware\</w:t>
       </w:r>
     </w:p>
     <w:p>
@@ -16894,19 +16455,11 @@
         </w:rPr>
         <w:t xml:space="preserve">    </w:t>
       </w:r>
-      <w:proofErr w:type="gramStart"/>
       <w:r>
         <w:rPr>
           <w:color w:val="FFFFFF" w:themeColor="background1"/>
         </w:rPr>
-        <w:t>git</w:t>
-      </w:r>
-      <w:proofErr w:type="gramEnd"/>
-      <w:r>
-        <w:rPr>
-          <w:color w:val="FFFFFF" w:themeColor="background1"/>
-        </w:rPr>
-        <w:t xml:space="preserve"> </w:t>
+        <w:t xml:space="preserve">git </w:t>
       </w:r>
       <w:r>
         <w:rPr>

</xml_diff>

<commit_message>
Updated .perf file format to serialize instruction cycle-counts as the value minus two, allowing for cycle counts greater than seven, which is possible for undocumented 6502 instructions.  Also updated documentation and took new sample recordings
</commit_message>
<xml_diff>
--- a/docs/BeebPerf.docx
+++ b/docs/BeebPerf.docx
@@ -412,23 +412,21 @@
           <w:rFonts w:ascii="Aptos" w:hAnsi="Aptos"/>
           <w:color w:val="000000"/>
         </w:rPr>
-        <w:t xml:space="preserve"> (</w:t>
-      </w:r>
-      <w:proofErr w:type="gramStart"/>
+        <w:t xml:space="preserve"> (see .</w:t>
+      </w:r>
       <w:r>
         <w:rPr>
           <w:rFonts w:ascii="Aptos" w:hAnsi="Aptos"/>
           <w:color w:val="000000"/>
         </w:rPr>
-        <w:t>see .Perf</w:t>
-      </w:r>
-      <w:proofErr w:type="gramEnd"/>
+        <w:t>p</w:t>
+      </w:r>
       <w:r>
         <w:rPr>
           <w:rFonts w:ascii="Aptos" w:hAnsi="Aptos"/>
           <w:color w:val="000000"/>
         </w:rPr>
-        <w:t xml:space="preserve"> </w:t>
+        <w:t xml:space="preserve">erf </w:t>
       </w:r>
       <w:r>
         <w:rPr>
@@ -760,6 +758,52 @@
         <w:t>rc</w:t>
       </w:r>
       <w:proofErr w:type="spellEnd"/>
+    </w:p>
+    <w:p>
+      <w:pPr>
+        <w:pStyle w:val="ListParagraph"/>
+        <w:spacing w:after="100" w:afterAutospacing="1"/>
+        <w:ind w:left="1080"/>
+      </w:pPr>
+    </w:p>
+    <w:p>
+      <w:pPr>
+        <w:pStyle w:val="ListParagraph"/>
+        <w:numPr>
+          <w:ilvl w:val="0"/>
+          <w:numId w:val="9"/>
+        </w:numPr>
+        <w:spacing w:after="100" w:afterAutospacing="1"/>
+      </w:pPr>
+      <w:r>
+        <w:t>Download and i</w:t>
+      </w:r>
+      <w:r>
+        <w:t xml:space="preserve">nstall </w:t>
+      </w:r>
+      <w:hyperlink r:id="rId8" w:history="1">
+        <w:r>
+          <w:rPr>
+            <w:rStyle w:val="Hyperlink"/>
+            <w:b/>
+            <w:bCs/>
+          </w:rPr>
+          <w:t>Microsoft DirectX SDK (June 2010)</w:t>
+        </w:r>
+      </w:hyperlink>
+      <w:r>
+        <w:rPr>
+          <w:b/>
+          <w:bCs/>
+        </w:rPr>
+        <w:t xml:space="preserve"> </w:t>
+      </w:r>
+      <w:r>
+        <w:t>from:</w:t>
+      </w:r>
+      <w:r>
+        <w:t xml:space="preserve"> https://www.microsoft.com/en-us/download/details.aspx?id=6812</w:t>
+      </w:r>
     </w:p>
     <w:p>
       <w:pPr>
@@ -850,6 +894,7 @@
         <w:contextualSpacing w:val="0"/>
       </w:pPr>
       <w:r>
+        <w:lastRenderedPageBreak/>
         <w:t xml:space="preserve">Using the </w:t>
       </w:r>
       <w:r>
@@ -905,19 +950,11 @@
         </w:rPr>
         <w:t xml:space="preserve">   </w:t>
       </w:r>
-      <w:proofErr w:type="gramStart"/>
       <w:r>
         <w:rPr>
           <w:color w:val="FFFFFF" w:themeColor="background1"/>
         </w:rPr>
-        <w:t>git</w:t>
-      </w:r>
-      <w:proofErr w:type="gramEnd"/>
-      <w:r>
-        <w:rPr>
-          <w:color w:val="FFFFFF" w:themeColor="background1"/>
-        </w:rPr>
-        <w:t xml:space="preserve"> </w:t>
+        <w:t xml:space="preserve">git </w:t>
       </w:r>
       <w:r>
         <w:rPr>
@@ -959,8 +996,25 @@
         <w:contextualSpacing w:val="0"/>
       </w:pPr>
       <w:r>
-        <w:lastRenderedPageBreak/>
-        <w:t>Reopen and build the solution</w:t>
+        <w:t xml:space="preserve">Reopen </w:t>
+      </w:r>
+      <w:r>
+        <w:t xml:space="preserve">and rebuild the </w:t>
+      </w:r>
+      <w:r>
+        <w:t xml:space="preserve">solution </w:t>
+      </w:r>
+      <w:r>
+        <w:t>(</w:t>
+      </w:r>
+      <w:r>
+        <w:t>x64 configuration</w:t>
+      </w:r>
+      <w:r>
+        <w:t>)</w:t>
+      </w:r>
+      <w:r>
+        <w:t>.</w:t>
       </w:r>
     </w:p>
     <w:p>
@@ -1036,7 +1090,20 @@
         <w:t>Capture Perf…</w:t>
       </w:r>
       <w:r>
-        <w:t xml:space="preserve"> menu item, choosing the name of the file to create.  To end the recording, select the </w:t>
+        <w:t xml:space="preserve"> menu item, choosing the name of the</w:t>
+      </w:r>
+      <w:r>
+        <w:t xml:space="preserve"> </w:t>
+      </w:r>
+      <w:r>
+        <w:rPr>
+          <w:b/>
+          <w:bCs/>
+        </w:rPr>
+        <w:t>.perf</w:t>
+      </w:r>
+      <w:r>
+        <w:t xml:space="preserve"> file to create.  To end the recording, select the </w:t>
       </w:r>
       <w:r>
         <w:rPr>
@@ -1082,16 +1149,13 @@
         <w:t>-</w:t>
       </w:r>
       <w:r>
-        <w:t xml:space="preserve">minute recording will </w:t>
-      </w:r>
-      <w:r>
-        <w:t xml:space="preserve">use </w:t>
-      </w:r>
-      <w:r>
-        <w:t xml:space="preserve">approximately </w:t>
-      </w:r>
-      <w:r>
-        <w:t>40Mb to 80Mb of disk space and may take</w:t>
+        <w:t xml:space="preserve">minute recording </w:t>
+      </w:r>
+      <w:r>
+        <w:t xml:space="preserve">may use </w:t>
+      </w:r>
+      <w:r>
+        <w:t>80Mb of disk space and take</w:t>
       </w:r>
       <w:r>
         <w:t xml:space="preserve"> tens of </w:t>
@@ -1129,7 +1193,10 @@
         <w:t xml:space="preserve">over BBC </w:t>
       </w:r>
       <w:r>
-        <w:t xml:space="preserve">disc activity, if code is being loaded.  </w:t>
+        <w:t>disc activity, if code is being loaded.</w:t>
+      </w:r>
+      <w:r>
+        <w:t xml:space="preserve"> </w:t>
       </w:r>
       <w:proofErr w:type="spellStart"/>
       <w:r>
@@ -1170,7 +1237,31 @@
     </w:p>
     <w:p>
       <w:r>
-        <w:t xml:space="preserve">Labels can be included in generated .Perf files by launching </w:t>
+        <w:t xml:space="preserve">Labels can be included in generated </w:t>
+      </w:r>
+      <w:r>
+        <w:rPr>
+          <w:b/>
+          <w:bCs/>
+        </w:rPr>
+        <w:t>.</w:t>
+      </w:r>
+      <w:r>
+        <w:rPr>
+          <w:b/>
+          <w:bCs/>
+        </w:rPr>
+        <w:t>p</w:t>
+      </w:r>
+      <w:r>
+        <w:rPr>
+          <w:b/>
+          <w:bCs/>
+        </w:rPr>
+        <w:t>erf</w:t>
+      </w:r>
+      <w:r>
+        <w:t xml:space="preserve"> files by launching </w:t>
       </w:r>
       <w:r>
         <w:rPr>
@@ -1563,15 +1654,7 @@
         <w:t>based</w:t>
       </w:r>
       <w:r>
-        <w:t xml:space="preserve"> </w:t>
-      </w:r>
-      <w:proofErr w:type="gramStart"/>
-      <w:r>
-        <w:t>from</w:t>
-      </w:r>
-      <w:proofErr w:type="gramEnd"/>
-      <w:r>
-        <w:t xml:space="preserve"> Visual Studio</w:t>
+        <w:t xml:space="preserve"> from Visual Studio</w:t>
       </w:r>
       <w:r>
         <w:t>.</w:t>
@@ -1656,7 +1739,7 @@
                     <pic:cNvPicPr/>
                   </pic:nvPicPr>
                   <pic:blipFill>
-                    <a:blip r:embed="rId8"/>
+                    <a:blip r:embed="rId9"/>
                     <a:stretch>
                       <a:fillRect/>
                     </a:stretch>
@@ -1686,7 +1769,13 @@
     </w:p>
     <w:p>
       <w:r>
-        <w:t xml:space="preserve">The top row, positioned beneath the toolbar, contains the timeline and associated display frames.  The current analysis time range is </w:t>
+        <w:t xml:space="preserve">The top row, positioned beneath the toolbar, contains the timeline and associated </w:t>
+      </w:r>
+      <w:r>
+        <w:t>display-frame</w:t>
+      </w:r>
+      <w:r>
+        <w:t xml:space="preserve">s.  The current analysis time range is </w:t>
       </w:r>
       <w:r>
         <w:t xml:space="preserve">highlighted </w:t>
@@ -1791,7 +1880,7 @@
                     <pic:cNvPicPr/>
                   </pic:nvPicPr>
                   <pic:blipFill>
-                    <a:blip r:embed="rId9"/>
+                    <a:blip r:embed="rId10"/>
                     <a:stretch>
                       <a:fillRect/>
                     </a:stretch>
@@ -1859,16 +1948,11 @@
       <w:r>
         <w:t xml:space="preserve">by dragging the black </w:t>
       </w:r>
-      <w:proofErr w:type="gramStart"/>
       <w:r>
         <w:t xml:space="preserve">colored </w:t>
       </w:r>
       <w:r>
-        <w:t>end</w:t>
-      </w:r>
-      <w:proofErr w:type="gramEnd"/>
-      <w:r>
-        <w:t xml:space="preserve"> handles</w:t>
+        <w:t>end handles</w:t>
       </w:r>
       <w:r>
         <w:t xml:space="preserve">, </w:t>
@@ -1897,19 +1981,168 @@
         <w:t>edit selection</w:t>
       </w:r>
       <w:r>
+        <w:t xml:space="preserve"> button</w:t>
+      </w:r>
+      <w:r>
         <w:t xml:space="preserve"> </w:t>
       </w:r>
-      <w:proofErr w:type="gramStart"/>
+      <w:r>
+        <w:t>.</w:t>
+      </w:r>
+    </w:p>
+    <w:p>
+      <w:r>
+        <w:t xml:space="preserve">The </w:t>
+      </w:r>
+      <w:r>
+        <w:rPr>
+          <w:b/>
+          <w:bCs/>
+        </w:rPr>
+        <w:t xml:space="preserve">Zoom </w:t>
+      </w:r>
+      <w:r>
+        <w:rPr>
+          <w:b/>
+          <w:bCs/>
+        </w:rPr>
+        <w:t>i</w:t>
+      </w:r>
+      <w:r>
+        <w:rPr>
+          <w:b/>
+          <w:bCs/>
+        </w:rPr>
+        <w:t>n</w:t>
+      </w:r>
+      <w:r>
+        <w:t xml:space="preserve"> and </w:t>
+      </w:r>
+      <w:r>
+        <w:rPr>
+          <w:b/>
+          <w:bCs/>
+        </w:rPr>
+        <w:t xml:space="preserve">Zoom </w:t>
+      </w:r>
+      <w:r>
+        <w:rPr>
+          <w:b/>
+          <w:bCs/>
+        </w:rPr>
+        <w:t>o</w:t>
+      </w:r>
+      <w:r>
+        <w:rPr>
+          <w:b/>
+          <w:bCs/>
+        </w:rPr>
+        <w:t>ut</w:t>
+      </w:r>
+      <w:r>
+        <w:t xml:space="preserve"> button</w:t>
+      </w:r>
+      <w:r>
+        <w:t>s change the scale</w:t>
+      </w:r>
+      <w:r>
+        <w:t xml:space="preserve">.  The </w:t>
+      </w:r>
+      <w:r>
+        <w:rPr>
+          <w:b/>
+          <w:bCs/>
+        </w:rPr>
+        <w:t>Fit selection</w:t>
+      </w:r>
+      <w:r>
+        <w:rPr>
+          <w:b/>
+          <w:bCs/>
+        </w:rPr>
+        <w:t xml:space="preserve"> </w:t>
+      </w:r>
       <w:r>
         <w:t>button</w:t>
       </w:r>
       <w:r>
+        <w:rPr>
+          <w:b/>
+          <w:bCs/>
+        </w:rPr>
         <w:t xml:space="preserve"> </w:t>
       </w:r>
       <w:r>
+        <w:t>scale</w:t>
+      </w:r>
+      <w:r>
+        <w:t>s</w:t>
+      </w:r>
+      <w:r>
+        <w:t xml:space="preserve"> and translate</w:t>
+      </w:r>
+      <w:r>
+        <w:t>s</w:t>
+      </w:r>
+      <w:r>
+        <w:t xml:space="preserve"> the view </w:t>
+      </w:r>
+      <w:r>
+        <w:t xml:space="preserve">to as appropriate.  </w:t>
+      </w:r>
+    </w:p>
+    <w:p>
+      <w:r>
+        <w:t>Display-frame</w:t>
+      </w:r>
+      <w:r>
+        <w:t>s</w:t>
+      </w:r>
+      <w:r>
+        <w:t xml:space="preserve"> are shown below</w:t>
+      </w:r>
+      <w:r>
+        <w:t xml:space="preserve"> the </w:t>
+      </w:r>
+      <w:r>
+        <w:t>timeline</w:t>
+      </w:r>
+      <w:r>
         <w:t>.</w:t>
       </w:r>
-      <w:proofErr w:type="gramEnd"/>
+      <w:r>
+        <w:t xml:space="preserve">  Th</w:t>
+      </w:r>
+      <w:r>
+        <w:t xml:space="preserve">eir size can be changed </w:t>
+      </w:r>
+      <w:r>
+        <w:t xml:space="preserve">by dragging the </w:t>
+      </w:r>
+      <w:r>
+        <w:t xml:space="preserve">bottom </w:t>
+      </w:r>
+      <w:r>
+        <w:t xml:space="preserve">dividing </w:t>
+      </w:r>
+      <w:r>
+        <w:t>border.</w:t>
+      </w:r>
+      <w:r>
+        <w:t xml:space="preserve"> Frame number</w:t>
+      </w:r>
+      <w:r>
+        <w:t>s</w:t>
+      </w:r>
+      <w:r>
+        <w:t xml:space="preserve"> are displayed under each </w:t>
+      </w:r>
+      <w:r>
+        <w:t>display-frame</w:t>
+      </w:r>
+      <w:r>
+        <w:t>.</w:t>
+      </w:r>
     </w:p>
     <w:p>
       <w:r>
@@ -1920,182 +2153,28 @@
           <w:b/>
           <w:bCs/>
         </w:rPr>
-        <w:t xml:space="preserve">Zoom </w:t>
-      </w:r>
-      <w:r>
-        <w:rPr>
-          <w:b/>
-          <w:bCs/>
-        </w:rPr>
-        <w:t>i</w:t>
-      </w:r>
-      <w:r>
-        <w:rPr>
-          <w:b/>
-          <w:bCs/>
-        </w:rPr>
-        <w:t>n</w:t>
-      </w:r>
-      <w:r>
-        <w:t xml:space="preserve"> and </w:t>
-      </w:r>
-      <w:proofErr w:type="gramStart"/>
-      <w:r>
-        <w:rPr>
-          <w:b/>
-          <w:bCs/>
-        </w:rPr>
-        <w:t>Zoom</w:t>
-      </w:r>
-      <w:proofErr w:type="gramEnd"/>
-      <w:r>
-        <w:rPr>
-          <w:b/>
-          <w:bCs/>
-        </w:rPr>
-        <w:t xml:space="preserve"> </w:t>
-      </w:r>
-      <w:r>
-        <w:rPr>
-          <w:b/>
-          <w:bCs/>
-        </w:rPr>
-        <w:t>o</w:t>
-      </w:r>
-      <w:r>
-        <w:rPr>
-          <w:b/>
-          <w:bCs/>
-        </w:rPr>
-        <w:t>ut</w:t>
-      </w:r>
-      <w:r>
-        <w:t xml:space="preserve"> button</w:t>
-      </w:r>
-      <w:r>
-        <w:t>s change the scale</w:t>
-      </w:r>
-      <w:r>
-        <w:t xml:space="preserve">.  The </w:t>
-      </w:r>
-      <w:r>
-        <w:rPr>
-          <w:b/>
-          <w:bCs/>
-        </w:rPr>
-        <w:t>Fit selection</w:t>
-      </w:r>
-      <w:r>
-        <w:rPr>
-          <w:b/>
-          <w:bCs/>
-        </w:rPr>
-        <w:t xml:space="preserve"> </w:t>
-      </w:r>
-      <w:r>
-        <w:t>button</w:t>
-      </w:r>
-      <w:r>
-        <w:rPr>
-          <w:b/>
-          <w:bCs/>
-        </w:rPr>
-        <w:t xml:space="preserve"> </w:t>
-      </w:r>
-      <w:r>
-        <w:t>scale</w:t>
-      </w:r>
-      <w:r>
+        <w:t xml:space="preserve">Fit </w:t>
+      </w:r>
+      <w:r>
+        <w:rPr>
+          <w:b/>
+          <w:bCs/>
+        </w:rPr>
+        <w:t>display-frame</w:t>
+      </w:r>
+      <w:r>
+        <w:rPr>
+          <w:b/>
+          <w:bCs/>
+        </w:rPr>
         <w:t>s</w:t>
       </w:r>
       <w:r>
-        <w:t xml:space="preserve"> and translate</w:t>
-      </w:r>
-      <w:r>
-        <w:t>s</w:t>
-      </w:r>
-      <w:r>
-        <w:t xml:space="preserve"> the view </w:t>
-      </w:r>
-      <w:r>
-        <w:t xml:space="preserve">to as appropriate.  </w:t>
-      </w:r>
-    </w:p>
-    <w:p>
-      <w:r>
-        <w:t>Display f</w:t>
-      </w:r>
-      <w:r>
-        <w:t>rame</w:t>
-      </w:r>
-      <w:r>
-        <w:t>s</w:t>
-      </w:r>
-      <w:r>
-        <w:t xml:space="preserve"> are shown below</w:t>
-      </w:r>
-      <w:r>
-        <w:t xml:space="preserve"> the </w:t>
+        <w:t xml:space="preserve"> button scales the </w:t>
       </w:r>
       <w:r>
         <w:t>timeline</w:t>
       </w:r>
-      <w:r>
-        <w:t>.</w:t>
-      </w:r>
-      <w:r>
-        <w:t xml:space="preserve">  Th</w:t>
-      </w:r>
-      <w:r>
-        <w:t xml:space="preserve">eir size can be changed </w:t>
-      </w:r>
-      <w:r>
-        <w:t xml:space="preserve">by dragging the </w:t>
-      </w:r>
-      <w:r>
-        <w:t xml:space="preserve">bottom </w:t>
-      </w:r>
-      <w:r>
-        <w:t xml:space="preserve">dividing </w:t>
-      </w:r>
-      <w:r>
-        <w:t>border.</w:t>
-      </w:r>
-      <w:r>
-        <w:t xml:space="preserve"> Frame number</w:t>
-      </w:r>
-      <w:r>
-        <w:t>s</w:t>
-      </w:r>
-      <w:r>
-        <w:t xml:space="preserve"> are displayed under each </w:t>
-      </w:r>
-      <w:r>
-        <w:t xml:space="preserve">display </w:t>
-      </w:r>
-      <w:r>
-        <w:t>frame.</w:t>
-      </w:r>
-    </w:p>
-    <w:p>
-      <w:r>
-        <w:t xml:space="preserve">The </w:t>
-      </w:r>
-      <w:r>
-        <w:rPr>
-          <w:b/>
-          <w:bCs/>
-        </w:rPr>
-        <w:t>Fit display frames</w:t>
-      </w:r>
-      <w:r>
-        <w:t xml:space="preserve"> button scales the </w:t>
-      </w:r>
-      <w:proofErr w:type="gramStart"/>
-      <w:r>
-        <w:t>timeline</w:t>
-      </w:r>
-      <w:proofErr w:type="gramEnd"/>
       <w:r>
         <w:t xml:space="preserve"> so frames are </w:t>
       </w:r>
@@ -2146,7 +2225,7 @@
                     <pic:cNvPicPr/>
                   </pic:nvPicPr>
                   <pic:blipFill>
-                    <a:blip r:embed="rId10"/>
+                    <a:blip r:embed="rId11"/>
                     <a:stretch>
                       <a:fillRect/>
                     </a:stretch>
@@ -2238,7 +2317,10 @@
         <w:t xml:space="preserve">to the clipboard </w:t>
       </w:r>
       <w:r>
-        <w:t xml:space="preserve">and </w:t>
+        <w:t>or</w:t>
+      </w:r>
+      <w:r>
+        <w:t xml:space="preserve"> </w:t>
       </w:r>
       <w:r>
         <w:t xml:space="preserve">export </w:t>
@@ -2580,7 +2662,7 @@
                     <pic:cNvPicPr/>
                   </pic:nvPicPr>
                   <pic:blipFill>
-                    <a:blip r:embed="rId11"/>
+                    <a:blip r:embed="rId12"/>
                     <a:stretch>
                       <a:fillRect/>
                     </a:stretch>
@@ -2734,7 +2816,7 @@
                     <pic:cNvPicPr/>
                   </pic:nvPicPr>
                   <pic:blipFill>
-                    <a:blip r:embed="rId12"/>
+                    <a:blip r:embed="rId13"/>
                     <a:stretch>
                       <a:fillRect/>
                     </a:stretch>
@@ -2943,18 +3025,13 @@
         <w:t>Export</w:t>
       </w:r>
       <w:r>
-        <w:t xml:space="preserve"> buttons copy all the data to the clipboard and </w:t>
-      </w:r>
-      <w:proofErr w:type="gramStart"/>
-      <w:r>
-        <w:t>export</w:t>
-      </w:r>
-      <w:r>
-        <w:t>s</w:t>
-      </w:r>
-      <w:proofErr w:type="gramEnd"/>
-      <w:r>
-        <w:t xml:space="preserve"> the data to a CSV file.</w:t>
+        <w:t xml:space="preserve"> buttons copy all the data to the clipboard </w:t>
+      </w:r>
+      <w:r>
+        <w:t xml:space="preserve">or </w:t>
+      </w:r>
+      <w:r>
+        <w:t>export the data to a CSV file.</w:t>
       </w:r>
     </w:p>
     <w:p>
@@ -2992,7 +3069,7 @@
                     <pic:cNvPicPr/>
                   </pic:nvPicPr>
                   <pic:blipFill>
-                    <a:blip r:embed="rId13"/>
+                    <a:blip r:embed="rId14"/>
                     <a:stretch>
                       <a:fillRect/>
                     </a:stretch>
@@ -3099,17 +3176,8 @@
           <w:b/>
           <w:bCs/>
         </w:rPr>
-        <w:t xml:space="preserve">Call </w:t>
-      </w:r>
-      <w:proofErr w:type="gramStart"/>
-      <w:r>
-        <w:rPr>
-          <w:b/>
-          <w:bCs/>
-        </w:rPr>
-        <w:t>types</w:t>
-      </w:r>
-      <w:proofErr w:type="gramEnd"/>
+        <w:t>Call types</w:t>
+      </w:r>
       <w:r>
         <w:t xml:space="preserve"> button.</w:t>
       </w:r>
@@ -3140,7 +3208,13 @@
         <w:t>Copy</w:t>
       </w:r>
       <w:r>
-        <w:t xml:space="preserve"> copies the image to the clipboard.</w:t>
+        <w:t xml:space="preserve"> </w:t>
+      </w:r>
+      <w:r>
+        <w:t xml:space="preserve">button </w:t>
+      </w:r>
+      <w:r>
+        <w:t>copies the image to the clipboard.</w:t>
       </w:r>
     </w:p>
     <w:p>
@@ -3175,7 +3249,7 @@
                     <pic:cNvPicPr/>
                   </pic:nvPicPr>
                   <pic:blipFill>
-                    <a:blip r:embed="rId14"/>
+                    <a:blip r:embed="rId15"/>
                     <a:stretch>
                       <a:fillRect/>
                     </a:stretch>
@@ -3325,15 +3399,13 @@
         <w:t>Export</w:t>
       </w:r>
       <w:r>
-        <w:t xml:space="preserve"> buttons copy all the data to the clipboard and </w:t>
-      </w:r>
-      <w:proofErr w:type="gramStart"/>
-      <w:r>
-        <w:t>exports</w:t>
-      </w:r>
-      <w:proofErr w:type="gramEnd"/>
-      <w:r>
-        <w:t xml:space="preserve"> the data to a CSV file.</w:t>
+        <w:t xml:space="preserve"> buttons copy all the data to the clipboard </w:t>
+      </w:r>
+      <w:r>
+        <w:t>or</w:t>
+      </w:r>
+      <w:r>
+        <w:t xml:space="preserve"> export the data to a CSV file.</w:t>
       </w:r>
     </w:p>
     <w:p>
@@ -3371,7 +3443,7 @@
                     <pic:cNvPicPr/>
                   </pic:nvPicPr>
                   <pic:blipFill>
-                    <a:blip r:embed="rId15"/>
+                    <a:blip r:embed="rId16"/>
                     <a:stretch>
                       <a:fillRect/>
                     </a:stretch>
@@ -3429,21 +3501,12 @@
       <w:r>
         <w:t xml:space="preserve"> and </w:t>
       </w:r>
-      <w:proofErr w:type="gramStart"/>
-      <w:r>
-        <w:rPr>
-          <w:b/>
-          <w:bCs/>
-        </w:rPr>
-        <w:t>Edit</w:t>
-      </w:r>
-      <w:proofErr w:type="gramEnd"/>
-      <w:r>
-        <w:rPr>
-          <w:b/>
-          <w:bCs/>
-        </w:rPr>
-        <w:t>…</w:t>
+      <w:r>
+        <w:rPr>
+          <w:b/>
+          <w:bCs/>
+        </w:rPr>
+        <w:t>Edit…</w:t>
       </w:r>
       <w:r>
         <w:t xml:space="preserve"> frame settings button</w:t>
@@ -3452,32 +3515,56 @@
         <w:t>s</w:t>
       </w:r>
       <w:r>
+        <w:t xml:space="preserve"> (see below).</w:t>
+      </w:r>
+    </w:p>
+    <w:p>
+      <w:r>
+        <w:t xml:space="preserve">The view shows each frame’s duration, its offset from </w:t>
+      </w:r>
+      <w:r>
+        <w:t xml:space="preserve">the </w:t>
+      </w:r>
+      <w:r>
+        <w:t>next display</w:t>
+      </w:r>
+      <w:r>
+        <w:t>-</w:t>
+      </w:r>
+      <w:r>
+        <w:t xml:space="preserve">frame, and how many writes to screen memory occur before </w:t>
+      </w:r>
+      <w:r>
+        <w:t xml:space="preserve">the </w:t>
+      </w:r>
+      <w:r>
+        <w:t>display</w:t>
+      </w:r>
+      <w:r>
+        <w:t xml:space="preserve"> screen memory scan read</w:t>
+      </w:r>
+      <w:r>
+        <w:t xml:space="preserve">, and how many writes to screen memory occur </w:t>
+      </w:r>
+      <w:r>
+        <w:t>after the display screen memory scan read</w:t>
+      </w:r>
+      <w:r>
         <w:t>.</w:t>
       </w:r>
-    </w:p>
-    <w:p>
-      <w:r>
-        <w:t xml:space="preserve">The view shows each frame’s duration, its offset from </w:t>
-      </w:r>
-      <w:r>
-        <w:t xml:space="preserve">the </w:t>
-      </w:r>
-      <w:r>
-        <w:t>next display</w:t>
-      </w:r>
-      <w:r>
-        <w:t>-</w:t>
-      </w:r>
-      <w:r>
-        <w:t>frame, and how many writes to screen memory occur before display, and how many writes to screen memory occur afterwards.</w:t>
-      </w:r>
       <w:r>
         <w:t xml:space="preserve">  This information can be useful for identifying display tearing.</w:t>
       </w:r>
     </w:p>
     <w:p>
       <w:r>
-        <w:t>The visualization column provided a frame centric view, where the frame’s duration is shown relative to a defined threshold (</w:t>
+        <w:t>The visualization column provide</w:t>
+      </w:r>
+      <w:r>
+        <w:t>s</w:t>
+      </w:r>
+      <w:r>
+        <w:t xml:space="preserve"> a frame centric view, where the frame’s duration is shown relative to a defined threshold (</w:t>
       </w:r>
       <w:r>
         <w:t xml:space="preserve">typically </w:t>
@@ -3495,7 +3582,13 @@
         <w:t xml:space="preserve"> second)</w:t>
       </w:r>
       <w:r>
-        <w:t xml:space="preserve">.  The frame’s associated display frames are also shown, where the arrow represents the </w:t>
+        <w:t xml:space="preserve">.  The frame’s associated </w:t>
+      </w:r>
+      <w:r>
+        <w:t>display-frame</w:t>
+      </w:r>
+      <w:r>
+        <w:t xml:space="preserve">s are also shown, where the arrow represents the </w:t>
       </w:r>
       <w:r>
         <w:t xml:space="preserve">span of the associated </w:t>
@@ -3529,15 +3622,13 @@
         <w:t>Export</w:t>
       </w:r>
       <w:r>
-        <w:t xml:space="preserve"> buttons copy all the data to the clipboard and </w:t>
-      </w:r>
-      <w:proofErr w:type="gramStart"/>
-      <w:r>
-        <w:t>exports</w:t>
-      </w:r>
-      <w:proofErr w:type="gramEnd"/>
-      <w:r>
-        <w:t xml:space="preserve"> the data to a CSV file.</w:t>
+        <w:t xml:space="preserve"> buttons copy all the data to the clipboard </w:t>
+      </w:r>
+      <w:r>
+        <w:t>or</w:t>
+      </w:r>
+      <w:r>
+        <w:t xml:space="preserve"> export the data to a CSV file.</w:t>
       </w:r>
     </w:p>
     <w:p>
@@ -3547,26 +3638,16 @@
       <w:r>
         <w:t xml:space="preserve">rame settings can be added, edited, and removed.  These persist across sessions.  The </w:t>
       </w:r>
-      <w:proofErr w:type="gramStart"/>
-      <w:r>
-        <w:rPr>
-          <w:b/>
-          <w:bCs/>
-        </w:rPr>
-        <w:t>Add..</w:t>
-      </w:r>
-      <w:proofErr w:type="gramEnd"/>
-      <w:r>
-        <w:rPr>
-          <w:b/>
-          <w:bCs/>
-        </w:rPr>
-        <w:t xml:space="preserve"> </w:t>
+      <w:r>
+        <w:rPr>
+          <w:b/>
+          <w:bCs/>
+        </w:rPr>
+        <w:t xml:space="preserve">Add.. </w:t>
       </w:r>
       <w:r>
         <w:t xml:space="preserve">and </w:t>
       </w:r>
-      <w:proofErr w:type="gramStart"/>
       <w:r>
         <w:rPr>
           <w:b/>
@@ -3574,7 +3655,6 @@
         </w:rPr>
         <w:t>Edit..</w:t>
       </w:r>
-      <w:proofErr w:type="gramEnd"/>
       <w:r>
         <w:t xml:space="preserve"> button</w:t>
       </w:r>
@@ -3590,6 +3670,9 @@
         <w:jc w:val="center"/>
       </w:pPr>
       <w:r>
+        <w:rPr>
+          <w:noProof/>
+        </w:rPr>
         <w:drawing>
           <wp:inline distT="0" distB="0" distL="0" distR="0" wp14:anchorId="3F70C3F2" wp14:editId="725D0706">
             <wp:extent cx="2530677" cy="1713017"/>
@@ -3606,7 +3689,7 @@
                     <pic:cNvPicPr/>
                   </pic:nvPicPr>
                   <pic:blipFill>
-                    <a:blip r:embed="rId16"/>
+                    <a:blip r:embed="rId17"/>
                     <a:stretch>
                       <a:fillRect/>
                     </a:stretch>
@@ -3656,7 +3739,13 @@
         <w:t>threshold</w:t>
       </w:r>
       <w:r>
-        <w:t xml:space="preserve"> settings.  The former can be based on a start and end code address (which can be the same), the code address of a routine, or the code address of a </w:t>
+        <w:t xml:space="preserve"> settings.  The </w:t>
+      </w:r>
+      <w:r>
+        <w:t>span</w:t>
+      </w:r>
+      <w:r>
+        <w:t xml:space="preserve"> can be based on a start and end code address (which can be the same), the code address of a routine, or the code address of a </w:t>
       </w:r>
       <w:r>
         <w:rPr>
@@ -3666,7 +3755,19 @@
         <w:t>JSR</w:t>
       </w:r>
       <w:r>
-        <w:t xml:space="preserve"> instruction.  The latter is optional, but typically 1/50</w:t>
+        <w:t xml:space="preserve"> instruction.  The </w:t>
+      </w:r>
+      <w:r>
+        <w:t xml:space="preserve">threshold is </w:t>
+      </w:r>
+      <w:r>
+        <w:t xml:space="preserve">optional but typically </w:t>
+      </w:r>
+      <w:r>
+        <w:t xml:space="preserve">set to </w:t>
+      </w:r>
+      <w:r>
+        <w:t>1/50</w:t>
       </w:r>
       <w:r>
         <w:rPr>
@@ -3675,7 +3776,7 @@
         <w:t>th</w:t>
       </w:r>
       <w:r>
-        <w:t xml:space="preserve"> second (or 40000 cycles).</w:t>
+        <w:t xml:space="preserve"> second (40000 cycles).</w:t>
       </w:r>
     </w:p>
     <w:p>
@@ -3708,7 +3809,7 @@
                     <pic:cNvPicPr/>
                   </pic:nvPicPr>
                   <pic:blipFill>
-                    <a:blip r:embed="rId17"/>
+                    <a:blip r:embed="rId18"/>
                     <a:stretch>
                       <a:fillRect/>
                     </a:stretch>
@@ -4062,15 +4163,13 @@
         <w:t>Export</w:t>
       </w:r>
       <w:r>
-        <w:t xml:space="preserve"> buttons copy all the data to the clipboard and </w:t>
-      </w:r>
-      <w:proofErr w:type="gramStart"/>
-      <w:r>
-        <w:t>exports</w:t>
-      </w:r>
-      <w:proofErr w:type="gramEnd"/>
-      <w:r>
-        <w:t xml:space="preserve"> the data to a CSV file.</w:t>
+        <w:t xml:space="preserve"> buttons copy all the data to the clipboard </w:t>
+      </w:r>
+      <w:r>
+        <w:t>or</w:t>
+      </w:r>
+      <w:r>
+        <w:t xml:space="preserve"> export the data to a CSV file.</w:t>
       </w:r>
     </w:p>
     <w:p>
@@ -4170,7 +4269,7 @@
                     <pic:cNvPicPr/>
                   </pic:nvPicPr>
                   <pic:blipFill>
-                    <a:blip r:embed="rId18"/>
+                    <a:blip r:embed="rId19"/>
                     <a:stretch>
                       <a:fillRect/>
                     </a:stretch>
@@ -4244,7 +4343,7 @@
                     <pic:cNvPicPr/>
                   </pic:nvPicPr>
                   <pic:blipFill>
-                    <a:blip r:embed="rId19"/>
+                    <a:blip r:embed="rId20"/>
                     <a:stretch>
                       <a:fillRect/>
                     </a:stretch>
@@ -4751,7 +4850,14 @@
           <w:b/>
           <w:bCs/>
         </w:rPr>
-        <w:t>Display frame reconstruction.</w:t>
+        <w:t>Display-frame</w:t>
+      </w:r>
+      <w:r>
+        <w:rPr>
+          <w:b/>
+          <w:bCs/>
+        </w:rPr>
+        <w:t xml:space="preserve"> reconstruction.</w:t>
       </w:r>
       <w:r>
         <w:rPr>
@@ -4826,7 +4932,16 @@
         <w:t>, to keep the memory footprint low</w:t>
       </w:r>
       <w:r>
-        <w:t>, though this never became a significant issue.</w:t>
+        <w:t xml:space="preserve">, </w:t>
+      </w:r>
+      <w:r>
+        <w:t xml:space="preserve"> though this never became </w:t>
+      </w:r>
+      <w:r>
+        <w:t>necessary</w:t>
+      </w:r>
+      <w:r>
+        <w:t>.</w:t>
       </w:r>
     </w:p>
     <w:p>
@@ -4919,7 +5034,21 @@
           <w:b/>
           <w:bCs/>
         </w:rPr>
-        <w:t>.Perf</w:t>
+        <w:t>.</w:t>
+      </w:r>
+      <w:r>
+        <w:rPr>
+          <w:b/>
+          <w:bCs/>
+        </w:rPr>
+        <w:t>p</w:t>
+      </w:r>
+      <w:r>
+        <w:rPr>
+          <w:b/>
+          <w:bCs/>
+        </w:rPr>
+        <w:t>erf</w:t>
       </w:r>
       <w:r>
         <w:t xml:space="preserve"> file loading and analysis, leveraging CPU, memory, and </w:t>
@@ -5167,7 +5296,13 @@
         <w:t xml:space="preserve"> the </w:t>
       </w:r>
       <w:r>
-        <w:t>last opened .Perf file</w:t>
+        <w:t>last opened .</w:t>
+      </w:r>
+      <w:r>
+        <w:t>p</w:t>
+      </w:r>
+      <w:r>
+        <w:t>erf file</w:t>
       </w:r>
       <w:r>
         <w:t>, if it exists.</w:t>
@@ -5196,7 +5331,13 @@
         <w:pStyle w:val="Heading3"/>
       </w:pPr>
       <w:r>
-        <w:t>.Perf file loading</w:t>
+        <w:t>.</w:t>
+      </w:r>
+      <w:r>
+        <w:t>p</w:t>
+      </w:r>
+      <w:r>
+        <w:t>erf file loading</w:t>
       </w:r>
     </w:p>
     <w:p>
@@ -5284,7 +5425,13 @@
         <w:t>s</w:t>
       </w:r>
       <w:r>
-        <w:t xml:space="preserve"> a loaded .Perf file.</w:t>
+        <w:t xml:space="preserve"> a loaded .</w:t>
+      </w:r>
+      <w:r>
+        <w:t>p</w:t>
+      </w:r>
+      <w:r>
+        <w:t>erf file.</w:t>
       </w:r>
       <w:r>
         <w:t xml:space="preserve"> </w:t>
@@ -5571,15 +5718,7 @@
         <w:t xml:space="preserve">All the events and instructions defined across </w:t>
       </w:r>
       <w:r>
-        <w:t xml:space="preserve">the </w:t>
-      </w:r>
-      <w:proofErr w:type="gramStart"/>
-      <w:r>
-        <w:t>read .perf</w:t>
-      </w:r>
-      <w:proofErr w:type="gramEnd"/>
-      <w:r>
-        <w:t xml:space="preserve"> file’s </w:t>
+        <w:t xml:space="preserve">the read .perf file’s </w:t>
       </w:r>
       <w:r>
         <w:t xml:space="preserve">execution chunks are put in a single </w:t>
@@ -5871,19 +6010,50 @@
         <w:t xml:space="preserve"> file is loaded</w:t>
       </w:r>
       <w:r>
-        <w:t xml:space="preserve">.  The form class asynchronously </w:t>
+        <w:t xml:space="preserve"> and it is only performed </w:t>
+      </w:r>
+      <w:proofErr w:type="spellStart"/>
+      <w:r>
+        <w:t>oncee</w:t>
+      </w:r>
+      <w:proofErr w:type="spellEnd"/>
+      <w:r>
+        <w:t>.</w:t>
+      </w:r>
+    </w:p>
+    <w:p>
+      <w:r>
+        <w:t xml:space="preserve">The form class asynchronously </w:t>
       </w:r>
       <w:r>
         <w:t xml:space="preserve">invokes </w:t>
       </w:r>
       <w:r>
+        <w:t xml:space="preserve">static </w:t>
+      </w:r>
+      <w:r>
         <w:t xml:space="preserve">CPU and </w:t>
       </w:r>
       <w:r>
         <w:t>frame</w:t>
       </w:r>
       <w:r>
-        <w:t xml:space="preserve"> analysis in parallel.</w:t>
+        <w:t xml:space="preserve"> analysis in parallel</w:t>
+      </w:r>
+      <w:r>
+        <w:t xml:space="preserve">, </w:t>
+      </w:r>
+      <w:r>
+        <w:t>unless frame analysis is dependent on CPU analysis</w:t>
+      </w:r>
+      <w:r>
+        <w:t xml:space="preserve"> </w:t>
+      </w:r>
+      <w:r>
+        <w:t xml:space="preserve">results, </w:t>
+      </w:r>
+      <w:r>
+        <w:t>in which case it is scheduled afterwards.</w:t>
       </w:r>
     </w:p>
     <w:p>
@@ -6266,6 +6436,7 @@
           <w:b/>
           <w:bCs/>
         </w:rPr>
+        <w:lastRenderedPageBreak/>
         <w:t>CallStack</w:t>
       </w:r>
       <w:proofErr w:type="spellEnd"/>
@@ -6288,7 +6459,6 @@
         </w:numPr>
       </w:pPr>
       <w:r>
-        <w:lastRenderedPageBreak/>
         <w:t>Call-type (None, JSR, IRQ, NMI, BRK, Tail-call, fall-through)</w:t>
       </w:r>
     </w:p>
@@ -6382,13 +6552,8 @@
       <w:r>
         <w:t xml:space="preserve"> is defined by the sequence of addresses up through the parent chain, ending at the root or a call stack that has an ISR </w:t>
       </w:r>
-      <w:proofErr w:type="gramStart"/>
-      <w:r>
-        <w:t>o NMI</w:t>
-      </w:r>
-      <w:proofErr w:type="gramEnd"/>
-      <w:r>
-        <w:t xml:space="preserve"> </w:t>
+      <w:r>
+        <w:t xml:space="preserve">o NMI </w:t>
       </w:r>
       <w:r>
         <w:t>call type.</w:t>
@@ -6443,15 +6608,7 @@
         </w:numPr>
       </w:pPr>
       <w:r>
-        <w:t xml:space="preserve">Every JSR destination address is </w:t>
-      </w:r>
-      <w:proofErr w:type="gramStart"/>
-      <w:r>
-        <w:t>by definition a</w:t>
-      </w:r>
-      <w:proofErr w:type="gramEnd"/>
-      <w:r>
-        <w:t xml:space="preserve"> routine.</w:t>
+        <w:t>Every JSR destination address is by definition a routine.</w:t>
       </w:r>
     </w:p>
     <w:p>
@@ -6463,15 +6620,7 @@
         </w:numPr>
       </w:pPr>
       <w:r>
-        <w:t xml:space="preserve">Every Interrupt destination address is </w:t>
-      </w:r>
-      <w:proofErr w:type="gramStart"/>
-      <w:r>
-        <w:t>by definition a</w:t>
-      </w:r>
-      <w:proofErr w:type="gramEnd"/>
-      <w:r>
-        <w:t xml:space="preserve"> routine. </w:t>
+        <w:t xml:space="preserve">Every Interrupt destination address is by definition a routine. </w:t>
       </w:r>
     </w:p>
     <w:p>
@@ -6561,6 +6710,21 @@
     <w:p>
       <w:pPr>
         <w:ind w:left="720"/>
+      </w:pPr>
+      <w:r>
+        <w:lastRenderedPageBreak/>
+        <w:t xml:space="preserve">Note that the BeebEm changes include code to maintain the call-stack, </w:t>
+      </w:r>
+      <w:r>
+        <w:t xml:space="preserve">including </w:t>
+      </w:r>
+      <w:r>
+        <w:t>routine addresses, and include this in the .perf file snapshot, as it’s not possible to reconstruct this information from the contents of the stack on the 6502.</w:t>
+      </w:r>
+    </w:p>
+    <w:p>
+      <w:pPr>
+        <w:ind w:left="720"/>
         <w:rPr>
           <w:rFonts w:ascii="Aptos" w:hAnsi="Aptos"/>
           <w:color w:val="000000"/>
@@ -6615,7 +6779,6 @@
           <w:rFonts w:ascii="Aptos" w:hAnsi="Aptos"/>
           <w:color w:val="000000"/>
         </w:rPr>
-        <w:lastRenderedPageBreak/>
         <w:t>And after the last instruction has been processed, the remaining stack frames are unwound to set the</w:t>
       </w:r>
       <w:r>
@@ -6630,23 +6793,21 @@
           <w:rFonts w:ascii="Aptos" w:hAnsi="Aptos"/>
           <w:color w:val="000000"/>
         </w:rPr>
-        <w:t xml:space="preserve"> </w:t>
-      </w:r>
-      <w:proofErr w:type="gramStart"/>
+        <w:t xml:space="preserve"> final end</w:t>
+      </w:r>
       <w:r>
         <w:rPr>
           <w:rFonts w:ascii="Aptos" w:hAnsi="Aptos"/>
           <w:color w:val="000000"/>
         </w:rPr>
-        <w:t>final end</w:t>
-      </w:r>
-      <w:proofErr w:type="gramEnd"/>
+        <w:t>-</w:t>
+      </w:r>
       <w:r>
         <w:rPr>
           <w:rFonts w:ascii="Aptos" w:hAnsi="Aptos"/>
           <w:color w:val="000000"/>
         </w:rPr>
-        <w:t xml:space="preserve"> cycle counts.</w:t>
+        <w:t>cycle counts.</w:t>
       </w:r>
     </w:p>
     <w:p>
@@ -6699,7 +6860,7 @@
           <w:rFonts w:ascii="Aptos" w:hAnsi="Aptos"/>
           <w:color w:val="000000"/>
         </w:rPr>
-        <w:t xml:space="preserve">And finally, the stack frame’s effective start and end instruction indexes are set. </w:t>
+        <w:t>And finally, the stack frame’s effective start and end instruction indexes are set.</w:t>
       </w:r>
     </w:p>
     <w:p>
@@ -6717,13 +6878,34 @@
         <w:contextualSpacing w:val="0"/>
       </w:pPr>
       <w:r>
-        <w:t>The goal of frame analysis is to produce two frame lists.  The display frame list, and the ‘game</w:t>
+        <w:t>The goal of frame analysis is to produce two frame lists.  The display</w:t>
       </w:r>
       <w:r>
         <w:t>-</w:t>
       </w:r>
       <w:r>
-        <w:t>loop’ frame list</w:t>
+        <w:t xml:space="preserve">frame list, and the </w:t>
+      </w:r>
+      <w:r>
+        <w:t>programmatic</w:t>
+      </w:r>
+      <w:r>
+        <w:t>-</w:t>
+      </w:r>
+      <w:r>
+        <w:t xml:space="preserve">frame list (e.g. </w:t>
+      </w:r>
+      <w:r>
+        <w:t xml:space="preserve">the </w:t>
+      </w:r>
+      <w:r>
+        <w:t>game-loop</w:t>
+      </w:r>
+      <w:r>
+        <w:t xml:space="preserve"> frame list</w:t>
+      </w:r>
+      <w:r>
+        <w:t>)</w:t>
       </w:r>
       <w:r>
         <w:t>.</w:t>
@@ -6736,16 +6918,31 @@
         <w:contextualSpacing w:val="0"/>
       </w:pPr>
       <w:r>
-        <w:t>The display frame list contains</w:t>
-      </w:r>
-      <w:r>
-        <w:t xml:space="preserve"> all the display frame</w:t>
+        <w:t xml:space="preserve">The </w:t>
+      </w:r>
+      <w:r>
+        <w:t>display-frame</w:t>
+      </w:r>
+      <w:r>
+        <w:t xml:space="preserve"> list contains</w:t>
+      </w:r>
+      <w:r>
+        <w:t xml:space="preserve"> all the </w:t>
+      </w:r>
+      <w:r>
+        <w:t>display-frame</w:t>
       </w:r>
       <w:r>
         <w:t xml:space="preserve"> snapshots</w:t>
       </w:r>
       <w:r>
-        <w:t>.  The frames that were displayed on the CRT display.  The frame</w:t>
+        <w:t>.  The frames that were displayed on the CRT display.  The</w:t>
+      </w:r>
+      <w:r>
+        <w:t xml:space="preserve">es </w:t>
+      </w:r>
+      <w:r>
+        <w:t>frame</w:t>
       </w:r>
       <w:r>
         <w:t xml:space="preserve"> snapshots</w:t>
@@ -6761,24 +6958,63 @@
         <w:contextualSpacing w:val="0"/>
       </w:pPr>
       <w:r>
-        <w:t>The ‘game-</w:t>
-      </w:r>
-      <w:proofErr w:type="gramStart"/>
-      <w:r>
-        <w:t>loop’</w:t>
-      </w:r>
-      <w:proofErr w:type="gramEnd"/>
-      <w:r>
-        <w:t xml:space="preserve"> frame list contains all the programmatic frames, capturing their durations, how they align with display frames, and how many screen memory writes occur before and after the screen memory is read during the display </w:t>
-      </w:r>
-      <w:r>
-        <w:t xml:space="preserve">memory </w:t>
-      </w:r>
-      <w:r>
-        <w:t>scan.  These frames are displayed in the Frame tab.</w:t>
-      </w:r>
-      <w:r>
-        <w:t xml:space="preserve">  What constitutes a ‘game-loop’ is defined using the Frames settings dialog.</w:t>
+        <w:t xml:space="preserve">The </w:t>
+      </w:r>
+      <w:r>
+        <w:t>programmatic</w:t>
+      </w:r>
+      <w:r>
+        <w:t xml:space="preserve"> frame list contains all the </w:t>
+      </w:r>
+      <w:r>
+        <w:t xml:space="preserve">programmatic </w:t>
+      </w:r>
+      <w:r>
+        <w:t>frames, capturing their durations, how they align with display</w:t>
+      </w:r>
+      <w:r>
+        <w:t>-</w:t>
+      </w:r>
+      <w:r>
+        <w:t xml:space="preserve">frames, and how many screen memory writes occur before and after the </w:t>
+      </w:r>
+      <w:r>
+        <w:t xml:space="preserve">display </w:t>
+      </w:r>
+      <w:r>
+        <w:t xml:space="preserve">screen memory </w:t>
+      </w:r>
+      <w:r>
+        <w:t xml:space="preserve">scan </w:t>
+      </w:r>
+      <w:r>
+        <w:t>read.  These frames are displayed in the Frame</w:t>
+      </w:r>
+      <w:r>
+        <w:t>s</w:t>
+      </w:r>
+      <w:r>
+        <w:t xml:space="preserve"> tab.</w:t>
+      </w:r>
+      <w:r>
+        <w:t xml:space="preserve">  What constitutes a </w:t>
+      </w:r>
+      <w:r>
+        <w:t xml:space="preserve">programmatic frame </w:t>
+      </w:r>
+      <w:r>
+        <w:t>is defined using the Frames settings dialog.</w:t>
+      </w:r>
+      <w:r>
+        <w:t xml:space="preserve">  These settings are typically set to match the game-loop.</w:t>
+      </w:r>
+    </w:p>
+    <w:p>
+      <w:pPr>
+        <w:pStyle w:val="Heading4"/>
+      </w:pPr>
+      <w:r>
+        <w:t>Display-frame generation</w:t>
       </w:r>
     </w:p>
     <w:p>
@@ -6788,7 +7024,13 @@
         <w:contextualSpacing w:val="0"/>
       </w:pPr>
       <w:r>
-        <w:t>The display frames are generated as follows:</w:t>
+        <w:t>The display</w:t>
+      </w:r>
+      <w:r>
+        <w:t>-</w:t>
+      </w:r>
+      <w:r>
+        <w:t>frames are generated as follows:</w:t>
       </w:r>
     </w:p>
     <w:p>
@@ -6814,10 +7056,10 @@
         <w:contextualSpacing w:val="0"/>
       </w:pPr>
       <w:r>
-        <w:t>D</w:t>
-      </w:r>
-      <w:r>
-        <w:t>isplay frame analysis uses these events to recreate frame snapshots</w:t>
+        <w:t>Display-frame</w:t>
+      </w:r>
+      <w:r>
+        <w:t xml:space="preserve"> analysis uses these events to recreate frame snapshots</w:t>
       </w:r>
       <w:r>
         <w:t xml:space="preserve">, which are </w:t>
@@ -6885,6 +7127,7 @@
         </w:numPr>
       </w:pPr>
       <w:r>
+        <w:lastRenderedPageBreak/>
         <w:t>Mixed non-teletext modes (mid-frame ULA changes)</w:t>
       </w:r>
     </w:p>
@@ -6938,7 +7181,13 @@
         </w:numPr>
       </w:pPr>
       <w:r>
-        <w:t>No support for shadow RAM reads</w:t>
+        <w:t xml:space="preserve">No support for </w:t>
+      </w:r>
+      <w:r>
+        <w:t xml:space="preserve">the </w:t>
+      </w:r>
+      <w:r>
+        <w:t>hardware cursor</w:t>
       </w:r>
     </w:p>
     <w:p>
@@ -6953,10 +7202,10 @@
         <w:t xml:space="preserve">No support for </w:t>
       </w:r>
       <w:r>
-        <w:t xml:space="preserve">the </w:t>
-      </w:r>
-      <w:r>
-        <w:t>hardware cursor</w:t>
+        <w:t xml:space="preserve">custom </w:t>
+      </w:r>
+      <w:r>
+        <w:t>teletext modes</w:t>
       </w:r>
     </w:p>
     <w:p>
@@ -6968,8 +7217,7 @@
         </w:numPr>
       </w:pPr>
       <w:r>
-        <w:lastRenderedPageBreak/>
-        <w:t>No support for non-interlaced teletext modes</w:t>
+        <w:t>No support for graphics tablets</w:t>
       </w:r>
     </w:p>
     <w:p>
@@ -6981,44 +7229,61 @@
         </w:numPr>
       </w:pPr>
       <w:r>
-        <w:t>No support for mixed teletext and non-teletext modes</w:t>
-      </w:r>
-    </w:p>
-    <w:p>
-      <w:pPr>
-        <w:pStyle w:val="ListParagraph"/>
-        <w:numPr>
-          <w:ilvl w:val="0"/>
-          <w:numId w:val="12"/>
-        </w:numPr>
-      </w:pPr>
-      <w:r>
-        <w:t>No support for graphics tablets</w:t>
-      </w:r>
-    </w:p>
-    <w:p>
-      <w:pPr>
-        <w:pStyle w:val="ListParagraph"/>
-        <w:numPr>
-          <w:ilvl w:val="0"/>
-          <w:numId w:val="12"/>
-        </w:numPr>
-      </w:pPr>
-      <w:r>
-        <w:t>No support for custom ULA palette</w:t>
-      </w:r>
-      <w:r>
-        <w:t xml:space="preserve"> hardware</w:t>
-      </w:r>
-    </w:p>
-    <w:p>
-      <w:r>
-        <w:t>The ‘game-loop’ frames are generated as part of display frame analysis.</w:t>
-      </w:r>
-    </w:p>
-    <w:p>
-      <w:r>
-        <w:t>Programmatic frames are generated by determining the next frame’s start instruction index, and when this is encountered, start the frame.  As part of this the frame’s end instruction index is calculated, based on the frame settings.  When the frame end instruction index is encountered, the frame is added to the list, and the process repeats.</w:t>
+        <w:t xml:space="preserve">No support for custom ULA </w:t>
+      </w:r>
+      <w:r>
+        <w:t>hardware</w:t>
+      </w:r>
+    </w:p>
+    <w:p>
+      <w:pPr>
+        <w:pStyle w:val="Heading4"/>
+      </w:pPr>
+      <w:r>
+        <w:t>Programmatic-frame generation</w:t>
+      </w:r>
+    </w:p>
+    <w:p>
+      <w:r>
+        <w:t xml:space="preserve">The </w:t>
+      </w:r>
+      <w:r>
+        <w:t>programmatic</w:t>
+      </w:r>
+      <w:r>
+        <w:t>-</w:t>
+      </w:r>
+      <w:r>
+        <w:t>frames are generated as part of display</w:t>
+      </w:r>
+      <w:r>
+        <w:t>-</w:t>
+      </w:r>
+      <w:r>
+        <w:t>frame analysis.</w:t>
+      </w:r>
+    </w:p>
+    <w:p>
+      <w:r>
+        <w:t>Programmatic</w:t>
+      </w:r>
+      <w:r>
+        <w:t>-</w:t>
+      </w:r>
+      <w:r>
+        <w:t xml:space="preserve">frames are generated by determining the next </w:t>
+      </w:r>
+      <w:r>
+        <w:t>programmatic-</w:t>
+      </w:r>
+      <w:r>
+        <w:t xml:space="preserve">frame’s start instruction index, and when this is encountered, start the frame.  As part of this the </w:t>
+      </w:r>
+      <w:r>
+        <w:t>programmatic-</w:t>
+      </w:r>
+      <w:r>
+        <w:t>frame’s end instruction index is calculated, based on the frame settings.  When the frame end instruction index is encountered, the frame is added to the list, and the process repeats.</w:t>
       </w:r>
     </w:p>
     <w:p>
@@ -7032,12 +7297,19 @@
         <w:t>memory ‘writes before display’ and ‘writes after display’ counts need to be calculated</w:t>
       </w:r>
       <w:r>
-        <w:t>.  Mirrored screen memory pages, storing the last display frame number, are used to determine if screen writes occur before or after display.</w:t>
-      </w:r>
-    </w:p>
-    <w:p>
-      <w:r>
-        <w:t>Note that frame analysis is delayed to dynamic analysis if the frame settings are dependent on routines and stack frames.</w:t>
+        <w:t xml:space="preserve"> during processing</w:t>
+      </w:r>
+      <w:r>
+        <w:t xml:space="preserve">.  Mirrored screen memory pages, storing the last </w:t>
+      </w:r>
+      <w:r>
+        <w:t>display-frame</w:t>
+      </w:r>
+      <w:r>
+        <w:t xml:space="preserve"> number, are used to </w:t>
+      </w:r>
+      <w:r>
+        <w:t>accomplish this.</w:t>
       </w:r>
     </w:p>
     <w:p>
@@ -7065,7 +7337,13 @@
         <w:t>is completed</w:t>
       </w:r>
       <w:r>
-        <w:t xml:space="preserve">, and whenever the analysis timespan is changed by the user.  </w:t>
+        <w:t>, and whenever the analysis time</w:t>
+      </w:r>
+      <w:r>
+        <w:t xml:space="preserve"> range</w:t>
+      </w:r>
+      <w:r>
+        <w:t xml:space="preserve"> is changed by the user.  </w:t>
       </w:r>
     </w:p>
     <w:p>
@@ -7147,6 +7425,7 @@
         <w:pStyle w:val="Heading3"/>
       </w:pPr>
       <w:r>
+        <w:lastRenderedPageBreak/>
         <w:t>Dynamic Memory analysis</w:t>
       </w:r>
     </w:p>
@@ -8386,19 +8665,9 @@
           <w:numId w:val="12"/>
         </w:numPr>
       </w:pPr>
-      <w:proofErr w:type="gramStart"/>
-      <w:r>
-        <w:t>bool</w:t>
-      </w:r>
-      <w:proofErr w:type="gramEnd"/>
-      <w:r>
-        <w:t xml:space="preserve"> </w:t>
-      </w:r>
-      <w:proofErr w:type="gramStart"/>
-      <w:r>
-        <w:t>Execute(</w:t>
-      </w:r>
-      <w:proofErr w:type="gramEnd"/>
+      <w:r>
+        <w:t>bool Execute(</w:t>
+      </w:r>
       <w:r>
         <w:rPr>
           <w:b/>
@@ -8422,17 +8691,12 @@
         <w:t xml:space="preserve">bool </w:t>
       </w:r>
       <w:proofErr w:type="spellStart"/>
-      <w:proofErr w:type="gramStart"/>
       <w:r>
         <w:t>CanUndo</w:t>
       </w:r>
       <w:proofErr w:type="spellEnd"/>
       <w:r>
-        <w:t>(</w:t>
-      </w:r>
-      <w:proofErr w:type="gramEnd"/>
-      <w:r>
-        <w:t>)</w:t>
+        <w:t>()</w:t>
       </w:r>
     </w:p>
     <w:p>
@@ -8447,17 +8711,12 @@
         <w:t xml:space="preserve">bool </w:t>
       </w:r>
       <w:proofErr w:type="spellStart"/>
-      <w:proofErr w:type="gramStart"/>
       <w:r>
         <w:t>CanRedo</w:t>
       </w:r>
       <w:proofErr w:type="spellEnd"/>
       <w:r>
-        <w:t>(</w:t>
-      </w:r>
-      <w:proofErr w:type="gramEnd"/>
-      <w:r>
-        <w:t>)</w:t>
+        <w:t>()</w:t>
       </w:r>
     </w:p>
     <w:p>
@@ -8469,15 +8728,7 @@
         </w:numPr>
       </w:pPr>
       <w:r>
-        <w:t xml:space="preserve">void </w:t>
-      </w:r>
-      <w:proofErr w:type="gramStart"/>
-      <w:r>
-        <w:t>Undo(</w:t>
-      </w:r>
-      <w:proofErr w:type="gramEnd"/>
-      <w:r>
-        <w:t>)</w:t>
+        <w:t>void Undo()</w:t>
       </w:r>
     </w:p>
     <w:p>
@@ -8489,15 +8740,7 @@
         </w:numPr>
       </w:pPr>
       <w:r>
-        <w:t xml:space="preserve">void </w:t>
-      </w:r>
-      <w:proofErr w:type="gramStart"/>
-      <w:r>
-        <w:t>Redo(</w:t>
-      </w:r>
-      <w:proofErr w:type="gramEnd"/>
-      <w:r>
-        <w:t>)</w:t>
+        <w:t>void Redo()</w:t>
       </w:r>
     </w:p>
     <w:p>
@@ -8508,21 +8751,8 @@
           <w:numId w:val="12"/>
         </w:numPr>
       </w:pPr>
-      <w:proofErr w:type="gramStart"/>
-      <w:r>
-        <w:t>void</w:t>
-      </w:r>
-      <w:proofErr w:type="gramEnd"/>
-      <w:r>
-        <w:t xml:space="preserve"> </w:t>
-      </w:r>
-      <w:proofErr w:type="gramStart"/>
-      <w:r>
-        <w:t>Clear(</w:t>
-      </w:r>
-      <w:proofErr w:type="gramEnd"/>
-      <w:r>
-        <w:t>)</w:t>
+      <w:r>
+        <w:t>void Clear()</w:t>
       </w:r>
     </w:p>
     <w:p>
@@ -8557,21 +8787,8 @@
           <w:numId w:val="12"/>
         </w:numPr>
       </w:pPr>
-      <w:proofErr w:type="gramStart"/>
-      <w:r>
-        <w:t>bool</w:t>
-      </w:r>
-      <w:proofErr w:type="gramEnd"/>
-      <w:r>
-        <w:t xml:space="preserve"> </w:t>
-      </w:r>
-      <w:proofErr w:type="gramStart"/>
-      <w:r>
-        <w:t>Execute(</w:t>
-      </w:r>
-      <w:proofErr w:type="gramEnd"/>
-      <w:r>
-        <w:t>)</w:t>
+      <w:r>
+        <w:t>bool Execute()</w:t>
       </w:r>
     </w:p>
     <w:p>
@@ -8583,15 +8800,7 @@
         </w:numPr>
       </w:pPr>
       <w:r>
-        <w:t xml:space="preserve">void </w:t>
-      </w:r>
-      <w:proofErr w:type="gramStart"/>
-      <w:r>
-        <w:t>Undo(</w:t>
-      </w:r>
-      <w:proofErr w:type="gramEnd"/>
-      <w:r>
-        <w:t>)</w:t>
+        <w:t>void Undo()</w:t>
       </w:r>
     </w:p>
     <w:p>
@@ -8603,15 +8812,7 @@
         </w:numPr>
       </w:pPr>
       <w:r>
-        <w:t xml:space="preserve">void </w:t>
-      </w:r>
-      <w:proofErr w:type="gramStart"/>
-      <w:r>
-        <w:t>Redo(</w:t>
-      </w:r>
-      <w:proofErr w:type="gramEnd"/>
-      <w:r>
-        <w:t>)</w:t>
+        <w:t>void Redo()</w:t>
       </w:r>
     </w:p>
     <w:p>
@@ -8666,21 +8867,12 @@
       <w:r>
         <w:t xml:space="preserve">The </w:t>
       </w:r>
-      <w:proofErr w:type="gramStart"/>
-      <w:r>
-        <w:rPr>
-          <w:b/>
-          <w:bCs/>
-        </w:rPr>
-        <w:t>Execute(</w:t>
-      </w:r>
-      <w:proofErr w:type="gramEnd"/>
-      <w:r>
-        <w:rPr>
-          <w:b/>
-          <w:bCs/>
-        </w:rPr>
-        <w:t>Operation</w:t>
+      <w:r>
+        <w:rPr>
+          <w:b/>
+          <w:bCs/>
+        </w:rPr>
+        <w:t>Execute(Operation</w:t>
       </w:r>
       <w:r>
         <w:t xml:space="preserve"> op)</w:t>
@@ -8843,15 +9035,7 @@
         <w:t>implemented as an operation.</w:t>
       </w:r>
       <w:r>
-        <w:t xml:space="preserve">  These </w:t>
-      </w:r>
-      <w:proofErr w:type="gramStart"/>
-      <w:r>
-        <w:t>are located in</w:t>
-      </w:r>
-      <w:proofErr w:type="gramEnd"/>
-      <w:r>
-        <w:t xml:space="preserve"> the </w:t>
+        <w:t xml:space="preserve">  These are located in the </w:t>
       </w:r>
       <w:r>
         <w:rPr>
@@ -8993,84 +9177,77 @@
         <w:t xml:space="preserve">The </w:t>
       </w:r>
       <w:r>
-        <w:t xml:space="preserve">project </w:t>
-      </w:r>
-      <w:proofErr w:type="gramStart"/>
-      <w:r>
-        <w:t>builds</w:t>
-      </w:r>
-      <w:proofErr w:type="gramEnd"/>
+        <w:t xml:space="preserve">project builds </w:t>
+      </w:r>
+      <w:r>
+        <w:t xml:space="preserve">to create </w:t>
+      </w:r>
+      <w:r>
+        <w:rPr>
+          <w:b/>
+          <w:bCs/>
+        </w:rPr>
+        <w:t>zlib.dll</w:t>
+      </w:r>
+      <w:r>
+        <w:t>.</w:t>
+      </w:r>
+      <w:r>
+        <w:t xml:space="preserve">  </w:t>
+      </w:r>
+    </w:p>
+    <w:p>
+      <w:r>
+        <w:t xml:space="preserve">The </w:t>
+      </w:r>
+      <w:proofErr w:type="spellStart"/>
+      <w:r>
+        <w:rPr>
+          <w:b/>
+          <w:bCs/>
+        </w:rPr>
+        <w:t>PerfReader</w:t>
+      </w:r>
+      <w:proofErr w:type="spellEnd"/>
+      <w:r>
+        <w:t xml:space="preserve"> class calls the </w:t>
+      </w:r>
+      <w:proofErr w:type="spellStart"/>
+      <w:r>
+        <w:t>zlib</w:t>
+      </w:r>
+      <w:proofErr w:type="spellEnd"/>
       <w:r>
         <w:t xml:space="preserve"> </w:t>
       </w:r>
-      <w:r>
-        <w:t xml:space="preserve">to create </w:t>
-      </w:r>
-      <w:r>
-        <w:rPr>
-          <w:b/>
-          <w:bCs/>
-        </w:rPr>
-        <w:t>zlib.dll</w:t>
+      <w:proofErr w:type="spellStart"/>
+      <w:r>
+        <w:t>apis</w:t>
+      </w:r>
+      <w:proofErr w:type="spellEnd"/>
+      <w:r>
+        <w:t xml:space="preserve"> using </w:t>
+      </w:r>
+      <w:r>
+        <w:t>P/Invoke</w:t>
       </w:r>
       <w:r>
         <w:t>.</w:t>
       </w:r>
-      <w:r>
-        <w:t xml:space="preserve">  </w:t>
-      </w:r>
-    </w:p>
-    <w:p>
-      <w:r>
-        <w:t xml:space="preserve">The </w:t>
-      </w:r>
-      <w:proofErr w:type="spellStart"/>
-      <w:r>
-        <w:rPr>
-          <w:b/>
-          <w:bCs/>
-        </w:rPr>
-        <w:t>PerfReader</w:t>
-      </w:r>
-      <w:proofErr w:type="spellEnd"/>
-      <w:r>
-        <w:t xml:space="preserve"> class calls the </w:t>
-      </w:r>
-      <w:proofErr w:type="spellStart"/>
-      <w:r>
-        <w:t>zlib</w:t>
-      </w:r>
-      <w:proofErr w:type="spellEnd"/>
-      <w:r>
-        <w:t xml:space="preserve"> </w:t>
-      </w:r>
-      <w:proofErr w:type="spellStart"/>
-      <w:r>
-        <w:t>apis</w:t>
-      </w:r>
-      <w:proofErr w:type="spellEnd"/>
-      <w:r>
-        <w:t xml:space="preserve"> using </w:t>
-      </w:r>
-      <w:r>
-        <w:t>P/Invoke</w:t>
-      </w:r>
-      <w:r>
+    </w:p>
+    <w:p>
+      <w:pPr>
+        <w:pStyle w:val="Heading1"/>
+      </w:pPr>
+      <w:r>
+        <w:lastRenderedPageBreak/>
         <w:t>.</w:t>
       </w:r>
-    </w:p>
-    <w:p>
-      <w:pPr>
-        <w:pStyle w:val="Heading1"/>
-      </w:pPr>
-      <w:proofErr w:type="gramStart"/>
-      <w:r>
-        <w:lastRenderedPageBreak/>
-        <w:t>.Perf</w:t>
-      </w:r>
-      <w:proofErr w:type="gramEnd"/>
-      <w:r>
-        <w:t xml:space="preserve"> </w:t>
+      <w:r>
+        <w:t>p</w:t>
+      </w:r>
+      <w:r>
+        <w:t xml:space="preserve">erf </w:t>
       </w:r>
       <w:r>
         <w:t>F</w:t>
@@ -9185,7 +9362,13 @@
         </w:numPr>
       </w:pPr>
       <w:r>
-        <w:t>Limiting the size of a .Perf file.</w:t>
+        <w:t>Limiting the size of a .</w:t>
+      </w:r>
+      <w:r>
+        <w:t>p</w:t>
+      </w:r>
+      <w:r>
+        <w:t>erf file.</w:t>
       </w:r>
     </w:p>
     <w:p>
@@ -10154,15 +10337,7 @@
     </w:p>
     <w:p>
       <w:r>
-        <w:t xml:space="preserve">The header chunk is the first </w:t>
-      </w:r>
-      <w:proofErr w:type="gramStart"/>
-      <w:r>
-        <w:t>chunk</w:t>
-      </w:r>
-      <w:proofErr w:type="gramEnd"/>
-      <w:r>
-        <w:t xml:space="preserve"> and it contains the file’s version, BBC model, and the total execution count.</w:t>
+        <w:t>The header chunk is the first chunk and it contains the file’s version, BBC model, and the total execution count.</w:t>
       </w:r>
     </w:p>
     <w:p>
@@ -14068,23 +14243,7 @@
                 <w:i/>
                 <w:iCs/>
               </w:rPr>
-              <w:t>&amp;80, &amp;</w:t>
-            </w:r>
-            <w:proofErr w:type="gramStart"/>
-            <w:r>
-              <w:rPr>
-                <w:i/>
-                <w:iCs/>
-              </w:rPr>
-              <w:t>03..</w:t>
-            </w:r>
-            <w:proofErr w:type="gramEnd"/>
-            <w:r>
-              <w:rPr>
-                <w:i/>
-                <w:iCs/>
-              </w:rPr>
-              <w:t>&amp;7F</w:t>
+              <w:t>&amp;80, &amp;03..&amp;7F</w:t>
             </w:r>
           </w:p>
         </w:tc>
@@ -14143,15 +14302,7 @@
         <w:t xml:space="preserve">The </w:t>
       </w:r>
       <w:r>
-        <w:t xml:space="preserve">maskable (IRQ) and non-maskable (NMI) interrupt events signify that an </w:t>
-      </w:r>
-      <w:proofErr w:type="gramStart"/>
-      <w:r>
-        <w:t>interrupt</w:t>
-      </w:r>
-      <w:proofErr w:type="gramEnd"/>
-      <w:r>
-        <w:t xml:space="preserve"> has occurred.  A begin display event signifies that the screen memory read, used to display screen memory, begins.  The screen memory is read every 50</w:t>
+        <w:t>maskable (IRQ) and non-maskable (NMI) interrupt events signify that an interrupt has occurred.  A begin display event signifies that the screen memory read, used to display screen memory, begins.  The screen memory is read every 50</w:t>
       </w:r>
       <w:r>
         <w:rPr>
@@ -14302,16 +14453,11 @@
         <w:t>display_field</w:t>
       </w:r>
       <w:proofErr w:type="spellEnd"/>
-      <w:proofErr w:type="gramStart"/>
       <w:r>
         <w:t>&gt;</w:t>
       </w:r>
       <w:r>
-        <w:t xml:space="preserve">  (</w:t>
-      </w:r>
-      <w:proofErr w:type="gramEnd"/>
-      <w:r>
-        <w:t>1 byte).  0 for even field, 1 for odd field (when interlaced sync is enabled).</w:t>
+        <w:t xml:space="preserve">  (1 byte).  0 for even field, 1 for odd field (when interlaced sync is enabled).</w:t>
       </w:r>
     </w:p>
     <w:p>
@@ -14685,15 +14831,7 @@
               <w:jc w:val="center"/>
             </w:pPr>
             <w:r>
-              <w:t>&amp;</w:t>
-            </w:r>
-            <w:proofErr w:type="gramStart"/>
-            <w:r>
-              <w:t>81..</w:t>
-            </w:r>
-            <w:proofErr w:type="gramEnd"/>
-            <w:r>
-              <w:t>&amp;FF</w:t>
+              <w:t>&amp;81..&amp;FF</w:t>
             </w:r>
           </w:p>
         </w:tc>
@@ -14736,15 +14874,7 @@
           </w:tcPr>
           <w:p>
             <w:r>
-              <w:t>Absolute address: &amp;</w:t>
-            </w:r>
-            <w:proofErr w:type="gramStart"/>
-            <w:r>
-              <w:t>0000..</w:t>
-            </w:r>
-            <w:proofErr w:type="gramEnd"/>
-            <w:r>
-              <w:t>&amp;7FFF</w:t>
+              <w:t>Absolute address: &amp;0000..&amp;7FFF</w:t>
             </w:r>
           </w:p>
         </w:tc>
@@ -14756,13 +14886,8 @@
             <w:pPr>
               <w:jc w:val="center"/>
             </w:pPr>
-            <w:proofErr w:type="gramStart"/>
-            <w:r>
-              <w:t>0..&amp;</w:t>
-            </w:r>
-            <w:proofErr w:type="gramEnd"/>
-            <w:r>
-              <w:t>7F</w:t>
+            <w:r>
+              <w:t>0..&amp;7F</w:t>
             </w:r>
           </w:p>
         </w:tc>
@@ -14774,13 +14899,8 @@
             <w:pPr>
               <w:jc w:val="center"/>
             </w:pPr>
-            <w:proofErr w:type="gramStart"/>
-            <w:r>
-              <w:t>0..&amp;</w:t>
-            </w:r>
-            <w:proofErr w:type="gramEnd"/>
-            <w:r>
-              <w:t>FF</w:t>
+            <w:r>
+              <w:t>0..&amp;FF</w:t>
             </w:r>
           </w:p>
         </w:tc>
@@ -14809,15 +14929,7 @@
           </w:tcPr>
           <w:p>
             <w:r>
-              <w:t>Absolute address: &amp;</w:t>
-            </w:r>
-            <w:proofErr w:type="gramStart"/>
-            <w:r>
-              <w:t>8000..</w:t>
-            </w:r>
-            <w:proofErr w:type="gramEnd"/>
-            <w:r>
-              <w:t>&amp;FFFF</w:t>
+              <w:t>Absolute address: &amp;8000..&amp;FFFF</w:t>
             </w:r>
           </w:p>
         </w:tc>
@@ -14843,15 +14955,7 @@
               <w:jc w:val="center"/>
             </w:pPr>
             <w:r>
-              <w:t>&amp;</w:t>
-            </w:r>
-            <w:proofErr w:type="gramStart"/>
-            <w:r>
-              <w:t>80..</w:t>
-            </w:r>
-            <w:proofErr w:type="gramEnd"/>
-            <w:r>
-              <w:t>&amp;FF</w:t>
+              <w:t>&amp;80..&amp;FF</w:t>
             </w:r>
           </w:p>
         </w:tc>
@@ -14863,13 +14967,8 @@
             <w:pPr>
               <w:jc w:val="center"/>
             </w:pPr>
-            <w:proofErr w:type="gramStart"/>
-            <w:r>
-              <w:t>0..&amp;</w:t>
-            </w:r>
-            <w:proofErr w:type="gramEnd"/>
-            <w:r>
-              <w:t>FF</w:t>
+            <w:r>
+              <w:t>0..&amp;FF</w:t>
             </w:r>
           </w:p>
         </w:tc>
@@ -14938,21 +15037,12 @@
                 <w:iCs/>
               </w:rPr>
             </w:pPr>
-            <w:proofErr w:type="gramStart"/>
             <w:r>
               <w:rPr>
                 <w:i/>
                 <w:iCs/>
               </w:rPr>
-              <w:t>0..&amp;</w:t>
-            </w:r>
-            <w:proofErr w:type="gramEnd"/>
-            <w:r>
-              <w:rPr>
-                <w:i/>
-                <w:iCs/>
-              </w:rPr>
-              <w:t>7F</w:t>
+              <w:t>0..&amp;7F</w:t>
             </w:r>
           </w:p>
         </w:tc>
@@ -15350,15 +15440,7 @@
         <w:ind w:left="720"/>
       </w:pPr>
       <w:r>
-        <w:t xml:space="preserve">&lt;operand&gt; (0, 1, or 2 bytes) The instruction’s operand value.  The number of bytes is defined by the instruction’s </w:t>
-      </w:r>
-      <w:proofErr w:type="gramStart"/>
-      <w:r>
-        <w:t>opcode</w:t>
-      </w:r>
-      <w:proofErr w:type="gramEnd"/>
-      <w:r>
-        <w:t>, per the 6502 &amp; 65C02 instruction set.</w:t>
+        <w:t>&lt;operand&gt; (0, 1, or 2 bytes) The instruction’s operand value.  The number of bytes is defined by the instruction’s opcode, per the 6502 &amp; 65C02 instruction set.</w:t>
       </w:r>
     </w:p>
     <w:p>
@@ -15381,34 +15463,55 @@
           <w:b/>
           <w:bCs/>
         </w:rPr>
-        <w:t xml:space="preserve">bits </w:t>
-      </w:r>
-      <w:proofErr w:type="gramStart"/>
-      <w:r>
-        <w:rPr>
-          <w:b/>
-          <w:bCs/>
-        </w:rPr>
-        <w:t>0..</w:t>
-      </w:r>
-      <w:proofErr w:type="gramEnd"/>
-      <w:r>
-        <w:rPr>
-          <w:b/>
-          <w:bCs/>
-        </w:rPr>
-        <w:t>2</w:t>
-      </w:r>
-      <w:r>
-        <w:t xml:space="preserve"> of next byte) Contains the number of cycles the instruction took to execute.  The value in the range: </w:t>
-      </w:r>
-      <w:proofErr w:type="gramStart"/>
-      <w:r>
-        <w:t>2..</w:t>
-      </w:r>
-      <w:proofErr w:type="gramEnd"/>
-      <w:r>
-        <w:t>7.</w:t>
+        <w:t>bits 0..2</w:t>
+      </w:r>
+      <w:r>
+        <w:t xml:space="preserve"> of next byte) Contains the number</w:t>
+      </w:r>
+      <w:r>
+        <w:t xml:space="preserve"> </w:t>
+      </w:r>
+      <w:r>
+        <w:t>of cycles</w:t>
+      </w:r>
+      <w:r>
+        <w:t>, minus two,</w:t>
+      </w:r>
+      <w:r>
+        <w:t xml:space="preserve"> </w:t>
+      </w:r>
+      <w:r>
+        <w:t xml:space="preserve">that </w:t>
+      </w:r>
+      <w:r>
+        <w:t xml:space="preserve">the instruction took to execute.  The </w:t>
+      </w:r>
+      <w:r>
+        <w:t xml:space="preserve">decoded </w:t>
+      </w:r>
+      <w:r>
+        <w:t xml:space="preserve">value </w:t>
+      </w:r>
+      <w:r>
+        <w:t xml:space="preserve">is </w:t>
+      </w:r>
+      <w:r>
+        <w:t>in the range: 2..</w:t>
+      </w:r>
+      <w:r>
+        <w:t>9</w:t>
+      </w:r>
+      <w:r>
+        <w:t>.</w:t>
+      </w:r>
+      <w:r>
+        <w:t xml:space="preserve">  </w:t>
+      </w:r>
+      <w:r>
+        <w:t>S</w:t>
+      </w:r>
+      <w:r>
+        <w:t>ome undocumented 6502 instructions can have a cycle count greater than 7.</w:t>
       </w:r>
     </w:p>
     <w:p>
@@ -15552,26 +15655,14 @@
           <w:b/>
           <w:bCs/>
         </w:rPr>
-        <w:t xml:space="preserve">bits </w:t>
-      </w:r>
-      <w:proofErr w:type="gramStart"/>
-      <w:r>
-        <w:rPr>
-          <w:b/>
-          <w:bCs/>
-        </w:rPr>
-        <w:t>3..</w:t>
-      </w:r>
-      <w:proofErr w:type="gramEnd"/>
-      <w:r>
-        <w:rPr>
-          <w:b/>
-          <w:bCs/>
-        </w:rPr>
-        <w:t>7</w:t>
-      </w:r>
-      <w:r>
-        <w:t xml:space="preserve"> of next byte).  Bit flags indicating which register value(s) the instruction modified.  The table below lists which bits are set for each corresponding modified register.  The bits are only set if the executed instruction changed the contents/value of the corresponding register.</w:t>
+        <w:t>bits 3..7</w:t>
+      </w:r>
+      <w:r>
+        <w:t xml:space="preserve"> of next byte).  Bit flags indicating which register value(s) the instruction modified.  The table below lists which bits are </w:t>
+      </w:r>
+      <w:r>
+        <w:lastRenderedPageBreak/>
+        <w:t>set for each corresponding modified register.  The bits are only set if the executed instruction changed the contents/value of the corresponding register.</w:t>
       </w:r>
     </w:p>
     <w:tbl>
@@ -15604,7 +15695,6 @@
                 <w:b/>
                 <w:bCs/>
               </w:rPr>
-              <w:lastRenderedPageBreak/>
               <w:t>Bit</w:t>
             </w:r>
           </w:p>
@@ -16172,6 +16262,7 @@
         <w:ind w:left="1440"/>
       </w:pPr>
       <w:r>
+        <w:lastRenderedPageBreak/>
         <w:t>(Absolute, X) - 65C02 extension</w:t>
       </w:r>
     </w:p>
@@ -16193,7 +16284,6 @@
         <w:ind w:left="720"/>
       </w:pPr>
       <w:r>
-        <w:lastRenderedPageBreak/>
         <w:t>Contains the resolved address, or &amp;FFFF for indirect addresses that could not be resolved.</w:t>
       </w:r>
     </w:p>
@@ -16258,15 +16348,7 @@
         <w:ind w:left="720"/>
       </w:pPr>
       <w:r>
-        <w:t xml:space="preserve">The value is not populated </w:t>
-      </w:r>
-      <w:proofErr w:type="gramStart"/>
-      <w:r>
-        <w:t>for</w:t>
-      </w:r>
-      <w:proofErr w:type="gramEnd"/>
-      <w:r>
-        <w:t xml:space="preserve"> </w:t>
+        <w:t xml:space="preserve">The value is not populated for </w:t>
       </w:r>
       <w:r>
         <w:rPr>
@@ -16567,11 +16649,24 @@
     </w:p>
     <w:p>
       <w:r>
-        <w:t>Any errors that occur during recording are reported to the user when the session is ended.  Errors include file IO errors, compression errors, and buffer contention.  In practice, the latter should not happen unless I/O error occurs.  Only the first error is reported.</w:t>
-      </w:r>
-    </w:p>
-    <w:p>
-      <w:r>
+        <w:t xml:space="preserve">Any errors that occur during recording are reported to the user when the </w:t>
+      </w:r>
+      <w:r>
+        <w:t xml:space="preserve">performance </w:t>
+      </w:r>
+      <w:r>
+        <w:t xml:space="preserve">session is ended.  Errors include file IO errors, compression errors, and buffer contention.  In practice, the latter should not happen unless </w:t>
+      </w:r>
+      <w:r>
+        <w:t xml:space="preserve">an </w:t>
+      </w:r>
+      <w:r>
+        <w:t>I/O error occurs.  Only the first error is reported.</w:t>
+      </w:r>
+    </w:p>
+    <w:p>
+      <w:r>
+        <w:lastRenderedPageBreak/>
         <w:t>Changes to BeebEm are kept to a minimum.  Here is a list of the changes made to the existing source files:</w:t>
       </w:r>
     </w:p>
@@ -16615,32 +16710,22 @@
         </w:numPr>
       </w:pPr>
       <w:r>
-        <w:lastRenderedPageBreak/>
         <w:t xml:space="preserve">Added calls to </w:t>
       </w:r>
       <w:proofErr w:type="spellStart"/>
       <w:r>
-        <w:t>PerfWriter_</w:t>
-      </w:r>
-      <w:proofErr w:type="gramStart"/>
-      <w:r>
-        <w:t>WriteInstruction</w:t>
+        <w:t>PerfWriter_WriteInstruction</w:t>
       </w:r>
       <w:proofErr w:type="spellEnd"/>
       <w:r>
         <w:t>(</w:t>
       </w:r>
-      <w:proofErr w:type="gramEnd"/>
       <w:r>
         <w:t xml:space="preserve">…) and </w:t>
       </w:r>
       <w:proofErr w:type="spellStart"/>
       <w:r>
-        <w:t>PerfWriter_</w:t>
-      </w:r>
-      <w:proofErr w:type="gramStart"/>
-      <w:r>
-        <w:t>WriteI</w:t>
+        <w:t>PerfWriter_WriteI</w:t>
       </w:r>
       <w:r>
         <w:t>nterrupt</w:t>
@@ -16649,7 +16734,6 @@
       <w:r>
         <w:t>(</w:t>
       </w:r>
-      <w:proofErr w:type="gramEnd"/>
       <w:r>
         <w:t xml:space="preserve">…) to log instructions and interrupts.  These wrapper functions only invoke the </w:t>
       </w:r>
@@ -16699,17 +16783,12 @@
       </w:r>
       <w:proofErr w:type="spellStart"/>
       <w:r>
-        <w:t>PerfWriter_</w:t>
-      </w:r>
-      <w:proofErr w:type="gramStart"/>
-      <w:r>
-        <w:t>WriteInstruction</w:t>
+        <w:t>PerfWriter_WriteInstruction</w:t>
       </w:r>
       <w:proofErr w:type="spellEnd"/>
       <w:r>
         <w:t>(</w:t>
       </w:r>
-      <w:proofErr w:type="gramEnd"/>
       <w:r>
         <w:t>…).  Added helpers (</w:t>
       </w:r>
@@ -16873,17 +16952,12 @@
         <w:t xml:space="preserve">Added helper to get the emulator’s registers: </w:t>
       </w:r>
       <w:proofErr w:type="spellStart"/>
-      <w:proofErr w:type="gramStart"/>
       <w:r>
         <w:t>GetRegisters</w:t>
       </w:r>
       <w:proofErr w:type="spellEnd"/>
       <w:r>
-        <w:t>(</w:t>
-      </w:r>
-      <w:proofErr w:type="gramEnd"/>
-      <w:r>
-        <w:t>…).  This is called during snapshot chunk serialization.</w:t>
+        <w:t>(…).  This is called during snapshot chunk serialization.</w:t>
       </w:r>
     </w:p>
     <w:p>
@@ -16967,15 +17041,7 @@
         </w:numPr>
       </w:pPr>
       <w:r>
-        <w:t xml:space="preserve">Defined new </w:t>
-      </w:r>
-      <w:proofErr w:type="gramStart"/>
-      <w:r>
-        <w:t>struct</w:t>
-      </w:r>
-      <w:proofErr w:type="gramEnd"/>
-      <w:r>
-        <w:t xml:space="preserve"> (</w:t>
+        <w:t>Defined new struct (</w:t>
       </w:r>
       <w:proofErr w:type="spellStart"/>
       <w:r>
@@ -17020,11 +17086,9 @@
           <w:bCs/>
         </w:rPr>
       </w:pPr>
-      <w:proofErr w:type="gramStart"/>
       <w:r>
         <w:t>Externed</w:t>
       </w:r>
-      <w:proofErr w:type="gramEnd"/>
       <w:r>
         <w:rPr>
           <w:b/>
@@ -17075,16 +17139,11 @@
         </w:rPr>
         <w:t xml:space="preserve"> </w:t>
       </w:r>
-      <w:proofErr w:type="gramStart"/>
       <w:r>
         <w:t>variables</w:t>
       </w:r>
       <w:r>
-        <w:t xml:space="preserve"> so these</w:t>
-      </w:r>
-      <w:proofErr w:type="gramEnd"/>
-      <w:r>
-        <w:t xml:space="preserve"> are accessible during snapshot serialization.</w:t>
+        <w:t xml:space="preserve"> so these are accessible during snapshot serialization.</w:t>
       </w:r>
     </w:p>
     <w:p>
@@ -17158,19 +17217,11 @@
       </w:r>
       <w:proofErr w:type="spellStart"/>
       <w:r>
-        <w:t>PerfWriter_</w:t>
-      </w:r>
-      <w:proofErr w:type="gramStart"/>
-      <w:r>
-        <w:t>WriteBeginDisplayEvent</w:t>
-      </w:r>
-      <w:proofErr w:type="spellEnd"/>
-      <w:r>
-        <w:t>(</w:t>
-      </w:r>
-      <w:proofErr w:type="gramEnd"/>
-      <w:r>
-        <w:t xml:space="preserve">…) to log the start of screen display. </w:t>
+        <w:t>PerfWriter_WriteBeginDisplayEvent</w:t>
+      </w:r>
+      <w:proofErr w:type="spellEnd"/>
+      <w:r>
+        <w:t xml:space="preserve">(…) to log the start of screen display. </w:t>
       </w:r>
       <w:r>
         <w:t xml:space="preserve"> </w:t>
@@ -17305,6 +17356,7 @@
         </w:rPr>
       </w:pPr>
       <w:r>
+        <w:lastRenderedPageBreak/>
         <w:t xml:space="preserve">Added performance capture functionality in the UX.  </w:t>
       </w:r>
       <w:r>
@@ -17318,75 +17370,51 @@
         <w:t xml:space="preserve"> </w:t>
       </w:r>
       <w:proofErr w:type="spellStart"/>
-      <w:proofErr w:type="gramStart"/>
       <w:r>
         <w:t>UpdatePerfCaptureMenu</w:t>
       </w:r>
       <w:proofErr w:type="spellEnd"/>
       <w:r>
-        <w:t>(</w:t>
-      </w:r>
-      <w:proofErr w:type="gramEnd"/>
-      <w:r>
-        <w:t>)</w:t>
+        <w:t>()</w:t>
       </w:r>
       <w:r>
         <w:t xml:space="preserve">, </w:t>
       </w:r>
       <w:proofErr w:type="spellStart"/>
-      <w:proofErr w:type="gramStart"/>
       <w:r>
         <w:t>CapturePerf</w:t>
       </w:r>
       <w:proofErr w:type="spellEnd"/>
       <w:r>
-        <w:t>(</w:t>
-      </w:r>
-      <w:proofErr w:type="gramEnd"/>
-      <w:r>
-        <w:t>)</w:t>
+        <w:t>()</w:t>
       </w:r>
       <w:r>
         <w:t xml:space="preserve">, </w:t>
       </w:r>
       <w:proofErr w:type="spellStart"/>
-      <w:proofErr w:type="gramStart"/>
       <w:r>
         <w:t>EndPerfCapture</w:t>
       </w:r>
       <w:proofErr w:type="spellEnd"/>
       <w:r>
-        <w:t>(</w:t>
-      </w:r>
-      <w:proofErr w:type="gramEnd"/>
-      <w:r>
-        <w:t>)</w:t>
+        <w:t>()</w:t>
       </w:r>
       <w:r>
         <w:t xml:space="preserve">, and </w:t>
       </w:r>
       <w:proofErr w:type="spellStart"/>
-      <w:proofErr w:type="gramStart"/>
       <w:r>
         <w:t>IsCapturingPerf</w:t>
       </w:r>
       <w:proofErr w:type="spellEnd"/>
       <w:r>
-        <w:t>(</w:t>
-      </w:r>
-      <w:proofErr w:type="gramEnd"/>
-      <w:r>
-        <w:t>)</w:t>
+        <w:t>()</w:t>
       </w:r>
       <w:r>
         <w:t xml:space="preserve"> functions</w:t>
       </w:r>
       <w:r>
-        <w:t xml:space="preserve"> (modelled from the existing video capture functionality) and invoked these in a similar way to how video </w:t>
-      </w:r>
-      <w:r>
-        <w:lastRenderedPageBreak/>
-        <w:t xml:space="preserve">capture is implemented.  The only notable differences are that </w:t>
+        <w:t xml:space="preserve"> (modelled from the existing video capture functionality) and invoked these in a similar way to how video capture is implemented.  The only notable differences are that </w:t>
       </w:r>
       <w:proofErr w:type="spellStart"/>
       <w:r>
@@ -17480,15 +17508,7 @@
         <w:t xml:space="preserve">Added a </w:t>
       </w:r>
       <w:r>
-        <w:t xml:space="preserve">performance </w:t>
-      </w:r>
-      <w:proofErr w:type="gramStart"/>
-      <w:r>
-        <w:t>capture</w:t>
-      </w:r>
-      <w:proofErr w:type="gramEnd"/>
-      <w:r>
-        <w:t xml:space="preserve"> file path preference, used to remember the location of the last written </w:t>
+        <w:t xml:space="preserve">performance capture file path preference, used to remember the location of the last written </w:t>
       </w:r>
       <w:r>
         <w:rPr>
@@ -17629,7 +17649,6 @@
         <w:t>*</w:t>
       </w:r>
       <w:proofErr w:type="spellStart"/>
-      <w:proofErr w:type="gramStart"/>
       <w:r>
         <w:rPr>
           <w:b/>
@@ -17666,7 +17685,6 @@
         <w:t>.filters</w:t>
       </w:r>
       <w:proofErr w:type="spellEnd"/>
-      <w:proofErr w:type="gramEnd"/>
     </w:p>
     <w:p>
       <w:pPr>
@@ -17786,6 +17804,69 @@
     </w:p>
     <w:p>
       <w:pPr>
+        <w:pStyle w:val="ListParagraph"/>
+        <w:numPr>
+          <w:ilvl w:val="0"/>
+          <w:numId w:val="1"/>
+        </w:numPr>
+      </w:pPr>
+      <w:r>
+        <w:t xml:space="preserve">Added DirectX SDK </w:t>
+      </w:r>
+      <w:r>
+        <w:t xml:space="preserve">to </w:t>
+      </w:r>
+      <w:r>
+        <w:t>Additional</w:t>
+      </w:r>
+      <w:r>
+        <w:t xml:space="preserve"> </w:t>
+      </w:r>
+      <w:r>
+        <w:t>Include</w:t>
+      </w:r>
+      <w:r>
+        <w:t xml:space="preserve"> </w:t>
+      </w:r>
+      <w:r>
+        <w:t>Directories</w:t>
+      </w:r>
+      <w:r>
+        <w:t xml:space="preserve"> (as this is not included in the v142 Platform Toolset)</w:t>
+      </w:r>
+    </w:p>
+    <w:p>
+      <w:pPr>
+        <w:pStyle w:val="ListParagraph"/>
+        <w:numPr>
+          <w:ilvl w:val="0"/>
+          <w:numId w:val="1"/>
+        </w:numPr>
+      </w:pPr>
+      <w:r>
+        <w:t xml:space="preserve">Added ATL to Resource Compiler’s </w:t>
+      </w:r>
+      <w:r>
+        <w:t>Additional</w:t>
+      </w:r>
+      <w:r>
+        <w:t xml:space="preserve"> </w:t>
+      </w:r>
+      <w:r>
+        <w:t>Include</w:t>
+      </w:r>
+      <w:r>
+        <w:t xml:space="preserve"> </w:t>
+      </w:r>
+      <w:r>
+        <w:t>Directories</w:t>
+      </w:r>
+      <w:r>
+        <w:t xml:space="preserve"> (as this is not included in the v142 Platform Toolset)</w:t>
+      </w:r>
+    </w:p>
+    <w:p>
+      <w:pPr>
         <w:pStyle w:val="Heading2"/>
       </w:pPr>
       <w:r>
@@ -17950,19 +18031,11 @@
         </w:rPr>
         <w:t xml:space="preserve">    </w:t>
       </w:r>
-      <w:proofErr w:type="gramStart"/>
       <w:r>
         <w:rPr>
           <w:color w:val="FFFFFF" w:themeColor="background1"/>
         </w:rPr>
-        <w:t>git</w:t>
-      </w:r>
-      <w:proofErr w:type="gramEnd"/>
-      <w:r>
-        <w:rPr>
-          <w:color w:val="FFFFFF" w:themeColor="background1"/>
-        </w:rPr>
-        <w:t xml:space="preserve"> </w:t>
+        <w:t xml:space="preserve">git </w:t>
       </w:r>
       <w:r>
         <w:rPr>
@@ -17996,12 +18069,12 @@
     <w:p/>
     <w:p/>
     <w:sectPr>
-      <w:headerReference w:type="even" r:id="rId20"/>
-      <w:headerReference w:type="default" r:id="rId21"/>
-      <w:footerReference w:type="even" r:id="rId22"/>
-      <w:footerReference w:type="default" r:id="rId23"/>
-      <w:headerReference w:type="first" r:id="rId24"/>
-      <w:footerReference w:type="first" r:id="rId25"/>
+      <w:headerReference w:type="even" r:id="rId21"/>
+      <w:headerReference w:type="default" r:id="rId22"/>
+      <w:footerReference w:type="even" r:id="rId23"/>
+      <w:footerReference w:type="default" r:id="rId24"/>
+      <w:headerReference w:type="first" r:id="rId25"/>
+      <w:footerReference w:type="first" r:id="rId26"/>
       <w:pgSz w:w="12240" w:h="15840"/>
       <w:pgMar w:top="1440" w:right="1440" w:bottom="1440" w:left="1440" w:header="720" w:footer="720" w:gutter="0"/>
       <w:cols w:space="720"/>
@@ -20244,6 +20317,7 @@
   <w:style w:type="character" w:default="1" w:styleId="DefaultParagraphFont">
     <w:name w:val="Default Paragraph Font"/>
     <w:uiPriority w:val="1"/>
+    <w:semiHidden/>
     <w:unhideWhenUsed/>
   </w:style>
   <w:style w:type="table" w:default="1" w:styleId="TableNormal">
@@ -20869,6 +20943,36 @@
       <w:u w:val="single"/>
     </w:rPr>
   </w:style>
+  <w:style w:type="paragraph" w:styleId="HTMLPreformatted">
+    <w:name w:val="HTML Preformatted"/>
+    <w:basedOn w:val="Normal"/>
+    <w:link w:val="HTMLPreformattedChar"/>
+    <w:uiPriority w:val="99"/>
+    <w:semiHidden/>
+    <w:unhideWhenUsed/>
+    <w:rsid w:val="008C4F1C"/>
+    <w:pPr>
+      <w:spacing w:after="0" w:line="240" w:lineRule="auto"/>
+    </w:pPr>
+    <w:rPr>
+      <w:rFonts w:ascii="Consolas" w:hAnsi="Consolas"/>
+      <w:sz w:val="20"/>
+      <w:szCs w:val="20"/>
+    </w:rPr>
+  </w:style>
+  <w:style w:type="character" w:customStyle="1" w:styleId="HTMLPreformattedChar">
+    <w:name w:val="HTML Preformatted Char"/>
+    <w:basedOn w:val="DefaultParagraphFont"/>
+    <w:link w:val="HTMLPreformatted"/>
+    <w:uiPriority w:val="99"/>
+    <w:semiHidden/>
+    <w:rsid w:val="008C4F1C"/>
+    <w:rPr>
+      <w:rFonts w:ascii="Consolas" w:hAnsi="Consolas"/>
+      <w:sz w:val="20"/>
+      <w:szCs w:val="20"/>
+    </w:rPr>
+  </w:style>
 </w:styles>
 </file>
 

</xml_diff>

<commit_message>
Documentation updates (new design for emulating video hardware)
</commit_message>
<xml_diff>
--- a/docs/BeebPerf.docx
+++ b/docs/BeebPerf.docx
@@ -412,15 +412,7 @@
           <w:rFonts w:ascii="Aptos" w:hAnsi="Aptos"/>
           <w:color w:val="000000"/>
         </w:rPr>
-        <w:t xml:space="preserve"> (</w:t>
-      </w:r>
-      <w:proofErr w:type="gramStart"/>
-      <w:r>
-        <w:rPr>
-          <w:rFonts w:ascii="Aptos" w:hAnsi="Aptos"/>
-          <w:color w:val="000000"/>
-        </w:rPr>
-        <w:t>see .</w:t>
+        <w:t xml:space="preserve"> (see .</w:t>
       </w:r>
       <w:r>
         <w:rPr>
@@ -434,15 +426,7 @@
           <w:rFonts w:ascii="Aptos" w:hAnsi="Aptos"/>
           <w:color w:val="000000"/>
         </w:rPr>
-        <w:t>erf</w:t>
-      </w:r>
-      <w:proofErr w:type="gramEnd"/>
-      <w:r>
-        <w:rPr>
-          <w:rFonts w:ascii="Aptos" w:hAnsi="Aptos"/>
-          <w:color w:val="000000"/>
-        </w:rPr>
-        <w:t xml:space="preserve"> </w:t>
+        <w:t xml:space="preserve">erf </w:t>
       </w:r>
       <w:r>
         <w:rPr>
@@ -992,19 +976,11 @@
         </w:rPr>
         <w:t xml:space="preserve">   </w:t>
       </w:r>
-      <w:proofErr w:type="gramStart"/>
       <w:r>
         <w:rPr>
           <w:color w:val="FFFFFF" w:themeColor="background1"/>
         </w:rPr>
-        <w:t>git</w:t>
-      </w:r>
-      <w:proofErr w:type="gramEnd"/>
-      <w:r>
-        <w:rPr>
-          <w:color w:val="FFFFFF" w:themeColor="background1"/>
-        </w:rPr>
-        <w:t xml:space="preserve"> </w:t>
+        <w:t xml:space="preserve">git </w:t>
       </w:r>
       <w:r>
         <w:rPr>
@@ -1247,17 +1223,12 @@
         <w:t xml:space="preserve">over BBC </w:t>
       </w:r>
       <w:r>
-        <w:t>disc activity, if code is loaded</w:t>
-      </w:r>
-      <w:proofErr w:type="gramStart"/>
-      <w:r>
-        <w:t>.</w:t>
+        <w:t>disc activity, if code is loaded.</w:t>
       </w:r>
       <w:r>
         <w:t xml:space="preserve"> </w:t>
       </w:r>
       <w:proofErr w:type="spellStart"/>
-      <w:proofErr w:type="gramEnd"/>
       <w:r>
         <w:rPr>
           <w:b/>
@@ -2095,15 +2066,43 @@
       <w:r>
         <w:t xml:space="preserve"> and </w:t>
       </w:r>
-      <w:proofErr w:type="gramStart"/>
-      <w:r>
-        <w:rPr>
-          <w:b/>
-          <w:bCs/>
-        </w:rPr>
-        <w:t>Zoom</w:t>
-      </w:r>
-      <w:proofErr w:type="gramEnd"/>
+      <w:r>
+        <w:rPr>
+          <w:b/>
+          <w:bCs/>
+        </w:rPr>
+        <w:t xml:space="preserve">Zoom </w:t>
+      </w:r>
+      <w:r>
+        <w:rPr>
+          <w:b/>
+          <w:bCs/>
+        </w:rPr>
+        <w:t>o</w:t>
+      </w:r>
+      <w:r>
+        <w:rPr>
+          <w:b/>
+          <w:bCs/>
+        </w:rPr>
+        <w:t>ut</w:t>
+      </w:r>
+      <w:r>
+        <w:t xml:space="preserve"> button</w:t>
+      </w:r>
+      <w:r>
+        <w:t>s change the scale</w:t>
+      </w:r>
+      <w:r>
+        <w:t xml:space="preserve">.  The </w:t>
+      </w:r>
+      <w:r>
+        <w:rPr>
+          <w:b/>
+          <w:bCs/>
+        </w:rPr>
+        <w:t>Fit selection</w:t>
+      </w:r>
       <w:r>
         <w:rPr>
           <w:b/>
@@ -2112,34 +2111,7 @@
         <w:t xml:space="preserve"> </w:t>
       </w:r>
       <w:r>
-        <w:rPr>
-          <w:b/>
-          <w:bCs/>
-        </w:rPr>
-        <w:t>o</w:t>
-      </w:r>
-      <w:r>
-        <w:rPr>
-          <w:b/>
-          <w:bCs/>
-        </w:rPr>
-        <w:t>ut</w:t>
-      </w:r>
-      <w:r>
-        <w:t xml:space="preserve"> button</w:t>
-      </w:r>
-      <w:r>
-        <w:t>s change the scale</w:t>
-      </w:r>
-      <w:r>
-        <w:t xml:space="preserve">.  The </w:t>
-      </w:r>
-      <w:r>
-        <w:rPr>
-          <w:b/>
-          <w:bCs/>
-        </w:rPr>
-        <w:t>Fit selection</w:t>
+        <w:t>button</w:t>
       </w:r>
       <w:r>
         <w:rPr>
@@ -2149,7 +2121,94 @@
         <w:t xml:space="preserve"> </w:t>
       </w:r>
       <w:r>
-        <w:t>button</w:t>
+        <w:t>scale</w:t>
+      </w:r>
+      <w:r>
+        <w:t>s</w:t>
+      </w:r>
+      <w:r>
+        <w:t xml:space="preserve"> and translate</w:t>
+      </w:r>
+      <w:r>
+        <w:t>s</w:t>
+      </w:r>
+      <w:r>
+        <w:t xml:space="preserve"> the view </w:t>
+      </w:r>
+      <w:r>
+        <w:t xml:space="preserve">as appropriate.  </w:t>
+      </w:r>
+    </w:p>
+    <w:p>
+      <w:r>
+        <w:t>Display-frame</w:t>
+      </w:r>
+      <w:r>
+        <w:t>s</w:t>
+      </w:r>
+      <w:r>
+        <w:t xml:space="preserve"> are shown below</w:t>
+      </w:r>
+      <w:r>
+        <w:t xml:space="preserve"> the </w:t>
+      </w:r>
+      <w:r>
+        <w:t>timeline</w:t>
+      </w:r>
+      <w:r>
+        <w:t>.</w:t>
+      </w:r>
+      <w:r>
+        <w:t xml:space="preserve">  Th</w:t>
+      </w:r>
+      <w:r>
+        <w:t xml:space="preserve">eir size can be changed </w:t>
+      </w:r>
+      <w:r>
+        <w:t xml:space="preserve">by dragging the </w:t>
+      </w:r>
+      <w:r>
+        <w:t xml:space="preserve">bottom </w:t>
+      </w:r>
+      <w:r>
+        <w:t xml:space="preserve">dividing </w:t>
+      </w:r>
+      <w:r>
+        <w:t>border.</w:t>
+      </w:r>
+      <w:r>
+        <w:t xml:space="preserve"> Frame number</w:t>
+      </w:r>
+      <w:r>
+        <w:t>s</w:t>
+      </w:r>
+      <w:r>
+        <w:t xml:space="preserve"> are displayed under each </w:t>
+      </w:r>
+      <w:r>
+        <w:t>display-frame</w:t>
+      </w:r>
+      <w:r>
+        <w:t>.</w:t>
+      </w:r>
+    </w:p>
+    <w:p>
+      <w:r>
+        <w:t xml:space="preserve">The </w:t>
+      </w:r>
+      <w:r>
+        <w:rPr>
+          <w:b/>
+          <w:bCs/>
+        </w:rPr>
+        <w:t xml:space="preserve">Fit </w:t>
+      </w:r>
+      <w:r>
+        <w:rPr>
+          <w:b/>
+          <w:bCs/>
+        </w:rPr>
+        <w:t>display</w:t>
       </w:r>
       <w:r>
         <w:rPr>
@@ -2159,132 +2218,25 @@
         <w:t xml:space="preserve"> </w:t>
       </w:r>
       <w:r>
-        <w:t>scale</w:t>
-      </w:r>
-      <w:r>
+        <w:rPr>
+          <w:b/>
+          <w:bCs/>
+        </w:rPr>
+        <w:t>frame</w:t>
+      </w:r>
+      <w:r>
+        <w:rPr>
+          <w:b/>
+          <w:bCs/>
+        </w:rPr>
         <w:t>s</w:t>
       </w:r>
       <w:r>
-        <w:t xml:space="preserve"> and translate</w:t>
-      </w:r>
-      <w:r>
-        <w:t>s</w:t>
-      </w:r>
-      <w:r>
-        <w:t xml:space="preserve"> the view </w:t>
-      </w:r>
-      <w:r>
-        <w:t xml:space="preserve">as appropriate.  </w:t>
-      </w:r>
-    </w:p>
-    <w:p>
-      <w:r>
-        <w:t>Display-frame</w:t>
-      </w:r>
-      <w:r>
-        <w:t>s</w:t>
-      </w:r>
-      <w:r>
-        <w:t xml:space="preserve"> are shown below</w:t>
-      </w:r>
-      <w:r>
-        <w:t xml:space="preserve"> the </w:t>
+        <w:t xml:space="preserve"> button scales the </w:t>
       </w:r>
       <w:r>
         <w:t>timeline</w:t>
       </w:r>
-      <w:r>
-        <w:t>.</w:t>
-      </w:r>
-      <w:r>
-        <w:t xml:space="preserve">  Th</w:t>
-      </w:r>
-      <w:r>
-        <w:t xml:space="preserve">eir size can be changed </w:t>
-      </w:r>
-      <w:r>
-        <w:t xml:space="preserve">by dragging the </w:t>
-      </w:r>
-      <w:r>
-        <w:t xml:space="preserve">bottom </w:t>
-      </w:r>
-      <w:r>
-        <w:t xml:space="preserve">dividing </w:t>
-      </w:r>
-      <w:r>
-        <w:t>border</w:t>
-      </w:r>
-      <w:proofErr w:type="gramStart"/>
-      <w:r>
-        <w:t>.</w:t>
-      </w:r>
-      <w:r>
-        <w:t xml:space="preserve"> </w:t>
-      </w:r>
-      <w:proofErr w:type="gramEnd"/>
-      <w:r>
-        <w:t>Frame number</w:t>
-      </w:r>
-      <w:r>
-        <w:t>s</w:t>
-      </w:r>
-      <w:r>
-        <w:t xml:space="preserve"> are displayed under each </w:t>
-      </w:r>
-      <w:r>
-        <w:t>display-frame</w:t>
-      </w:r>
-      <w:r>
-        <w:t>.</w:t>
-      </w:r>
-    </w:p>
-    <w:p>
-      <w:r>
-        <w:t xml:space="preserve">The </w:t>
-      </w:r>
-      <w:r>
-        <w:rPr>
-          <w:b/>
-          <w:bCs/>
-        </w:rPr>
-        <w:t xml:space="preserve">Fit </w:t>
-      </w:r>
-      <w:r>
-        <w:rPr>
-          <w:b/>
-          <w:bCs/>
-        </w:rPr>
-        <w:t>display</w:t>
-      </w:r>
-      <w:r>
-        <w:rPr>
-          <w:b/>
-          <w:bCs/>
-        </w:rPr>
-        <w:t xml:space="preserve"> </w:t>
-      </w:r>
-      <w:r>
-        <w:rPr>
-          <w:b/>
-          <w:bCs/>
-        </w:rPr>
-        <w:t>frame</w:t>
-      </w:r>
-      <w:r>
-        <w:rPr>
-          <w:b/>
-          <w:bCs/>
-        </w:rPr>
-        <w:t>s</w:t>
-      </w:r>
-      <w:r>
-        <w:t xml:space="preserve"> button scales the </w:t>
-      </w:r>
-      <w:proofErr w:type="gramStart"/>
-      <w:r>
-        <w:t>timeline</w:t>
-      </w:r>
-      <w:proofErr w:type="gramEnd"/>
       <w:r>
         <w:t xml:space="preserve"> so frames are </w:t>
       </w:r>
@@ -2503,9 +2455,11 @@
             <w:tcW w:w="1975" w:type="dxa"/>
           </w:tcPr>
           <w:p>
+            <w:proofErr w:type="spellStart"/>
             <w:r>
               <w:t>Self CPU</w:t>
             </w:r>
+            <w:proofErr w:type="spellEnd"/>
           </w:p>
         </w:tc>
         <w:tc>
@@ -3075,16 +3029,11 @@
         <w:t xml:space="preserve">top-level nodes </w:t>
       </w:r>
       <w:r>
-        <w:t>represent the program and interrupt entry points</w:t>
-      </w:r>
-      <w:proofErr w:type="gramStart"/>
-      <w:r>
-        <w:t>.</w:t>
+        <w:t>represent the program and interrupt entry points.</w:t>
       </w:r>
       <w:r>
         <w:t xml:space="preserve"> </w:t>
       </w:r>
-      <w:proofErr w:type="gramEnd"/>
       <w:r>
         <w:t xml:space="preserve">Each node in the tree shows </w:t>
       </w:r>
@@ -3298,17 +3247,8 @@
           <w:b/>
           <w:bCs/>
         </w:rPr>
-        <w:t xml:space="preserve">Call </w:t>
-      </w:r>
-      <w:proofErr w:type="gramStart"/>
-      <w:r>
-        <w:rPr>
-          <w:b/>
-          <w:bCs/>
-        </w:rPr>
-        <w:t>types</w:t>
-      </w:r>
-      <w:proofErr w:type="gramEnd"/>
+        <w:t>Call types</w:t>
+      </w:r>
       <w:r>
         <w:t xml:space="preserve"> button.</w:t>
       </w:r>
@@ -3641,21 +3581,12 @@
       <w:r>
         <w:t xml:space="preserve"> and </w:t>
       </w:r>
-      <w:proofErr w:type="gramStart"/>
-      <w:r>
-        <w:rPr>
-          <w:b/>
-          <w:bCs/>
-        </w:rPr>
-        <w:t>Edit</w:t>
-      </w:r>
-      <w:proofErr w:type="gramEnd"/>
-      <w:r>
-        <w:rPr>
-          <w:b/>
-          <w:bCs/>
-        </w:rPr>
-        <w:t>…</w:t>
+      <w:r>
+        <w:rPr>
+          <w:b/>
+          <w:bCs/>
+        </w:rPr>
+        <w:t>Edit…</w:t>
       </w:r>
       <w:r>
         <w:t xml:space="preserve"> frame settings button</w:t>
@@ -3799,26 +3730,16 @@
       <w:r>
         <w:t xml:space="preserve">sessions.  The </w:t>
       </w:r>
-      <w:proofErr w:type="gramStart"/>
-      <w:r>
-        <w:rPr>
-          <w:b/>
-          <w:bCs/>
-        </w:rPr>
-        <w:t>Add..</w:t>
-      </w:r>
-      <w:proofErr w:type="gramEnd"/>
-      <w:r>
-        <w:rPr>
-          <w:b/>
-          <w:bCs/>
-        </w:rPr>
-        <w:t xml:space="preserve"> </w:t>
+      <w:r>
+        <w:rPr>
+          <w:b/>
+          <w:bCs/>
+        </w:rPr>
+        <w:t xml:space="preserve">Add.. </w:t>
       </w:r>
       <w:r>
         <w:t xml:space="preserve">and </w:t>
       </w:r>
-      <w:proofErr w:type="gramStart"/>
       <w:r>
         <w:rPr>
           <w:b/>
@@ -3826,7 +3747,6 @@
         </w:rPr>
         <w:t>Edit..</w:t>
       </w:r>
-      <w:proofErr w:type="gramEnd"/>
       <w:r>
         <w:t xml:space="preserve"> button</w:t>
       </w:r>
@@ -5110,13 +5030,8 @@
       </w:r>
       <w:proofErr w:type="spellEnd"/>
       <w:r>
-        <w:t xml:space="preserve"> is a .NET Windows Forms app, written in C#</w:t>
-      </w:r>
-      <w:proofErr w:type="gramStart"/>
-      <w:r>
-        <w:t xml:space="preserve">. </w:t>
-      </w:r>
-      <w:proofErr w:type="gramEnd"/>
+        <w:t xml:space="preserve"> is a .NET Windows Forms app, written in C#. </w:t>
+      </w:r>
       <w:r>
         <w:t>Whil</w:t>
       </w:r>
@@ -5135,11 +5050,7 @@
         <w:t>I considered implementing the analysis portions in C++</w:t>
       </w:r>
       <w:r>
-        <w:t xml:space="preserve">, to keep the memory footprint </w:t>
-      </w:r>
-      <w:proofErr w:type="gramStart"/>
-      <w:r>
-        <w:t>low</w:t>
+        <w:t>, to keep the memory footprint low</w:t>
       </w:r>
       <w:r>
         <w:t xml:space="preserve">, </w:t>
@@ -5148,11 +5059,7 @@
         <w:t xml:space="preserve"> </w:t>
       </w:r>
       <w:r>
-        <w:t>but</w:t>
-      </w:r>
-      <w:proofErr w:type="gramEnd"/>
-      <w:r>
-        <w:t xml:space="preserve"> this </w:t>
+        <w:t xml:space="preserve">but this </w:t>
       </w:r>
       <w:r>
         <w:t xml:space="preserve">never became </w:t>
@@ -5193,13 +5100,8 @@
         <w:t xml:space="preserve">Form which </w:t>
       </w:r>
       <w:r>
-        <w:t>ties the application together</w:t>
-      </w:r>
-      <w:proofErr w:type="gramStart"/>
-      <w:r>
-        <w:t xml:space="preserve">. </w:t>
-      </w:r>
-      <w:proofErr w:type="gramEnd"/>
+        <w:t xml:space="preserve">ties the application together. </w:t>
+      </w:r>
       <w:r>
         <w:t>T</w:t>
       </w:r>
@@ -5934,15 +5836,7 @@
         <w:t xml:space="preserve">All the events and instructions defined across </w:t>
       </w:r>
       <w:r>
-        <w:t xml:space="preserve">the </w:t>
-      </w:r>
-      <w:proofErr w:type="gramStart"/>
-      <w:r>
-        <w:t>read .perf</w:t>
-      </w:r>
-      <w:proofErr w:type="gramEnd"/>
-      <w:r>
-        <w:t xml:space="preserve"> file’s </w:t>
+        <w:t xml:space="preserve">the read .perf file’s </w:t>
       </w:r>
       <w:r>
         <w:t xml:space="preserve">execution chunks are put in a single </w:t>
@@ -7429,82 +7323,395 @@
     </w:p>
     <w:p>
       <w:pPr>
-        <w:rPr>
-          <w:rFonts w:ascii="Aptos" w:hAnsi="Aptos"/>
-          <w:color w:val="000000"/>
-        </w:rPr>
-      </w:pPr>
-      <w:r>
-        <w:rPr>
-          <w:rFonts w:ascii="Aptos" w:hAnsi="Aptos"/>
-          <w:color w:val="000000"/>
-        </w:rPr>
-        <w:t xml:space="preserve">The emulation is based on </w:t>
-      </w:r>
-      <w:proofErr w:type="spellStart"/>
-      <w:r>
-        <w:rPr>
-          <w:rFonts w:ascii="Aptos" w:hAnsi="Aptos"/>
-          <w:b/>
-          <w:bCs/>
-          <w:color w:val="000000"/>
-        </w:rPr>
-        <w:t>BeebEm’s</w:t>
-      </w:r>
-      <w:proofErr w:type="spellEnd"/>
-      <w:r>
-        <w:rPr>
-          <w:rFonts w:ascii="Aptos" w:hAnsi="Aptos"/>
-          <w:color w:val="000000"/>
-        </w:rPr>
-        <w:t xml:space="preserve"> implementation</w:t>
-      </w:r>
-      <w:r>
-        <w:rPr>
-          <w:rFonts w:ascii="Aptos" w:hAnsi="Aptos"/>
-          <w:color w:val="000000"/>
-        </w:rPr>
-        <w:t xml:space="preserve"> (see video.cpp)</w:t>
-      </w:r>
-      <w:r>
-        <w:rPr>
-          <w:rFonts w:ascii="Aptos" w:hAnsi="Aptos"/>
-          <w:color w:val="000000"/>
-        </w:rPr>
-        <w:t>, but always runs at scanline-character fidelity, regardless of the screen mode.</w:t>
-      </w:r>
-    </w:p>
-    <w:p>
-      <w:r>
-        <w:rPr>
-          <w:rFonts w:ascii="Aptos" w:hAnsi="Aptos"/>
-          <w:color w:val="000000"/>
-        </w:rPr>
-        <w:t>The emulation generates pixels in a 4bpp framebuffer (1024×</w:t>
-      </w:r>
-      <w:r>
-        <w:rPr>
-          <w:rFonts w:ascii="Aptos" w:hAnsi="Aptos"/>
-          <w:color w:val="000000"/>
-        </w:rPr>
-        <w:t>500</w:t>
-      </w:r>
-      <w:r>
-        <w:rPr>
-          <w:rFonts w:ascii="Aptos" w:hAnsi="Aptos"/>
-          <w:color w:val="000000"/>
-        </w:rPr>
-        <w:t>), where each value indexes a fixed palette of BBC physical colors: 0 black, 1 red, 2 green, 3 yellow, 4 blue, 5 magenta, 6 cyan, and 7 white.</w:t>
-      </w:r>
-    </w:p>
-    <w:p>
-      <w:pPr>
         <w:pStyle w:val="ListParagraph"/>
         <w:ind w:left="0"/>
         <w:contextualSpacing w:val="0"/>
       </w:pPr>
       <w:r>
-        <w:t>Displayed images are extracted from the frame buffer when a VSYNC occurs.</w:t>
+        <w:t>The emulation leverages performance log</w:t>
+      </w:r>
+      <w:r>
+        <w:t>:</w:t>
+      </w:r>
+      <w:r>
+        <w:t xml:space="preserve"> </w:t>
+      </w:r>
+      <w:r>
+        <w:rPr>
+          <w:b/>
+          <w:bCs/>
+        </w:rPr>
+        <w:t>CRTC</w:t>
+      </w:r>
+      <w:r>
+        <w:rPr>
+          <w:b/>
+          <w:bCs/>
+        </w:rPr>
+        <w:t xml:space="preserve"> </w:t>
+      </w:r>
+      <w:r>
+        <w:rPr>
+          <w:b/>
+          <w:bCs/>
+        </w:rPr>
+        <w:t>frame</w:t>
+      </w:r>
+      <w:r>
+        <w:rPr>
+          <w:b/>
+          <w:bCs/>
+        </w:rPr>
+        <w:t>-start</w:t>
+      </w:r>
+      <w:r>
+        <w:t xml:space="preserve"> </w:t>
+      </w:r>
+      <w:r>
+        <w:rPr>
+          <w:b/>
+          <w:bCs/>
+        </w:rPr>
+        <w:t>events</w:t>
+      </w:r>
+      <w:r>
+        <w:t xml:space="preserve"> which </w:t>
+      </w:r>
+      <w:r>
+        <w:t>mark</w:t>
+      </w:r>
+      <w:r>
+        <w:t xml:space="preserve"> the start of </w:t>
+      </w:r>
+      <w:r>
+        <w:t xml:space="preserve">every </w:t>
+      </w:r>
+      <w:r>
+        <w:t xml:space="preserve">CRTC </w:t>
+      </w:r>
+      <w:r>
+        <w:t>frame.  The</w:t>
+      </w:r>
+      <w:r>
+        <w:t>se</w:t>
+      </w:r>
+      <w:r>
+        <w:t xml:space="preserve"> event</w:t>
+      </w:r>
+      <w:r>
+        <w:t>s</w:t>
+      </w:r>
+      <w:r>
+        <w:t xml:space="preserve"> include a snapshot of the CRTC and ULA states</w:t>
+      </w:r>
+      <w:r>
+        <w:t>.</w:t>
+      </w:r>
+    </w:p>
+    <w:p>
+      <w:pPr>
+        <w:rPr>
+          <w:rFonts w:ascii="Aptos" w:hAnsi="Aptos"/>
+          <w:color w:val="000000"/>
+        </w:rPr>
+      </w:pPr>
+      <w:r>
+        <w:rPr>
+          <w:rFonts w:ascii="Aptos" w:hAnsi="Aptos"/>
+          <w:color w:val="000000"/>
+        </w:rPr>
+        <w:t>The</w:t>
+      </w:r>
+      <w:r>
+        <w:rPr>
+          <w:rFonts w:ascii="Aptos" w:hAnsi="Aptos"/>
+          <w:color w:val="000000"/>
+        </w:rPr>
+        <w:t xml:space="preserve"> </w:t>
+      </w:r>
+      <w:r>
+        <w:rPr>
+          <w:rFonts w:ascii="Aptos" w:hAnsi="Aptos"/>
+          <w:color w:val="000000"/>
+        </w:rPr>
+        <w:t xml:space="preserve">code </w:t>
+      </w:r>
+      <w:r>
+        <w:rPr>
+          <w:rFonts w:ascii="Aptos" w:hAnsi="Aptos"/>
+          <w:color w:val="000000"/>
+        </w:rPr>
+        <w:t xml:space="preserve">is </w:t>
+      </w:r>
+      <w:r>
+        <w:rPr>
+          <w:rFonts w:ascii="Aptos" w:hAnsi="Aptos"/>
+          <w:color w:val="000000"/>
+        </w:rPr>
+        <w:t xml:space="preserve">based on </w:t>
+      </w:r>
+      <w:proofErr w:type="spellStart"/>
+      <w:r>
+        <w:rPr>
+          <w:rFonts w:ascii="Aptos" w:hAnsi="Aptos"/>
+          <w:b/>
+          <w:bCs/>
+          <w:color w:val="000000"/>
+        </w:rPr>
+        <w:t>BeebEm’s</w:t>
+      </w:r>
+      <w:proofErr w:type="spellEnd"/>
+      <w:r>
+        <w:rPr>
+          <w:rFonts w:ascii="Aptos" w:hAnsi="Aptos"/>
+          <w:color w:val="000000"/>
+        </w:rPr>
+        <w:t xml:space="preserve"> implementation</w:t>
+      </w:r>
+      <w:r>
+        <w:rPr>
+          <w:rFonts w:ascii="Aptos" w:hAnsi="Aptos"/>
+          <w:color w:val="000000"/>
+        </w:rPr>
+        <w:t xml:space="preserve"> (see video.cpp)</w:t>
+      </w:r>
+      <w:r>
+        <w:rPr>
+          <w:rFonts w:ascii="Aptos" w:hAnsi="Aptos"/>
+          <w:color w:val="000000"/>
+        </w:rPr>
+        <w:t>, but runs at scanline-character fidelity, regardless of the screen mode.</w:t>
+      </w:r>
+    </w:p>
+    <w:p>
+      <w:pPr>
+        <w:rPr>
+          <w:rFonts w:ascii="Aptos" w:hAnsi="Aptos"/>
+          <w:color w:val="000000"/>
+        </w:rPr>
+      </w:pPr>
+      <w:r>
+        <w:rPr>
+          <w:rFonts w:ascii="Aptos" w:hAnsi="Aptos"/>
+          <w:color w:val="000000"/>
+        </w:rPr>
+        <w:t xml:space="preserve">The emulation </w:t>
+      </w:r>
+      <w:r>
+        <w:rPr>
+          <w:rFonts w:ascii="Aptos" w:hAnsi="Aptos"/>
+          <w:color w:val="000000"/>
+        </w:rPr>
+        <w:t xml:space="preserve">writes </w:t>
+      </w:r>
+      <w:r>
+        <w:rPr>
+          <w:rFonts w:ascii="Aptos" w:hAnsi="Aptos"/>
+          <w:color w:val="000000"/>
+        </w:rPr>
+        <w:t xml:space="preserve">pixels </w:t>
+      </w:r>
+      <w:r>
+        <w:rPr>
+          <w:rFonts w:ascii="Aptos" w:hAnsi="Aptos"/>
+          <w:color w:val="000000"/>
+        </w:rPr>
+        <w:t xml:space="preserve">to </w:t>
+      </w:r>
+      <w:r>
+        <w:rPr>
+          <w:rFonts w:ascii="Aptos" w:hAnsi="Aptos"/>
+          <w:color w:val="000000"/>
+        </w:rPr>
+        <w:t>a 4bpp framebuffer, where each value indexes a fixed palette of BBC physical colors: 0 black, 1 red, 2 green, 3 yellow, 4 blue, 5 magenta, 6 cyan, and 7 white.</w:t>
+      </w:r>
+    </w:p>
+    <w:p>
+      <w:pPr>
+        <w:rPr>
+          <w:rFonts w:ascii="Aptos" w:hAnsi="Aptos"/>
+          <w:color w:val="000000"/>
+        </w:rPr>
+      </w:pPr>
+      <w:r>
+        <w:rPr>
+          <w:rFonts w:ascii="Aptos" w:hAnsi="Aptos"/>
+          <w:color w:val="000000"/>
+        </w:rPr>
+        <w:lastRenderedPageBreak/>
+        <w:t xml:space="preserve">The effective resolution of the frame buffer </w:t>
+      </w:r>
+      <w:r>
+        <w:t xml:space="preserve">is </w:t>
+      </w:r>
+      <w:r>
+        <w:rPr>
+          <w:b/>
+          <w:bCs/>
+        </w:rPr>
+        <w:t>1024 x 624</w:t>
+      </w:r>
+      <w:r>
+        <w:t xml:space="preserve"> </w:t>
+      </w:r>
+      <w:r>
+        <w:t>in</w:t>
+      </w:r>
+      <w:r>
+        <w:t xml:space="preserve"> non-teletext modes, and </w:t>
+      </w:r>
+      <w:r>
+        <w:rPr>
+          <w:b/>
+          <w:bCs/>
+        </w:rPr>
+        <w:t>768 x 624</w:t>
+      </w:r>
+      <w:r>
+        <w:t xml:space="preserve"> </w:t>
+      </w:r>
+      <w:r>
+        <w:t>in</w:t>
+      </w:r>
+      <w:r>
+        <w:t xml:space="preserve"> teletext mode.</w:t>
+      </w:r>
+      <w:r>
+        <w:t xml:space="preserve">  </w:t>
+      </w:r>
+      <w:r>
+        <w:rPr>
+          <w:rFonts w:ascii="Aptos" w:hAnsi="Aptos"/>
+          <w:color w:val="000000"/>
+        </w:rPr>
+        <w:t xml:space="preserve">Pixels written into the framebuffer </w:t>
+      </w:r>
+      <w:r>
+        <w:rPr>
+          <w:rFonts w:ascii="Aptos" w:hAnsi="Aptos"/>
+          <w:color w:val="000000"/>
+        </w:rPr>
+        <w:t xml:space="preserve">are </w:t>
+      </w:r>
+      <w:r>
+        <w:rPr>
+          <w:rFonts w:ascii="Aptos" w:hAnsi="Aptos"/>
+          <w:color w:val="000000"/>
+        </w:rPr>
+        <w:t>scaled</w:t>
+      </w:r>
+      <w:r>
+        <w:rPr>
+          <w:rFonts w:ascii="Aptos" w:hAnsi="Aptos"/>
+          <w:color w:val="000000"/>
+        </w:rPr>
+        <w:t xml:space="preserve"> </w:t>
+      </w:r>
+      <w:r>
+        <w:rPr>
+          <w:rFonts w:ascii="Aptos" w:hAnsi="Aptos"/>
+          <w:color w:val="000000"/>
+        </w:rPr>
+        <w:t xml:space="preserve">up </w:t>
+      </w:r>
+      <w:r>
+        <w:rPr>
+          <w:rFonts w:ascii="Aptos" w:hAnsi="Aptos"/>
+          <w:color w:val="000000"/>
+        </w:rPr>
+        <w:t xml:space="preserve">to match these </w:t>
+      </w:r>
+      <w:r>
+        <w:rPr>
+          <w:rFonts w:ascii="Aptos" w:hAnsi="Aptos"/>
+          <w:color w:val="000000"/>
+        </w:rPr>
+        <w:t>resolution</w:t>
+      </w:r>
+      <w:r>
+        <w:rPr>
+          <w:rFonts w:ascii="Aptos" w:hAnsi="Aptos"/>
+          <w:color w:val="000000"/>
+        </w:rPr>
+        <w:t>s</w:t>
+      </w:r>
+      <w:r>
+        <w:rPr>
+          <w:rFonts w:ascii="Aptos" w:hAnsi="Aptos"/>
+          <w:color w:val="000000"/>
+        </w:rPr>
+        <w:t>.</w:t>
+      </w:r>
+    </w:p>
+    <w:p>
+      <w:pPr>
+        <w:rPr>
+          <w:rFonts w:ascii="Aptos" w:hAnsi="Aptos"/>
+          <w:color w:val="000000"/>
+        </w:rPr>
+      </w:pPr>
+      <w:r>
+        <w:rPr>
+          <w:rFonts w:ascii="Aptos" w:hAnsi="Aptos"/>
+          <w:color w:val="000000"/>
+        </w:rPr>
+        <w:t>This approach leads to more accurate renditions</w:t>
+      </w:r>
+      <w:r>
+        <w:rPr>
+          <w:rFonts w:ascii="Aptos" w:hAnsi="Aptos"/>
+          <w:color w:val="000000"/>
+        </w:rPr>
+        <w:t xml:space="preserve"> </w:t>
+      </w:r>
+      <w:r>
+        <w:rPr>
+          <w:rFonts w:ascii="Aptos" w:hAnsi="Aptos"/>
+          <w:color w:val="000000"/>
+        </w:rPr>
+        <w:t>of frames which</w:t>
+      </w:r>
+      <w:r>
+        <w:rPr>
+          <w:rFonts w:ascii="Aptos" w:hAnsi="Aptos"/>
+          <w:color w:val="000000"/>
+        </w:rPr>
+        <w:t xml:space="preserve"> </w:t>
+      </w:r>
+      <w:r>
+        <w:rPr>
+          <w:rFonts w:ascii="Aptos" w:hAnsi="Aptos"/>
+          <w:color w:val="000000"/>
+        </w:rPr>
+        <w:t xml:space="preserve">include mid-frame </w:t>
+      </w:r>
+      <w:r>
+        <w:rPr>
+          <w:rFonts w:ascii="Aptos" w:hAnsi="Aptos"/>
+          <w:color w:val="000000"/>
+        </w:rPr>
+        <w:t xml:space="preserve">screen </w:t>
+      </w:r>
+      <w:r>
+        <w:rPr>
+          <w:rFonts w:ascii="Aptos" w:hAnsi="Aptos"/>
+          <w:color w:val="000000"/>
+        </w:rPr>
+        <w:t xml:space="preserve">mode </w:t>
+      </w:r>
+      <w:r>
+        <w:rPr>
+          <w:rFonts w:ascii="Aptos" w:hAnsi="Aptos"/>
+          <w:color w:val="000000"/>
+        </w:rPr>
+        <w:t>changes</w:t>
+      </w:r>
+      <w:r>
+        <w:rPr>
+          <w:rFonts w:ascii="Aptos" w:hAnsi="Aptos"/>
+          <w:color w:val="000000"/>
+        </w:rPr>
+        <w:t>.</w:t>
       </w:r>
     </w:p>
     <w:p>
@@ -7514,6 +7721,22 @@
         <w:contextualSpacing w:val="0"/>
       </w:pPr>
       <w:r>
+        <w:t>I</w:t>
+      </w:r>
+      <w:r>
+        <w:t>mages are extracted from the frame buffer when a VSYNC occurs</w:t>
+      </w:r>
+      <w:r>
+        <w:t>.</w:t>
+      </w:r>
+    </w:p>
+    <w:p>
+      <w:pPr>
+        <w:pStyle w:val="ListParagraph"/>
+        <w:ind w:left="0"/>
+        <w:contextualSpacing w:val="0"/>
+      </w:pPr>
+      <w:r>
         <w:t xml:space="preserve">The </w:t>
       </w:r>
       <w:r>
@@ -7536,6 +7759,9 @@
       </w:r>
       <w:r>
         <w:t>s</w:t>
+      </w:r>
+      <w:r>
+        <w:t>,</w:t>
       </w:r>
       <w:r>
         <w:t xml:space="preserve"> of </w:t>
@@ -7560,15 +7786,15 @@
         <w:tblLook w:val="04A0" w:firstRow="1" w:lastRow="0" w:firstColumn="1" w:lastColumn="0" w:noHBand="0" w:noVBand="1"/>
       </w:tblPr>
       <w:tblGrid>
-        <w:gridCol w:w="2065"/>
-        <w:gridCol w:w="1980"/>
-        <w:gridCol w:w="1980"/>
-        <w:gridCol w:w="1890"/>
+        <w:gridCol w:w="1959"/>
+        <w:gridCol w:w="1913"/>
+        <w:gridCol w:w="1913"/>
+        <w:gridCol w:w="1786"/>
       </w:tblGrid>
       <w:tr>
         <w:tc>
           <w:tcPr>
-            <w:tcW w:w="2065" w:type="dxa"/>
+            <w:tcW w:w="1959" w:type="dxa"/>
           </w:tcPr>
           <w:p>
             <w:pPr>
@@ -7581,7 +7807,6 @@
               </w:rPr>
             </w:pPr>
             <w:r>
-              <w:lastRenderedPageBreak/>
               <w:t xml:space="preserve"> </w:t>
             </w:r>
             <w:r>
@@ -7595,7 +7820,7 @@
         </w:tc>
         <w:tc>
           <w:tcPr>
-            <w:tcW w:w="1980" w:type="dxa"/>
+            <w:tcW w:w="1913" w:type="dxa"/>
           </w:tcPr>
           <w:p>
             <w:pPr>
@@ -7613,27 +7838,13 @@
                 <w:b/>
                 <w:bCs/>
               </w:rPr>
-              <w:t xml:space="preserve">Standard </w:t>
-            </w:r>
-            <w:r>
-              <w:rPr>
-                <w:b/>
-                <w:bCs/>
-              </w:rPr>
-              <w:t>R</w:t>
-            </w:r>
-            <w:r>
-              <w:rPr>
-                <w:b/>
-                <w:bCs/>
-              </w:rPr>
-              <w:t>esolution</w:t>
-            </w:r>
-          </w:p>
-        </w:tc>
-        <w:tc>
-          <w:tcPr>
-            <w:tcW w:w="1980" w:type="dxa"/>
+              <w:t>Standard Resolution</w:t>
+            </w:r>
+          </w:p>
+        </w:tc>
+        <w:tc>
+          <w:tcPr>
+            <w:tcW w:w="1913" w:type="dxa"/>
             <w:vAlign w:val="center"/>
           </w:tcPr>
           <w:p>
@@ -7652,14 +7863,7 @@
                 <w:b/>
                 <w:bCs/>
               </w:rPr>
-              <w:t xml:space="preserve">Max </w:t>
-            </w:r>
-            <w:r>
-              <w:rPr>
-                <w:b/>
-                <w:bCs/>
-              </w:rPr>
-              <w:t>R</w:t>
+              <w:t>Max R</w:t>
             </w:r>
             <w:r>
               <w:rPr>
@@ -7679,7 +7883,7 @@
         </w:tc>
         <w:tc>
           <w:tcPr>
-            <w:tcW w:w="1890" w:type="dxa"/>
+            <w:tcW w:w="1786" w:type="dxa"/>
             <w:vAlign w:val="center"/>
           </w:tcPr>
           <w:p>
@@ -7706,7 +7910,7 @@
       <w:tr>
         <w:tc>
           <w:tcPr>
-            <w:tcW w:w="2065" w:type="dxa"/>
+            <w:tcW w:w="1959" w:type="dxa"/>
             <w:vAlign w:val="center"/>
           </w:tcPr>
           <w:p>
@@ -7716,22 +7920,13 @@
               <w:contextualSpacing w:val="0"/>
             </w:pPr>
             <w:r>
-              <w:t>Modes 0</w:t>
-            </w:r>
-            <w:r>
-              <w:t xml:space="preserve"> to </w:t>
-            </w:r>
-            <w:r>
-              <w:t>6</w:t>
-            </w:r>
-            <w:r>
-              <w:t>, 8</w:t>
-            </w:r>
-          </w:p>
-        </w:tc>
-        <w:tc>
-          <w:tcPr>
-            <w:tcW w:w="1980" w:type="dxa"/>
+              <w:t>Modes 0 to 6, 8</w:t>
+            </w:r>
+          </w:p>
+        </w:tc>
+        <w:tc>
+          <w:tcPr>
+            <w:tcW w:w="1913" w:type="dxa"/>
           </w:tcPr>
           <w:p>
             <w:pPr>
@@ -7747,7 +7942,7 @@
         </w:tc>
         <w:tc>
           <w:tcPr>
-            <w:tcW w:w="1980" w:type="dxa"/>
+            <w:tcW w:w="1913" w:type="dxa"/>
             <w:vAlign w:val="center"/>
           </w:tcPr>
           <w:p>
@@ -7764,7 +7959,7 @@
         </w:tc>
         <w:tc>
           <w:tcPr>
-            <w:tcW w:w="1890" w:type="dxa"/>
+            <w:tcW w:w="1786" w:type="dxa"/>
             <w:vAlign w:val="center"/>
           </w:tcPr>
           <w:p>
@@ -7783,7 +7978,7 @@
       <w:tr>
         <w:tc>
           <w:tcPr>
-            <w:tcW w:w="2065" w:type="dxa"/>
+            <w:tcW w:w="1959" w:type="dxa"/>
             <w:vAlign w:val="center"/>
           </w:tcPr>
           <w:p>
@@ -7793,16 +7988,13 @@
               <w:contextualSpacing w:val="0"/>
             </w:pPr>
             <w:r>
-              <w:t>Mode 7</w:t>
-            </w:r>
-            <w:r>
-              <w:t xml:space="preserve"> (teletext)</w:t>
-            </w:r>
-          </w:p>
-        </w:tc>
-        <w:tc>
-          <w:tcPr>
-            <w:tcW w:w="1980" w:type="dxa"/>
+              <w:t>Mode 7 (teletext)</w:t>
+            </w:r>
+          </w:p>
+        </w:tc>
+        <w:tc>
+          <w:tcPr>
+            <w:tcW w:w="1913" w:type="dxa"/>
           </w:tcPr>
           <w:p>
             <w:pPr>
@@ -7812,16 +8004,13 @@
               <w:jc w:val="center"/>
             </w:pPr>
             <w:r>
-              <w:t xml:space="preserve">480 x </w:t>
-            </w:r>
-            <w:r>
-              <w:t>500</w:t>
-            </w:r>
-          </w:p>
-        </w:tc>
-        <w:tc>
-          <w:tcPr>
-            <w:tcW w:w="1980" w:type="dxa"/>
+              <w:t>480 x 500</w:t>
+            </w:r>
+          </w:p>
+        </w:tc>
+        <w:tc>
+          <w:tcPr>
+            <w:tcW w:w="1913" w:type="dxa"/>
             <w:vAlign w:val="center"/>
           </w:tcPr>
           <w:p>
@@ -7832,16 +8021,13 @@
               <w:jc w:val="center"/>
             </w:pPr>
             <w:r>
-              <w:t xml:space="preserve">480 x </w:t>
-            </w:r>
-            <w:r>
-              <w:t>500</w:t>
-            </w:r>
-          </w:p>
-        </w:tc>
-        <w:tc>
-          <w:tcPr>
-            <w:tcW w:w="1890" w:type="dxa"/>
+              <w:t>480 x 500</w:t>
+            </w:r>
+          </w:p>
+        </w:tc>
+        <w:tc>
+          <w:tcPr>
+            <w:tcW w:w="1786" w:type="dxa"/>
             <w:vAlign w:val="center"/>
           </w:tcPr>
           <w:p>
@@ -7868,21 +8054,16 @@
     </w:p>
     <w:p>
       <w:pPr>
-        <w:rPr>
-          <w:rFonts w:ascii="Aptos" w:hAnsi="Aptos"/>
-          <w:b/>
-          <w:bCs/>
-          <w:color w:val="000000"/>
-        </w:rPr>
-      </w:pPr>
-      <w:r>
-        <w:rPr>
-          <w:rFonts w:ascii="Aptos" w:hAnsi="Aptos"/>
-          <w:b/>
-          <w:bCs/>
-          <w:color w:val="000000"/>
-        </w:rPr>
-        <w:t>Non-teletext screen modes</w:t>
+        <w:pStyle w:val="Heading5"/>
+      </w:pPr>
+      <w:r>
+        <w:t>Non-teletext screen mode</w:t>
+      </w:r>
+      <w:r>
+        <w:t xml:space="preserve"> details</w:t>
+      </w:r>
+      <w:r>
+        <w:t>:</w:t>
       </w:r>
     </w:p>
     <w:p>
@@ -7949,6 +8130,28 @@
           <w:rFonts w:ascii="Aptos" w:hAnsi="Aptos"/>
           <w:color w:val="000000"/>
         </w:rPr>
+        <w:t>Pixels are duplicated vertically</w:t>
+      </w:r>
+      <w:r>
+        <w:rPr>
+          <w:rFonts w:ascii="Aptos" w:hAnsi="Aptos"/>
+          <w:color w:val="000000"/>
+        </w:rPr>
+        <w:t>.</w:t>
+      </w:r>
+    </w:p>
+    <w:p>
+      <w:pPr>
+        <w:rPr>
+          <w:rFonts w:ascii="Aptos" w:hAnsi="Aptos"/>
+          <w:color w:val="000000"/>
+        </w:rPr>
+      </w:pPr>
+      <w:r>
+        <w:rPr>
+          <w:rFonts w:ascii="Aptos" w:hAnsi="Aptos"/>
+          <w:color w:val="000000"/>
+        </w:rPr>
         <w:t xml:space="preserve">In interlaced sync and interlaced sync &amp; video modes, each field is rendered independently without integrating </w:t>
       </w:r>
       <w:r>
@@ -7968,18 +8171,20 @@
     </w:p>
     <w:p>
       <w:pPr>
-        <w:rPr>
-          <w:b/>
-          <w:bCs/>
-        </w:rPr>
-      </w:pPr>
-      <w:r>
-        <w:rPr>
-          <w:b/>
-          <w:bCs/>
-        </w:rPr>
+        <w:pStyle w:val="Heading5"/>
+      </w:pPr>
+      <w:r>
         <w:t>Teletext screen mode (Mode 7)</w:t>
       </w:r>
+      <w:r>
+        <w:t xml:space="preserve"> </w:t>
+      </w:r>
+      <w:r>
+        <w:t>details</w:t>
+      </w:r>
+      <w:r>
+        <w:t>:</w:t>
+      </w:r>
     </w:p>
     <w:p>
       <w:pPr>
@@ -8204,7 +8409,7 @@
           <w:rFonts w:ascii="Aptos" w:hAnsi="Aptos"/>
           <w:color w:val="000000"/>
         </w:rPr>
-        <w:t xml:space="preserve">also generates a </w:t>
+        <w:t xml:space="preserve">generates a </w:t>
       </w:r>
       <w:r>
         <w:rPr>
@@ -8251,6 +8456,12 @@
       </w:r>
     </w:p>
     <w:p>
+      <w:pPr>
+        <w:rPr>
+          <w:rFonts w:ascii="Aptos" w:hAnsi="Aptos"/>
+          <w:color w:val="000000"/>
+        </w:rPr>
+      </w:pPr>
       <w:r>
         <w:rPr>
           <w:rFonts w:ascii="Aptos" w:hAnsi="Aptos"/>
@@ -8270,7 +8481,22 @@
           <w:rFonts w:ascii="Aptos" w:hAnsi="Aptos"/>
           <w:color w:val="000000"/>
         </w:rPr>
-        <w:t>The rounded value is incremented, and the process repeats, resulting in two scanlines for every CRTC character scanline</w:t>
+        <w:t xml:space="preserve">The rounded value is </w:t>
+      </w:r>
+      <w:r>
+        <w:rPr>
+          <w:rFonts w:ascii="Aptos" w:hAnsi="Aptos"/>
+          <w:color w:val="000000"/>
+        </w:rPr>
+        <w:lastRenderedPageBreak/>
+        <w:t xml:space="preserve">then </w:t>
+      </w:r>
+      <w:r>
+        <w:rPr>
+          <w:rFonts w:ascii="Aptos" w:hAnsi="Aptos"/>
+          <w:color w:val="000000"/>
+        </w:rPr>
+        <w:t>incremented, and the process repeats, resulting in two scanlines for every CRTC character scanline</w:t>
       </w:r>
       <w:r>
         <w:rPr>
@@ -8281,20 +8507,11 @@
       </w:r>
     </w:p>
     <w:p>
-      <w:r>
-        <w:t>Display f</w:t>
-      </w:r>
-      <w:r>
-        <w:t xml:space="preserve">rame </w:t>
-      </w:r>
-      <w:r>
-        <w:t xml:space="preserve">recreation </w:t>
-      </w:r>
-      <w:r>
-        <w:t>support</w:t>
-      </w:r>
-      <w:r>
-        <w:t>s the following features</w:t>
+      <w:pPr>
+        <w:pStyle w:val="Heading4"/>
+      </w:pPr>
+      <w:r>
+        <w:t>Supported features</w:t>
       </w:r>
       <w:r>
         <w:t>:</w:t>
@@ -8388,6 +8605,9 @@
       </w:r>
     </w:p>
     <w:p>
+      <w:pPr>
+        <w:pStyle w:val="Heading4"/>
+      </w:pPr>
       <w:r>
         <w:t>Limitations:</w:t>
       </w:r>
@@ -8401,7 +8621,6 @@
         </w:numPr>
       </w:pPr>
       <w:r>
-        <w:lastRenderedPageBreak/>
         <w:t xml:space="preserve">No support for </w:t>
       </w:r>
       <w:r>
@@ -8619,6 +8838,7 @@
         </w:numPr>
       </w:pPr>
       <w:r>
+        <w:lastRenderedPageBreak/>
         <w:t xml:space="preserve">Use the CPU metrics to generate a call tree, </w:t>
       </w:r>
       <w:r>
@@ -9792,19 +10012,9 @@
           <w:numId w:val="12"/>
         </w:numPr>
       </w:pPr>
-      <w:proofErr w:type="gramStart"/>
-      <w:r>
-        <w:t>bool</w:t>
-      </w:r>
-      <w:proofErr w:type="gramEnd"/>
-      <w:r>
-        <w:t xml:space="preserve"> </w:t>
-      </w:r>
-      <w:proofErr w:type="gramStart"/>
-      <w:r>
-        <w:t>Execute(</w:t>
-      </w:r>
-      <w:proofErr w:type="gramEnd"/>
+      <w:r>
+        <w:t>bool Execute(</w:t>
+      </w:r>
       <w:r>
         <w:rPr>
           <w:b/>
@@ -9828,17 +10038,12 @@
         <w:t xml:space="preserve">bool </w:t>
       </w:r>
       <w:proofErr w:type="spellStart"/>
-      <w:proofErr w:type="gramStart"/>
       <w:r>
         <w:t>CanUndo</w:t>
       </w:r>
       <w:proofErr w:type="spellEnd"/>
       <w:r>
-        <w:t>(</w:t>
-      </w:r>
-      <w:proofErr w:type="gramEnd"/>
-      <w:r>
-        <w:t>)</w:t>
+        <w:t>()</w:t>
       </w:r>
     </w:p>
     <w:p>
@@ -9853,17 +10058,12 @@
         <w:t xml:space="preserve">bool </w:t>
       </w:r>
       <w:proofErr w:type="spellStart"/>
-      <w:proofErr w:type="gramStart"/>
       <w:r>
         <w:t>CanRedo</w:t>
       </w:r>
       <w:proofErr w:type="spellEnd"/>
       <w:r>
-        <w:t>(</w:t>
-      </w:r>
-      <w:proofErr w:type="gramEnd"/>
-      <w:r>
-        <w:t>)</w:t>
+        <w:t>()</w:t>
       </w:r>
     </w:p>
     <w:p>
@@ -9875,15 +10075,7 @@
         </w:numPr>
       </w:pPr>
       <w:r>
-        <w:t xml:space="preserve">void </w:t>
-      </w:r>
-      <w:proofErr w:type="gramStart"/>
-      <w:r>
-        <w:t>Undo(</w:t>
-      </w:r>
-      <w:proofErr w:type="gramEnd"/>
-      <w:r>
-        <w:t>)</w:t>
+        <w:t>void Undo()</w:t>
       </w:r>
     </w:p>
     <w:p>
@@ -9895,15 +10087,7 @@
         </w:numPr>
       </w:pPr>
       <w:r>
-        <w:t xml:space="preserve">void </w:t>
-      </w:r>
-      <w:proofErr w:type="gramStart"/>
-      <w:r>
-        <w:t>Redo(</w:t>
-      </w:r>
-      <w:proofErr w:type="gramEnd"/>
-      <w:r>
-        <w:t>)</w:t>
+        <w:t>void Redo()</w:t>
       </w:r>
     </w:p>
     <w:p>
@@ -9914,22 +10098,9 @@
           <w:numId w:val="12"/>
         </w:numPr>
       </w:pPr>
-      <w:proofErr w:type="gramStart"/>
       <w:r>
         <w:lastRenderedPageBreak/>
-        <w:t>void</w:t>
-      </w:r>
-      <w:proofErr w:type="gramEnd"/>
-      <w:r>
-        <w:t xml:space="preserve"> </w:t>
-      </w:r>
-      <w:proofErr w:type="gramStart"/>
-      <w:r>
-        <w:t>Clear(</w:t>
-      </w:r>
-      <w:proofErr w:type="gramEnd"/>
-      <w:r>
-        <w:t>)</w:t>
+        <w:t>void Clear()</w:t>
       </w:r>
     </w:p>
     <w:p>
@@ -9964,21 +10135,8 @@
           <w:numId w:val="12"/>
         </w:numPr>
       </w:pPr>
-      <w:proofErr w:type="gramStart"/>
-      <w:r>
-        <w:t>bool</w:t>
-      </w:r>
-      <w:proofErr w:type="gramEnd"/>
-      <w:r>
-        <w:t xml:space="preserve"> </w:t>
-      </w:r>
-      <w:proofErr w:type="gramStart"/>
-      <w:r>
-        <w:t>Execute(</w:t>
-      </w:r>
-      <w:proofErr w:type="gramEnd"/>
-      <w:r>
-        <w:t>)</w:t>
+      <w:r>
+        <w:t>bool Execute()</w:t>
       </w:r>
     </w:p>
     <w:p>
@@ -9990,15 +10148,7 @@
         </w:numPr>
       </w:pPr>
       <w:r>
-        <w:t xml:space="preserve">void </w:t>
-      </w:r>
-      <w:proofErr w:type="gramStart"/>
-      <w:r>
-        <w:t>Undo(</w:t>
-      </w:r>
-      <w:proofErr w:type="gramEnd"/>
-      <w:r>
-        <w:t>)</w:t>
+        <w:t>void Undo()</w:t>
       </w:r>
     </w:p>
     <w:p>
@@ -10010,15 +10160,7 @@
         </w:numPr>
       </w:pPr>
       <w:r>
-        <w:t xml:space="preserve">void </w:t>
-      </w:r>
-      <w:proofErr w:type="gramStart"/>
-      <w:r>
-        <w:t>Redo(</w:t>
-      </w:r>
-      <w:proofErr w:type="gramEnd"/>
-      <w:r>
-        <w:t>)</w:t>
+        <w:t>void Redo()</w:t>
       </w:r>
     </w:p>
     <w:p>
@@ -10073,21 +10215,12 @@
       <w:r>
         <w:t xml:space="preserve">The </w:t>
       </w:r>
-      <w:proofErr w:type="gramStart"/>
-      <w:r>
-        <w:rPr>
-          <w:b/>
-          <w:bCs/>
-        </w:rPr>
-        <w:t>Execute(</w:t>
-      </w:r>
-      <w:proofErr w:type="gramEnd"/>
-      <w:r>
-        <w:rPr>
-          <w:b/>
-          <w:bCs/>
-        </w:rPr>
-        <w:t>Operation</w:t>
+      <w:r>
+        <w:rPr>
+          <w:b/>
+          <w:bCs/>
+        </w:rPr>
+        <w:t>Execute(Operation</w:t>
       </w:r>
       <w:r>
         <w:t xml:space="preserve"> op)</w:t>
@@ -10392,15 +10525,7 @@
         <w:t xml:space="preserve">The </w:t>
       </w:r>
       <w:r>
-        <w:t xml:space="preserve">project </w:t>
-      </w:r>
-      <w:proofErr w:type="gramStart"/>
-      <w:r>
-        <w:t>builds</w:t>
-      </w:r>
-      <w:proofErr w:type="gramEnd"/>
-      <w:r>
-        <w:t xml:space="preserve"> </w:t>
+        <w:t xml:space="preserve">project builds </w:t>
       </w:r>
       <w:r>
         <w:t xml:space="preserve">to create </w:t>
@@ -10475,7 +10600,6 @@
       <w:pPr>
         <w:pStyle w:val="Heading1"/>
       </w:pPr>
-      <w:proofErr w:type="gramStart"/>
       <w:r>
         <w:lastRenderedPageBreak/>
         <w:t>.</w:t>
@@ -10484,11 +10608,7 @@
         <w:t>p</w:t>
       </w:r>
       <w:r>
-        <w:t>erf</w:t>
-      </w:r>
-      <w:proofErr w:type="gramEnd"/>
-      <w:r>
-        <w:t xml:space="preserve"> </w:t>
+        <w:t xml:space="preserve">erf </w:t>
       </w:r>
       <w:r>
         <w:t>F</w:t>
@@ -10693,7 +10813,19 @@
         <w:t xml:space="preserve">subsequent </w:t>
       </w:r>
       <w:r>
-        <w:t>6502 (or 65C02) instructions.  The log contains all 6502/65C02 register state changes, all memory accesses and values, plus key events like interrupts.  It also optionally contains label information.</w:t>
+        <w:t>6502 (or 65C02) instructions.  The log contains all 6502/65C02 register state changes, all memory accesses and values, plus key events like interrupts</w:t>
+      </w:r>
+      <w:r>
+        <w:t xml:space="preserve"> and new </w:t>
+      </w:r>
+      <w:r>
+        <w:t xml:space="preserve">display </w:t>
+      </w:r>
+      <w:r>
+        <w:t>frame</w:t>
+      </w:r>
+      <w:r>
+        <w:t>.  It also optionally contains label information.</w:t>
       </w:r>
     </w:p>
     <w:p>
@@ -11629,15 +11761,7 @@
         <w:t xml:space="preserve">The header chunk is the first chunk </w:t>
       </w:r>
       <w:r>
-        <w:t xml:space="preserve">in the </w:t>
-      </w:r>
-      <w:proofErr w:type="gramStart"/>
-      <w:r>
-        <w:t>file</w:t>
-      </w:r>
-      <w:proofErr w:type="gramEnd"/>
-      <w:r>
-        <w:t xml:space="preserve"> </w:t>
+        <w:t xml:space="preserve">in the file </w:t>
       </w:r>
       <w:r>
         <w:t>and it contains the file’s version, BBC model, and the total execution count.</w:t>
@@ -12568,7 +12692,7 @@
         <w:t xml:space="preserve">The </w:t>
       </w:r>
       <w:r>
-        <w:t>Snapshot Chunk contains a snapshot of the machine’s state at the beginning of the recording, prior to the first recorded instruction (see execution-chuck).  It contains a snapshot of the machine’s CPU registers, paging registers, call stack, video 6845 and ULA registers, and</w:t>
+        <w:t>Snapshot Chunk contains a snapshot of the machine’s state at the beginning of the recording, prior to the first recorded instruction (see execution-chuck).  It contains a snapshot of the machine’s CPU registers, paging registers, call stack, registers, and</w:t>
       </w:r>
       <w:r>
         <w:t xml:space="preserve"> </w:t>
@@ -12783,56 +12907,6 @@
         <w:t>&lt;</w:t>
       </w:r>
       <w:proofErr w:type="spellStart"/>
-      <w:r>
-        <w:t>video_ula_state</w:t>
-      </w:r>
-      <w:proofErr w:type="spellEnd"/>
-      <w:r>
-        <w:t xml:space="preserve">&gt; + </w:t>
-      </w:r>
-      <w:r>
-        <w:t>&lt;</w:t>
-      </w:r>
-      <w:proofErr w:type="spellStart"/>
-      <w:r>
-        <w:t>video_</w:t>
-      </w:r>
-      <w:r>
-        <w:t>crtc</w:t>
-      </w:r>
-      <w:r>
-        <w:t>_state</w:t>
-      </w:r>
-      <w:proofErr w:type="spellEnd"/>
-      <w:r>
-        <w:t xml:space="preserve">&gt; </w:t>
-      </w:r>
-      <w:r>
-        <w:t>+</w:t>
-      </w:r>
-      <w:r>
-        <w:t xml:space="preserve"> &lt;</w:t>
-      </w:r>
-      <w:proofErr w:type="spellStart"/>
-      <w:r>
-        <w:t>display_scanline</w:t>
-      </w:r>
-      <w:proofErr w:type="spellEnd"/>
-      <w:r>
-        <w:t xml:space="preserve">&gt; </w:t>
-      </w:r>
-      <w:proofErr w:type="gramStart"/>
-      <w:r>
-        <w:t xml:space="preserve">+ </w:t>
-      </w:r>
-      <w:r>
-        <w:t xml:space="preserve"> </w:t>
-      </w:r>
-      <w:r>
-        <w:t>&lt;</w:t>
-      </w:r>
-      <w:proofErr w:type="spellStart"/>
-      <w:proofErr w:type="gramEnd"/>
       <w:r>
         <w:t>screen_wrap_address</w:t>
       </w:r>
@@ -14312,1165 +14386,6 @@
     </w:p>
     <w:p>
       <w:pPr>
-        <w:ind w:left="720" w:hanging="360"/>
-      </w:pPr>
-      <w:r>
-        <w:rPr>
-          <w:b/>
-          <w:bCs/>
-        </w:rPr>
-        <w:t>&lt;</w:t>
-      </w:r>
-      <w:proofErr w:type="spellStart"/>
-      <w:r>
-        <w:rPr>
-          <w:b/>
-          <w:bCs/>
-        </w:rPr>
-        <w:t>video_ula_state</w:t>
-      </w:r>
-      <w:proofErr w:type="spellEnd"/>
-      <w:r>
-        <w:rPr>
-          <w:b/>
-          <w:bCs/>
-        </w:rPr>
-        <w:t>&gt;</w:t>
-      </w:r>
-      <w:r>
-        <w:t xml:space="preserve"> </w:t>
-      </w:r>
-      <w:proofErr w:type="gramStart"/>
-      <w:r>
-        <w:t xml:space="preserve">= </w:t>
-      </w:r>
-      <w:r>
-        <w:t xml:space="preserve"> </w:t>
-      </w:r>
-      <w:r>
-        <w:t>&lt;</w:t>
-      </w:r>
-      <w:proofErr w:type="spellStart"/>
-      <w:proofErr w:type="gramEnd"/>
-      <w:r>
-        <w:t>video_ula_control_register</w:t>
-      </w:r>
-      <w:proofErr w:type="spellEnd"/>
-      <w:r>
-        <w:t>&gt;</w:t>
-      </w:r>
-      <w:r>
-        <w:t xml:space="preserve"> + &lt;</w:t>
-      </w:r>
-      <w:proofErr w:type="spellStart"/>
-      <w:r>
-        <w:t>video_ula_</w:t>
-      </w:r>
-      <w:r>
-        <w:t>palette</w:t>
-      </w:r>
-      <w:proofErr w:type="spellEnd"/>
-      <w:r>
-        <w:t>&gt;</w:t>
-      </w:r>
-    </w:p>
-    <w:p>
-      <w:pPr>
-        <w:ind w:left="720"/>
-      </w:pPr>
-      <w:r>
-        <w:rPr>
-          <w:b/>
-          <w:bCs/>
-        </w:rPr>
-        <w:t>&lt;</w:t>
-      </w:r>
-      <w:proofErr w:type="spellStart"/>
-      <w:r>
-        <w:rPr>
-          <w:b/>
-          <w:bCs/>
-        </w:rPr>
-        <w:t>video_ula_</w:t>
-      </w:r>
-      <w:r>
-        <w:rPr>
-          <w:b/>
-          <w:bCs/>
-        </w:rPr>
-        <w:t>control_register</w:t>
-      </w:r>
-      <w:proofErr w:type="spellEnd"/>
-      <w:r>
-        <w:rPr>
-          <w:b/>
-          <w:bCs/>
-        </w:rPr>
-        <w:t>&gt;</w:t>
-      </w:r>
-      <w:r>
-        <w:t xml:space="preserve"> (1 byte).  The value of the ULA video control register.</w:t>
-      </w:r>
-    </w:p>
-    <w:p>
-      <w:pPr>
-        <w:ind w:left="720"/>
-      </w:pPr>
-      <w:r>
-        <w:rPr>
-          <w:b/>
-          <w:bCs/>
-        </w:rPr>
-        <w:t>&lt;</w:t>
-      </w:r>
-      <w:proofErr w:type="spellStart"/>
-      <w:r>
-        <w:rPr>
-          <w:b/>
-          <w:bCs/>
-        </w:rPr>
-        <w:t>video_ula_palette</w:t>
-      </w:r>
-      <w:proofErr w:type="spellEnd"/>
-      <w:r>
-        <w:rPr>
-          <w:b/>
-          <w:bCs/>
-        </w:rPr>
-        <w:t>&gt;</w:t>
-      </w:r>
-      <w:r>
-        <w:t xml:space="preserve"> (16 bytes).  The ULA’s 16 palette entries where physical colors are </w:t>
-      </w:r>
-      <w:proofErr w:type="spellStart"/>
-      <w:r>
-        <w:t>xor’d</w:t>
-      </w:r>
-      <w:proofErr w:type="spellEnd"/>
-      <w:r>
-        <w:t xml:space="preserve"> with 0x7.</w:t>
-      </w:r>
-    </w:p>
-    <w:p>
-      <w:pPr>
-        <w:ind w:left="720" w:hanging="360"/>
-      </w:pPr>
-      <w:r>
-        <w:rPr>
-          <w:b/>
-          <w:bCs/>
-        </w:rPr>
-        <w:t>&lt;</w:t>
-      </w:r>
-      <w:proofErr w:type="spellStart"/>
-      <w:r>
-        <w:rPr>
-          <w:b/>
-          <w:bCs/>
-        </w:rPr>
-        <w:t>video_</w:t>
-      </w:r>
-      <w:r>
-        <w:rPr>
-          <w:b/>
-          <w:bCs/>
-        </w:rPr>
-        <w:t>crtc</w:t>
-      </w:r>
-      <w:r>
-        <w:rPr>
-          <w:b/>
-          <w:bCs/>
-        </w:rPr>
-        <w:t>_state</w:t>
-      </w:r>
-      <w:proofErr w:type="spellEnd"/>
-      <w:r>
-        <w:rPr>
-          <w:b/>
-          <w:bCs/>
-        </w:rPr>
-        <w:t>&gt;</w:t>
-      </w:r>
-      <w:r>
-        <w:t xml:space="preserve"> = </w:t>
-      </w:r>
-      <w:r>
-        <w:br/>
-      </w:r>
-      <w:r>
-        <w:t>&lt;</w:t>
-      </w:r>
-      <w:proofErr w:type="spellStart"/>
-      <w:r>
-        <w:t>video_</w:t>
-      </w:r>
-      <w:r>
-        <w:t>crtc</w:t>
-      </w:r>
-      <w:r>
-        <w:t>_register_select</w:t>
-      </w:r>
-      <w:proofErr w:type="spellEnd"/>
-      <w:r>
-        <w:t xml:space="preserve">&gt; + </w:t>
-      </w:r>
-      <w:r>
-        <w:t>&lt;</w:t>
-      </w:r>
-      <w:proofErr w:type="spellStart"/>
-      <w:r>
-        <w:t>video_</w:t>
-      </w:r>
-      <w:r>
-        <w:t>crtc</w:t>
-      </w:r>
-      <w:r>
-        <w:t>_registers</w:t>
-      </w:r>
-      <w:proofErr w:type="spellEnd"/>
-      <w:r>
-        <w:t>&gt; + &lt;</w:t>
-      </w:r>
-      <w:r>
-        <w:t xml:space="preserve"> &lt;</w:t>
-      </w:r>
-      <w:proofErr w:type="spellStart"/>
-      <w:r>
-        <w:t>video_</w:t>
-      </w:r>
-      <w:r>
-        <w:t>crtc</w:t>
-      </w:r>
-      <w:r>
-        <w:t>_character_row</w:t>
-      </w:r>
-      <w:proofErr w:type="spellEnd"/>
-      <w:r>
-        <w:t>&gt; + &lt;</w:t>
-      </w:r>
-      <w:proofErr w:type="spellStart"/>
-      <w:r>
-        <w:t>video_</w:t>
-      </w:r>
-      <w:r>
-        <w:t>crtc</w:t>
-      </w:r>
-      <w:r>
-        <w:t>_character_column</w:t>
-      </w:r>
-      <w:proofErr w:type="spellEnd"/>
-      <w:r>
-        <w:t>&gt;</w:t>
-      </w:r>
-      <w:r>
-        <w:t xml:space="preserve"> </w:t>
-      </w:r>
-      <w:r>
-        <w:t xml:space="preserve">+ </w:t>
-      </w:r>
-      <w:r>
-        <w:t>&lt;</w:t>
-      </w:r>
-      <w:proofErr w:type="spellStart"/>
-      <w:r>
-        <w:t>video_</w:t>
-      </w:r>
-      <w:r>
-        <w:t>crtc</w:t>
-      </w:r>
-      <w:r>
-        <w:t>_character_scanline</w:t>
-      </w:r>
-      <w:proofErr w:type="spellEnd"/>
-      <w:r>
-        <w:t xml:space="preserve">&gt; + </w:t>
-      </w:r>
-      <w:r>
-        <w:t>&lt;</w:t>
-      </w:r>
-      <w:proofErr w:type="spellStart"/>
-      <w:r>
-        <w:t>video_</w:t>
-      </w:r>
-      <w:r>
-        <w:t>crtc</w:t>
-      </w:r>
-      <w:r>
-        <w:t>_horizontal_sync_count</w:t>
-      </w:r>
-      <w:proofErr w:type="spellEnd"/>
-      <w:r>
-        <w:t>&gt;</w:t>
-      </w:r>
-      <w:r>
-        <w:t xml:space="preserve"> + </w:t>
-      </w:r>
-      <w:r>
-        <w:t>&lt;</w:t>
-      </w:r>
-      <w:proofErr w:type="spellStart"/>
-      <w:r>
-        <w:t>video_</w:t>
-      </w:r>
-      <w:r>
-        <w:t>crtc</w:t>
-      </w:r>
-      <w:r>
-        <w:t>_</w:t>
-      </w:r>
-      <w:r>
-        <w:t>field</w:t>
-      </w:r>
-      <w:proofErr w:type="spellEnd"/>
-      <w:r>
-        <w:t>&gt;</w:t>
-      </w:r>
-    </w:p>
-    <w:p>
-      <w:pPr>
-        <w:ind w:left="720"/>
-      </w:pPr>
-      <w:r>
-        <w:rPr>
-          <w:b/>
-          <w:bCs/>
-        </w:rPr>
-        <w:t>&lt;</w:t>
-      </w:r>
-      <w:proofErr w:type="spellStart"/>
-      <w:r>
-        <w:rPr>
-          <w:b/>
-          <w:bCs/>
-        </w:rPr>
-        <w:t>video_</w:t>
-      </w:r>
-      <w:r>
-        <w:rPr>
-          <w:b/>
-          <w:bCs/>
-        </w:rPr>
-        <w:t>crtc</w:t>
-      </w:r>
-      <w:r>
-        <w:rPr>
-          <w:b/>
-          <w:bCs/>
-        </w:rPr>
-        <w:t>_</w:t>
-      </w:r>
-      <w:r>
-        <w:rPr>
-          <w:b/>
-          <w:bCs/>
-        </w:rPr>
-        <w:t>register</w:t>
-      </w:r>
-      <w:r>
-        <w:rPr>
-          <w:b/>
-          <w:bCs/>
-        </w:rPr>
-        <w:t>_select</w:t>
-      </w:r>
-      <w:proofErr w:type="spellEnd"/>
-      <w:r>
-        <w:rPr>
-          <w:b/>
-          <w:bCs/>
-        </w:rPr>
-        <w:t xml:space="preserve">&gt; </w:t>
-      </w:r>
-      <w:r>
-        <w:t xml:space="preserve">(1 byte).  The </w:t>
-      </w:r>
-      <w:r>
-        <w:t>CRTC</w:t>
-      </w:r>
-      <w:r>
-        <w:t>’s</w:t>
-      </w:r>
-      <w:r>
-        <w:t xml:space="preserve"> </w:t>
-      </w:r>
-      <w:r>
-        <w:t>‘</w:t>
-      </w:r>
-      <w:r>
-        <w:t>register</w:t>
-      </w:r>
-      <w:r>
-        <w:t xml:space="preserve"> </w:t>
-      </w:r>
-      <w:r>
-        <w:t>select</w:t>
-      </w:r>
-      <w:r>
-        <w:t>’</w:t>
-      </w:r>
-      <w:r>
-        <w:t xml:space="preserve">, </w:t>
-      </w:r>
-      <w:r>
-        <w:t xml:space="preserve">which is used to write </w:t>
-      </w:r>
-      <w:r>
-        <w:t xml:space="preserve">values to the </w:t>
-      </w:r>
-      <w:r>
-        <w:t xml:space="preserve">CRTC’s </w:t>
-      </w:r>
-      <w:r>
-        <w:t>register</w:t>
-      </w:r>
-      <w:r>
-        <w:t>s</w:t>
-      </w:r>
-      <w:r>
-        <w:t>.</w:t>
-      </w:r>
-      <w:r>
-        <w:t xml:space="preserve">  The value is in the range 0 to 17</w:t>
-      </w:r>
-      <w:r>
-        <w:t>.</w:t>
-      </w:r>
-    </w:p>
-    <w:p>
-      <w:pPr>
-        <w:ind w:left="720"/>
-      </w:pPr>
-      <w:r>
-        <w:rPr>
-          <w:b/>
-          <w:bCs/>
-        </w:rPr>
-        <w:lastRenderedPageBreak/>
-        <w:t>&lt;</w:t>
-      </w:r>
-      <w:proofErr w:type="spellStart"/>
-      <w:r>
-        <w:rPr>
-          <w:b/>
-          <w:bCs/>
-        </w:rPr>
-        <w:t>video_</w:t>
-      </w:r>
-      <w:r>
-        <w:rPr>
-          <w:b/>
-          <w:bCs/>
-        </w:rPr>
-        <w:t>crtc</w:t>
-      </w:r>
-      <w:r>
-        <w:rPr>
-          <w:b/>
-          <w:bCs/>
-        </w:rPr>
-        <w:t>_registers</w:t>
-      </w:r>
-      <w:proofErr w:type="spellEnd"/>
-      <w:r>
-        <w:rPr>
-          <w:b/>
-          <w:bCs/>
-        </w:rPr>
-        <w:t>&gt;</w:t>
-      </w:r>
-      <w:r>
-        <w:rPr>
-          <w:b/>
-          <w:bCs/>
-        </w:rPr>
-        <w:t xml:space="preserve"> </w:t>
-      </w:r>
-      <w:r>
-        <w:t xml:space="preserve">(18 bytes).  The </w:t>
-      </w:r>
-      <w:r>
-        <w:t>value</w:t>
-      </w:r>
-      <w:r>
-        <w:t>s</w:t>
-      </w:r>
-      <w:r>
-        <w:t xml:space="preserve"> of the </w:t>
-      </w:r>
-      <w:r>
-        <w:t>CRTC</w:t>
-      </w:r>
-      <w:r>
-        <w:t>’s</w:t>
-      </w:r>
-      <w:r>
-        <w:t xml:space="preserve"> 18 registers.</w:t>
-      </w:r>
-    </w:p>
-    <w:p>
-      <w:pPr>
-        <w:ind w:left="720"/>
-      </w:pPr>
-      <w:r>
-        <w:rPr>
-          <w:b/>
-          <w:bCs/>
-        </w:rPr>
-        <w:t>&lt;</w:t>
-      </w:r>
-      <w:proofErr w:type="spellStart"/>
-      <w:r>
-        <w:rPr>
-          <w:b/>
-          <w:bCs/>
-        </w:rPr>
-        <w:t>video_</w:t>
-      </w:r>
-      <w:r>
-        <w:rPr>
-          <w:b/>
-          <w:bCs/>
-        </w:rPr>
-        <w:t>crtc</w:t>
-      </w:r>
-      <w:r>
-        <w:rPr>
-          <w:b/>
-          <w:bCs/>
-        </w:rPr>
-        <w:t>_character_row</w:t>
-      </w:r>
-      <w:proofErr w:type="spellEnd"/>
-      <w:r>
-        <w:rPr>
-          <w:b/>
-          <w:bCs/>
-        </w:rPr>
-        <w:t>&gt;</w:t>
-      </w:r>
-      <w:r>
-        <w:t xml:space="preserve"> (1 byte)</w:t>
-      </w:r>
-      <w:r>
-        <w:t xml:space="preserve">.  The </w:t>
-      </w:r>
-      <w:r>
-        <w:t xml:space="preserve">value of the </w:t>
-      </w:r>
-      <w:r>
-        <w:t>CRTC</w:t>
-      </w:r>
-      <w:r>
-        <w:t>’s</w:t>
-      </w:r>
-      <w:r>
-        <w:t xml:space="preserve"> internal character row counter</w:t>
-      </w:r>
-      <w:r>
-        <w:t>, which is incremented every character row</w:t>
-      </w:r>
-      <w:r>
-        <w:t>, and reset every frame.</w:t>
-      </w:r>
-    </w:p>
-    <w:p>
-      <w:pPr>
-        <w:ind w:left="720"/>
-      </w:pPr>
-      <w:r>
-        <w:rPr>
-          <w:b/>
-          <w:bCs/>
-        </w:rPr>
-        <w:t>&lt;</w:t>
-      </w:r>
-      <w:proofErr w:type="spellStart"/>
-      <w:r>
-        <w:rPr>
-          <w:b/>
-          <w:bCs/>
-        </w:rPr>
-        <w:t>video_</w:t>
-      </w:r>
-      <w:r>
-        <w:rPr>
-          <w:b/>
-          <w:bCs/>
-        </w:rPr>
-        <w:t>crtc</w:t>
-      </w:r>
-      <w:r>
-        <w:rPr>
-          <w:b/>
-          <w:bCs/>
-        </w:rPr>
-        <w:t>_character_column</w:t>
-      </w:r>
-      <w:proofErr w:type="spellEnd"/>
-      <w:r>
-        <w:rPr>
-          <w:b/>
-          <w:bCs/>
-        </w:rPr>
-        <w:t>&gt;</w:t>
-      </w:r>
-      <w:r>
-        <w:t xml:space="preserve"> (1 byte)</w:t>
-      </w:r>
-      <w:r>
-        <w:t xml:space="preserve">.  The </w:t>
-      </w:r>
-      <w:r>
-        <w:t xml:space="preserve">value of the </w:t>
-      </w:r>
-      <w:r>
-        <w:t>CRTC</w:t>
-      </w:r>
-      <w:r>
-        <w:t>’s</w:t>
-      </w:r>
-      <w:r>
-        <w:t xml:space="preserve"> internal character </w:t>
-      </w:r>
-      <w:r>
-        <w:t>column counter</w:t>
-      </w:r>
-      <w:r>
-        <w:t>, which is reset at the end of every scanline.</w:t>
-      </w:r>
-    </w:p>
-    <w:p>
-      <w:pPr>
-        <w:ind w:left="720"/>
-      </w:pPr>
-      <w:r>
-        <w:rPr>
-          <w:b/>
-          <w:bCs/>
-        </w:rPr>
-        <w:t>&lt;</w:t>
-      </w:r>
-      <w:proofErr w:type="spellStart"/>
-      <w:r>
-        <w:rPr>
-          <w:b/>
-          <w:bCs/>
-        </w:rPr>
-        <w:t>video_</w:t>
-      </w:r>
-      <w:r>
-        <w:rPr>
-          <w:b/>
-          <w:bCs/>
-        </w:rPr>
-        <w:t>crtc</w:t>
-      </w:r>
-      <w:r>
-        <w:rPr>
-          <w:b/>
-          <w:bCs/>
-        </w:rPr>
-        <w:t>_charact</w:t>
-      </w:r>
-      <w:r>
-        <w:rPr>
-          <w:b/>
-          <w:bCs/>
-        </w:rPr>
-        <w:t>er_scanline</w:t>
-      </w:r>
-      <w:proofErr w:type="spellEnd"/>
-      <w:r>
-        <w:rPr>
-          <w:b/>
-          <w:bCs/>
-        </w:rPr>
-        <w:t>&gt;</w:t>
-      </w:r>
-      <w:r>
-        <w:t xml:space="preserve"> </w:t>
-      </w:r>
-      <w:r>
-        <w:t>(1 byte)</w:t>
-      </w:r>
-      <w:r>
-        <w:t xml:space="preserve">.  The </w:t>
-      </w:r>
-      <w:r>
-        <w:t xml:space="preserve">value of the </w:t>
-      </w:r>
-      <w:r>
-        <w:t>CRTC</w:t>
-      </w:r>
-      <w:r>
-        <w:t>’s</w:t>
-      </w:r>
-      <w:r>
-        <w:t xml:space="preserve"> internal character </w:t>
-      </w:r>
-      <w:r>
-        <w:t xml:space="preserve">scanline </w:t>
-      </w:r>
-      <w:r>
-        <w:t>counter</w:t>
-      </w:r>
-      <w:r>
-        <w:t>, which is incremented every scanline</w:t>
-      </w:r>
-      <w:r>
-        <w:t xml:space="preserve"> (by two in interlaced video mode)</w:t>
-      </w:r>
-      <w:r>
-        <w:t>, and reset every character row</w:t>
-      </w:r>
-      <w:r>
-        <w:t xml:space="preserve"> (to zero or one in interlaced video mode).</w:t>
-      </w:r>
-    </w:p>
-    <w:p>
-      <w:pPr>
-        <w:ind w:left="720"/>
-      </w:pPr>
-      <w:r>
-        <w:rPr>
-          <w:b/>
-          <w:bCs/>
-        </w:rPr>
-        <w:t>&lt;</w:t>
-      </w:r>
-      <w:proofErr w:type="spellStart"/>
-      <w:r>
-        <w:rPr>
-          <w:b/>
-          <w:bCs/>
-        </w:rPr>
-        <w:t>video_</w:t>
-      </w:r>
-      <w:r>
-        <w:rPr>
-          <w:b/>
-          <w:bCs/>
-        </w:rPr>
-        <w:t>crtc</w:t>
-      </w:r>
-      <w:r>
-        <w:rPr>
-          <w:b/>
-          <w:bCs/>
-        </w:rPr>
-        <w:t>_</w:t>
-      </w:r>
-      <w:r>
-        <w:rPr>
-          <w:b/>
-          <w:bCs/>
-        </w:rPr>
-        <w:t>display_scanline</w:t>
-      </w:r>
-      <w:proofErr w:type="spellEnd"/>
-      <w:r>
-        <w:rPr>
-          <w:b/>
-          <w:bCs/>
-        </w:rPr>
-        <w:t>&gt;</w:t>
-      </w:r>
-      <w:r>
-        <w:t xml:space="preserve"> (2 bytes).  </w:t>
-      </w:r>
-      <w:r>
-        <w:t>T</w:t>
-      </w:r>
-      <w:r>
-        <w:t xml:space="preserve">he </w:t>
-      </w:r>
-      <w:r>
-        <w:t>current display scanline.  Th</w:t>
-      </w:r>
-      <w:r>
-        <w:t xml:space="preserve">is </w:t>
-      </w:r>
-      <w:r>
-        <w:t xml:space="preserve">is essentially </w:t>
-      </w:r>
-      <w:r>
-        <w:t xml:space="preserve">the </w:t>
-      </w:r>
-      <w:r>
-        <w:t xml:space="preserve">number of </w:t>
-      </w:r>
-      <w:r>
-        <w:t xml:space="preserve">HSYNC’s </w:t>
-      </w:r>
-      <w:r>
-        <w:t xml:space="preserve">that have occurred </w:t>
-      </w:r>
-      <w:r>
-        <w:t xml:space="preserve">since </w:t>
-      </w:r>
-      <w:r>
-        <w:t>the last VSYNC</w:t>
-      </w:r>
-      <w:proofErr w:type="gramStart"/>
-      <w:r>
-        <w:t>.</w:t>
-      </w:r>
-      <w:r>
-        <w:t xml:space="preserve"> </w:t>
-      </w:r>
-      <w:proofErr w:type="gramEnd"/>
-      <w:r>
-        <w:t>(</w:t>
-      </w:r>
-      <w:proofErr w:type="gramStart"/>
-      <w:r>
-        <w:t>0..</w:t>
-      </w:r>
-      <w:proofErr w:type="gramEnd"/>
-      <w:r>
-        <w:t>311</w:t>
-      </w:r>
-      <w:r>
-        <w:t>).</w:t>
-      </w:r>
-    </w:p>
-    <w:p>
-      <w:pPr>
-        <w:ind w:left="720"/>
-      </w:pPr>
-      <w:r>
-        <w:rPr>
-          <w:b/>
-          <w:bCs/>
-        </w:rPr>
-        <w:t>&lt;</w:t>
-      </w:r>
-      <w:proofErr w:type="spellStart"/>
-      <w:r>
-        <w:rPr>
-          <w:b/>
-          <w:bCs/>
-        </w:rPr>
-        <w:t>video_</w:t>
-      </w:r>
-      <w:r>
-        <w:rPr>
-          <w:b/>
-          <w:bCs/>
-        </w:rPr>
-        <w:t>crtc</w:t>
-      </w:r>
-      <w:r>
-        <w:rPr>
-          <w:b/>
-          <w:bCs/>
-        </w:rPr>
-        <w:t>_</w:t>
-      </w:r>
-      <w:r>
-        <w:rPr>
-          <w:b/>
-          <w:bCs/>
-        </w:rPr>
-        <w:t>display_</w:t>
-      </w:r>
-      <w:r>
-        <w:rPr>
-          <w:b/>
-          <w:bCs/>
-        </w:rPr>
-        <w:t>field</w:t>
-      </w:r>
-      <w:proofErr w:type="spellEnd"/>
-      <w:r>
-        <w:rPr>
-          <w:b/>
-          <w:bCs/>
-        </w:rPr>
-        <w:t>&gt;</w:t>
-      </w:r>
-      <w:r>
-        <w:rPr>
-          <w:b/>
-          <w:bCs/>
-        </w:rPr>
-        <w:t xml:space="preserve"> </w:t>
-      </w:r>
-      <w:r>
-        <w:t>(1 byte)</w:t>
-      </w:r>
-      <w:r>
-        <w:t xml:space="preserve">. </w:t>
-      </w:r>
-      <w:r>
-        <w:t xml:space="preserve"> </w:t>
-      </w:r>
-      <w:r>
-        <w:t xml:space="preserve">The value is zero for </w:t>
-      </w:r>
-      <w:r>
-        <w:t>normal</w:t>
-      </w:r>
-      <w:r>
-        <w:t xml:space="preserve"> </w:t>
-      </w:r>
-      <w:r>
-        <w:t xml:space="preserve">sync and even numbered </w:t>
-      </w:r>
-      <w:r>
-        <w:t>interlaced</w:t>
-      </w:r>
-      <w:r>
-        <w:t xml:space="preserve"> </w:t>
-      </w:r>
-      <w:r>
-        <w:t xml:space="preserve">sync </w:t>
-      </w:r>
-      <w:r>
-        <w:t xml:space="preserve">fields, </w:t>
-      </w:r>
-      <w:r>
-        <w:t xml:space="preserve">and one for </w:t>
-      </w:r>
-      <w:r>
-        <w:t xml:space="preserve">odd numbered </w:t>
-      </w:r>
-      <w:r>
-        <w:t>interlaced</w:t>
-      </w:r>
-      <w:r>
-        <w:t xml:space="preserve"> sync </w:t>
-      </w:r>
-      <w:r>
-        <w:t>fields</w:t>
-      </w:r>
-      <w:r>
-        <w:t>, as shown in the table below:</w:t>
-      </w:r>
-    </w:p>
-    <w:tbl>
-      <w:tblPr>
-        <w:tblStyle w:val="TableGrid"/>
-        <w:tblW w:w="0" w:type="auto"/>
-        <w:tblInd w:w="720" w:type="dxa"/>
-        <w:tblLook w:val="04A0" w:firstRow="1" w:lastRow="0" w:firstColumn="1" w:lastColumn="0" w:noHBand="0" w:noVBand="1"/>
-      </w:tblPr>
-      <w:tblGrid>
-        <w:gridCol w:w="2896"/>
-        <w:gridCol w:w="2867"/>
-        <w:gridCol w:w="2867"/>
-      </w:tblGrid>
-      <w:tr>
-        <w:tc>
-          <w:tcPr>
-            <w:tcW w:w="3116" w:type="dxa"/>
-          </w:tcPr>
-          <w:p>
-            <w:pPr>
-              <w:rPr>
-                <w:b/>
-                <w:bCs/>
-              </w:rPr>
-            </w:pPr>
-            <w:r>
-              <w:rPr>
-                <w:b/>
-                <w:bCs/>
-              </w:rPr>
-              <w:t>Sync mode</w:t>
-            </w:r>
-          </w:p>
-        </w:tc>
-        <w:tc>
-          <w:tcPr>
-            <w:tcW w:w="3117" w:type="dxa"/>
-          </w:tcPr>
-          <w:p>
-            <w:pPr>
-              <w:jc w:val="center"/>
-              <w:rPr>
-                <w:b/>
-                <w:bCs/>
-              </w:rPr>
-            </w:pPr>
-            <w:r>
-              <w:rPr>
-                <w:b/>
-                <w:bCs/>
-              </w:rPr>
-              <w:t>Even display field</w:t>
-            </w:r>
-          </w:p>
-        </w:tc>
-        <w:tc>
-          <w:tcPr>
-            <w:tcW w:w="3117" w:type="dxa"/>
-          </w:tcPr>
-          <w:p>
-            <w:pPr>
-              <w:jc w:val="center"/>
-              <w:rPr>
-                <w:b/>
-                <w:bCs/>
-              </w:rPr>
-            </w:pPr>
-            <w:r>
-              <w:rPr>
-                <w:b/>
-                <w:bCs/>
-              </w:rPr>
-              <w:t>Odd display field</w:t>
-            </w:r>
-          </w:p>
-        </w:tc>
-      </w:tr>
-      <w:tr>
-        <w:tc>
-          <w:tcPr>
-            <w:tcW w:w="3116" w:type="dxa"/>
-          </w:tcPr>
-          <w:p>
-            <w:r>
-              <w:t xml:space="preserve">Normal </w:t>
-            </w:r>
-            <w:r>
-              <w:t>S</w:t>
-            </w:r>
-            <w:r>
-              <w:t>ync</w:t>
-            </w:r>
-          </w:p>
-        </w:tc>
-        <w:tc>
-          <w:tcPr>
-            <w:tcW w:w="3117" w:type="dxa"/>
-          </w:tcPr>
-          <w:p>
-            <w:pPr>
-              <w:jc w:val="center"/>
-            </w:pPr>
-            <w:r>
-              <w:t>0</w:t>
-            </w:r>
-          </w:p>
-        </w:tc>
-        <w:tc>
-          <w:tcPr>
-            <w:tcW w:w="3117" w:type="dxa"/>
-          </w:tcPr>
-          <w:p>
-            <w:pPr>
-              <w:jc w:val="center"/>
-            </w:pPr>
-            <w:r>
-              <w:t>0</w:t>
-            </w:r>
-          </w:p>
-        </w:tc>
-      </w:tr>
-      <w:tr>
-        <w:tc>
-          <w:tcPr>
-            <w:tcW w:w="3116" w:type="dxa"/>
-          </w:tcPr>
-          <w:p>
-            <w:r>
-              <w:t xml:space="preserve">Interlaced </w:t>
-            </w:r>
-            <w:r>
-              <w:t>S</w:t>
-            </w:r>
-            <w:r>
-              <w:t>ync</w:t>
-            </w:r>
-          </w:p>
-        </w:tc>
-        <w:tc>
-          <w:tcPr>
-            <w:tcW w:w="3117" w:type="dxa"/>
-          </w:tcPr>
-          <w:p>
-            <w:pPr>
-              <w:jc w:val="center"/>
-            </w:pPr>
-            <w:r>
-              <w:t>0</w:t>
-            </w:r>
-          </w:p>
-        </w:tc>
-        <w:tc>
-          <w:tcPr>
-            <w:tcW w:w="3117" w:type="dxa"/>
-          </w:tcPr>
-          <w:p>
-            <w:pPr>
-              <w:jc w:val="center"/>
-            </w:pPr>
-            <w:r>
-              <w:t>1</w:t>
-            </w:r>
-          </w:p>
-        </w:tc>
-      </w:tr>
-      <w:tr>
-        <w:tc>
-          <w:tcPr>
-            <w:tcW w:w="3116" w:type="dxa"/>
-          </w:tcPr>
-          <w:p>
-            <w:r>
-              <w:t xml:space="preserve">Interlaced </w:t>
-            </w:r>
-            <w:r>
-              <w:t>S</w:t>
-            </w:r>
-            <w:r>
-              <w:t xml:space="preserve">ync &amp; </w:t>
-            </w:r>
-            <w:r>
-              <w:t>V</w:t>
-            </w:r>
-            <w:r>
-              <w:t>ideo</w:t>
-            </w:r>
-          </w:p>
-        </w:tc>
-        <w:tc>
-          <w:tcPr>
-            <w:tcW w:w="3117" w:type="dxa"/>
-          </w:tcPr>
-          <w:p>
-            <w:pPr>
-              <w:jc w:val="center"/>
-            </w:pPr>
-            <w:r>
-              <w:t>0</w:t>
-            </w:r>
-          </w:p>
-        </w:tc>
-        <w:tc>
-          <w:tcPr>
-            <w:tcW w:w="3117" w:type="dxa"/>
-          </w:tcPr>
-          <w:p>
-            <w:pPr>
-              <w:jc w:val="center"/>
-            </w:pPr>
-            <w:r>
-              <w:t>1</w:t>
-            </w:r>
-          </w:p>
-        </w:tc>
-      </w:tr>
-    </w:tbl>
-    <w:p>
-      <w:pPr>
-        <w:ind w:left="720"/>
-      </w:pPr>
-    </w:p>
-    <w:p>
-      <w:pPr>
         <w:ind w:left="360"/>
       </w:pPr>
       <w:r>
@@ -15816,6 +14731,7 @@
         <w:ind w:left="720"/>
       </w:pPr>
       <w:r>
+        <w:lastRenderedPageBreak/>
         <w:t>The following table shows which elements are included based on the BBC model.</w:t>
       </w:r>
     </w:p>
@@ -15851,7 +14767,6 @@
                 <w:b/>
                 <w:bCs/>
               </w:rPr>
-              <w:lastRenderedPageBreak/>
               <w:t>Included memory</w:t>
             </w:r>
           </w:p>
@@ -16861,16 +15776,11 @@
         <w:t xml:space="preserve"> </w:t>
       </w:r>
       <w:r>
-        <w:t>Integra</w:t>
-      </w:r>
-      <w:proofErr w:type="gramStart"/>
-      <w:r>
-        <w:t>.</w:t>
+        <w:t>Integra.</w:t>
       </w:r>
       <w:r>
         <w:t xml:space="preserve"> </w:t>
       </w:r>
-      <w:proofErr w:type="gramEnd"/>
       <w:r>
         <w:t>Addresses &amp;</w:t>
       </w:r>
@@ -17069,51 +15979,6 @@
     <w:p>
       <w:pPr>
         <w:ind w:left="720" w:hanging="360"/>
-      </w:pPr>
-      <w:r>
-        <w:rPr>
-          <w:b/>
-          <w:bCs/>
-        </w:rPr>
-        <w:t>&lt;</w:t>
-      </w:r>
-      <w:r>
-        <w:rPr>
-          <w:b/>
-          <w:bCs/>
-        </w:rPr>
-        <w:t>event</w:t>
-      </w:r>
-      <w:r>
-        <w:rPr>
-          <w:b/>
-          <w:bCs/>
-        </w:rPr>
-        <w:t>&gt;</w:t>
-      </w:r>
-      <w:r>
-        <w:t xml:space="preserve"> = &lt;</w:t>
-      </w:r>
-      <w:proofErr w:type="spellStart"/>
-      <w:r>
-        <w:t>event_marker</w:t>
-      </w:r>
-      <w:proofErr w:type="spellEnd"/>
-      <w:r>
-        <w:t>&gt; + &lt;</w:t>
-      </w:r>
-      <w:proofErr w:type="spellStart"/>
-      <w:r>
-        <w:t>event_params</w:t>
-      </w:r>
-      <w:proofErr w:type="spellEnd"/>
-      <w:r>
-        <w:t xml:space="preserve">&gt; </w:t>
-      </w:r>
-    </w:p>
-    <w:p>
-      <w:pPr>
-        <w:ind w:left="720"/>
       </w:pPr>
       <w:r>
         <w:rPr>
@@ -17123,16 +15988,61 @@
         <w:lastRenderedPageBreak/>
         <w:t>&lt;</w:t>
       </w:r>
-      <w:proofErr w:type="spellStart"/>
-      <w:r>
-        <w:rPr>
-          <w:b/>
-          <w:bCs/>
-        </w:rPr>
+      <w:r>
+        <w:rPr>
+          <w:b/>
+          <w:bCs/>
+        </w:rPr>
+        <w:t>event</w:t>
+      </w:r>
+      <w:r>
+        <w:rPr>
+          <w:b/>
+          <w:bCs/>
+        </w:rPr>
+        <w:t>&gt;</w:t>
+      </w:r>
+      <w:r>
+        <w:t xml:space="preserve"> = &lt;</w:t>
+      </w:r>
+      <w:proofErr w:type="spellStart"/>
+      <w:r>
         <w:t>event_marker</w:t>
       </w:r>
       <w:proofErr w:type="spellEnd"/>
       <w:r>
+        <w:t>&gt; + &lt;</w:t>
+      </w:r>
+      <w:proofErr w:type="spellStart"/>
+      <w:r>
+        <w:t>event_params</w:t>
+      </w:r>
+      <w:proofErr w:type="spellEnd"/>
+      <w:r>
+        <w:t xml:space="preserve">&gt; </w:t>
+      </w:r>
+    </w:p>
+    <w:p>
+      <w:pPr>
+        <w:ind w:left="720"/>
+      </w:pPr>
+      <w:r>
+        <w:rPr>
+          <w:b/>
+          <w:bCs/>
+        </w:rPr>
+        <w:t>&lt;</w:t>
+      </w:r>
+      <w:proofErr w:type="spellStart"/>
+      <w:r>
+        <w:rPr>
+          <w:b/>
+          <w:bCs/>
+        </w:rPr>
+        <w:t>event_marker</w:t>
+      </w:r>
+      <w:proofErr w:type="spellEnd"/>
+      <w:r>
         <w:rPr>
           <w:b/>
           <w:bCs/>
@@ -17140,20 +16050,23 @@
         <w:t>&gt;</w:t>
       </w:r>
       <w:r>
-        <w:t xml:space="preserve"> (2 bytes).  A two-byte value that distinguishes an &lt;event&gt; from an &lt;instruction&gt;.  The marker also specifies the event type and subsequent parameters as depicted in the table below.</w:t>
+        <w:t xml:space="preserve"> (2 bytes).  A two-byte value that distinguishes an &lt;event&gt; from an &lt;instruction&gt;.  The marker also specifies the event type and subsequent parameters as depicted in the table below</w:t>
+      </w:r>
+      <w:r>
+        <w:t>.</w:t>
       </w:r>
     </w:p>
     <w:tbl>
       <w:tblPr>
         <w:tblStyle w:val="TableGrid"/>
-        <w:tblW w:w="8370" w:type="dxa"/>
-        <w:tblInd w:w="1165" w:type="dxa"/>
+        <w:tblW w:w="8910" w:type="dxa"/>
+        <w:tblInd w:w="715" w:type="dxa"/>
         <w:tblLook w:val="04A0" w:firstRow="1" w:lastRow="0" w:firstColumn="1" w:lastColumn="0" w:noHBand="0" w:noVBand="1"/>
       </w:tblPr>
       <w:tblGrid>
         <w:gridCol w:w="1800"/>
-        <w:gridCol w:w="3510"/>
-        <w:gridCol w:w="3060"/>
+        <w:gridCol w:w="3330"/>
+        <w:gridCol w:w="3780"/>
       </w:tblGrid>
       <w:tr>
         <w:tc>
@@ -17185,7 +16098,7 @@
         </w:tc>
         <w:tc>
           <w:tcPr>
-            <w:tcW w:w="3510" w:type="dxa"/>
+            <w:tcW w:w="3330" w:type="dxa"/>
           </w:tcPr>
           <w:p>
             <w:pPr>
@@ -17212,7 +16125,7 @@
         </w:tc>
         <w:tc>
           <w:tcPr>
-            <w:tcW w:w="3060" w:type="dxa"/>
+            <w:tcW w:w="3780" w:type="dxa"/>
           </w:tcPr>
           <w:p>
             <w:pPr>
@@ -17244,7 +16157,7 @@
         </w:tc>
         <w:tc>
           <w:tcPr>
-            <w:tcW w:w="3510" w:type="dxa"/>
+            <w:tcW w:w="3330" w:type="dxa"/>
           </w:tcPr>
           <w:p>
             <w:r>
@@ -17254,7 +16167,7 @@
         </w:tc>
         <w:tc>
           <w:tcPr>
-            <w:tcW w:w="3060" w:type="dxa"/>
+            <w:tcW w:w="3780" w:type="dxa"/>
           </w:tcPr>
           <w:p>
             <w:r>
@@ -17284,7 +16197,7 @@
         </w:tc>
         <w:tc>
           <w:tcPr>
-            <w:tcW w:w="3510" w:type="dxa"/>
+            <w:tcW w:w="3330" w:type="dxa"/>
           </w:tcPr>
           <w:p>
             <w:r>
@@ -17294,7 +16207,7 @@
         </w:tc>
         <w:tc>
           <w:tcPr>
-            <w:tcW w:w="3060" w:type="dxa"/>
+            <w:tcW w:w="3780" w:type="dxa"/>
           </w:tcPr>
           <w:p>
             <w:r>
@@ -17303,6 +16216,55 @@
             <w:proofErr w:type="spellStart"/>
             <w:r>
               <w:t>interrupt_event_params</w:t>
+            </w:r>
+            <w:proofErr w:type="spellEnd"/>
+            <w:r>
+              <w:t>&gt;</w:t>
+            </w:r>
+          </w:p>
+        </w:tc>
+      </w:tr>
+      <w:tr>
+        <w:tc>
+          <w:tcPr>
+            <w:tcW w:w="1800" w:type="dxa"/>
+          </w:tcPr>
+          <w:p>
+            <w:r>
+              <w:t>&amp;80, &amp;02</w:t>
+            </w:r>
+          </w:p>
+        </w:tc>
+        <w:tc>
+          <w:tcPr>
+            <w:tcW w:w="3330" w:type="dxa"/>
+          </w:tcPr>
+          <w:p>
+            <w:r>
+              <w:t xml:space="preserve">CRTC </w:t>
+            </w:r>
+            <w:r>
+              <w:t>frame-start</w:t>
+            </w:r>
+          </w:p>
+        </w:tc>
+        <w:tc>
+          <w:tcPr>
+            <w:tcW w:w="3780" w:type="dxa"/>
+          </w:tcPr>
+          <w:p>
+            <w:r>
+              <w:t>&lt;</w:t>
+            </w:r>
+            <w:proofErr w:type="spellStart"/>
+            <w:r>
+              <w:t>crtc_frame_</w:t>
+            </w:r>
+            <w:r>
+              <w:t>start_</w:t>
+            </w:r>
+            <w:r>
+              <w:t>event_params</w:t>
             </w:r>
             <w:proofErr w:type="spellEnd"/>
             <w:r>
@@ -17328,15 +16290,7 @@
                 <w:i/>
                 <w:iCs/>
               </w:rPr>
-              <w:t>&amp;80, &amp;</w:t>
-            </w:r>
-            <w:proofErr w:type="gramStart"/>
-            <w:r>
-              <w:rPr>
-                <w:i/>
-                <w:iCs/>
-              </w:rPr>
-              <w:t>0</w:t>
+              <w:t>&amp;80, &amp;0</w:t>
             </w:r>
             <w:r>
               <w:rPr>
@@ -17350,21 +16304,13 @@
                 <w:i/>
                 <w:iCs/>
               </w:rPr>
-              <w:t>..</w:t>
-            </w:r>
-            <w:proofErr w:type="gramEnd"/>
-            <w:r>
-              <w:rPr>
-                <w:i/>
-                <w:iCs/>
-              </w:rPr>
-              <w:t>&amp;7F</w:t>
-            </w:r>
-          </w:p>
-        </w:tc>
-        <w:tc>
-          <w:tcPr>
-            <w:tcW w:w="3510" w:type="dxa"/>
+              <w:t>..&amp;7F</w:t>
+            </w:r>
+          </w:p>
+        </w:tc>
+        <w:tc>
+          <w:tcPr>
+            <w:tcW w:w="3330" w:type="dxa"/>
           </w:tcPr>
           <w:p>
             <w:pPr>
@@ -17384,7 +16330,7 @@
         </w:tc>
         <w:tc>
           <w:tcPr>
-            <w:tcW w:w="3060" w:type="dxa"/>
+            <w:tcW w:w="3780" w:type="dxa"/>
           </w:tcPr>
           <w:p>
             <w:pPr>
@@ -17419,6 +16365,130 @@
       <w:r>
         <w:t>maskable (IRQ) and non-maskable (NMI) interrupt events signify that an interrupt has occurred.</w:t>
       </w:r>
+      <w:r>
+        <w:t xml:space="preserve">  </w:t>
+      </w:r>
+    </w:p>
+    <w:p>
+      <w:pPr>
+        <w:ind w:left="720"/>
+        <w:rPr>
+          <w:rFonts w:ascii="Aptos" w:hAnsi="Aptos"/>
+          <w:color w:val="000000"/>
+        </w:rPr>
+      </w:pPr>
+      <w:r>
+        <w:rPr>
+          <w:rFonts w:ascii="Aptos" w:hAnsi="Aptos"/>
+          <w:color w:val="000000"/>
+        </w:rPr>
+        <w:t xml:space="preserve">A CRTC </w:t>
+      </w:r>
+      <w:r>
+        <w:rPr>
+          <w:rFonts w:ascii="Aptos" w:hAnsi="Aptos"/>
+          <w:color w:val="000000"/>
+        </w:rPr>
+        <w:t>frame-start</w:t>
+      </w:r>
+      <w:r>
+        <w:rPr>
+          <w:rFonts w:ascii="Aptos" w:hAnsi="Aptos"/>
+          <w:color w:val="000000"/>
+        </w:rPr>
+        <w:t xml:space="preserve"> event marks the start of </w:t>
+      </w:r>
+      <w:r>
+        <w:rPr>
+          <w:rFonts w:ascii="Aptos" w:hAnsi="Aptos"/>
+          <w:color w:val="000000"/>
+        </w:rPr>
+        <w:t xml:space="preserve">a </w:t>
+      </w:r>
+      <w:r>
+        <w:rPr>
+          <w:rFonts w:ascii="Aptos" w:hAnsi="Aptos"/>
+          <w:color w:val="000000"/>
+        </w:rPr>
+        <w:t xml:space="preserve">new </w:t>
+      </w:r>
+      <w:r>
+        <w:rPr>
+          <w:rFonts w:ascii="Aptos" w:hAnsi="Aptos"/>
+          <w:color w:val="000000"/>
+        </w:rPr>
+        <w:t xml:space="preserve">frame, triggered when the CRTC's MA/RA/DE </w:t>
+      </w:r>
+      <w:r>
+        <w:rPr>
+          <w:rFonts w:ascii="Aptos" w:hAnsi="Aptos"/>
+          <w:color w:val="000000"/>
+        </w:rPr>
+        <w:t>ou</w:t>
+      </w:r>
+      <w:r>
+        <w:rPr>
+          <w:rFonts w:ascii="Aptos" w:hAnsi="Aptos"/>
+          <w:color w:val="000000"/>
+        </w:rPr>
+        <w:t>t</w:t>
+      </w:r>
+      <w:r>
+        <w:rPr>
+          <w:rFonts w:ascii="Aptos" w:hAnsi="Aptos"/>
+          <w:color w:val="000000"/>
+        </w:rPr>
+        <w:t xml:space="preserve">puts </w:t>
+      </w:r>
+      <w:r>
+        <w:rPr>
+          <w:rFonts w:ascii="Aptos" w:hAnsi="Aptos"/>
+          <w:color w:val="000000"/>
+        </w:rPr>
+        <w:t xml:space="preserve">address the first </w:t>
+      </w:r>
+      <w:r>
+        <w:rPr>
+          <w:rFonts w:ascii="Aptos" w:hAnsi="Aptos"/>
+          <w:color w:val="000000"/>
+        </w:rPr>
+        <w:t xml:space="preserve">screen memory address </w:t>
+      </w:r>
+      <w:r>
+        <w:rPr>
+          <w:rFonts w:ascii="Aptos" w:hAnsi="Aptos"/>
+          <w:color w:val="000000"/>
+        </w:rPr>
+        <w:t xml:space="preserve">to </w:t>
+      </w:r>
+      <w:r>
+        <w:rPr>
+          <w:rFonts w:ascii="Aptos" w:hAnsi="Aptos"/>
+          <w:color w:val="000000"/>
+        </w:rPr>
+        <w:t xml:space="preserve">be </w:t>
+      </w:r>
+      <w:r>
+        <w:rPr>
+          <w:rFonts w:ascii="Aptos" w:hAnsi="Aptos"/>
+          <w:color w:val="000000"/>
+        </w:rPr>
+        <w:t>read</w:t>
+      </w:r>
+      <w:r>
+        <w:rPr>
+          <w:rFonts w:ascii="Aptos" w:hAnsi="Aptos"/>
+          <w:color w:val="000000"/>
+        </w:rPr>
+        <w:t xml:space="preserve"> for display</w:t>
+      </w:r>
+      <w:r>
+        <w:rPr>
+          <w:rFonts w:ascii="Aptos" w:hAnsi="Aptos"/>
+          <w:color w:val="000000"/>
+        </w:rPr>
+        <w:t>.</w:t>
+      </w:r>
     </w:p>
     <w:p>
       <w:pPr>
@@ -17642,74 +16712,810 @@
         <w:t xml:space="preserve">that was </w:t>
       </w:r>
       <w:r>
-        <w:t>pushed on the stack</w:t>
-      </w:r>
-      <w:proofErr w:type="gramStart"/>
+        <w:t>pushed on the stack.</w:t>
+      </w:r>
+      <w:r>
+        <w:t xml:space="preserve"> </w:t>
+      </w:r>
+      <w:r>
+        <w:t xml:space="preserve">The </w:t>
+      </w:r>
+      <w:r>
+        <w:t>‘</w:t>
+      </w:r>
+      <w:r>
+        <w:t>B flag</w:t>
+      </w:r>
+      <w:r>
+        <w:t>’</w:t>
+      </w:r>
+      <w:r>
+        <w:t xml:space="preserve"> (b</w:t>
+      </w:r>
+      <w:r>
+        <w:t>it</w:t>
+      </w:r>
+      <w:r>
+        <w:t>-</w:t>
+      </w:r>
+      <w:r>
+        <w:t>4</w:t>
+      </w:r>
+      <w:r>
+        <w:t>) is set</w:t>
+      </w:r>
+      <w:r>
+        <w:t xml:space="preserve"> if </w:t>
+      </w:r>
+      <w:r>
+        <w:t xml:space="preserve">a </w:t>
+      </w:r>
+      <w:r>
+        <w:rPr>
+          <w:b/>
+          <w:bCs/>
+        </w:rPr>
+        <w:t>BRK</w:t>
+      </w:r>
+      <w:r>
+        <w:t xml:space="preserve"> </w:t>
+      </w:r>
+      <w:r>
+        <w:t xml:space="preserve">instruction </w:t>
+      </w:r>
+      <w:r>
+        <w:t>invoked</w:t>
+      </w:r>
+      <w:r>
+        <w:t xml:space="preserve"> the interrupt</w:t>
+      </w:r>
+      <w:r>
+        <w:t xml:space="preserve"> (IRQ)</w:t>
+      </w:r>
       <w:r>
         <w:t>.</w:t>
       </w:r>
-      <w:r>
+    </w:p>
+    <w:p>
+      <w:pPr>
+        <w:ind w:left="720"/>
+      </w:pPr>
+      <w:r>
+        <w:rPr>
+          <w:b/>
+          <w:bCs/>
+        </w:rPr>
+        <w:t>&lt;</w:t>
+      </w:r>
+      <w:proofErr w:type="spellStart"/>
+      <w:r>
+        <w:rPr>
+          <w:b/>
+          <w:bCs/>
+        </w:rPr>
+        <w:t>crtc</w:t>
+      </w:r>
+      <w:r>
+        <w:rPr>
+          <w:b/>
+          <w:bCs/>
+        </w:rPr>
+        <w:t>_f</w:t>
+      </w:r>
+      <w:r>
+        <w:rPr>
+          <w:b/>
+          <w:bCs/>
+        </w:rPr>
+        <w:t>rame_</w:t>
+      </w:r>
+      <w:r>
+        <w:rPr>
+          <w:b/>
+          <w:bCs/>
+        </w:rPr>
+        <w:t>start</w:t>
+      </w:r>
+      <w:r>
+        <w:rPr>
+          <w:b/>
+          <w:bCs/>
+        </w:rPr>
+        <w:t>_params</w:t>
+      </w:r>
+      <w:proofErr w:type="spellEnd"/>
+      <w:r>
+        <w:rPr>
+          <w:b/>
+          <w:bCs/>
+        </w:rPr>
+        <w:t>&gt;</w:t>
+      </w:r>
+      <w:r>
+        <w:rPr>
+          <w:b/>
+          <w:bCs/>
+        </w:rPr>
         <w:t xml:space="preserve"> </w:t>
       </w:r>
-      <w:proofErr w:type="gramEnd"/>
-      <w:r>
-        <w:t xml:space="preserve">The </w:t>
-      </w:r>
-      <w:r>
-        <w:t>‘</w:t>
-      </w:r>
-      <w:r>
-        <w:t>B flag</w:t>
-      </w:r>
-      <w:r>
-        <w:t>’</w:t>
-      </w:r>
-      <w:r>
-        <w:t xml:space="preserve"> (b</w:t>
-      </w:r>
-      <w:r>
-        <w:t>it</w:t>
-      </w:r>
-      <w:r>
-        <w:t>-</w:t>
-      </w:r>
-      <w:r>
-        <w:t>4</w:t>
-      </w:r>
-      <w:r>
-        <w:t>) is set</w:t>
-      </w:r>
-      <w:r>
-        <w:t xml:space="preserve"> if </w:t>
-      </w:r>
-      <w:r>
-        <w:t xml:space="preserve">a </w:t>
-      </w:r>
-      <w:r>
-        <w:rPr>
-          <w:b/>
-          <w:bCs/>
-        </w:rPr>
-        <w:t>BRK</w:t>
-      </w:r>
-      <w:r>
+      <w:r>
+        <w:t xml:space="preserve">= </w:t>
+      </w:r>
+      <w:r>
+        <w:t>&lt;</w:t>
+      </w:r>
+      <w:proofErr w:type="spellStart"/>
+      <w:r>
+        <w:t>video_ula</w:t>
+      </w:r>
+      <w:r>
+        <w:t>_state</w:t>
+      </w:r>
+      <w:proofErr w:type="spellEnd"/>
+      <w:r>
+        <w:t xml:space="preserve">&gt; + </w:t>
+      </w:r>
+      <w:r>
+        <w:t>&lt;</w:t>
+      </w:r>
+      <w:proofErr w:type="spellStart"/>
+      <w:r>
+        <w:t>crtc</w:t>
+      </w:r>
+      <w:r>
+        <w:t>_state</w:t>
+      </w:r>
+      <w:proofErr w:type="spellEnd"/>
+      <w:r>
+        <w:t xml:space="preserve">&gt; </w:t>
+      </w:r>
+    </w:p>
+    <w:p>
+      <w:pPr>
+        <w:ind w:left="1440" w:hanging="360"/>
+      </w:pPr>
+      <w:r>
+        <w:rPr>
+          <w:b/>
+          <w:bCs/>
+        </w:rPr>
+        <w:t>&lt;</w:t>
+      </w:r>
+      <w:proofErr w:type="spellStart"/>
+      <w:r>
+        <w:rPr>
+          <w:b/>
+          <w:bCs/>
+        </w:rPr>
+        <w:t>video_ula_state</w:t>
+      </w:r>
+      <w:proofErr w:type="spellEnd"/>
+      <w:r>
+        <w:rPr>
+          <w:b/>
+          <w:bCs/>
+        </w:rPr>
+        <w:t>&gt;</w:t>
+      </w:r>
+      <w:r>
+        <w:t xml:space="preserve"> = </w:t>
+      </w:r>
+      <w:r>
+        <w:t>&lt;</w:t>
+      </w:r>
+      <w:proofErr w:type="spellStart"/>
+      <w:r>
+        <w:t>ula_</w:t>
+      </w:r>
+      <w:r>
+        <w:t>control_register</w:t>
+      </w:r>
+      <w:proofErr w:type="spellEnd"/>
+      <w:r>
+        <w:t>&gt;</w:t>
+      </w:r>
+      <w:r>
+        <w:t xml:space="preserve"> + </w:t>
+      </w:r>
+      <w:r>
+        <w:t>&lt;</w:t>
+      </w:r>
+      <w:proofErr w:type="spellStart"/>
+      <w:r>
+        <w:t>ula_</w:t>
+      </w:r>
+      <w:r>
+        <w:t>palette</w:t>
+      </w:r>
+      <w:proofErr w:type="spellEnd"/>
+      <w:r>
+        <w:t>&gt;</w:t>
+      </w:r>
+    </w:p>
+    <w:p>
+      <w:pPr>
+        <w:ind w:left="1440"/>
+      </w:pPr>
+      <w:r>
+        <w:rPr>
+          <w:b/>
+          <w:bCs/>
+        </w:rPr>
+        <w:t>&lt;</w:t>
+      </w:r>
+      <w:proofErr w:type="spellStart"/>
+      <w:r>
+        <w:rPr>
+          <w:b/>
+          <w:bCs/>
+        </w:rPr>
+        <w:t>ula_</w:t>
+      </w:r>
+      <w:r>
+        <w:rPr>
+          <w:b/>
+          <w:bCs/>
+        </w:rPr>
+        <w:t>control_register</w:t>
+      </w:r>
+      <w:proofErr w:type="spellEnd"/>
+      <w:r>
+        <w:rPr>
+          <w:b/>
+          <w:bCs/>
+        </w:rPr>
+        <w:t>&gt;</w:t>
+      </w:r>
+      <w:r>
+        <w:t xml:space="preserve"> (1 byte).  The value of the ULA video control register.</w:t>
+      </w:r>
+    </w:p>
+    <w:p>
+      <w:pPr>
+        <w:ind w:left="1440"/>
+      </w:pPr>
+      <w:r>
+        <w:rPr>
+          <w:b/>
+          <w:bCs/>
+        </w:rPr>
+        <w:t>&lt;</w:t>
+      </w:r>
+      <w:proofErr w:type="spellStart"/>
+      <w:r>
+        <w:rPr>
+          <w:b/>
+          <w:bCs/>
+        </w:rPr>
+        <w:t>ula_palette</w:t>
+      </w:r>
+      <w:proofErr w:type="spellEnd"/>
+      <w:r>
+        <w:rPr>
+          <w:b/>
+          <w:bCs/>
+        </w:rPr>
+        <w:t>&gt;</w:t>
+      </w:r>
+      <w:r>
+        <w:t xml:space="preserve"> (16 bytes).  The ULA’s 16 palette entries where physical colors are </w:t>
+      </w:r>
+      <w:proofErr w:type="spellStart"/>
+      <w:r>
+        <w:t>xor’d</w:t>
+      </w:r>
+      <w:proofErr w:type="spellEnd"/>
+      <w:r>
+        <w:t xml:space="preserve"> with 0x7.</w:t>
+      </w:r>
+    </w:p>
+    <w:p>
+      <w:pPr>
+        <w:ind w:left="1440" w:hanging="360"/>
+      </w:pPr>
+      <w:r>
+        <w:rPr>
+          <w:b/>
+          <w:bCs/>
+        </w:rPr>
+        <w:t>&lt;</w:t>
+      </w:r>
+      <w:proofErr w:type="spellStart"/>
+      <w:r>
+        <w:rPr>
+          <w:b/>
+          <w:bCs/>
+        </w:rPr>
+        <w:t>crtc</w:t>
+      </w:r>
+      <w:r>
+        <w:rPr>
+          <w:b/>
+          <w:bCs/>
+        </w:rPr>
+        <w:t>_state</w:t>
+      </w:r>
+      <w:proofErr w:type="spellEnd"/>
+      <w:r>
+        <w:rPr>
+          <w:b/>
+          <w:bCs/>
+        </w:rPr>
+        <w:t>&gt;</w:t>
+      </w:r>
+      <w:r>
+        <w:t xml:space="preserve"> = </w:t>
+      </w:r>
+      <w:r>
+        <w:br/>
+      </w:r>
+      <w:r>
+        <w:t>&lt;</w:t>
+      </w:r>
+      <w:proofErr w:type="spellStart"/>
+      <w:r>
+        <w:t>crtc</w:t>
+      </w:r>
+      <w:r>
+        <w:t>_register_select</w:t>
+      </w:r>
+      <w:proofErr w:type="spellEnd"/>
+      <w:r>
+        <w:t>&gt; + &lt;</w:t>
+      </w:r>
+      <w:proofErr w:type="spellStart"/>
+      <w:r>
+        <w:t>crtc</w:t>
+      </w:r>
+      <w:r>
+        <w:t>_registers</w:t>
+      </w:r>
+      <w:proofErr w:type="spellEnd"/>
+      <w:r>
+        <w:t xml:space="preserve">&gt; </w:t>
+      </w:r>
+      <w:r>
+        <w:t xml:space="preserve">+ </w:t>
+      </w:r>
+      <w:r>
+        <w:t>&lt;</w:t>
+      </w:r>
+      <w:proofErr w:type="spellStart"/>
+      <w:r>
+        <w:t>crtc</w:t>
+      </w:r>
+      <w:r>
+        <w:t>_scanline</w:t>
+      </w:r>
+      <w:proofErr w:type="spellEnd"/>
+      <w:r>
+        <w:t>&gt; +</w:t>
+      </w:r>
+      <w:r>
+        <w:rPr>
+          <w:b/>
+          <w:bCs/>
+        </w:rPr>
         <w:t xml:space="preserve"> </w:t>
       </w:r>
       <w:r>
-        <w:t xml:space="preserve">instruction </w:t>
-      </w:r>
-      <w:r>
-        <w:t>invoked</w:t>
-      </w:r>
-      <w:r>
-        <w:t xml:space="preserve"> the interrupt</w:t>
-      </w:r>
-      <w:r>
-        <w:t xml:space="preserve"> (IRQ)</w:t>
+        <w:t>&lt;</w:t>
+      </w:r>
+      <w:proofErr w:type="spellStart"/>
+      <w:r>
+        <w:t>crtc</w:t>
+      </w:r>
+      <w:r>
+        <w:t>_</w:t>
+      </w:r>
+      <w:r>
+        <w:t>flags</w:t>
+      </w:r>
+      <w:proofErr w:type="spellEnd"/>
+      <w:r>
+        <w:t>&gt;</w:t>
+      </w:r>
+    </w:p>
+    <w:p>
+      <w:pPr>
+        <w:ind w:left="1440"/>
+      </w:pPr>
+      <w:r>
+        <w:rPr>
+          <w:b/>
+          <w:bCs/>
+        </w:rPr>
+        <w:lastRenderedPageBreak/>
+        <w:t>&lt;</w:t>
+      </w:r>
+      <w:proofErr w:type="spellStart"/>
+      <w:r>
+        <w:rPr>
+          <w:b/>
+          <w:bCs/>
+        </w:rPr>
+        <w:t>crtc</w:t>
+      </w:r>
+      <w:r>
+        <w:rPr>
+          <w:b/>
+          <w:bCs/>
+        </w:rPr>
+        <w:t>_register</w:t>
+      </w:r>
+      <w:r>
+        <w:rPr>
+          <w:b/>
+          <w:bCs/>
+        </w:rPr>
+        <w:t>_select</w:t>
+      </w:r>
+      <w:proofErr w:type="spellEnd"/>
+      <w:r>
+        <w:rPr>
+          <w:b/>
+          <w:bCs/>
+        </w:rPr>
+        <w:t xml:space="preserve">&gt; </w:t>
+      </w:r>
+      <w:r>
+        <w:t>(1 byte).  The CRTC’s ‘register select’, which is used to write values to the CRTC’s registers.  The value is in the range 0 to 17.</w:t>
+      </w:r>
+    </w:p>
+    <w:p>
+      <w:pPr>
+        <w:ind w:left="1440"/>
+      </w:pPr>
+      <w:r>
+        <w:rPr>
+          <w:b/>
+          <w:bCs/>
+        </w:rPr>
+        <w:t>&lt;</w:t>
+      </w:r>
+      <w:proofErr w:type="spellStart"/>
+      <w:r>
+        <w:rPr>
+          <w:b/>
+          <w:bCs/>
+        </w:rPr>
+        <w:t>crtc</w:t>
+      </w:r>
+      <w:r>
+        <w:rPr>
+          <w:b/>
+          <w:bCs/>
+        </w:rPr>
+        <w:t>_registers</w:t>
+      </w:r>
+      <w:proofErr w:type="spellEnd"/>
+      <w:r>
+        <w:rPr>
+          <w:b/>
+          <w:bCs/>
+        </w:rPr>
+        <w:t xml:space="preserve">&gt; </w:t>
+      </w:r>
+      <w:r>
+        <w:t>(18 bytes).  The values of the CRTC’s 18 registers.</w:t>
+      </w:r>
+    </w:p>
+    <w:p>
+      <w:pPr>
+        <w:ind w:left="1440"/>
+      </w:pPr>
+      <w:r>
+        <w:rPr>
+          <w:b/>
+          <w:bCs/>
+        </w:rPr>
+        <w:t>&lt;</w:t>
+      </w:r>
+      <w:proofErr w:type="spellStart"/>
+      <w:r>
+        <w:rPr>
+          <w:b/>
+          <w:bCs/>
+        </w:rPr>
+        <w:t>crtc</w:t>
+      </w:r>
+      <w:r>
+        <w:rPr>
+          <w:b/>
+          <w:bCs/>
+        </w:rPr>
+        <w:t>_</w:t>
+      </w:r>
+      <w:r>
+        <w:rPr>
+          <w:b/>
+          <w:bCs/>
+        </w:rPr>
+        <w:t>scanline</w:t>
+      </w:r>
+      <w:proofErr w:type="spellEnd"/>
+      <w:r>
+        <w:rPr>
+          <w:b/>
+          <w:bCs/>
+        </w:rPr>
+        <w:t>&gt;</w:t>
+      </w:r>
+      <w:r>
+        <w:t xml:space="preserve"> (2 bytes).  The scanline</w:t>
+      </w:r>
+      <w:r>
+        <w:t xml:space="preserve"> </w:t>
+      </w:r>
+      <w:r>
+        <w:t xml:space="preserve">where the </w:t>
+      </w:r>
+      <w:r>
+        <w:t>frame-start</w:t>
+      </w:r>
+      <w:r>
+        <w:t xml:space="preserve"> is rendered from.  The value is in range </w:t>
+      </w:r>
+      <w:r>
+        <w:t>0</w:t>
+      </w:r>
+      <w:r>
+        <w:t xml:space="preserve"> to </w:t>
+      </w:r>
+      <w:r>
+        <w:t>311</w:t>
       </w:r>
       <w:r>
         <w:t>.</w:t>
       </w:r>
+    </w:p>
+    <w:p>
+      <w:pPr>
+        <w:ind w:left="1440"/>
+      </w:pPr>
+      <w:r>
+        <w:rPr>
+          <w:b/>
+          <w:bCs/>
+        </w:rPr>
+        <w:t>&lt;</w:t>
+      </w:r>
+      <w:proofErr w:type="spellStart"/>
+      <w:r>
+        <w:rPr>
+          <w:b/>
+          <w:bCs/>
+        </w:rPr>
+        <w:t>crtc_</w:t>
+      </w:r>
+      <w:r>
+        <w:rPr>
+          <w:b/>
+          <w:bCs/>
+        </w:rPr>
+        <w:t>flags</w:t>
+      </w:r>
+      <w:proofErr w:type="spellEnd"/>
+      <w:r>
+        <w:rPr>
+          <w:b/>
+          <w:bCs/>
+        </w:rPr>
+        <w:t>&gt;</w:t>
+      </w:r>
+      <w:r>
+        <w:rPr>
+          <w:b/>
+          <w:bCs/>
+        </w:rPr>
+        <w:t xml:space="preserve"> </w:t>
+      </w:r>
+      <w:r>
+        <w:t>(1 byte)</w:t>
+      </w:r>
+      <w:r>
+        <w:t>.</w:t>
+      </w:r>
+      <w:r>
+        <w:t xml:space="preserve">  Contains the following </w:t>
+      </w:r>
+      <w:r>
+        <w:t>bit flags</w:t>
+      </w:r>
+      <w:r>
+        <w:t>:</w:t>
+      </w:r>
+    </w:p>
+    <w:tbl>
+      <w:tblPr>
+        <w:tblStyle w:val="TableGrid"/>
+        <w:tblW w:w="0" w:type="auto"/>
+        <w:tblInd w:w="1440" w:type="dxa"/>
+        <w:tblLook w:val="04A0" w:firstRow="1" w:lastRow="0" w:firstColumn="1" w:lastColumn="0" w:noHBand="0" w:noVBand="1"/>
+      </w:tblPr>
+      <w:tblGrid>
+        <w:gridCol w:w="625"/>
+        <w:gridCol w:w="1530"/>
+        <w:gridCol w:w="5755"/>
+      </w:tblGrid>
+      <w:tr>
+        <w:tc>
+          <w:tcPr>
+            <w:tcW w:w="625" w:type="dxa"/>
+          </w:tcPr>
+          <w:p>
+            <w:pPr>
+              <w:jc w:val="center"/>
+              <w:rPr>
+                <w:b/>
+                <w:bCs/>
+              </w:rPr>
+            </w:pPr>
+            <w:r>
+              <w:rPr>
+                <w:b/>
+                <w:bCs/>
+              </w:rPr>
+              <w:t>Bit</w:t>
+            </w:r>
+          </w:p>
+        </w:tc>
+        <w:tc>
+          <w:tcPr>
+            <w:tcW w:w="1530" w:type="dxa"/>
+          </w:tcPr>
+          <w:p>
+            <w:pPr>
+              <w:rPr>
+                <w:b/>
+                <w:bCs/>
+              </w:rPr>
+            </w:pPr>
+            <w:r>
+              <w:rPr>
+                <w:b/>
+                <w:bCs/>
+              </w:rPr>
+              <w:t>Flag name</w:t>
+            </w:r>
+          </w:p>
+        </w:tc>
+        <w:tc>
+          <w:tcPr>
+            <w:tcW w:w="5755" w:type="dxa"/>
+          </w:tcPr>
+          <w:p>
+            <w:pPr>
+              <w:rPr>
+                <w:b/>
+                <w:bCs/>
+              </w:rPr>
+            </w:pPr>
+            <w:r>
+              <w:rPr>
+                <w:b/>
+                <w:bCs/>
+              </w:rPr>
+              <w:t>Descri</w:t>
+            </w:r>
+            <w:r>
+              <w:rPr>
+                <w:b/>
+                <w:bCs/>
+              </w:rPr>
+              <w:t>p</w:t>
+            </w:r>
+            <w:r>
+              <w:rPr>
+                <w:b/>
+                <w:bCs/>
+              </w:rPr>
+              <w:t>tion</w:t>
+            </w:r>
+          </w:p>
+        </w:tc>
+      </w:tr>
+      <w:tr>
+        <w:tc>
+          <w:tcPr>
+            <w:tcW w:w="625" w:type="dxa"/>
+          </w:tcPr>
+          <w:p>
+            <w:pPr>
+              <w:jc w:val="center"/>
+            </w:pPr>
+            <w:r>
+              <w:t>0</w:t>
+            </w:r>
+          </w:p>
+        </w:tc>
+        <w:tc>
+          <w:tcPr>
+            <w:tcW w:w="1530" w:type="dxa"/>
+          </w:tcPr>
+          <w:p>
+            <w:r>
+              <w:t>Display field</w:t>
+            </w:r>
+          </w:p>
+        </w:tc>
+        <w:tc>
+          <w:tcPr>
+            <w:tcW w:w="5755" w:type="dxa"/>
+          </w:tcPr>
+          <w:p>
+            <w:r>
+              <w:t>The value is 0 (even field) or 1(odd field).  The value toggles across non split</w:t>
+            </w:r>
+            <w:r>
+              <w:t xml:space="preserve"> </w:t>
+            </w:r>
+            <w:r>
+              <w:t>screen frames, irrespective of the interlace mode.</w:t>
+            </w:r>
+          </w:p>
+        </w:tc>
+      </w:tr>
+      <w:tr>
+        <w:tc>
+          <w:tcPr>
+            <w:tcW w:w="625" w:type="dxa"/>
+          </w:tcPr>
+          <w:p>
+            <w:pPr>
+              <w:jc w:val="center"/>
+            </w:pPr>
+            <w:r>
+              <w:t>1</w:t>
+            </w:r>
+          </w:p>
+        </w:tc>
+        <w:tc>
+          <w:tcPr>
+            <w:tcW w:w="1530" w:type="dxa"/>
+          </w:tcPr>
+          <w:p>
+            <w:r>
+              <w:t>Split screen</w:t>
+            </w:r>
+          </w:p>
+        </w:tc>
+        <w:tc>
+          <w:tcPr>
+            <w:tcW w:w="5755" w:type="dxa"/>
+          </w:tcPr>
+          <w:p>
+            <w:r>
+              <w:t xml:space="preserve">Whether the frame is displayed below </w:t>
+            </w:r>
+            <w:r>
+              <w:t xml:space="preserve">the </w:t>
+            </w:r>
+            <w:r>
+              <w:t xml:space="preserve">previous frame </w:t>
+            </w:r>
+            <w:r>
+              <w:t xml:space="preserve">to </w:t>
+            </w:r>
+            <w:r>
+              <w:t xml:space="preserve">create </w:t>
+            </w:r>
+            <w:r>
+              <w:t xml:space="preserve">a split screen.  </w:t>
+            </w:r>
+          </w:p>
+          <w:p>
+            <w:r>
+              <w:t>The value is either 0 (false) or 1(true).</w:t>
+            </w:r>
+          </w:p>
+        </w:tc>
+      </w:tr>
+    </w:tbl>
+    <w:p>
+      <w:pPr>
+        <w:ind w:left="1440"/>
+      </w:pPr>
     </w:p>
     <w:p>
       <w:pPr>
@@ -18096,15 +17902,7 @@
               <w:jc w:val="center"/>
             </w:pPr>
             <w:r>
-              <w:t>&amp;</w:t>
-            </w:r>
-            <w:proofErr w:type="gramStart"/>
-            <w:r>
-              <w:t>81..</w:t>
-            </w:r>
-            <w:proofErr w:type="gramEnd"/>
-            <w:r>
-              <w:t>&amp;FF</w:t>
+              <w:t>&amp;81..&amp;FF</w:t>
             </w:r>
           </w:p>
         </w:tc>
@@ -18147,15 +17945,7 @@
           </w:tcPr>
           <w:p>
             <w:r>
-              <w:t>Absolute address: &amp;</w:t>
-            </w:r>
-            <w:proofErr w:type="gramStart"/>
-            <w:r>
-              <w:t>0000..</w:t>
-            </w:r>
-            <w:proofErr w:type="gramEnd"/>
-            <w:r>
-              <w:t>&amp;7FFF</w:t>
+              <w:t>Absolute address: &amp;0000..&amp;7FFF</w:t>
             </w:r>
           </w:p>
         </w:tc>
@@ -18167,13 +17957,8 @@
             <w:pPr>
               <w:jc w:val="center"/>
             </w:pPr>
-            <w:proofErr w:type="gramStart"/>
-            <w:r>
-              <w:t>0..&amp;</w:t>
-            </w:r>
-            <w:proofErr w:type="gramEnd"/>
-            <w:r>
-              <w:t>7F</w:t>
+            <w:r>
+              <w:t>0..&amp;7F</w:t>
             </w:r>
           </w:p>
         </w:tc>
@@ -18185,13 +17970,8 @@
             <w:pPr>
               <w:jc w:val="center"/>
             </w:pPr>
-            <w:proofErr w:type="gramStart"/>
-            <w:r>
-              <w:t>0..&amp;</w:t>
-            </w:r>
-            <w:proofErr w:type="gramEnd"/>
-            <w:r>
-              <w:t>FF</w:t>
+            <w:r>
+              <w:t>0..&amp;FF</w:t>
             </w:r>
           </w:p>
         </w:tc>
@@ -18220,15 +18000,7 @@
           </w:tcPr>
           <w:p>
             <w:r>
-              <w:t>Absolute address: &amp;</w:t>
-            </w:r>
-            <w:proofErr w:type="gramStart"/>
-            <w:r>
-              <w:t>8000..</w:t>
-            </w:r>
-            <w:proofErr w:type="gramEnd"/>
-            <w:r>
-              <w:t>&amp;FFFF</w:t>
+              <w:t>Absolute address: &amp;8000..&amp;FFFF</w:t>
             </w:r>
           </w:p>
         </w:tc>
@@ -18254,15 +18026,7 @@
               <w:jc w:val="center"/>
             </w:pPr>
             <w:r>
-              <w:t>&amp;</w:t>
-            </w:r>
-            <w:proofErr w:type="gramStart"/>
-            <w:r>
-              <w:t>80..</w:t>
-            </w:r>
-            <w:proofErr w:type="gramEnd"/>
-            <w:r>
-              <w:t>&amp;FF</w:t>
+              <w:t>&amp;80..&amp;FF</w:t>
             </w:r>
           </w:p>
         </w:tc>
@@ -18274,13 +18038,8 @@
             <w:pPr>
               <w:jc w:val="center"/>
             </w:pPr>
-            <w:proofErr w:type="gramStart"/>
-            <w:r>
-              <w:t>0..&amp;</w:t>
-            </w:r>
-            <w:proofErr w:type="gramEnd"/>
-            <w:r>
-              <w:t>FF</w:t>
+            <w:r>
+              <w:t>0..&amp;FF</w:t>
             </w:r>
           </w:p>
         </w:tc>
@@ -18349,21 +18108,12 @@
                 <w:iCs/>
               </w:rPr>
             </w:pPr>
-            <w:proofErr w:type="gramStart"/>
             <w:r>
               <w:rPr>
                 <w:i/>
                 <w:iCs/>
               </w:rPr>
-              <w:t>0..&amp;</w:t>
-            </w:r>
-            <w:proofErr w:type="gramEnd"/>
-            <w:r>
-              <w:rPr>
-                <w:i/>
-                <w:iCs/>
-              </w:rPr>
-              <w:t>7F</w:t>
+              <w:t>0..&amp;7F</w:t>
             </w:r>
           </w:p>
         </w:tc>
@@ -18393,7 +18143,6 @@
         <w:ind w:left="720"/>
       </w:pPr>
       <w:r>
-        <w:lastRenderedPageBreak/>
         <w:t>The following pseudo code depicts how the opcode address is written.</w:t>
       </w:r>
     </w:p>
@@ -18581,6 +18330,7 @@
           <w:noProof/>
           <w:color w:val="BF4E14" w:themeColor="accent2" w:themeShade="BF"/>
         </w:rPr>
+        <w:lastRenderedPageBreak/>
         <w:t># relative address</w:t>
       </w:r>
     </w:p>
@@ -18814,23 +18564,7 @@
           <w:b/>
           <w:bCs/>
         </w:rPr>
-        <w:t xml:space="preserve">bits </w:t>
-      </w:r>
-      <w:proofErr w:type="gramStart"/>
-      <w:r>
-        <w:rPr>
-          <w:b/>
-          <w:bCs/>
-        </w:rPr>
-        <w:t>0..</w:t>
-      </w:r>
-      <w:proofErr w:type="gramEnd"/>
-      <w:r>
-        <w:rPr>
-          <w:b/>
-          <w:bCs/>
-        </w:rPr>
-        <w:t>2</w:t>
+        <w:t>bits 0..2</w:t>
       </w:r>
       <w:r>
         <w:t xml:space="preserve"> of next byte) Contains the number</w:t>
@@ -18863,13 +18597,8 @@
         <w:t xml:space="preserve">is </w:t>
       </w:r>
       <w:r>
-        <w:t xml:space="preserve">in the range: </w:t>
-      </w:r>
-      <w:proofErr w:type="gramStart"/>
-      <w:r>
-        <w:t>2..</w:t>
-      </w:r>
-      <w:proofErr w:type="gramEnd"/>
+        <w:t>in the range: 2..</w:t>
+      </w:r>
       <w:r>
         <w:t>9</w:t>
       </w:r>
@@ -19059,23 +18788,7 @@
           <w:b/>
           <w:bCs/>
         </w:rPr>
-        <w:t xml:space="preserve">bits </w:t>
-      </w:r>
-      <w:proofErr w:type="gramStart"/>
-      <w:r>
-        <w:rPr>
-          <w:b/>
-          <w:bCs/>
-        </w:rPr>
-        <w:t>3..</w:t>
-      </w:r>
-      <w:proofErr w:type="gramEnd"/>
-      <w:r>
-        <w:rPr>
-          <w:b/>
-          <w:bCs/>
-        </w:rPr>
-        <w:t>7</w:t>
+        <w:t>bits 3..7</w:t>
       </w:r>
       <w:r>
         <w:t xml:space="preserve"> of next byte).  Bit flags indicating which register value(s) the instruction modified.  The table below lists which bits are set for each corresponding modified register.  The bits are only set if the executed instruction changed the contents/value of the corresponding register.</w:t>
@@ -19235,7 +18948,6 @@
               <w:jc w:val="center"/>
             </w:pPr>
             <w:r>
-              <w:lastRenderedPageBreak/>
               <w:t>6</w:t>
             </w:r>
           </w:p>
@@ -19328,6 +19040,7 @@
           <w:b/>
           <w:bCs/>
         </w:rPr>
+        <w:lastRenderedPageBreak/>
         <w:t>&lt;</w:t>
       </w:r>
       <w:proofErr w:type="spellStart"/>
@@ -19809,7 +19522,6 @@
           <w:b/>
           <w:bCs/>
         </w:rPr>
-        <w:lastRenderedPageBreak/>
         <w:t>&lt;</w:t>
       </w:r>
       <w:proofErr w:type="spellStart"/>
@@ -19968,7 +19680,11 @@
         <w:t>STY</w:t>
       </w:r>
       <w:r>
-        <w:t xml:space="preserve">) that write to an address, excluding the stack (e.g. PHA).  Contains the value attempted to be written.  This includes instructions like ASL </w:t>
+        <w:t xml:space="preserve">) that write to an address, excluding the stack (e.g. PHA).  Contains the value </w:t>
+      </w:r>
+      <w:r>
+        <w:lastRenderedPageBreak/>
+        <w:t xml:space="preserve">attempted to be written.  This includes instructions like ASL </w:t>
       </w:r>
       <w:r>
         <w:rPr>
@@ -20267,27 +19983,18 @@
       </w:r>
       <w:proofErr w:type="spellStart"/>
       <w:r>
-        <w:t>PerfWriter_</w:t>
-      </w:r>
-      <w:proofErr w:type="gramStart"/>
-      <w:r>
-        <w:t>WriteInstruction</w:t>
+        <w:t>PerfWriter_WriteInstruction</w:t>
       </w:r>
       <w:proofErr w:type="spellEnd"/>
       <w:r>
         <w:t>(</w:t>
       </w:r>
-      <w:proofErr w:type="gramEnd"/>
       <w:r>
         <w:t xml:space="preserve">…) and </w:t>
       </w:r>
       <w:proofErr w:type="spellStart"/>
       <w:r>
-        <w:t>PerfWriter_</w:t>
-      </w:r>
-      <w:proofErr w:type="gramStart"/>
-      <w:r>
-        <w:t>WriteI</w:t>
+        <w:t>PerfWriter_WriteI</w:t>
       </w:r>
       <w:r>
         <w:t>nterrupt</w:t>
@@ -20296,7 +20003,6 @@
       <w:r>
         <w:t>(</w:t>
       </w:r>
-      <w:proofErr w:type="gramEnd"/>
       <w:r>
         <w:t xml:space="preserve">…) to log instructions and interrupts.  These wrapper functions only invoke the </w:t>
       </w:r>
@@ -20346,17 +20052,12 @@
       </w:r>
       <w:proofErr w:type="spellStart"/>
       <w:r>
-        <w:t>PerfWriter_</w:t>
-      </w:r>
-      <w:proofErr w:type="gramStart"/>
-      <w:r>
-        <w:t>WriteInstruction</w:t>
+        <w:t>PerfWriter_WriteInstruction</w:t>
       </w:r>
       <w:proofErr w:type="spellEnd"/>
       <w:r>
         <w:t>(</w:t>
       </w:r>
-      <w:proofErr w:type="gramEnd"/>
       <w:r>
         <w:t>…).  Added helpers (</w:t>
       </w:r>
@@ -20402,15 +20103,7 @@
         </w:numPr>
       </w:pPr>
       <w:r>
-        <w:t xml:space="preserve">Defined new </w:t>
-      </w:r>
-      <w:proofErr w:type="gramStart"/>
-      <w:r>
-        <w:t>struct</w:t>
-      </w:r>
-      <w:proofErr w:type="gramEnd"/>
-      <w:r>
-        <w:t xml:space="preserve"> (</w:t>
+        <w:t>Defined new struct (</w:t>
       </w:r>
       <w:proofErr w:type="spellStart"/>
       <w:r>
@@ -20529,17 +20222,12 @@
         <w:t xml:space="preserve">Added helper to get the emulator’s registers: </w:t>
       </w:r>
       <w:proofErr w:type="spellStart"/>
-      <w:proofErr w:type="gramStart"/>
       <w:r>
         <w:t>GetRegisters</w:t>
       </w:r>
       <w:proofErr w:type="spellEnd"/>
       <w:r>
-        <w:t>(</w:t>
-      </w:r>
-      <w:proofErr w:type="gramEnd"/>
-      <w:r>
-        <w:t>…).  This is called during snapshot chunk serialization.</w:t>
+        <w:t>(…).  This is called during snapshot chunk serialization.</w:t>
       </w:r>
     </w:p>
     <w:p>
@@ -20632,15 +20320,7 @@
         </w:numPr>
       </w:pPr>
       <w:r>
-        <w:t xml:space="preserve">Defined new </w:t>
-      </w:r>
-      <w:proofErr w:type="gramStart"/>
-      <w:r>
-        <w:t>struct</w:t>
-      </w:r>
-      <w:proofErr w:type="gramEnd"/>
-      <w:r>
-        <w:t xml:space="preserve"> (</w:t>
+        <w:t>Defined new struct (</w:t>
       </w:r>
       <w:proofErr w:type="spellStart"/>
       <w:r>
@@ -20881,17 +20561,12 @@
         <w:t xml:space="preserve"> state: </w:t>
       </w:r>
       <w:proofErr w:type="spellStart"/>
-      <w:proofErr w:type="gramStart"/>
       <w:r>
         <w:t>VideoGetState</w:t>
       </w:r>
       <w:proofErr w:type="spellEnd"/>
       <w:r>
-        <w:t>(</w:t>
-      </w:r>
-      <w:proofErr w:type="gramEnd"/>
-      <w:r>
-        <w:t>…)</w:t>
+        <w:t>(…)</w:t>
       </w:r>
       <w:r>
         <w:t>.   This is called during snapshot chunk serialization.</w:t>
@@ -21022,65 +20697,45 @@
         <w:t xml:space="preserve"> </w:t>
       </w:r>
       <w:proofErr w:type="spellStart"/>
-      <w:proofErr w:type="gramStart"/>
       <w:r>
         <w:t>UpdatePerfCaptureMenu</w:t>
       </w:r>
       <w:proofErr w:type="spellEnd"/>
       <w:r>
-        <w:t>(</w:t>
-      </w:r>
-      <w:proofErr w:type="gramEnd"/>
-      <w:r>
-        <w:t>)</w:t>
+        <w:t>()</w:t>
       </w:r>
       <w:r>
         <w:t xml:space="preserve">, </w:t>
       </w:r>
       <w:proofErr w:type="spellStart"/>
-      <w:proofErr w:type="gramStart"/>
       <w:r>
         <w:t>CapturePerf</w:t>
       </w:r>
       <w:proofErr w:type="spellEnd"/>
       <w:r>
-        <w:t>(</w:t>
-      </w:r>
-      <w:proofErr w:type="gramEnd"/>
-      <w:r>
-        <w:t>)</w:t>
+        <w:t>()</w:t>
       </w:r>
       <w:r>
         <w:t xml:space="preserve">, </w:t>
       </w:r>
       <w:proofErr w:type="spellStart"/>
-      <w:proofErr w:type="gramStart"/>
       <w:r>
         <w:t>EndPerfCapture</w:t>
       </w:r>
       <w:proofErr w:type="spellEnd"/>
       <w:r>
-        <w:t>(</w:t>
-      </w:r>
-      <w:proofErr w:type="gramEnd"/>
-      <w:r>
-        <w:t>)</w:t>
+        <w:t>()</w:t>
       </w:r>
       <w:r>
         <w:t xml:space="preserve">, and </w:t>
       </w:r>
       <w:proofErr w:type="spellStart"/>
-      <w:proofErr w:type="gramStart"/>
       <w:r>
         <w:t>IsCapturingPerf</w:t>
       </w:r>
       <w:proofErr w:type="spellEnd"/>
       <w:r>
-        <w:t>(</w:t>
-      </w:r>
-      <w:proofErr w:type="gramEnd"/>
-      <w:r>
-        <w:t>)</w:t>
+        <w:t>()</w:t>
       </w:r>
       <w:r>
         <w:t xml:space="preserve"> functions</w:t>
@@ -21327,7 +20982,6 @@
         <w:t>*</w:t>
       </w:r>
       <w:proofErr w:type="spellStart"/>
-      <w:proofErr w:type="gramStart"/>
       <w:r>
         <w:rPr>
           <w:b/>
@@ -21364,7 +21018,6 @@
         <w:t>.filters</w:t>
       </w:r>
       <w:proofErr w:type="spellEnd"/>
-      <w:proofErr w:type="gramEnd"/>
     </w:p>
     <w:p>
       <w:pPr>
@@ -21724,19 +21377,11 @@
         </w:rPr>
         <w:t xml:space="preserve">    </w:t>
       </w:r>
-      <w:proofErr w:type="gramStart"/>
       <w:r>
         <w:rPr>
           <w:color w:val="FFFFFF" w:themeColor="background1"/>
         </w:rPr>
-        <w:t>git</w:t>
-      </w:r>
-      <w:proofErr w:type="gramEnd"/>
-      <w:r>
-        <w:rPr>
-          <w:color w:val="FFFFFF" w:themeColor="background1"/>
-        </w:rPr>
-        <w:t xml:space="preserve"> </w:t>
+        <w:t xml:space="preserve">git </w:t>
       </w:r>
       <w:r>
         <w:rPr>
@@ -24341,6 +23986,7 @@
   <w:style w:type="character" w:default="1" w:styleId="DefaultParagraphFont">
     <w:name w:val="Default Paragraph Font"/>
     <w:uiPriority w:val="1"/>
+    <w:semiHidden/>
     <w:unhideWhenUsed/>
   </w:style>
   <w:style w:type="table" w:default="1" w:styleId="TableNormal">

</xml_diff>

<commit_message>
Corrected .perf file format documentation.
</commit_message>
<xml_diff>
--- a/docs/BeebPerf.docx
+++ b/docs/BeebPerf.docx
@@ -6044,10 +6044,7 @@
         <w:t>parameters associated with a frame start event.</w:t>
       </w:r>
       <w:r>
-        <w:t xml:space="preserve">  </w:t>
-      </w:r>
-      <w:r>
-        <w:t>Contains the following immutable fields:</w:t>
+        <w:t xml:space="preserve">  Contains the following immutable fields:</w:t>
       </w:r>
     </w:p>
     <w:p>
@@ -14061,7 +14058,7 @@
           </w:tcPr>
           <w:p>
             <w:r>
-              <w:t>&lt;mos_ram&gt;</w:t>
+              <w:t>&lt;private_ram&gt;</w:t>
             </w:r>
           </w:p>
         </w:tc>
@@ -14083,6 +14080,9 @@
             <w:pPr>
               <w:jc w:val="center"/>
             </w:pPr>
+            <w:r>
+              <w:t>yes</w:t>
+            </w:r>
           </w:p>
         </w:tc>
         <w:tc>
@@ -14093,6 +14093,9 @@
             <w:pPr>
               <w:jc w:val="center"/>
             </w:pPr>
+            <w:r>
+              <w:t>yes</w:t>
+            </w:r>
           </w:p>
         </w:tc>
         <w:tc>
@@ -14103,9 +14106,6 @@
             <w:pPr>
               <w:jc w:val="center"/>
             </w:pPr>
-            <w:r>
-              <w:t>yes</w:t>
-            </w:r>
           </w:p>
         </w:tc>
       </w:tr>
@@ -14116,7 +14116,7 @@
           </w:tcPr>
           <w:p>
             <w:r>
-              <w:t>&lt;filing_system_ram&gt;</w:t>
+              <w:t>&lt;private_mos_ram&gt;</w:t>
             </w:r>
           </w:p>
         </w:tc>
@@ -14171,7 +14171,7 @@
           </w:tcPr>
           <w:p>
             <w:r>
-              <w:t>&lt;private_ram&gt;</w:t>
+              <w:t>&lt;filing_system_ram&gt;</w:t>
             </w:r>
           </w:p>
         </w:tc>
@@ -14193,9 +14193,6 @@
             <w:pPr>
               <w:jc w:val="center"/>
             </w:pPr>
-            <w:r>
-              <w:t>yes</w:t>
-            </w:r>
           </w:p>
         </w:tc>
         <w:tc>
@@ -14206,9 +14203,6 @@
             <w:pPr>
               <w:jc w:val="center"/>
             </w:pPr>
-            <w:r>
-              <w:t>yes</w:t>
-            </w:r>
           </w:p>
         </w:tc>
         <w:tc>
@@ -14219,6 +14213,9 @@
             <w:pPr>
               <w:jc w:val="center"/>
             </w:pPr>
+            <w:r>
+              <w:t>yes</w:t>
+            </w:r>
           </w:p>
         </w:tc>
       </w:tr>
@@ -14436,7 +14433,13 @@
         <w:t>&lt;shadow_ram&gt;</w:t>
       </w:r>
       <w:r>
-        <w:t xml:space="preserve"> (20K) Populated on Model B Plus, BBC Model B Integra, and BBC Master.  Addresses &amp;3000 to &amp;7FFF.</w:t>
+        <w:t xml:space="preserve"> (20K) </w:t>
+      </w:r>
+      <w:r>
+        <w:t>Written</w:t>
+      </w:r>
+      <w:r>
+        <w:t xml:space="preserve"> on Model B Plus, BBC Model B Integra, and BBC Master.  Addresses &amp;3000 to &amp;7FFF.</w:t>
       </w:r>
     </w:p>
     <w:p>
@@ -14448,10 +14451,55 @@
           <w:b/>
           <w:bCs/>
         </w:rPr>
-        <w:t>&lt;mos_ram&gt;</w:t>
-      </w:r>
-      <w:r>
-        <w:t xml:space="preserve"> (4K) Populated on BBC Master.  Addresses &amp;8000 to &amp;8FFF.</w:t>
+        <w:t xml:space="preserve">&lt;private_ram&gt; </w:t>
+      </w:r>
+      <w:r>
+        <w:t xml:space="preserve">(12K) </w:t>
+      </w:r>
+      <w:r>
+        <w:t>Written</w:t>
+      </w:r>
+      <w:r>
+        <w:t xml:space="preserve"> on </w:t>
+      </w:r>
+      <w:r>
+        <w:t xml:space="preserve">BBC </w:t>
+      </w:r>
+      <w:r>
+        <w:t>Model B Plus</w:t>
+      </w:r>
+      <w:r>
+        <w:t xml:space="preserve"> and </w:t>
+      </w:r>
+      <w:r>
+        <w:t>BBC Model B</w:t>
+      </w:r>
+      <w:r>
+        <w:t xml:space="preserve"> </w:t>
+      </w:r>
+      <w:r>
+        <w:t>Integra.</w:t>
+      </w:r>
+      <w:r>
+        <w:t xml:space="preserve"> </w:t>
+      </w:r>
+      <w:r>
+        <w:t>Addresses &amp;</w:t>
+      </w:r>
+      <w:r>
+        <w:t>8</w:t>
+      </w:r>
+      <w:r>
+        <w:t>000 to &amp;</w:t>
+      </w:r>
+      <w:r>
+        <w:t>A</w:t>
+      </w:r>
+      <w:r>
+        <w:t>FFF.</w:t>
+      </w:r>
+      <w:r>
+        <w:t xml:space="preserve"> </w:t>
       </w:r>
     </w:p>
     <w:p>
@@ -14463,10 +14511,51 @@
           <w:b/>
           <w:bCs/>
         </w:rPr>
+        <w:t>&lt;</w:t>
+      </w:r>
+      <w:r>
+        <w:rPr>
+          <w:b/>
+          <w:bCs/>
+        </w:rPr>
+        <w:t>private_</w:t>
+      </w:r>
+      <w:r>
+        <w:rPr>
+          <w:b/>
+          <w:bCs/>
+        </w:rPr>
+        <w:t>mos_ram&gt;</w:t>
+      </w:r>
+      <w:r>
+        <w:t xml:space="preserve"> (4K) </w:t>
+      </w:r>
+      <w:r>
+        <w:t>Written</w:t>
+      </w:r>
+      <w:r>
+        <w:t xml:space="preserve"> on BBC Master.  Addresses &amp;8000 to &amp;8FFF.</w:t>
+      </w:r>
+    </w:p>
+    <w:p>
+      <w:pPr>
+        <w:ind w:left="720"/>
+      </w:pPr>
+      <w:r>
+        <w:rPr>
+          <w:b/>
+          <w:bCs/>
+        </w:rPr>
         <w:t>&lt;filing_system_ram&gt;</w:t>
       </w:r>
       <w:r>
-        <w:t xml:space="preserve"> (8K) Populated on BBC Master.  Addresses &amp;C000 to &amp;DFFF.</w:t>
+        <w:t xml:space="preserve"> (8K) </w:t>
+      </w:r>
+      <w:r>
+        <w:t>Written</w:t>
+      </w:r>
+      <w:r>
+        <w:t xml:space="preserve"> on BBC Master.  Addresses &amp;C000 to &amp;DFFF.</w:t>
       </w:r>
     </w:p>
     <w:p>
@@ -14478,64 +14567,19 @@
           <w:b/>
           <w:bCs/>
         </w:rPr>
-        <w:t xml:space="preserve">&lt;private_ram&gt; </w:t>
-      </w:r>
-      <w:r>
-        <w:t xml:space="preserve">(12K) Populated on </w:t>
-      </w:r>
-      <w:r>
-        <w:t xml:space="preserve">BBC </w:t>
-      </w:r>
-      <w:r>
-        <w:t>Model B Plus</w:t>
-      </w:r>
-      <w:r>
-        <w:t xml:space="preserve"> and </w:t>
-      </w:r>
-      <w:r>
-        <w:t>BBC Model B</w:t>
+        <w:t>&lt;hidden_ram&gt;</w:t>
+      </w:r>
+      <w:r>
+        <w:t xml:space="preserve"> (256 bytes) </w:t>
+      </w:r>
+      <w:r>
+        <w:t>Written</w:t>
       </w:r>
       <w:r>
         <w:t xml:space="preserve"> </w:t>
       </w:r>
       <w:r>
-        <w:t>Integra.</w:t>
-      </w:r>
-      <w:r>
-        <w:t xml:space="preserve"> </w:t>
-      </w:r>
-      <w:r>
-        <w:t>Addresses &amp;</w:t>
-      </w:r>
-      <w:r>
-        <w:t>8</w:t>
-      </w:r>
-      <w:r>
-        <w:t>000 to &amp;</w:t>
-      </w:r>
-      <w:r>
-        <w:t>A</w:t>
-      </w:r>
-      <w:r>
-        <w:t>FFF.</w:t>
-      </w:r>
-      <w:r>
-        <w:t xml:space="preserve"> </w:t>
-      </w:r>
-    </w:p>
-    <w:p>
-      <w:pPr>
-        <w:ind w:left="720"/>
-      </w:pPr>
-      <w:r>
-        <w:rPr>
-          <w:b/>
-          <w:bCs/>
-        </w:rPr>
-        <w:t>&lt;hidden_ram&gt;</w:t>
-      </w:r>
-      <w:r>
-        <w:t xml:space="preserve"> (256 bytes) Populated on BBC Model Integra B.</w:t>
+        <w:t>on BBC Model Integra B.</w:t>
       </w:r>
     </w:p>
     <w:p>
@@ -22169,6 +22213,7 @@
   <w:style w:type="character" w:default="1" w:styleId="DefaultParagraphFont">
     <w:name w:val="Default Paragraph Font"/>
     <w:uiPriority w:val="1"/>
+    <w:semiHidden/>
     <w:unhideWhenUsed/>
   </w:style>
   <w:style w:type="table" w:default="1" w:styleId="TableNormal">

</xml_diff>

<commit_message>
Updated .Perf file format yet again to encode frame start event correctly, adding a start address property.
</commit_message>
<xml_diff>
--- a/docs/BeebPerf.docx
+++ b/docs/BeebPerf.docx
@@ -5556,6 +5556,18 @@
         </w:numPr>
       </w:pPr>
       <w:r>
+        <w:t>CRTC and video ULA registers</w:t>
+      </w:r>
+    </w:p>
+    <w:p>
+      <w:pPr>
+        <w:pStyle w:val="ListParagraph"/>
+        <w:numPr>
+          <w:ilvl w:val="1"/>
+          <w:numId w:val="2"/>
+        </w:numPr>
+      </w:pPr>
+      <w:r>
         <w:t>M</w:t>
       </w:r>
       <w:r>
@@ -5594,6 +5606,104 @@
     </w:p>
     <w:p>
       <w:pPr>
+        <w:rPr>
+          <w:rFonts w:ascii="Aptos" w:hAnsi="Aptos"/>
+          <w:color w:val="000000"/>
+        </w:rPr>
+      </w:pPr>
+      <w:r>
+        <w:rPr>
+          <w:rFonts w:ascii="Aptos" w:hAnsi="Aptos"/>
+          <w:color w:val="000000"/>
+        </w:rPr>
+        <w:t xml:space="preserve">As part of </w:t>
+      </w:r>
+      <w:r>
+        <w:rPr>
+          <w:rFonts w:ascii="Aptos" w:hAnsi="Aptos"/>
+          <w:color w:val="000000"/>
+        </w:rPr>
+        <w:t xml:space="preserve">the loading </w:t>
+      </w:r>
+      <w:r>
+        <w:rPr>
+          <w:rFonts w:ascii="Aptos" w:hAnsi="Aptos"/>
+          <w:color w:val="000000"/>
+        </w:rPr>
+        <w:t xml:space="preserve">process, addresses are converted to canonical addresses, where </w:t>
+      </w:r>
+      <w:r>
+        <w:rPr>
+          <w:rFonts w:ascii="Aptos" w:hAnsi="Aptos"/>
+          <w:color w:val="000000"/>
+        </w:rPr>
+        <w:t xml:space="preserve">every </w:t>
+      </w:r>
+      <w:r>
+        <w:rPr>
+          <w:rFonts w:ascii="Aptos" w:hAnsi="Aptos"/>
+          <w:color w:val="000000"/>
+        </w:rPr>
+        <w:t xml:space="preserve">address </w:t>
+      </w:r>
+      <w:r>
+        <w:rPr>
+          <w:rFonts w:ascii="Aptos" w:hAnsi="Aptos"/>
+          <w:color w:val="000000"/>
+        </w:rPr>
+        <w:t xml:space="preserve">has an associated </w:t>
+      </w:r>
+      <w:r>
+        <w:rPr>
+          <w:rFonts w:ascii="Aptos" w:hAnsi="Aptos"/>
+          <w:color w:val="000000"/>
+        </w:rPr>
+        <w:t>page identifier.</w:t>
+      </w:r>
+    </w:p>
+    <w:p>
+      <w:r>
+        <w:rPr>
+          <w:b/>
+          <w:bCs/>
+        </w:rPr>
+        <w:t>Canonical Address</w:t>
+      </w:r>
+      <w:r>
+        <w:t xml:space="preserve"> </w:t>
+      </w:r>
+      <w:r>
+        <w:rPr>
+          <w:b/>
+          <w:bCs/>
+        </w:rPr>
+        <w:t>–</w:t>
+      </w:r>
+      <w:r>
+        <w:rPr>
+          <w:b/>
+          <w:bCs/>
+        </w:rPr>
+        <w:t xml:space="preserve"> </w:t>
+      </w:r>
+      <w:r>
+        <w:t>represents a unique memory address.</w:t>
+      </w:r>
+      <w:r>
+        <w:t xml:space="preserve"> </w:t>
+      </w:r>
+      <w:r>
+        <w:t xml:space="preserve"> </w:t>
+      </w:r>
+      <w:r>
+        <w:t>It c</w:t>
+      </w:r>
+      <w:r>
+        <w:t>ontains the following immutable fields:</w:t>
+      </w:r>
+    </w:p>
+    <w:p>
+      <w:pPr>
         <w:pStyle w:val="ListParagraph"/>
         <w:numPr>
           <w:ilvl w:val="0"/>
@@ -5601,111 +5711,7 @@
         </w:numPr>
       </w:pPr>
       <w:r>
-        <w:t xml:space="preserve">Frame start event params (array of </w:t>
-      </w:r>
-      <w:r>
-        <w:t>FrameStartEventParams</w:t>
-      </w:r>
-      <w:r>
-        <w:t>)</w:t>
-      </w:r>
-    </w:p>
-    <w:p>
-      <w:pPr>
-        <w:rPr>
-          <w:rFonts w:ascii="Aptos" w:hAnsi="Aptos"/>
-          <w:color w:val="000000"/>
-        </w:rPr>
-      </w:pPr>
-      <w:r>
-        <w:rPr>
-          <w:rFonts w:ascii="Aptos" w:hAnsi="Aptos"/>
-          <w:color w:val="000000"/>
-        </w:rPr>
-        <w:t xml:space="preserve">As part of </w:t>
-      </w:r>
-      <w:r>
-        <w:rPr>
-          <w:rFonts w:ascii="Aptos" w:hAnsi="Aptos"/>
-          <w:color w:val="000000"/>
-        </w:rPr>
-        <w:t xml:space="preserve">the loading </w:t>
-      </w:r>
-      <w:r>
-        <w:rPr>
-          <w:rFonts w:ascii="Aptos" w:hAnsi="Aptos"/>
-          <w:color w:val="000000"/>
-        </w:rPr>
-        <w:t xml:space="preserve">process, addresses are converted to canonical addresses, where </w:t>
-      </w:r>
-      <w:r>
-        <w:rPr>
-          <w:rFonts w:ascii="Aptos" w:hAnsi="Aptos"/>
-          <w:color w:val="000000"/>
-        </w:rPr>
-        <w:t xml:space="preserve">every </w:t>
-      </w:r>
-      <w:r>
-        <w:rPr>
-          <w:rFonts w:ascii="Aptos" w:hAnsi="Aptos"/>
-          <w:color w:val="000000"/>
-        </w:rPr>
-        <w:t xml:space="preserve">address </w:t>
-      </w:r>
-      <w:r>
-        <w:rPr>
-          <w:rFonts w:ascii="Aptos" w:hAnsi="Aptos"/>
-          <w:color w:val="000000"/>
-        </w:rPr>
-        <w:t xml:space="preserve">has an associated </w:t>
-      </w:r>
-      <w:r>
-        <w:rPr>
-          <w:rFonts w:ascii="Aptos" w:hAnsi="Aptos"/>
-          <w:color w:val="000000"/>
-        </w:rPr>
-        <w:t>page identifier.</w:t>
-      </w:r>
-    </w:p>
-    <w:p>
-      <w:r>
-        <w:rPr>
-          <w:b/>
-          <w:bCs/>
-        </w:rPr>
-        <w:t>Canonical Address</w:t>
-      </w:r>
-      <w:r>
-        <w:t xml:space="preserve"> </w:t>
-      </w:r>
-      <w:r>
-        <w:rPr>
-          <w:b/>
-          <w:bCs/>
-        </w:rPr>
-        <w:t>–</w:t>
-      </w:r>
-      <w:r>
-        <w:rPr>
-          <w:b/>
-          <w:bCs/>
-        </w:rPr>
-        <w:t xml:space="preserve"> </w:t>
-      </w:r>
-      <w:r>
-        <w:t>represents a unique memory address.</w:t>
-      </w:r>
-      <w:r>
-        <w:t xml:space="preserve"> </w:t>
-      </w:r>
-      <w:r>
-        <w:t xml:space="preserve"> </w:t>
-      </w:r>
-      <w:r>
-        <w:t>It c</w:t>
-      </w:r>
-      <w:r>
-        <w:t>ontains the following immutable fields:</w:t>
+        <w:t>Page – memory page</w:t>
       </w:r>
     </w:p>
     <w:p>
@@ -5717,7 +5723,74 @@
         </w:numPr>
       </w:pPr>
       <w:r>
-        <w:t>Page – memory page</w:t>
+        <w:t xml:space="preserve">Address – </w:t>
+      </w:r>
+      <w:r>
+        <w:t xml:space="preserve">absolute </w:t>
+      </w:r>
+      <w:r>
+        <w:t>memory address</w:t>
+      </w:r>
+    </w:p>
+    <w:p>
+      <w:r>
+        <w:t xml:space="preserve">All the events and instructions defined across </w:t>
+      </w:r>
+      <w:r>
+        <w:t xml:space="preserve">the read .perf file’s </w:t>
+      </w:r>
+      <w:r>
+        <w:t xml:space="preserve">execution chunks are put in a single </w:t>
+      </w:r>
+      <w:r>
+        <w:t xml:space="preserve">large </w:t>
+      </w:r>
+      <w:r>
+        <w:t xml:space="preserve">array of </w:t>
+      </w:r>
+      <w:r>
+        <w:rPr>
+          <w:b/>
+          <w:bCs/>
+        </w:rPr>
+        <w:t>Instruction</w:t>
+      </w:r>
+      <w:r>
+        <w:t>.</w:t>
+      </w:r>
+    </w:p>
+    <w:p>
+      <w:r>
+        <w:rPr>
+          <w:b/>
+          <w:bCs/>
+        </w:rPr>
+        <w:t>Instruction</w:t>
+      </w:r>
+      <w:r>
+        <w:t xml:space="preserve"> </w:t>
+      </w:r>
+      <w:r>
+        <w:rPr>
+          <w:b/>
+          <w:bCs/>
+        </w:rPr>
+        <w:t>–</w:t>
+      </w:r>
+      <w:r>
+        <w:t xml:space="preserve"> represents an individual recorded instruction</w:t>
+      </w:r>
+      <w:r>
+        <w:t xml:space="preserve"> </w:t>
+      </w:r>
+      <w:r>
+        <w:t>or event</w:t>
+      </w:r>
+      <w:r>
+        <w:t xml:space="preserve"> (like an interrupt)</w:t>
+      </w:r>
+      <w:r>
+        <w:t>.  Contains the following immutable fields:</w:t>
       </w:r>
     </w:p>
     <w:p>
@@ -5729,74 +5802,7 @@
         </w:numPr>
       </w:pPr>
       <w:r>
-        <w:t xml:space="preserve">Address – </w:t>
-      </w:r>
-      <w:r>
-        <w:t xml:space="preserve">absolute </w:t>
-      </w:r>
-      <w:r>
-        <w:t>memory address</w:t>
-      </w:r>
-    </w:p>
-    <w:p>
-      <w:r>
-        <w:t xml:space="preserve">All the events and instructions defined across </w:t>
-      </w:r>
-      <w:r>
-        <w:t xml:space="preserve">the read .perf file’s </w:t>
-      </w:r>
-      <w:r>
-        <w:t xml:space="preserve">execution chunks are put in a single </w:t>
-      </w:r>
-      <w:r>
-        <w:t xml:space="preserve">large </w:t>
-      </w:r>
-      <w:r>
-        <w:t xml:space="preserve">array of </w:t>
-      </w:r>
-      <w:r>
-        <w:rPr>
-          <w:b/>
-          <w:bCs/>
-        </w:rPr>
-        <w:t>Instruction</w:t>
-      </w:r>
-      <w:r>
-        <w:t>.</w:t>
-      </w:r>
-    </w:p>
-    <w:p>
-      <w:r>
-        <w:rPr>
-          <w:b/>
-          <w:bCs/>
-        </w:rPr>
-        <w:t>Instruction</w:t>
-      </w:r>
-      <w:r>
-        <w:t xml:space="preserve"> </w:t>
-      </w:r>
-      <w:r>
-        <w:rPr>
-          <w:b/>
-          <w:bCs/>
-        </w:rPr>
-        <w:t>–</w:t>
-      </w:r>
-      <w:r>
-        <w:t xml:space="preserve"> represents an individual recorded instruction</w:t>
-      </w:r>
-      <w:r>
-        <w:t xml:space="preserve"> </w:t>
-      </w:r>
-      <w:r>
-        <w:t>or event</w:t>
-      </w:r>
-      <w:r>
-        <w:t xml:space="preserve"> (like an interrupt)</w:t>
-      </w:r>
-      <w:r>
-        <w:t>.  Contains the following immutable fields:</w:t>
+        <w:t>Type (instruction or event-type)</w:t>
       </w:r>
     </w:p>
     <w:p>
@@ -5808,7 +5814,7 @@
         </w:numPr>
       </w:pPr>
       <w:r>
-        <w:t>Type (instruction or event-type)</w:t>
+        <w:t>Cycle count (instruction/interrupt)</w:t>
       </w:r>
     </w:p>
     <w:p>
@@ -5820,7 +5826,7 @@
         </w:numPr>
       </w:pPr>
       <w:r>
-        <w:t>Cycle count (instruction/interrupt)</w:t>
+        <w:t>Opcode address (instruction)</w:t>
       </w:r>
     </w:p>
     <w:p>
@@ -5832,7 +5838,7 @@
         </w:numPr>
       </w:pPr>
       <w:r>
-        <w:t>Opcode address (instruction)</w:t>
+        <w:t>Opcode &amp; operand (instruction)</w:t>
       </w:r>
     </w:p>
     <w:p>
@@ -5844,7 +5850,7 @@
         </w:numPr>
       </w:pPr>
       <w:r>
-        <w:t>Opcode &amp; operand (instruction)</w:t>
+        <w:t>Stack value (instruction)</w:t>
       </w:r>
     </w:p>
     <w:p>
@@ -5856,7 +5862,7 @@
         </w:numPr>
       </w:pPr>
       <w:r>
-        <w:t>Stack value (instruction)</w:t>
+        <w:t>Stack pointer (instruction)</w:t>
       </w:r>
     </w:p>
     <w:p>
@@ -5868,7 +5874,7 @@
         </w:numPr>
       </w:pPr>
       <w:r>
-        <w:t>Stack pointer (instruction)</w:t>
+        <w:t>Memory address (instruction)</w:t>
       </w:r>
     </w:p>
     <w:p>
@@ -5880,7 +5886,7 @@
         </w:numPr>
       </w:pPr>
       <w:r>
-        <w:t>Memory address (instruction)</w:t>
+        <w:t>Memory read/write values (instruction)</w:t>
       </w:r>
     </w:p>
     <w:p>
@@ -5892,7 +5898,7 @@
         </w:numPr>
       </w:pPr>
       <w:r>
-        <w:t>Memory read/write values (instruction)</w:t>
+        <w:t>Destination address (instruction/interrupt)</w:t>
       </w:r>
     </w:p>
     <w:p>
@@ -5904,7 +5910,7 @@
         </w:numPr>
       </w:pPr>
       <w:r>
-        <w:t>Destination address (instruction/interrupt)</w:t>
+        <w:t>Return address (instruction/interrupt)</w:t>
       </w:r>
     </w:p>
     <w:p>
@@ -5916,7 +5922,7 @@
         </w:numPr>
       </w:pPr>
       <w:r>
-        <w:t>Return address (instruction/interrupt)</w:t>
+        <w:t>System-VIA and User-VIA interrupt flag registers (interrupt)</w:t>
       </w:r>
     </w:p>
     <w:p>
@@ -5928,7 +5934,13 @@
         </w:numPr>
       </w:pPr>
       <w:r>
-        <w:t>System-VIA and User-VIA interrupt flag registers (interrupt)</w:t>
+        <w:t>Offset cycle count (</w:t>
+      </w:r>
+      <w:r>
+        <w:t>frame start event</w:t>
+      </w:r>
+      <w:r>
+        <w:t>)</w:t>
       </w:r>
     </w:p>
     <w:p>
@@ -5940,335 +5952,16 @@
         </w:numPr>
       </w:pPr>
       <w:r>
-        <w:t>Frame start event parameter</w:t>
-      </w:r>
-      <w:r>
-        <w:t>s</w:t>
-      </w:r>
-      <w:r>
-        <w:t xml:space="preserve"> index (frame start event)</w:t>
-      </w:r>
-    </w:p>
-    <w:p>
-      <w:r>
-        <w:t xml:space="preserve">To minimize memory, </w:t>
-      </w:r>
-      <w:r>
-        <w:rPr>
-          <w:b/>
-          <w:bCs/>
-        </w:rPr>
-        <w:t>Instruction</w:t>
-      </w:r>
-      <w:r>
-        <w:t xml:space="preserve"> is defined as a 12-byte fixed sized </w:t>
-      </w:r>
-      <w:r>
-        <w:rPr>
-          <w:b/>
-          <w:bCs/>
-        </w:rPr>
-        <w:t>struct</w:t>
-      </w:r>
-      <w:r>
-        <w:t>.</w:t>
-      </w:r>
-    </w:p>
-    <w:p>
-      <w:r>
-        <w:lastRenderedPageBreak/>
-        <w:t xml:space="preserve">Frame start events contain more parameters than can fit within an Instruction, so the instruction contains an index into </w:t>
-      </w:r>
-      <w:r>
-        <w:t xml:space="preserve">the </w:t>
-      </w:r>
-      <w:r>
-        <w:rPr>
-          <w:b/>
-          <w:bCs/>
-        </w:rPr>
-        <w:t>FrameStartEventParams</w:t>
-      </w:r>
-      <w:r>
-        <w:rPr>
-          <w:b/>
-          <w:bCs/>
-        </w:rPr>
-        <w:t xml:space="preserve">List </w:t>
-      </w:r>
-      <w:r>
-        <w:t>array</w:t>
-      </w:r>
-      <w:r>
-        <w:t>.</w:t>
-      </w:r>
-    </w:p>
-    <w:p>
-      <w:r>
-        <w:rPr>
-          <w:b/>
-          <w:bCs/>
-        </w:rPr>
-        <w:t>FrameStartEventParams</w:t>
-      </w:r>
-      <w:r>
-        <w:rPr>
-          <w:b/>
-          <w:bCs/>
-        </w:rPr>
-        <w:t xml:space="preserve"> </w:t>
-      </w:r>
-      <w:r>
-        <w:t>– represents a</w:t>
-      </w:r>
-      <w:r>
-        <w:t>n</w:t>
-      </w:r>
-      <w:r>
-        <w:t xml:space="preserve"> ind</w:t>
-      </w:r>
-      <w:r>
-        <w:t xml:space="preserve">ividual </w:t>
-      </w:r>
-      <w:r>
-        <w:t>set of</w:t>
-      </w:r>
-      <w:r>
-        <w:rPr>
-          <w:b/>
-          <w:bCs/>
-        </w:rPr>
-        <w:t xml:space="preserve"> </w:t>
-      </w:r>
-      <w:r>
-        <w:t>parameters associated with a frame start event.</w:t>
-      </w:r>
-      <w:r>
-        <w:t xml:space="preserve">  Contains the following immutable fields:</w:t>
-      </w:r>
-    </w:p>
-    <w:p>
-      <w:pPr>
-        <w:pStyle w:val="ListParagraph"/>
-        <w:numPr>
-          <w:ilvl w:val="0"/>
-          <w:numId w:val="19"/>
-        </w:numPr>
-      </w:pPr>
-      <w:r>
-        <w:t>Offset</w:t>
-      </w:r>
-      <w:r>
-        <w:t xml:space="preserve"> c</w:t>
-      </w:r>
-      <w:r>
-        <w:t>ycle</w:t>
-      </w:r>
-      <w:r>
-        <w:t xml:space="preserve"> c</w:t>
-      </w:r>
-      <w:r>
-        <w:t>ount</w:t>
-      </w:r>
-      <w:r>
-        <w:t xml:space="preserve"> (number of cycle</w:t>
-      </w:r>
-      <w:r>
-        <w:t>s</w:t>
-      </w:r>
-      <w:r>
-        <w:t xml:space="preserve"> prior when the frame actually started)</w:t>
-      </w:r>
-    </w:p>
-    <w:p>
-      <w:pPr>
-        <w:pStyle w:val="ListParagraph"/>
-        <w:numPr>
-          <w:ilvl w:val="0"/>
-          <w:numId w:val="19"/>
-        </w:numPr>
-      </w:pPr>
-      <w:r>
-        <w:t xml:space="preserve">Video </w:t>
-      </w:r>
-      <w:r>
-        <w:t>ULA</w:t>
-      </w:r>
-      <w:r>
-        <w:t xml:space="preserve"> c</w:t>
-      </w:r>
-      <w:r>
-        <w:t>ontrol</w:t>
-      </w:r>
-      <w:r>
-        <w:t xml:space="preserve"> r</w:t>
-      </w:r>
-      <w:r>
-        <w:t>egister</w:t>
-      </w:r>
-    </w:p>
-    <w:p>
-      <w:pPr>
-        <w:pStyle w:val="ListParagraph"/>
-        <w:numPr>
-          <w:ilvl w:val="0"/>
-          <w:numId w:val="19"/>
-        </w:numPr>
-      </w:pPr>
-      <w:r>
-        <w:t xml:space="preserve">Video </w:t>
-      </w:r>
-      <w:r>
-        <w:t>ULA</w:t>
-      </w:r>
-      <w:r>
-        <w:t xml:space="preserve"> c</w:t>
-      </w:r>
-      <w:r>
-        <w:t>olor</w:t>
-      </w:r>
-      <w:r>
-        <w:t xml:space="preserve"> p</w:t>
-      </w:r>
-      <w:r>
-        <w:t xml:space="preserve">alette </w:t>
-      </w:r>
-      <w:r>
-        <w:t xml:space="preserve">(16 </w:t>
-      </w:r>
-      <w:r>
-        <w:t>palette entries</w:t>
+        <w:t>Start address</w:t>
+      </w:r>
+      <w:r>
+        <w:t xml:space="preserve"> (</w:t>
+      </w:r>
+      <w:r>
+        <w:t>frame start event</w:t>
       </w:r>
       <w:r>
         <w:t>)</w:t>
-      </w:r>
-    </w:p>
-    <w:p>
-      <w:pPr>
-        <w:pStyle w:val="ListParagraph"/>
-        <w:numPr>
-          <w:ilvl w:val="0"/>
-          <w:numId w:val="19"/>
-        </w:numPr>
-      </w:pPr>
-      <w:r>
-        <w:t>CRTC</w:t>
-      </w:r>
-      <w:r>
-        <w:t xml:space="preserve"> r</w:t>
-      </w:r>
-      <w:r>
-        <w:t>egister</w:t>
-      </w:r>
-      <w:r>
-        <w:t xml:space="preserve"> s</w:t>
-      </w:r>
-      <w:r>
-        <w:t>elect</w:t>
-      </w:r>
-    </w:p>
-    <w:p>
-      <w:pPr>
-        <w:pStyle w:val="ListParagraph"/>
-        <w:numPr>
-          <w:ilvl w:val="0"/>
-          <w:numId w:val="19"/>
-        </w:numPr>
-      </w:pPr>
-      <w:r>
-        <w:t>CRTC</w:t>
-      </w:r>
-      <w:r>
-        <w:t xml:space="preserve"> r</w:t>
-      </w:r>
-      <w:r>
-        <w:t xml:space="preserve">egisters </w:t>
-      </w:r>
-      <w:r>
-        <w:t>(18 register values)</w:t>
-      </w:r>
-    </w:p>
-    <w:p>
-      <w:pPr>
-        <w:pStyle w:val="ListParagraph"/>
-        <w:numPr>
-          <w:ilvl w:val="0"/>
-          <w:numId w:val="19"/>
-        </w:numPr>
-      </w:pPr>
-      <w:r>
-        <w:t>D</w:t>
-      </w:r>
-      <w:r>
-        <w:t>isplay</w:t>
-      </w:r>
-      <w:r>
-        <w:t xml:space="preserve"> s</w:t>
-      </w:r>
-      <w:r>
-        <w:t>canline</w:t>
-      </w:r>
-      <w:r>
-        <w:t xml:space="preserve"> (current display scanline 0..311)</w:t>
-      </w:r>
-    </w:p>
-    <w:p>
-      <w:pPr>
-        <w:pStyle w:val="ListParagraph"/>
-        <w:numPr>
-          <w:ilvl w:val="0"/>
-          <w:numId w:val="19"/>
-        </w:numPr>
-      </w:pPr>
-      <w:r>
-        <w:t>Display</w:t>
-      </w:r>
-      <w:r>
-        <w:t xml:space="preserve"> f</w:t>
-      </w:r>
-      <w:r>
-        <w:t>ield</w:t>
-      </w:r>
-      <w:r>
-        <w:t xml:space="preserve"> (whether even of odd field)</w:t>
-      </w:r>
-    </w:p>
-    <w:p>
-      <w:pPr>
-        <w:pStyle w:val="ListParagraph"/>
-        <w:numPr>
-          <w:ilvl w:val="0"/>
-          <w:numId w:val="19"/>
-        </w:numPr>
-      </w:pPr>
-      <w:r>
-        <w:t>Split</w:t>
-      </w:r>
-      <w:r>
-        <w:t xml:space="preserve"> s</w:t>
-      </w:r>
-      <w:r>
-        <w:t>creen</w:t>
-      </w:r>
-      <w:r>
-        <w:t xml:space="preserve"> flag (whether the frame is positioned below the previous one)</w:t>
-      </w:r>
-    </w:p>
-    <w:p>
-      <w:r>
-        <w:t>The snapshot call stack is represented by a list of mini stack frames.</w:t>
-      </w:r>
-    </w:p>
-    <w:p>
-      <w:r>
-        <w:rPr>
-          <w:b/>
-          <w:bCs/>
-        </w:rPr>
-        <w:t>MiniStackFrame</w:t>
-      </w:r>
-      <w:r>
-        <w:t xml:space="preserve"> – represents a mini stack frame.  Contains the following fields:</w:t>
       </w:r>
     </w:p>
     <w:p>
@@ -6280,7 +5973,16 @@
         </w:numPr>
       </w:pPr>
       <w:r>
-        <w:t>Call-type (Root, JSR, BRK, IRQ, NMI)</w:t>
+        <w:t>D</w:t>
+      </w:r>
+      <w:r>
+        <w:t>isplay scanline (</w:t>
+      </w:r>
+      <w:r>
+        <w:t>frame start event</w:t>
+      </w:r>
+      <w:r>
+        <w:t>)</w:t>
       </w:r>
     </w:p>
     <w:p>
@@ -6292,7 +5994,59 @@
         </w:numPr>
       </w:pPr>
       <w:r>
-        <w:t>Start address</w:t>
+        <w:t>D</w:t>
+      </w:r>
+      <w:r>
+        <w:t>isplay flags (</w:t>
+      </w:r>
+      <w:r>
+        <w:t>frame start event</w:t>
+      </w:r>
+      <w:r>
+        <w:t>)</w:t>
+      </w:r>
+    </w:p>
+    <w:p>
+      <w:r>
+        <w:lastRenderedPageBreak/>
+        <w:t xml:space="preserve">To minimize memory, </w:t>
+      </w:r>
+      <w:r>
+        <w:rPr>
+          <w:b/>
+          <w:bCs/>
+        </w:rPr>
+        <w:t>Instruction</w:t>
+      </w:r>
+      <w:r>
+        <w:t xml:space="preserve"> is defined as a 12-byte fixed sized </w:t>
+      </w:r>
+      <w:r>
+        <w:rPr>
+          <w:b/>
+          <w:bCs/>
+        </w:rPr>
+        <w:t>struct</w:t>
+      </w:r>
+      <w:r>
+        <w:t>.</w:t>
+      </w:r>
+    </w:p>
+    <w:p>
+      <w:r>
+        <w:t>The snapshot call stack is represented by a list of mini stack frames.</w:t>
+      </w:r>
+    </w:p>
+    <w:p>
+      <w:r>
+        <w:rPr>
+          <w:b/>
+          <w:bCs/>
+        </w:rPr>
+        <w:t>MiniStackFrame</w:t>
+      </w:r>
+      <w:r>
+        <w:t xml:space="preserve"> – represents a mini stack frame.  Contains the following fields:</w:t>
       </w:r>
     </w:p>
     <w:p>
@@ -6304,7 +6058,7 @@
         </w:numPr>
       </w:pPr>
       <w:r>
-        <w:t>Return address</w:t>
+        <w:t>Call-type (Root, JSR, BRK, IRQ, NMI)</w:t>
       </w:r>
     </w:p>
     <w:p>
@@ -6316,6 +6070,30 @@
         </w:numPr>
       </w:pPr>
       <w:r>
+        <w:t>Start address</w:t>
+      </w:r>
+    </w:p>
+    <w:p>
+      <w:pPr>
+        <w:pStyle w:val="ListParagraph"/>
+        <w:numPr>
+          <w:ilvl w:val="0"/>
+          <w:numId w:val="2"/>
+        </w:numPr>
+      </w:pPr>
+      <w:r>
+        <w:t>Return address</w:t>
+      </w:r>
+    </w:p>
+    <w:p>
+      <w:pPr>
+        <w:pStyle w:val="ListParagraph"/>
+        <w:numPr>
+          <w:ilvl w:val="0"/>
+          <w:numId w:val="2"/>
+        </w:numPr>
+      </w:pPr>
+      <w:r>
         <w:t>Return stack pointer</w:t>
       </w:r>
     </w:p>
@@ -6485,7 +6263,6 @@
         </w:numPr>
       </w:pPr>
       <w:r>
-        <w:lastRenderedPageBreak/>
         <w:t>End address</w:t>
       </w:r>
     </w:p>
@@ -6696,6 +6473,7 @@
         </w:numPr>
       </w:pPr>
       <w:r>
+        <w:lastRenderedPageBreak/>
         <w:t>First and last instruction indices</w:t>
       </w:r>
     </w:p>
@@ -6984,7 +6762,6 @@
         </w:numPr>
       </w:pPr>
       <w:r>
-        <w:lastRenderedPageBreak/>
         <w:t>Every RTS destination address, which does not have a corresponding call-site, is also a routine.</w:t>
       </w:r>
     </w:p>
@@ -7081,7 +6858,11 @@
         <w:t xml:space="preserve">first constructing an initial stack-tree from the snapshot call stack, before </w:t>
       </w:r>
       <w:r>
-        <w:t>iterating over all the recorded instructions, creating nested stack-frames as code traverses over the routines and interrupts in the program.</w:t>
+        <w:t xml:space="preserve">iterating over all the recorded instructions, creating </w:t>
+      </w:r>
+      <w:r>
+        <w:lastRenderedPageBreak/>
+        <w:t>nested stack-frames as code traverses over the routines and interrupts in the program.</w:t>
       </w:r>
       <w:r>
         <w:t xml:space="preserve">  Tail-call and fall-through stack frames are also created as part of this process.</w:t>
@@ -7330,7 +7111,6 @@
         <w:contextualSpacing w:val="0"/>
       </w:pPr>
       <w:r>
-        <w:lastRenderedPageBreak/>
         <w:t xml:space="preserve">The </w:t>
       </w:r>
       <w:r>
@@ -7539,59 +7319,73 @@
         <w:ind w:left="0"/>
       </w:pPr>
       <w:r>
-        <w:t>The emulation uses frame-start events in the performance log to identify the start of each CRTC frame. These events capture the CRTC and ULA states, along with an offset showing how many cycles earlier (0..7) the frame actually began.</w:t>
-      </w:r>
-    </w:p>
-    <w:p>
-      <w:pPr>
-        <w:rPr>
-          <w:rFonts w:ascii="Aptos" w:hAnsi="Aptos"/>
-          <w:color w:val="000000"/>
-        </w:rPr>
-      </w:pPr>
-      <w:r>
-        <w:rPr>
-          <w:rFonts w:ascii="Aptos" w:hAnsi="Aptos"/>
-          <w:color w:val="000000"/>
-        </w:rPr>
+        <w:lastRenderedPageBreak/>
+        <w:t xml:space="preserve">The emulation uses </w:t>
+      </w:r>
+      <w:r>
+        <w:t xml:space="preserve">frame start </w:t>
+      </w:r>
+      <w:r>
+        <w:t xml:space="preserve">events in the execution log to synchronize generated display-frames.  These events are emitted </w:t>
+      </w:r>
+      <w:r>
+        <w:t>when a frame’s first scanline is d</w:t>
+      </w:r>
+      <w:r>
+        <w:t>isplayed</w:t>
+      </w:r>
+      <w:r>
+        <w:t>, when DE (</w:t>
+      </w:r>
+      <w:r>
+        <w:t xml:space="preserve">Display Enable) is </w:t>
+      </w:r>
+      <w:r>
+        <w:t>set</w:t>
+      </w:r>
+      <w:r>
+        <w:t>.</w:t>
+      </w:r>
+    </w:p>
+    <w:p>
+      <w:r>
+        <w:t xml:space="preserve">Different emulator implementations handle screen mode changes slightly differently, causing timing variations that </w:t>
+      </w:r>
+      <w:r>
+        <w:rPr>
+          <w:b/>
+          <w:bCs/>
+        </w:rPr>
+        <w:t>BeebPerf</w:t>
+      </w:r>
+      <w:r>
+        <w:t xml:space="preserve"> cannot reconcile without this event.</w:t>
+      </w:r>
+    </w:p>
+    <w:p>
+      <w:pPr>
+        <w:rPr>
+          <w:rFonts w:ascii="Aptos" w:hAnsi="Aptos"/>
+          <w:color w:val="000000"/>
+        </w:rPr>
+      </w:pPr>
+      <w:r>
         <w:t>The</w:t>
       </w:r>
       <w:r>
-        <w:rPr>
-          <w:rFonts w:ascii="Aptos" w:hAnsi="Aptos"/>
-          <w:color w:val="000000"/>
-        </w:rPr>
         <w:t xml:space="preserve"> </w:t>
       </w:r>
       <w:r>
-        <w:rPr>
-          <w:rFonts w:ascii="Aptos" w:hAnsi="Aptos"/>
-          <w:color w:val="000000"/>
-        </w:rPr>
         <w:t xml:space="preserve">code </w:t>
       </w:r>
       <w:r>
-        <w:rPr>
-          <w:rFonts w:ascii="Aptos" w:hAnsi="Aptos"/>
-          <w:color w:val="000000"/>
-        </w:rPr>
         <w:t xml:space="preserve">is </w:t>
       </w:r>
       <w:r>
-        <w:rPr>
-          <w:rFonts w:ascii="Aptos" w:hAnsi="Aptos"/>
-          <w:color w:val="000000"/>
-        </w:rPr>
-        <w:t xml:space="preserve">based on </w:t>
-      </w:r>
-      <w:r>
-        <w:rPr>
-          <w:rFonts w:ascii="Aptos" w:hAnsi="Aptos"/>
-          <w:b/>
-          <w:bCs/>
-          <w:color w:val="000000"/>
-        </w:rPr>
-        <w:t>BeebEm’s</w:t>
+        <w:t xml:space="preserve">largely </w:t>
+      </w:r>
+      <w:r>
+        <w:t>based on BeebEm’s</w:t>
       </w:r>
       <w:r>
         <w:rPr>
@@ -7612,21 +7406,21 @@
           <w:rFonts w:ascii="Aptos" w:hAnsi="Aptos"/>
           <w:color w:val="000000"/>
         </w:rPr>
-        <w:t>, but runs at scanline</w:t>
-      </w:r>
-      <w:r>
-        <w:rPr>
-          <w:rFonts w:ascii="Aptos" w:hAnsi="Aptos"/>
-          <w:color w:val="000000"/>
-        </w:rPr>
-        <w:t>/</w:t>
-      </w:r>
-      <w:r>
-        <w:rPr>
-          <w:rFonts w:ascii="Aptos" w:hAnsi="Aptos"/>
-          <w:color w:val="000000"/>
-        </w:rPr>
-        <w:t>character fidelity.</w:t>
+        <w:t xml:space="preserve"> but runs at character</w:t>
+      </w:r>
+      <w:r>
+        <w:rPr>
+          <w:rFonts w:ascii="Aptos" w:hAnsi="Aptos"/>
+          <w:color w:val="000000"/>
+        </w:rPr>
+        <w:t xml:space="preserve">-level </w:t>
+      </w:r>
+      <w:r>
+        <w:rPr>
+          <w:rFonts w:ascii="Aptos" w:hAnsi="Aptos"/>
+          <w:color w:val="000000"/>
+        </w:rPr>
+        <w:t>fidelity.</w:t>
       </w:r>
     </w:p>
     <w:p>
@@ -8229,271 +8023,271 @@
         <w:pStyle w:val="Heading5"/>
       </w:pPr>
       <w:r>
+        <w:t>Teletext screen mode (Mode 7)</w:t>
+      </w:r>
+      <w:r>
+        <w:t xml:space="preserve"> </w:t>
+      </w:r>
+      <w:r>
+        <w:t>details</w:t>
+      </w:r>
+      <w:r>
+        <w:t>:</w:t>
+      </w:r>
+    </w:p>
+    <w:p>
+      <w:pPr>
+        <w:rPr>
+          <w:rFonts w:ascii="Aptos" w:hAnsi="Aptos"/>
+          <w:color w:val="000000"/>
+        </w:rPr>
+      </w:pPr>
+      <w:r>
+        <w:rPr>
+          <w:rFonts w:ascii="Aptos" w:hAnsi="Aptos"/>
+          <w:color w:val="000000"/>
+        </w:rPr>
+        <w:t xml:space="preserve">Mode 7 uses interlaced sync </w:t>
+      </w:r>
+      <w:r>
+        <w:rPr>
+          <w:rFonts w:ascii="Aptos" w:hAnsi="Aptos"/>
+          <w:color w:val="000000"/>
+        </w:rPr>
+        <w:t xml:space="preserve">&amp; </w:t>
+      </w:r>
+      <w:r>
+        <w:rPr>
+          <w:rFonts w:ascii="Aptos" w:hAnsi="Aptos"/>
+          <w:color w:val="000000"/>
+        </w:rPr>
+        <w:t>video</w:t>
+      </w:r>
+      <w:r>
+        <w:rPr>
+          <w:rFonts w:ascii="Aptos" w:hAnsi="Aptos"/>
+          <w:color w:val="000000"/>
+        </w:rPr>
+        <w:t xml:space="preserve"> mode</w:t>
+      </w:r>
+      <w:r>
+        <w:rPr>
+          <w:rFonts w:ascii="Aptos" w:hAnsi="Aptos"/>
+          <w:color w:val="000000"/>
+        </w:rPr>
+        <w:t xml:space="preserve">, </w:t>
+      </w:r>
+      <w:r>
+        <w:rPr>
+          <w:rFonts w:ascii="Aptos" w:hAnsi="Aptos"/>
+          <w:color w:val="000000"/>
+        </w:rPr>
+        <w:t xml:space="preserve">displaying </w:t>
+      </w:r>
+      <w:r>
+        <w:rPr>
+          <w:rFonts w:ascii="Aptos" w:hAnsi="Aptos"/>
+          <w:color w:val="000000"/>
+        </w:rPr>
+        <w:t>250 lines (or 25 rows of text</w:t>
+      </w:r>
+      <w:r>
+        <w:rPr>
+          <w:rFonts w:ascii="Aptos" w:hAnsi="Aptos"/>
+          <w:color w:val="000000"/>
+        </w:rPr>
+        <w:t xml:space="preserve">, each with </w:t>
+      </w:r>
+      <w:r>
+        <w:rPr>
+          <w:rFonts w:ascii="Aptos" w:hAnsi="Aptos"/>
+          <w:color w:val="000000"/>
+        </w:rPr>
+        <w:t xml:space="preserve">ten even or ten odd </w:t>
+      </w:r>
+      <w:r>
+        <w:rPr>
+          <w:rFonts w:ascii="Aptos" w:hAnsi="Aptos"/>
+          <w:color w:val="000000"/>
+        </w:rPr>
+        <w:t>scanlines</w:t>
+      </w:r>
+      <w:r>
+        <w:rPr>
+          <w:rFonts w:ascii="Aptos" w:hAnsi="Aptos"/>
+          <w:color w:val="000000"/>
+        </w:rPr>
+        <w:t xml:space="preserve">) per field. </w:t>
+      </w:r>
+      <w:r>
+        <w:rPr>
+          <w:rFonts w:ascii="Aptos" w:hAnsi="Aptos"/>
+          <w:color w:val="000000"/>
+        </w:rPr>
+        <w:t xml:space="preserve"> </w:t>
+      </w:r>
+      <w:r>
+        <w:rPr>
+          <w:rFonts w:ascii="Aptos" w:hAnsi="Aptos"/>
+          <w:color w:val="000000"/>
+        </w:rPr>
+        <w:t>Th</w:t>
+      </w:r>
+      <w:r>
+        <w:rPr>
+          <w:rFonts w:ascii="Aptos" w:hAnsi="Aptos"/>
+          <w:color w:val="000000"/>
+        </w:rPr>
+        <w:t>ese</w:t>
+      </w:r>
+      <w:r>
+        <w:rPr>
+          <w:rFonts w:ascii="Aptos" w:hAnsi="Aptos"/>
+          <w:color w:val="000000"/>
+        </w:rPr>
+        <w:t xml:space="preserve"> interleaving </w:t>
+      </w:r>
+      <w:r>
+        <w:rPr>
+          <w:rFonts w:ascii="Aptos" w:hAnsi="Aptos"/>
+          <w:color w:val="000000"/>
+        </w:rPr>
+        <w:t xml:space="preserve">fields </w:t>
+      </w:r>
+      <w:r>
+        <w:rPr>
+          <w:rFonts w:ascii="Aptos" w:hAnsi="Aptos"/>
+          <w:color w:val="000000"/>
+        </w:rPr>
+        <w:t>produce a</w:t>
+      </w:r>
+      <w:r>
+        <w:rPr>
+          <w:rFonts w:ascii="Aptos" w:hAnsi="Aptos"/>
+          <w:color w:val="000000"/>
+        </w:rPr>
+        <w:t xml:space="preserve"> </w:t>
+      </w:r>
+      <w:r>
+        <w:rPr>
+          <w:rFonts w:ascii="Aptos" w:hAnsi="Aptos"/>
+          <w:color w:val="000000"/>
+        </w:rPr>
+        <w:t xml:space="preserve">500-line </w:t>
+      </w:r>
+      <w:r>
+        <w:rPr>
+          <w:rFonts w:ascii="Aptos" w:hAnsi="Aptos"/>
+          <w:color w:val="000000"/>
+        </w:rPr>
+        <w:t xml:space="preserve">interlaced </w:t>
+      </w:r>
+      <w:r>
+        <w:rPr>
+          <w:rFonts w:ascii="Aptos" w:hAnsi="Aptos"/>
+          <w:color w:val="000000"/>
+        </w:rPr>
+        <w:t>image</w:t>
+      </w:r>
+      <w:r>
+        <w:rPr>
+          <w:rFonts w:ascii="Aptos" w:hAnsi="Aptos"/>
+          <w:color w:val="000000"/>
+        </w:rPr>
+        <w:t xml:space="preserve"> </w:t>
+      </w:r>
+      <w:r>
+        <w:rPr>
+          <w:rFonts w:ascii="Aptos" w:hAnsi="Aptos"/>
+          <w:color w:val="000000"/>
+        </w:rPr>
+        <w:t>on the display</w:t>
+      </w:r>
+      <w:r>
+        <w:rPr>
+          <w:rFonts w:ascii="Aptos" w:hAnsi="Aptos"/>
+          <w:color w:val="000000"/>
+        </w:rPr>
+        <w:t>.</w:t>
+      </w:r>
+    </w:p>
+    <w:p>
+      <w:pPr>
+        <w:rPr>
+          <w:rFonts w:ascii="Aptos" w:hAnsi="Aptos"/>
+          <w:color w:val="000000"/>
+        </w:rPr>
+      </w:pPr>
+      <w:r>
+        <w:rPr>
+          <w:rFonts w:ascii="Aptos" w:hAnsi="Aptos"/>
+          <w:color w:val="000000"/>
+        </w:rPr>
+        <w:t xml:space="preserve">To enhance text quality </w:t>
+      </w:r>
+      <w:r>
+        <w:rPr>
+          <w:rFonts w:ascii="Aptos" w:hAnsi="Aptos"/>
+          <w:color w:val="000000"/>
+        </w:rPr>
+        <w:t xml:space="preserve">of </w:t>
+      </w:r>
+      <w:r>
+        <w:rPr>
+          <w:rFonts w:ascii="Aptos" w:hAnsi="Aptos"/>
+          <w:color w:val="000000"/>
+        </w:rPr>
+        <w:t>teletext screens, the emulat</w:t>
+      </w:r>
+      <w:r>
+        <w:rPr>
+          <w:rFonts w:ascii="Aptos" w:hAnsi="Aptos"/>
+          <w:color w:val="000000"/>
+        </w:rPr>
+        <w:t>ion</w:t>
+      </w:r>
+      <w:r>
+        <w:rPr>
+          <w:rFonts w:ascii="Aptos" w:hAnsi="Aptos"/>
+          <w:color w:val="000000"/>
+        </w:rPr>
+        <w:t xml:space="preserve"> </w:t>
+      </w:r>
+      <w:r>
+        <w:rPr>
+          <w:rFonts w:ascii="Aptos" w:hAnsi="Aptos"/>
+          <w:color w:val="000000"/>
+        </w:rPr>
+        <w:t xml:space="preserve">generates a </w:t>
+      </w:r>
+      <w:r>
+        <w:rPr>
+          <w:rFonts w:ascii="Aptos" w:hAnsi="Aptos"/>
+          <w:color w:val="000000"/>
+        </w:rPr>
+        <w:t>500-line composite image</w:t>
+      </w:r>
+      <w:r>
+        <w:rPr>
+          <w:rFonts w:ascii="Aptos" w:hAnsi="Aptos"/>
+          <w:color w:val="000000"/>
+        </w:rPr>
+        <w:t>.</w:t>
+      </w:r>
+    </w:p>
+    <w:p>
+      <w:pPr>
+        <w:rPr>
+          <w:rFonts w:ascii="Aptos" w:hAnsi="Aptos"/>
+          <w:color w:val="000000"/>
+        </w:rPr>
+      </w:pPr>
+      <w:r>
+        <w:rPr>
+          <w:rFonts w:ascii="Aptos" w:hAnsi="Aptos"/>
+          <w:color w:val="000000"/>
+        </w:rPr>
         <w:lastRenderedPageBreak/>
-        <w:t>Teletext screen mode (Mode 7)</w:t>
-      </w:r>
-      <w:r>
-        <w:t xml:space="preserve"> </w:t>
-      </w:r>
-      <w:r>
-        <w:t>details</w:t>
-      </w:r>
-      <w:r>
-        <w:t>:</w:t>
-      </w:r>
-    </w:p>
-    <w:p>
-      <w:pPr>
-        <w:rPr>
-          <w:rFonts w:ascii="Aptos" w:hAnsi="Aptos"/>
-          <w:color w:val="000000"/>
-        </w:rPr>
-      </w:pPr>
-      <w:r>
-        <w:rPr>
-          <w:rFonts w:ascii="Aptos" w:hAnsi="Aptos"/>
-          <w:color w:val="000000"/>
-        </w:rPr>
-        <w:t xml:space="preserve">Mode 7 uses interlaced sync </w:t>
-      </w:r>
-      <w:r>
-        <w:rPr>
-          <w:rFonts w:ascii="Aptos" w:hAnsi="Aptos"/>
-          <w:color w:val="000000"/>
-        </w:rPr>
-        <w:t xml:space="preserve">&amp; </w:t>
-      </w:r>
-      <w:r>
-        <w:rPr>
-          <w:rFonts w:ascii="Aptos" w:hAnsi="Aptos"/>
-          <w:color w:val="000000"/>
-        </w:rPr>
-        <w:t>video</w:t>
-      </w:r>
-      <w:r>
-        <w:rPr>
-          <w:rFonts w:ascii="Aptos" w:hAnsi="Aptos"/>
-          <w:color w:val="000000"/>
-        </w:rPr>
-        <w:t xml:space="preserve"> mode</w:t>
-      </w:r>
-      <w:r>
-        <w:rPr>
-          <w:rFonts w:ascii="Aptos" w:hAnsi="Aptos"/>
-          <w:color w:val="000000"/>
-        </w:rPr>
-        <w:t xml:space="preserve">, </w:t>
-      </w:r>
-      <w:r>
-        <w:rPr>
-          <w:rFonts w:ascii="Aptos" w:hAnsi="Aptos"/>
-          <w:color w:val="000000"/>
-        </w:rPr>
-        <w:t xml:space="preserve">displaying </w:t>
-      </w:r>
-      <w:r>
-        <w:rPr>
-          <w:rFonts w:ascii="Aptos" w:hAnsi="Aptos"/>
-          <w:color w:val="000000"/>
-        </w:rPr>
-        <w:t>250 lines (or 25 rows of text</w:t>
-      </w:r>
-      <w:r>
-        <w:rPr>
-          <w:rFonts w:ascii="Aptos" w:hAnsi="Aptos"/>
-          <w:color w:val="000000"/>
-        </w:rPr>
-        <w:t xml:space="preserve">, each with </w:t>
-      </w:r>
-      <w:r>
-        <w:rPr>
-          <w:rFonts w:ascii="Aptos" w:hAnsi="Aptos"/>
-          <w:color w:val="000000"/>
-        </w:rPr>
-        <w:t xml:space="preserve">ten even or ten odd </w:t>
-      </w:r>
-      <w:r>
-        <w:rPr>
-          <w:rFonts w:ascii="Aptos" w:hAnsi="Aptos"/>
-          <w:color w:val="000000"/>
-        </w:rPr>
-        <w:t>scanlines</w:t>
-      </w:r>
-      <w:r>
-        <w:rPr>
-          <w:rFonts w:ascii="Aptos" w:hAnsi="Aptos"/>
-          <w:color w:val="000000"/>
-        </w:rPr>
-        <w:t xml:space="preserve">) per field. </w:t>
-      </w:r>
-      <w:r>
-        <w:rPr>
-          <w:rFonts w:ascii="Aptos" w:hAnsi="Aptos"/>
-          <w:color w:val="000000"/>
-        </w:rPr>
-        <w:t xml:space="preserve"> </w:t>
-      </w:r>
-      <w:r>
-        <w:rPr>
-          <w:rFonts w:ascii="Aptos" w:hAnsi="Aptos"/>
-          <w:color w:val="000000"/>
-        </w:rPr>
-        <w:t>Th</w:t>
-      </w:r>
-      <w:r>
-        <w:rPr>
-          <w:rFonts w:ascii="Aptos" w:hAnsi="Aptos"/>
-          <w:color w:val="000000"/>
-        </w:rPr>
-        <w:t>ese</w:t>
-      </w:r>
-      <w:r>
-        <w:rPr>
-          <w:rFonts w:ascii="Aptos" w:hAnsi="Aptos"/>
-          <w:color w:val="000000"/>
-        </w:rPr>
-        <w:t xml:space="preserve"> interleaving </w:t>
-      </w:r>
-      <w:r>
-        <w:rPr>
-          <w:rFonts w:ascii="Aptos" w:hAnsi="Aptos"/>
-          <w:color w:val="000000"/>
-        </w:rPr>
-        <w:t xml:space="preserve">fields </w:t>
-      </w:r>
-      <w:r>
-        <w:rPr>
-          <w:rFonts w:ascii="Aptos" w:hAnsi="Aptos"/>
-          <w:color w:val="000000"/>
-        </w:rPr>
-        <w:t>produce a</w:t>
-      </w:r>
-      <w:r>
-        <w:rPr>
-          <w:rFonts w:ascii="Aptos" w:hAnsi="Aptos"/>
-          <w:color w:val="000000"/>
-        </w:rPr>
-        <w:t xml:space="preserve"> </w:t>
-      </w:r>
-      <w:r>
-        <w:rPr>
-          <w:rFonts w:ascii="Aptos" w:hAnsi="Aptos"/>
-          <w:color w:val="000000"/>
-        </w:rPr>
-        <w:t xml:space="preserve">500-line </w:t>
-      </w:r>
-      <w:r>
-        <w:rPr>
-          <w:rFonts w:ascii="Aptos" w:hAnsi="Aptos"/>
-          <w:color w:val="000000"/>
-        </w:rPr>
-        <w:t xml:space="preserve">interlaced </w:t>
-      </w:r>
-      <w:r>
-        <w:rPr>
-          <w:rFonts w:ascii="Aptos" w:hAnsi="Aptos"/>
-          <w:color w:val="000000"/>
-        </w:rPr>
-        <w:t>image</w:t>
-      </w:r>
-      <w:r>
-        <w:rPr>
-          <w:rFonts w:ascii="Aptos" w:hAnsi="Aptos"/>
-          <w:color w:val="000000"/>
-        </w:rPr>
-        <w:t xml:space="preserve"> </w:t>
-      </w:r>
-      <w:r>
-        <w:rPr>
-          <w:rFonts w:ascii="Aptos" w:hAnsi="Aptos"/>
-          <w:color w:val="000000"/>
-        </w:rPr>
-        <w:t>on the display</w:t>
-      </w:r>
-      <w:r>
-        <w:rPr>
-          <w:rFonts w:ascii="Aptos" w:hAnsi="Aptos"/>
-          <w:color w:val="000000"/>
-        </w:rPr>
-        <w:t>.</w:t>
-      </w:r>
-    </w:p>
-    <w:p>
-      <w:pPr>
-        <w:rPr>
-          <w:rFonts w:ascii="Aptos" w:hAnsi="Aptos"/>
-          <w:color w:val="000000"/>
-        </w:rPr>
-      </w:pPr>
-      <w:r>
-        <w:rPr>
-          <w:rFonts w:ascii="Aptos" w:hAnsi="Aptos"/>
-          <w:color w:val="000000"/>
-        </w:rPr>
-        <w:t xml:space="preserve">To enhance text quality </w:t>
-      </w:r>
-      <w:r>
-        <w:rPr>
-          <w:rFonts w:ascii="Aptos" w:hAnsi="Aptos"/>
-          <w:color w:val="000000"/>
-        </w:rPr>
-        <w:t xml:space="preserve">of </w:t>
-      </w:r>
-      <w:r>
-        <w:rPr>
-          <w:rFonts w:ascii="Aptos" w:hAnsi="Aptos"/>
-          <w:color w:val="000000"/>
-        </w:rPr>
-        <w:t>teletext screens, the emulat</w:t>
-      </w:r>
-      <w:r>
-        <w:rPr>
-          <w:rFonts w:ascii="Aptos" w:hAnsi="Aptos"/>
-          <w:color w:val="000000"/>
-        </w:rPr>
-        <w:t>ion</w:t>
-      </w:r>
-      <w:r>
-        <w:rPr>
-          <w:rFonts w:ascii="Aptos" w:hAnsi="Aptos"/>
-          <w:color w:val="000000"/>
-        </w:rPr>
-        <w:t xml:space="preserve"> </w:t>
-      </w:r>
-      <w:r>
-        <w:rPr>
-          <w:rFonts w:ascii="Aptos" w:hAnsi="Aptos"/>
-          <w:color w:val="000000"/>
-        </w:rPr>
-        <w:t xml:space="preserve">generates a </w:t>
-      </w:r>
-      <w:r>
-        <w:rPr>
-          <w:rFonts w:ascii="Aptos" w:hAnsi="Aptos"/>
-          <w:color w:val="000000"/>
-        </w:rPr>
-        <w:t>500-line composite image</w:t>
-      </w:r>
-      <w:r>
-        <w:rPr>
-          <w:rFonts w:ascii="Aptos" w:hAnsi="Aptos"/>
-          <w:color w:val="000000"/>
-        </w:rPr>
-        <w:t>.</w:t>
-      </w:r>
-    </w:p>
-    <w:p>
-      <w:pPr>
-        <w:rPr>
-          <w:rFonts w:ascii="Aptos" w:hAnsi="Aptos"/>
-          <w:color w:val="000000"/>
-        </w:rPr>
-      </w:pPr>
-      <w:r>
-        <w:rPr>
-          <w:rFonts w:ascii="Aptos" w:hAnsi="Aptos"/>
-          <w:color w:val="000000"/>
-        </w:rPr>
         <w:t xml:space="preserve">The CRTC works as usual, producing ten scanlines for each character row. </w:t>
       </w:r>
       <w:r>
@@ -8797,50 +8591,50 @@
     </w:p>
     <w:p>
       <w:r>
+        <w:t xml:space="preserve">The only complication is that </w:t>
+      </w:r>
+      <w:r>
+        <w:t xml:space="preserve">the </w:t>
+      </w:r>
+      <w:r>
+        <w:t>memory ‘writes before display’ and ‘writes after display’ counts need to be calculated</w:t>
+      </w:r>
+      <w:r>
+        <w:t xml:space="preserve"> during processing</w:t>
+      </w:r>
+      <w:r>
+        <w:t xml:space="preserve">.  Mirrored screen memory pages, storing the last </w:t>
+      </w:r>
+      <w:r>
+        <w:t>display-frame</w:t>
+      </w:r>
+      <w:r>
+        <w:t xml:space="preserve"> number, are used to </w:t>
+      </w:r>
+      <w:r>
+        <w:t>accomplish this.</w:t>
+      </w:r>
+    </w:p>
+    <w:p>
+      <w:r>
+        <w:t>One subtly is that the end of a display frame can only be determined reliably when the next display frame starts, so two sets of writes before and after count accumulators are needed, with one set applied to the current display frame, and the other to the next display frame.  The set used is determined when the display frames are associated with programmatic frames</w:t>
+      </w:r>
+      <w:r>
+        <w:t xml:space="preserve">, when their </w:t>
+      </w:r>
+      <w:r>
+        <w:t xml:space="preserve">durations </w:t>
+      </w:r>
+      <w:r>
+        <w:t>are known.</w:t>
+      </w:r>
+    </w:p>
+    <w:p>
+      <w:pPr>
+        <w:pStyle w:val="Heading2"/>
+      </w:pPr>
+      <w:r>
         <w:lastRenderedPageBreak/>
-        <w:t xml:space="preserve">The only complication is that </w:t>
-      </w:r>
-      <w:r>
-        <w:t xml:space="preserve">the </w:t>
-      </w:r>
-      <w:r>
-        <w:t>memory ‘writes before display’ and ‘writes after display’ counts need to be calculated</w:t>
-      </w:r>
-      <w:r>
-        <w:t xml:space="preserve"> during processing</w:t>
-      </w:r>
-      <w:r>
-        <w:t xml:space="preserve">.  Mirrored screen memory pages, storing the last </w:t>
-      </w:r>
-      <w:r>
-        <w:t>display-frame</w:t>
-      </w:r>
-      <w:r>
-        <w:t xml:space="preserve"> number, are used to </w:t>
-      </w:r>
-      <w:r>
-        <w:t>accomplish this.</w:t>
-      </w:r>
-    </w:p>
-    <w:p>
-      <w:r>
-        <w:t>One subtly is that the end of a display frame can only be determined reliably when the next display frame starts, so two sets of writes before and after count accumulators are needed, with one set applied to the current display frame, and the other to the next display frame.  The set used is determined when the display frames are associated with programmatic frames</w:t>
-      </w:r>
-      <w:r>
-        <w:t xml:space="preserve">, when their </w:t>
-      </w:r>
-      <w:r>
-        <w:t xml:space="preserve">durations </w:t>
-      </w:r>
-      <w:r>
-        <w:t>are known.</w:t>
-      </w:r>
-    </w:p>
-    <w:p>
-      <w:pPr>
-        <w:pStyle w:val="Heading2"/>
-      </w:pPr>
-      <w:r>
         <w:t>Dynamic analysis</w:t>
       </w:r>
     </w:p>
@@ -10787,7 +10581,7 @@
         <w:t xml:space="preserve"> and </w:t>
       </w:r>
       <w:r>
-        <w:t>frame start events</w:t>
+        <w:t>frame start</w:t>
       </w:r>
       <w:r>
         <w:t>.  It also optionally contains label information.</w:t>
@@ -12226,7 +12020,19 @@
         <w:t xml:space="preserve">The </w:t>
       </w:r>
       <w:r>
-        <w:t>Snapshot Chunk contains a snapshot of the machine’s state at the beginning of the recording, prior to the first recorded instruction (see execution-chuck).  It contains a snapshot of the machine’s CPU registers, paging registers, call stack, registers, and</w:t>
+        <w:t xml:space="preserve">Snapshot Chunk contains a snapshot of the machine’s state at the beginning of the recording, prior to the first recorded instruction (see execution-chuck).  It contains a snapshot of the machine’s CPU registers, paging registers, call stack, </w:t>
+      </w:r>
+      <w:r>
+        <w:t xml:space="preserve">video ULA </w:t>
+      </w:r>
+      <w:r>
+        <w:t>registers,</w:t>
+      </w:r>
+      <w:r>
+        <w:t xml:space="preserve"> CRTC registers,</w:t>
+      </w:r>
+      <w:r>
+        <w:t xml:space="preserve"> and</w:t>
       </w:r>
       <w:r>
         <w:t xml:space="preserve"> </w:t>
@@ -12374,13 +12180,19 @@
         <w:t xml:space="preserve"> + </w:t>
       </w:r>
       <w:r>
+        <w:t>&lt;video_ula_state&gt;</w:t>
+      </w:r>
+      <w:r>
+        <w:t xml:space="preserve"> + &lt;crtc_state&gt; + </w:t>
+      </w:r>
+      <w:r>
+        <w:t>&lt;screen_wrap_address&gt; +</w:t>
+      </w:r>
+      <w:r>
+        <w:t xml:space="preserve"> </w:t>
+      </w:r>
+      <w:r>
         <w:t xml:space="preserve">&lt;call_stack&gt; + </w:t>
-      </w:r>
-      <w:r>
-        <w:t>&lt;screen_wrap_address&gt; +</w:t>
-      </w:r>
-      <w:r>
-        <w:t xml:space="preserve"> </w:t>
       </w:r>
       <w:r>
         <w:t>&lt;memory_snapshot&gt;</w:t>
@@ -12608,13 +12420,7 @@
         <w:t>&lt;hidden_ram_address&gt;</w:t>
       </w:r>
       <w:r>
-        <w:t xml:space="preserve"> (1 byte).  </w:t>
-      </w:r>
-      <w:r>
-        <w:t>Written</w:t>
-      </w:r>
-      <w:r>
-        <w:t xml:space="preserve"> only on the </w:t>
+        <w:t xml:space="preserve"> (1 byte).  Written only on the </w:t>
       </w:r>
       <w:r>
         <w:t xml:space="preserve">BBC Model </w:t>
@@ -12627,6 +12433,358 @@
       </w:r>
       <w:r>
         <w:t>.  The value contains the hidden memory address (set via SHEILA address &amp;FE38).  Reads and writes to SHEILA address &amp;FE3C access this hidden address.</w:t>
+      </w:r>
+    </w:p>
+    <w:p>
+      <w:pPr>
+        <w:ind w:left="720" w:hanging="360"/>
+      </w:pPr>
+      <w:r>
+        <w:rPr>
+          <w:b/>
+          <w:bCs/>
+        </w:rPr>
+        <w:t>&lt;video_ula_state&gt;</w:t>
+      </w:r>
+      <w:r>
+        <w:t xml:space="preserve"> = </w:t>
+      </w:r>
+      <w:r>
+        <w:t>&lt;</w:t>
+      </w:r>
+      <w:r>
+        <w:t>ula_</w:t>
+      </w:r>
+      <w:r>
+        <w:t>control_register&gt;</w:t>
+      </w:r>
+      <w:r>
+        <w:t xml:space="preserve"> + &lt;ula_palette&gt;</w:t>
+      </w:r>
+    </w:p>
+    <w:p>
+      <w:pPr>
+        <w:ind w:left="720"/>
+      </w:pPr>
+      <w:r>
+        <w:rPr>
+          <w:b/>
+          <w:bCs/>
+        </w:rPr>
+        <w:t>&lt;</w:t>
+      </w:r>
+      <w:r>
+        <w:rPr>
+          <w:b/>
+          <w:bCs/>
+        </w:rPr>
+        <w:t>ula_</w:t>
+      </w:r>
+      <w:r>
+        <w:rPr>
+          <w:b/>
+          <w:bCs/>
+        </w:rPr>
+        <w:t>control_register&gt;</w:t>
+      </w:r>
+      <w:r>
+        <w:t xml:space="preserve"> (1 byte).  The value of the ULA video control register.</w:t>
+      </w:r>
+    </w:p>
+    <w:p>
+      <w:pPr>
+        <w:ind w:left="720"/>
+      </w:pPr>
+      <w:r>
+        <w:rPr>
+          <w:b/>
+          <w:bCs/>
+        </w:rPr>
+        <w:t>&lt;ula_palette&gt;</w:t>
+      </w:r>
+      <w:r>
+        <w:t xml:space="preserve"> (16 bytes).  The ULA’s 16 color palette.  Each palette entry is an actual color value in the range 0 to 15.  See the Actual Color Field definitions in the New Advanced User Guide (page 209).</w:t>
+      </w:r>
+    </w:p>
+    <w:p>
+      <w:pPr>
+        <w:ind w:left="720" w:hanging="360"/>
+      </w:pPr>
+      <w:r>
+        <w:rPr>
+          <w:b/>
+          <w:bCs/>
+        </w:rPr>
+        <w:t>&lt;</w:t>
+      </w:r>
+      <w:r>
+        <w:rPr>
+          <w:b/>
+          <w:bCs/>
+        </w:rPr>
+        <w:t>crtc</w:t>
+      </w:r>
+      <w:r>
+        <w:rPr>
+          <w:b/>
+          <w:bCs/>
+        </w:rPr>
+        <w:t>_state&gt;</w:t>
+      </w:r>
+      <w:r>
+        <w:t xml:space="preserve"> = </w:t>
+      </w:r>
+      <w:r>
+        <w:t>&lt;</w:t>
+      </w:r>
+      <w:r>
+        <w:t>crtc</w:t>
+      </w:r>
+      <w:r>
+        <w:t>_register_select&gt; + &lt;</w:t>
+      </w:r>
+      <w:r>
+        <w:t>crtc</w:t>
+      </w:r>
+      <w:r>
+        <w:t>_registers&gt;</w:t>
+      </w:r>
+    </w:p>
+    <w:p>
+      <w:pPr>
+        <w:ind w:left="720"/>
+      </w:pPr>
+      <w:r>
+        <w:rPr>
+          <w:b/>
+          <w:bCs/>
+        </w:rPr>
+        <w:t>&lt;</w:t>
+      </w:r>
+      <w:r>
+        <w:rPr>
+          <w:b/>
+          <w:bCs/>
+        </w:rPr>
+        <w:t>crtc</w:t>
+      </w:r>
+      <w:r>
+        <w:rPr>
+          <w:b/>
+          <w:bCs/>
+        </w:rPr>
+        <w:t>_register</w:t>
+      </w:r>
+      <w:r>
+        <w:rPr>
+          <w:b/>
+          <w:bCs/>
+        </w:rPr>
+        <w:t>_select</w:t>
+      </w:r>
+      <w:r>
+        <w:rPr>
+          <w:b/>
+          <w:bCs/>
+        </w:rPr>
+        <w:t xml:space="preserve">&gt; </w:t>
+      </w:r>
+      <w:r>
+        <w:t>(1 byte).  The CRTC’s ‘register select’, which is used to write values to the CRTC’s registers.  The value is in the range 0 to 17.</w:t>
+      </w:r>
+    </w:p>
+    <w:p>
+      <w:pPr>
+        <w:ind w:left="720"/>
+      </w:pPr>
+      <w:r>
+        <w:rPr>
+          <w:b/>
+          <w:bCs/>
+        </w:rPr>
+        <w:t>&lt;</w:t>
+      </w:r>
+      <w:r>
+        <w:rPr>
+          <w:b/>
+          <w:bCs/>
+        </w:rPr>
+        <w:t>crtc</w:t>
+      </w:r>
+      <w:r>
+        <w:rPr>
+          <w:b/>
+          <w:bCs/>
+        </w:rPr>
+        <w:t xml:space="preserve">_registers&gt; </w:t>
+      </w:r>
+      <w:r>
+        <w:t>(18 bytes).  The values of the CRTC’s 18 registers.</w:t>
+      </w:r>
+    </w:p>
+    <w:p>
+      <w:pPr>
+        <w:ind w:left="360"/>
+      </w:pPr>
+      <w:r>
+        <w:rPr>
+          <w:b/>
+          <w:bCs/>
+        </w:rPr>
+        <w:t>&lt;screen_wrap_address&gt;</w:t>
+      </w:r>
+      <w:r>
+        <w:t xml:space="preserve"> (1 byte).  The value specifies the screen wrap address, as defined by the following table.  This is used in conjunction with hardware scrolling to wrap screen addresses.</w:t>
+      </w:r>
+    </w:p>
+    <w:tbl>
+      <w:tblPr>
+        <w:tblStyle w:val="TableGrid"/>
+        <w:tblW w:w="3153" w:type="dxa"/>
+        <w:tblInd w:w="715" w:type="dxa"/>
+        <w:tblLook w:val="04A0" w:firstRow="1" w:lastRow="0" w:firstColumn="1" w:lastColumn="0" w:noHBand="0" w:noVBand="1"/>
+      </w:tblPr>
+      <w:tblGrid>
+        <w:gridCol w:w="828"/>
+        <w:gridCol w:w="2325"/>
+      </w:tblGrid>
+      <w:tr>
+        <w:tc>
+          <w:tcPr>
+            <w:tcW w:w="828" w:type="dxa"/>
+          </w:tcPr>
+          <w:p>
+            <w:pPr>
+              <w:rPr>
+                <w:b/>
+                <w:bCs/>
+              </w:rPr>
+            </w:pPr>
+            <w:r>
+              <w:rPr>
+                <w:b/>
+                <w:bCs/>
+              </w:rPr>
+              <w:t>Value</w:t>
+            </w:r>
+          </w:p>
+        </w:tc>
+        <w:tc>
+          <w:tcPr>
+            <w:tcW w:w="2325" w:type="dxa"/>
+          </w:tcPr>
+          <w:p>
+            <w:pPr>
+              <w:rPr>
+                <w:b/>
+                <w:bCs/>
+              </w:rPr>
+            </w:pPr>
+            <w:r>
+              <w:rPr>
+                <w:b/>
+                <w:bCs/>
+              </w:rPr>
+              <w:t>Screen address</w:t>
+            </w:r>
+          </w:p>
+        </w:tc>
+      </w:tr>
+      <w:tr>
+        <w:tc>
+          <w:tcPr>
+            <w:tcW w:w="828" w:type="dxa"/>
+          </w:tcPr>
+          <w:p>
+            <w:r>
+              <w:t>0</w:t>
+            </w:r>
+          </w:p>
+        </w:tc>
+        <w:tc>
+          <w:tcPr>
+            <w:tcW w:w="2325" w:type="dxa"/>
+          </w:tcPr>
+          <w:p>
+            <w:r>
+              <w:t>&amp;4000</w:t>
+            </w:r>
+          </w:p>
+        </w:tc>
+      </w:tr>
+      <w:tr>
+        <w:tc>
+          <w:tcPr>
+            <w:tcW w:w="828" w:type="dxa"/>
+          </w:tcPr>
+          <w:p>
+            <w:r>
+              <w:t>1</w:t>
+            </w:r>
+          </w:p>
+        </w:tc>
+        <w:tc>
+          <w:tcPr>
+            <w:tcW w:w="2325" w:type="dxa"/>
+          </w:tcPr>
+          <w:p>
+            <w:r>
+              <w:t>&amp;6000</w:t>
+            </w:r>
+          </w:p>
+        </w:tc>
+      </w:tr>
+      <w:tr>
+        <w:tc>
+          <w:tcPr>
+            <w:tcW w:w="828" w:type="dxa"/>
+          </w:tcPr>
+          <w:p>
+            <w:r>
+              <w:t>2</w:t>
+            </w:r>
+          </w:p>
+        </w:tc>
+        <w:tc>
+          <w:tcPr>
+            <w:tcW w:w="2325" w:type="dxa"/>
+          </w:tcPr>
+          <w:p>
+            <w:r>
+              <w:t>&amp;3000</w:t>
+            </w:r>
+          </w:p>
+        </w:tc>
+      </w:tr>
+      <w:tr>
+        <w:tc>
+          <w:tcPr>
+            <w:tcW w:w="828" w:type="dxa"/>
+          </w:tcPr>
+          <w:p>
+            <w:r>
+              <w:t>3</w:t>
+            </w:r>
+          </w:p>
+        </w:tc>
+        <w:tc>
+          <w:tcPr>
+            <w:tcW w:w="2325" w:type="dxa"/>
+          </w:tcPr>
+          <w:p>
+            <w:r>
+              <w:t>&amp;5600</w:t>
+            </w:r>
+          </w:p>
+        </w:tc>
+      </w:tr>
+    </w:tbl>
+    <w:p>
+      <w:pPr>
+        <w:ind w:left="360"/>
+      </w:pPr>
+      <w:r>
+        <w:t>Note that bit-1 and bit-0 match bit-5 and bit-4 of the System VIA Port B addressable latch.</w:t>
       </w:r>
     </w:p>
     <w:p>
@@ -12741,7 +12899,15 @@
           <w:rFonts w:ascii="Aptos" w:hAnsi="Aptos"/>
           <w:color w:val="000000"/>
         </w:rPr>
-        <w:t>Its start address is either the first sub &amp;8000 instruction jumped to from above &amp;8000, or the first instruction executed if no such jump occurs.</w:t>
+        <w:t xml:space="preserve">Its start address is either the first sub &amp;8000 instruction jumped to from above &amp;8000, or the first instruction executed if </w:t>
+      </w:r>
+      <w:r>
+        <w:rPr>
+          <w:rFonts w:ascii="Aptos" w:hAnsi="Aptos"/>
+          <w:color w:val="000000"/>
+        </w:rPr>
+        <w:lastRenderedPageBreak/>
+        <w:t>no such jump occurs.</w:t>
       </w:r>
       <w:r>
         <w:rPr>
@@ -12838,8 +13004,6 @@
       </w:r>
       <w:r>
         <w:br/>
-      </w:r>
-      <w:r>
         <w:t>&lt;stack_frame_type&gt; + &lt;start_address_page&gt; + &lt;start_address&gt; + &lt;return_address_page&gt; + &lt;return_address&gt; + &lt;return_stack_pointer&gt;</w:t>
       </w:r>
     </w:p>
@@ -13087,7 +13251,6 @@
                 <w:b/>
                 <w:bCs/>
               </w:rPr>
-              <w:lastRenderedPageBreak/>
               <w:t>Page</w:t>
             </w:r>
           </w:p>
@@ -13372,6 +13535,7 @@
           <w:b/>
           <w:bCs/>
         </w:rPr>
+        <w:lastRenderedPageBreak/>
         <w:t>&lt;return_address_page</w:t>
       </w:r>
       <w:r>
@@ -13435,13 +13599,7 @@
         <w:t xml:space="preserve"> </w:t>
       </w:r>
       <w:r>
-        <w:t>(1</w:t>
-      </w:r>
-      <w:r>
-        <w:t xml:space="preserve"> byte</w:t>
-      </w:r>
-      <w:r>
-        <w:t xml:space="preserve">) Return stack pointer.  The value that the stack register is set to by the returning </w:t>
+        <w:t xml:space="preserve">(1 byte) Return stack pointer.  The value that the stack register is set to by the returning </w:t>
       </w:r>
       <w:r>
         <w:rPr>
@@ -13466,171 +13624,6 @@
     </w:p>
     <w:p>
       <w:pPr>
-        <w:ind w:left="360"/>
-      </w:pPr>
-      <w:r>
-        <w:rPr>
-          <w:b/>
-          <w:bCs/>
-        </w:rPr>
-        <w:t>&lt;screen_wrap_address&gt;</w:t>
-      </w:r>
-      <w:r>
-        <w:t xml:space="preserve"> (1 byte).  The value specifies the screen wrap address, as defined by the following table.  This is used in conjunction with hardware scrolling to wrap screen addresses.</w:t>
-      </w:r>
-    </w:p>
-    <w:tbl>
-      <w:tblPr>
-        <w:tblStyle w:val="TableGrid"/>
-        <w:tblW w:w="3153" w:type="dxa"/>
-        <w:tblInd w:w="715" w:type="dxa"/>
-        <w:tblLook w:val="04A0" w:firstRow="1" w:lastRow="0" w:firstColumn="1" w:lastColumn="0" w:noHBand="0" w:noVBand="1"/>
-      </w:tblPr>
-      <w:tblGrid>
-        <w:gridCol w:w="828"/>
-        <w:gridCol w:w="2325"/>
-      </w:tblGrid>
-      <w:tr>
-        <w:tc>
-          <w:tcPr>
-            <w:tcW w:w="828" w:type="dxa"/>
-          </w:tcPr>
-          <w:p>
-            <w:pPr>
-              <w:rPr>
-                <w:b/>
-                <w:bCs/>
-              </w:rPr>
-            </w:pPr>
-            <w:r>
-              <w:rPr>
-                <w:b/>
-                <w:bCs/>
-              </w:rPr>
-              <w:t>Value</w:t>
-            </w:r>
-          </w:p>
-        </w:tc>
-        <w:tc>
-          <w:tcPr>
-            <w:tcW w:w="2325" w:type="dxa"/>
-          </w:tcPr>
-          <w:p>
-            <w:pPr>
-              <w:rPr>
-                <w:b/>
-                <w:bCs/>
-              </w:rPr>
-            </w:pPr>
-            <w:r>
-              <w:rPr>
-                <w:b/>
-                <w:bCs/>
-              </w:rPr>
-              <w:t>Screen address</w:t>
-            </w:r>
-          </w:p>
-        </w:tc>
-      </w:tr>
-      <w:tr>
-        <w:tc>
-          <w:tcPr>
-            <w:tcW w:w="828" w:type="dxa"/>
-          </w:tcPr>
-          <w:p>
-            <w:r>
-              <w:t>0</w:t>
-            </w:r>
-          </w:p>
-        </w:tc>
-        <w:tc>
-          <w:tcPr>
-            <w:tcW w:w="2325" w:type="dxa"/>
-          </w:tcPr>
-          <w:p>
-            <w:r>
-              <w:t>&amp;4000</w:t>
-            </w:r>
-          </w:p>
-        </w:tc>
-      </w:tr>
-      <w:tr>
-        <w:tc>
-          <w:tcPr>
-            <w:tcW w:w="828" w:type="dxa"/>
-          </w:tcPr>
-          <w:p>
-            <w:r>
-              <w:t>1</w:t>
-            </w:r>
-          </w:p>
-        </w:tc>
-        <w:tc>
-          <w:tcPr>
-            <w:tcW w:w="2325" w:type="dxa"/>
-          </w:tcPr>
-          <w:p>
-            <w:r>
-              <w:t>&amp;6000</w:t>
-            </w:r>
-          </w:p>
-        </w:tc>
-      </w:tr>
-      <w:tr>
-        <w:tc>
-          <w:tcPr>
-            <w:tcW w:w="828" w:type="dxa"/>
-          </w:tcPr>
-          <w:p>
-            <w:r>
-              <w:t>2</w:t>
-            </w:r>
-          </w:p>
-        </w:tc>
-        <w:tc>
-          <w:tcPr>
-            <w:tcW w:w="2325" w:type="dxa"/>
-          </w:tcPr>
-          <w:p>
-            <w:r>
-              <w:t>&amp;3000</w:t>
-            </w:r>
-          </w:p>
-        </w:tc>
-      </w:tr>
-      <w:tr>
-        <w:tc>
-          <w:tcPr>
-            <w:tcW w:w="828" w:type="dxa"/>
-          </w:tcPr>
-          <w:p>
-            <w:r>
-              <w:t>3</w:t>
-            </w:r>
-          </w:p>
-        </w:tc>
-        <w:tc>
-          <w:tcPr>
-            <w:tcW w:w="2325" w:type="dxa"/>
-          </w:tcPr>
-          <w:p>
-            <w:r>
-              <w:t>&amp;5600</w:t>
-            </w:r>
-          </w:p>
-        </w:tc>
-      </w:tr>
-    </w:tbl>
-    <w:p>
-      <w:pPr>
-        <w:ind w:left="360"/>
-      </w:pPr>
-      <w:r>
-        <w:t>Note that bit-1 and bit-0 match bit-5 and bit-4 of the System VIA Port B addressable latch.</w:t>
-      </w:r>
-    </w:p>
-    <w:p>
-      <w:pPr>
         <w:ind w:left="720" w:hanging="360"/>
         <w:rPr>
           <w:b/>
@@ -13723,7 +13716,6 @@
         <w:ind w:left="720"/>
       </w:pPr>
       <w:r>
-        <w:lastRenderedPageBreak/>
         <w:t>The following table shows which elements are included based on the BBC model.</w:t>
       </w:r>
     </w:p>
@@ -14451,6 +14443,7 @@
           <w:b/>
           <w:bCs/>
         </w:rPr>
+        <w:lastRenderedPageBreak/>
         <w:t xml:space="preserve">&lt;private_ram&gt; </w:t>
       </w:r>
       <w:r>
@@ -14677,7 +14670,6 @@
           <w:b/>
           <w:bCs/>
         </w:rPr>
-        <w:lastRenderedPageBreak/>
         <w:t>&lt;</w:t>
       </w:r>
       <w:r>
@@ -14719,19 +14711,19 @@
     <w:tbl>
       <w:tblPr>
         <w:tblStyle w:val="TableGrid"/>
-        <w:tblW w:w="8910" w:type="dxa"/>
+        <w:tblW w:w="9270" w:type="dxa"/>
         <w:tblInd w:w="715" w:type="dxa"/>
         <w:tblLook w:val="04A0" w:firstRow="1" w:lastRow="0" w:firstColumn="1" w:lastColumn="0" w:noHBand="0" w:noVBand="1"/>
       </w:tblPr>
       <w:tblGrid>
-        <w:gridCol w:w="1800"/>
-        <w:gridCol w:w="3330"/>
-        <w:gridCol w:w="3780"/>
+        <w:gridCol w:w="1756"/>
+        <w:gridCol w:w="3318"/>
+        <w:gridCol w:w="4196"/>
       </w:tblGrid>
       <w:tr>
         <w:tc>
           <w:tcPr>
-            <w:tcW w:w="1800" w:type="dxa"/>
+            <w:tcW w:w="1756" w:type="dxa"/>
           </w:tcPr>
           <w:p>
             <w:pPr>
@@ -14758,7 +14750,7 @@
         </w:tc>
         <w:tc>
           <w:tcPr>
-            <w:tcW w:w="3330" w:type="dxa"/>
+            <w:tcW w:w="3318" w:type="dxa"/>
           </w:tcPr>
           <w:p>
             <w:pPr>
@@ -14785,7 +14777,7 @@
         </w:tc>
         <w:tc>
           <w:tcPr>
-            <w:tcW w:w="3780" w:type="dxa"/>
+            <w:tcW w:w="4196" w:type="dxa"/>
           </w:tcPr>
           <w:p>
             <w:pPr>
@@ -14796,10 +14788,19 @@
             </w:pPr>
             <w:r>
               <w:rPr>
+                <w:rFonts w:ascii="Aptos" w:hAnsi="Aptos"/>
+                <w:b/>
+                <w:bCs/>
+                <w:color w:val="000000"/>
+              </w:rPr>
+              <w:t>&lt;</w:t>
+            </w:r>
+            <w:r>
+              <w:rPr>
                 <w:b/>
                 <w:bCs/>
               </w:rPr>
-              <w:t>Event params</w:t>
+              <w:t>event_params&gt;</w:t>
             </w:r>
           </w:p>
         </w:tc>
@@ -14807,7 +14808,7 @@
       <w:tr>
         <w:tc>
           <w:tcPr>
-            <w:tcW w:w="1800" w:type="dxa"/>
+            <w:tcW w:w="1756" w:type="dxa"/>
           </w:tcPr>
           <w:p>
             <w:r>
@@ -14817,7 +14818,7 @@
         </w:tc>
         <w:tc>
           <w:tcPr>
-            <w:tcW w:w="3330" w:type="dxa"/>
+            <w:tcW w:w="3318" w:type="dxa"/>
           </w:tcPr>
           <w:p>
             <w:r>
@@ -14827,11 +14828,23 @@
         </w:tc>
         <w:tc>
           <w:tcPr>
-            <w:tcW w:w="3780" w:type="dxa"/>
-          </w:tcPr>
-          <w:p>
-            <w:r>
-              <w:t>&lt;interrupt_event_params&gt;</w:t>
+            <w:tcW w:w="4196" w:type="dxa"/>
+          </w:tcPr>
+          <w:p>
+            <w:r>
+              <w:t>&lt;interrupt</w:t>
+            </w:r>
+            <w:r>
+              <w:t>_</w:t>
+            </w:r>
+            <w:r>
+              <w:t>event_</w:t>
+            </w:r>
+            <w:r>
+              <w:t>params</w:t>
+            </w:r>
+            <w:r>
+              <w:t>&gt;</w:t>
             </w:r>
           </w:p>
         </w:tc>
@@ -14839,7 +14852,7 @@
       <w:tr>
         <w:tc>
           <w:tcPr>
-            <w:tcW w:w="1800" w:type="dxa"/>
+            <w:tcW w:w="1756" w:type="dxa"/>
           </w:tcPr>
           <w:p>
             <w:r>
@@ -14849,7 +14862,7 @@
         </w:tc>
         <w:tc>
           <w:tcPr>
-            <w:tcW w:w="3330" w:type="dxa"/>
+            <w:tcW w:w="3318" w:type="dxa"/>
           </w:tcPr>
           <w:p>
             <w:r>
@@ -14859,11 +14872,23 @@
         </w:tc>
         <w:tc>
           <w:tcPr>
-            <w:tcW w:w="3780" w:type="dxa"/>
-          </w:tcPr>
-          <w:p>
-            <w:r>
-              <w:t>&lt;interrupt_event_params&gt;</w:t>
+            <w:tcW w:w="4196" w:type="dxa"/>
+          </w:tcPr>
+          <w:p>
+            <w:r>
+              <w:t>&lt;interrupt</w:t>
+            </w:r>
+            <w:r>
+              <w:t>_</w:t>
+            </w:r>
+            <w:r>
+              <w:t>event_</w:t>
+            </w:r>
+            <w:r>
+              <w:t>params</w:t>
+            </w:r>
+            <w:r>
+              <w:t>&gt;</w:t>
             </w:r>
           </w:p>
         </w:tc>
@@ -14871,7 +14896,7 @@
       <w:tr>
         <w:tc>
           <w:tcPr>
-            <w:tcW w:w="1800" w:type="dxa"/>
+            <w:tcW w:w="1756" w:type="dxa"/>
           </w:tcPr>
           <w:p>
             <w:r>
@@ -14881,30 +14906,33 @@
         </w:tc>
         <w:tc>
           <w:tcPr>
-            <w:tcW w:w="3330" w:type="dxa"/>
-          </w:tcPr>
-          <w:p>
-            <w:r>
-              <w:t>F</w:t>
-            </w:r>
-            <w:r>
-              <w:t>rame-start</w:t>
-            </w:r>
-          </w:p>
-        </w:tc>
-        <w:tc>
-          <w:tcPr>
-            <w:tcW w:w="3780" w:type="dxa"/>
-          </w:tcPr>
-          <w:p>
-            <w:r>
-              <w:t>&lt;frame_</w:t>
-            </w:r>
-            <w:r>
-              <w:t>start_</w:t>
-            </w:r>
-            <w:r>
-              <w:t>event_params&gt;</w:t>
+            <w:tcW w:w="3318" w:type="dxa"/>
+          </w:tcPr>
+          <w:p>
+            <w:r>
+              <w:t xml:space="preserve">Frame start </w:t>
+            </w:r>
+          </w:p>
+        </w:tc>
+        <w:tc>
+          <w:tcPr>
+            <w:tcW w:w="4196" w:type="dxa"/>
+          </w:tcPr>
+          <w:p>
+            <w:r>
+              <w:t>&lt;</w:t>
+            </w:r>
+            <w:r>
+              <w:t>frame_start_</w:t>
+            </w:r>
+            <w:r>
+              <w:t>event</w:t>
+            </w:r>
+            <w:r>
+              <w:t>_</w:t>
+            </w:r>
+            <w:r>
+              <w:t>params&gt;</w:t>
             </w:r>
           </w:p>
         </w:tc>
@@ -14912,7 +14940,7 @@
       <w:tr>
         <w:tc>
           <w:tcPr>
-            <w:tcW w:w="1800" w:type="dxa"/>
+            <w:tcW w:w="1756" w:type="dxa"/>
           </w:tcPr>
           <w:p>
             <w:pPr>
@@ -14946,7 +14974,8 @@
         </w:tc>
         <w:tc>
           <w:tcPr>
-            <w:tcW w:w="3330" w:type="dxa"/>
+            <w:tcW w:w="7514" w:type="dxa"/>
+            <w:gridSpan w:val="2"/>
           </w:tcPr>
           <w:p>
             <w:pPr>
@@ -14964,19 +14993,6 @@
             </w:r>
           </w:p>
         </w:tc>
-        <w:tc>
-          <w:tcPr>
-            <w:tcW w:w="3780" w:type="dxa"/>
-          </w:tcPr>
-          <w:p>
-            <w:pPr>
-              <w:rPr>
-                <w:i/>
-                <w:iCs/>
-              </w:rPr>
-            </w:pPr>
-          </w:p>
-        </w:tc>
       </w:tr>
     </w:tbl>
     <w:p>
@@ -15025,117 +15041,153 @@
           <w:rFonts w:ascii="Aptos" w:hAnsi="Aptos"/>
           <w:color w:val="000000"/>
         </w:rPr>
-        <w:t>frame-start</w:t>
-      </w:r>
-      <w:r>
-        <w:rPr>
-          <w:rFonts w:ascii="Aptos" w:hAnsi="Aptos"/>
-          <w:color w:val="000000"/>
-        </w:rPr>
-        <w:t xml:space="preserve"> event marks the start of </w:t>
-      </w:r>
-      <w:r>
-        <w:rPr>
-          <w:rFonts w:ascii="Aptos" w:hAnsi="Aptos"/>
-          <w:color w:val="000000"/>
-        </w:rPr>
-        <w:t xml:space="preserve">a </w:t>
-      </w:r>
-      <w:r>
-        <w:rPr>
-          <w:rFonts w:ascii="Aptos" w:hAnsi="Aptos"/>
-          <w:color w:val="000000"/>
-        </w:rPr>
-        <w:t xml:space="preserve">new </w:t>
-      </w:r>
-      <w:r>
-        <w:rPr>
-          <w:rFonts w:ascii="Aptos" w:hAnsi="Aptos"/>
-          <w:color w:val="000000"/>
-        </w:rPr>
-        <w:t xml:space="preserve">frame, triggered when the CRTC's MA/RA/DE </w:t>
-      </w:r>
-      <w:r>
-        <w:rPr>
-          <w:rFonts w:ascii="Aptos" w:hAnsi="Aptos"/>
-          <w:color w:val="000000"/>
-        </w:rPr>
-        <w:t>ou</w:t>
-      </w:r>
-      <w:r>
-        <w:rPr>
-          <w:rFonts w:ascii="Aptos" w:hAnsi="Aptos"/>
-          <w:color w:val="000000"/>
-        </w:rPr>
-        <w:t>t</w:t>
-      </w:r>
-      <w:r>
-        <w:rPr>
-          <w:rFonts w:ascii="Aptos" w:hAnsi="Aptos"/>
-          <w:color w:val="000000"/>
-        </w:rPr>
-        <w:t xml:space="preserve">puts </w:t>
-      </w:r>
-      <w:r>
-        <w:rPr>
-          <w:rFonts w:ascii="Aptos" w:hAnsi="Aptos"/>
-          <w:color w:val="000000"/>
-        </w:rPr>
-        <w:t xml:space="preserve">address the first </w:t>
-      </w:r>
-      <w:r>
-        <w:rPr>
-          <w:rFonts w:ascii="Aptos" w:hAnsi="Aptos"/>
-          <w:color w:val="000000"/>
-        </w:rPr>
-        <w:t xml:space="preserve">screen memory address </w:t>
-      </w:r>
-      <w:r>
-        <w:rPr>
-          <w:rFonts w:ascii="Aptos" w:hAnsi="Aptos"/>
-          <w:color w:val="000000"/>
-        </w:rPr>
-        <w:t xml:space="preserve">to </w:t>
-      </w:r>
-      <w:r>
-        <w:rPr>
-          <w:rFonts w:ascii="Aptos" w:hAnsi="Aptos"/>
-          <w:color w:val="000000"/>
-        </w:rPr>
-        <w:t xml:space="preserve">be </w:t>
-      </w:r>
-      <w:r>
-        <w:rPr>
-          <w:rFonts w:ascii="Aptos" w:hAnsi="Aptos"/>
-          <w:color w:val="000000"/>
-        </w:rPr>
-        <w:t>read</w:t>
-      </w:r>
-      <w:r>
-        <w:rPr>
-          <w:rFonts w:ascii="Aptos" w:hAnsi="Aptos"/>
-          <w:color w:val="000000"/>
-        </w:rPr>
-        <w:t xml:space="preserve"> for display</w:t>
-      </w:r>
-      <w:r>
-        <w:rPr>
-          <w:rFonts w:ascii="Aptos" w:hAnsi="Aptos"/>
-          <w:color w:val="000000"/>
-        </w:rPr>
-        <w:t>.</w:t>
+        <w:t xml:space="preserve">frame start </w:t>
+      </w:r>
+      <w:r>
+        <w:rPr>
+          <w:rFonts w:ascii="Aptos" w:hAnsi="Aptos"/>
+          <w:color w:val="000000"/>
+        </w:rPr>
+        <w:t xml:space="preserve">event signifies </w:t>
+      </w:r>
+      <w:r>
+        <w:rPr>
+          <w:rFonts w:ascii="Aptos" w:hAnsi="Aptos"/>
+          <w:color w:val="000000"/>
+        </w:rPr>
+        <w:t xml:space="preserve">the start of a new frame, </w:t>
+      </w:r>
+      <w:r>
+        <w:rPr>
+          <w:rFonts w:ascii="Aptos" w:hAnsi="Aptos"/>
+          <w:color w:val="000000"/>
+        </w:rPr>
+        <w:t xml:space="preserve">when DE (Display Enable) is </w:t>
+      </w:r>
+      <w:r>
+        <w:rPr>
+          <w:rFonts w:ascii="Aptos" w:hAnsi="Aptos"/>
+          <w:color w:val="000000"/>
+        </w:rPr>
+        <w:t xml:space="preserve">first </w:t>
+      </w:r>
+      <w:r>
+        <w:rPr>
+          <w:rFonts w:ascii="Aptos" w:hAnsi="Aptos"/>
+          <w:color w:val="000000"/>
+        </w:rPr>
+        <w:t>set.</w:t>
       </w:r>
     </w:p>
     <w:p>
       <w:pPr>
         <w:ind w:left="1080" w:hanging="360"/>
-      </w:pPr>
-      <w:r>
-        <w:rPr>
-          <w:b/>
-          <w:bCs/>
-        </w:rPr>
-        <w:t>&lt;interrupt_event_params&gt;</w:t>
+        <w:rPr>
+          <w:rFonts w:ascii="Aptos" w:hAnsi="Aptos"/>
+          <w:color w:val="000000"/>
+        </w:rPr>
+      </w:pPr>
+      <w:r>
+        <w:rPr>
+          <w:rFonts w:ascii="Aptos" w:hAnsi="Aptos"/>
+          <w:b/>
+          <w:bCs/>
+          <w:color w:val="000000"/>
+        </w:rPr>
+        <w:t>&lt;event_params&gt;</w:t>
+      </w:r>
+      <w:r>
+        <w:rPr>
+          <w:rFonts w:ascii="Aptos" w:hAnsi="Aptos"/>
+          <w:color w:val="000000"/>
+        </w:rPr>
+        <w:t xml:space="preserve"> = </w:t>
+      </w:r>
+      <w:r>
+        <w:rPr>
+          <w:rFonts w:ascii="Aptos" w:hAnsi="Aptos"/>
+          <w:color w:val="000000"/>
+        </w:rPr>
+        <w:t>&lt;</w:t>
+      </w:r>
+      <w:r>
+        <w:t>interrupt_</w:t>
+      </w:r>
+      <w:r>
+        <w:t>event_</w:t>
+      </w:r>
+      <w:r>
+        <w:t>params&gt;</w:t>
+      </w:r>
+      <w:r>
+        <w:rPr>
+          <w:vertAlign w:val="superscript"/>
+        </w:rPr>
+        <w:t>opt</w:t>
+      </w:r>
+      <w:r>
+        <w:t xml:space="preserve"> </w:t>
+      </w:r>
+      <w:r>
+        <w:t>or</w:t>
+      </w:r>
+      <w:r>
+        <w:t xml:space="preserve"> </w:t>
+      </w:r>
+      <w:r>
+        <w:t>&lt;</w:t>
+      </w:r>
+      <w:r>
+        <w:t>frame_start_event_params</w:t>
+      </w:r>
+      <w:r>
+        <w:t>&gt;</w:t>
+      </w:r>
+      <w:r>
+        <w:rPr>
+          <w:vertAlign w:val="superscript"/>
+        </w:rPr>
+        <w:t>opt</w:t>
+      </w:r>
+    </w:p>
+    <w:p>
+      <w:pPr>
+        <w:ind w:left="1440" w:hanging="360"/>
+      </w:pPr>
+      <w:r>
+        <w:rPr>
+          <w:b/>
+          <w:bCs/>
+        </w:rPr>
+        <w:t>&lt;interrupt</w:t>
+      </w:r>
+      <w:r>
+        <w:rPr>
+          <w:b/>
+          <w:bCs/>
+        </w:rPr>
+        <w:t>_</w:t>
+      </w:r>
+      <w:r>
+        <w:rPr>
+          <w:b/>
+          <w:bCs/>
+        </w:rPr>
+        <w:t>event_</w:t>
+      </w:r>
+      <w:r>
+        <w:rPr>
+          <w:b/>
+          <w:bCs/>
+        </w:rPr>
+        <w:t>params</w:t>
+      </w:r>
+      <w:r>
+        <w:rPr>
+          <w:b/>
+          <w:bCs/>
+        </w:rPr>
+        <w:t>&gt;</w:t>
       </w:r>
       <w:r>
         <w:t xml:space="preserve"> </w:t>
@@ -15159,7 +15211,7 @@
     </w:p>
     <w:p>
       <w:pPr>
-        <w:ind w:left="1080"/>
+        <w:ind w:left="1440"/>
       </w:pPr>
       <w:r>
         <w:rPr>
@@ -15180,17 +15232,18 @@
     </w:p>
     <w:p>
       <w:pPr>
-        <w:ind w:left="1080"/>
-        <w:rPr>
-          <w:b/>
-          <w:bCs/>
-        </w:rPr>
-      </w:pPr>
-      <w:r>
-        <w:rPr>
-          <w:b/>
-          <w:bCs/>
-        </w:rPr>
+        <w:ind w:left="1440"/>
+        <w:rPr>
+          <w:b/>
+          <w:bCs/>
+        </w:rPr>
+      </w:pPr>
+      <w:r>
+        <w:rPr>
+          <w:b/>
+          <w:bCs/>
+        </w:rPr>
+        <w:lastRenderedPageBreak/>
         <w:t>&lt;destination_address&gt;</w:t>
       </w:r>
       <w:r>
@@ -15202,7 +15255,7 @@
     </w:p>
     <w:p>
       <w:pPr>
-        <w:ind w:left="1080"/>
+        <w:ind w:left="1440"/>
       </w:pPr>
       <w:r>
         <w:rPr>
@@ -15217,7 +15270,7 @@
     </w:p>
     <w:p>
       <w:pPr>
-        <w:ind w:left="1080"/>
+        <w:ind w:left="1440"/>
       </w:pPr>
       <w:r>
         <w:rPr>
@@ -15305,7 +15358,7 @@
     </w:p>
     <w:p>
       <w:pPr>
-        <w:ind w:left="1080" w:hanging="360"/>
+        <w:ind w:left="1440" w:hanging="360"/>
       </w:pPr>
       <w:r>
         <w:rPr>
@@ -15319,605 +15372,357 @@
           <w:b/>
           <w:bCs/>
         </w:rPr>
-        <w:t>f</w:t>
-      </w:r>
-      <w:r>
-        <w:rPr>
-          <w:b/>
-          <w:bCs/>
-        </w:rPr>
-        <w:t>rame_</w:t>
-      </w:r>
-      <w:r>
-        <w:rPr>
-          <w:b/>
-          <w:bCs/>
-        </w:rPr>
-        <w:t>start</w:t>
-      </w:r>
-      <w:r>
-        <w:rPr>
-          <w:b/>
-          <w:bCs/>
-        </w:rPr>
+        <w:t>frame_start_event_params</w:t>
+      </w:r>
+      <w:r>
+        <w:rPr>
+          <w:b/>
+          <w:bCs/>
+        </w:rPr>
+        <w:t>&gt;</w:t>
+      </w:r>
+      <w:r>
+        <w:rPr>
+          <w:b/>
+          <w:bCs/>
+        </w:rPr>
+        <w:t xml:space="preserve"> </w:t>
+      </w:r>
+      <w:r>
+        <w:t>=</w:t>
+      </w:r>
+      <w:r>
+        <w:br/>
+      </w:r>
+      <w:r>
+        <w:t>&lt;</w:t>
+      </w:r>
+      <w:r>
+        <w:t>offset_cycle_count&gt; + &lt;start_address</w:t>
+      </w:r>
+      <w:r>
+        <w:t>&gt; +</w:t>
+      </w:r>
+      <w:r>
+        <w:t xml:space="preserve"> </w:t>
+      </w:r>
+      <w:r>
+        <w:t>&lt;</w:t>
+      </w:r>
+      <w:r>
+        <w:t xml:space="preserve">display_scanline&gt; + </w:t>
+      </w:r>
+      <w:r>
+        <w:t>&lt;</w:t>
+      </w:r>
+      <w:r>
+        <w:t>display</w:t>
+      </w:r>
+      <w:r>
         <w:t>_</w:t>
       </w:r>
       <w:r>
-        <w:rPr>
-          <w:b/>
-          <w:bCs/>
-        </w:rPr>
-        <w:t>event_</w:t>
-      </w:r>
-      <w:r>
-        <w:rPr>
-          <w:b/>
-          <w:bCs/>
-        </w:rPr>
-        <w:t>params&gt;</w:t>
-      </w:r>
-      <w:r>
-        <w:rPr>
-          <w:b/>
-          <w:bCs/>
-        </w:rPr>
+        <w:t>flags</w:t>
+      </w:r>
+      <w:r>
+        <w:t>&gt;</w:t>
+      </w:r>
+    </w:p>
+    <w:p>
+      <w:pPr>
+        <w:ind w:left="1440"/>
+        <w:rPr>
+          <w:b/>
+          <w:bCs/>
+        </w:rPr>
+      </w:pPr>
+      <w:r>
+        <w:rPr>
+          <w:b/>
+          <w:bCs/>
+        </w:rPr>
+        <w:t>&lt;</w:t>
+      </w:r>
+      <w:r>
+        <w:rPr>
+          <w:b/>
+          <w:bCs/>
+        </w:rPr>
+        <w:t>offset_cycle_count</w:t>
+      </w:r>
+      <w:r>
+        <w:rPr>
+          <w:b/>
+          <w:bCs/>
+        </w:rPr>
+        <w:t>&gt;</w:t>
+      </w:r>
+      <w:r>
+        <w:t xml:space="preserve"> (</w:t>
+      </w:r>
+      <w:r>
+        <w:t>1</w:t>
+      </w:r>
+      <w:r>
+        <w:t xml:space="preserve"> byte).  The number of cycles </w:t>
+      </w:r>
+      <w:r>
+        <w:t xml:space="preserve">before the event when the </w:t>
+      </w:r>
+      <w:r>
+        <w:t xml:space="preserve">frame began to be displayed, when </w:t>
+      </w:r>
+      <w:r>
+        <w:rPr>
+          <w:b/>
+          <w:bCs/>
+        </w:rPr>
+        <w:t>DE</w:t>
+      </w:r>
+      <w:r>
+        <w:t xml:space="preserve"> (Display Enable)</w:t>
+      </w:r>
+      <w:r>
+        <w:t xml:space="preserve"> is set </w:t>
+      </w:r>
+      <w:r>
+        <w:t>high</w:t>
+      </w:r>
+      <w:r>
+        <w:t xml:space="preserve">.  If the last instruction took </w:t>
+      </w:r>
+      <w:r>
+        <w:rPr>
+          <w:b/>
+          <w:bCs/>
+        </w:rPr>
+        <w:t>N</w:t>
+      </w:r>
+      <w:r>
+        <w:t xml:space="preserve"> cycles, the value is in the range 0..(</w:t>
+      </w:r>
+      <w:r>
+        <w:rPr>
+          <w:b/>
+          <w:bCs/>
+        </w:rPr>
+        <w:t>N</w:t>
+      </w:r>
+      <w:r>
+        <w:t>-1).</w:t>
+      </w:r>
+    </w:p>
+    <w:p>
+      <w:pPr>
+        <w:ind w:left="1440"/>
+        <w:rPr>
+          <w:b/>
+          <w:bCs/>
+        </w:rPr>
+      </w:pPr>
+      <w:r>
+        <w:rPr>
+          <w:b/>
+          <w:bCs/>
+        </w:rPr>
+        <w:t>&lt;</w:t>
+      </w:r>
+      <w:r>
+        <w:rPr>
+          <w:b/>
+          <w:bCs/>
+        </w:rPr>
+        <w:t>start_address</w:t>
+      </w:r>
+      <w:r>
+        <w:rPr>
+          <w:b/>
+          <w:bCs/>
+        </w:rPr>
+        <w:t>&gt;</w:t>
+      </w:r>
+      <w:r>
+        <w:t xml:space="preserve"> (</w:t>
+      </w:r>
+      <w:r>
+        <w:t>2</w:t>
+      </w:r>
+      <w:r>
+        <w:t xml:space="preserve"> byte</w:t>
+      </w:r>
+      <w:r>
+        <w:t>s</w:t>
+      </w:r>
+      <w:r>
+        <w:t xml:space="preserve">). </w:t>
+      </w:r>
+      <w:r>
         <w:t xml:space="preserve"> </w:t>
       </w:r>
       <w:r>
-        <w:t>=</w:t>
-      </w:r>
-      <w:r>
-        <w:br/>
-      </w:r>
-      <w:r>
+        <w:t xml:space="preserve">The </w:t>
+      </w:r>
+      <w:r>
+        <w:t>frame’s start addres</w:t>
+      </w:r>
+      <w:r>
+        <w:t xml:space="preserve">s, or </w:t>
+      </w:r>
+      <w:r>
+        <w:rPr>
+          <w:b/>
+          <w:bCs/>
+        </w:rPr>
+        <w:t>MA</w:t>
+      </w:r>
+      <w:r>
+        <w:t xml:space="preserve"> (</w:t>
+      </w:r>
+      <w:r>
+        <w:t xml:space="preserve">Memory Address), which is </w:t>
+      </w:r>
+      <w:r>
+        <w:t xml:space="preserve">latched from the </w:t>
+      </w:r>
+      <w:r>
+        <w:t>CRTC’s R12 and R13 address registers</w:t>
+      </w:r>
+      <w:r>
+        <w:t xml:space="preserve"> </w:t>
+      </w:r>
+      <w:r>
+        <w:t>at the end of the previous frame.</w:t>
+      </w:r>
+      <w:r>
+        <w:t xml:space="preserve">  Note that R12 and R13 may have different values when the event occurs.</w:t>
+      </w:r>
+    </w:p>
+    <w:p>
+      <w:pPr>
+        <w:ind w:left="1440"/>
+      </w:pPr>
+      <w:r>
+        <w:rPr>
+          <w:b/>
+          <w:bCs/>
+        </w:rPr>
         <w:t>&lt;</w:t>
       </w:r>
       <w:r>
-        <w:t>offset</w:t>
-      </w:r>
-      <w:r>
-        <w:t>_cycl</w:t>
-      </w:r>
-      <w:r>
-        <w:t>e_count</w:t>
-      </w:r>
-      <w:r>
-        <w:t>&gt; +</w:t>
-      </w:r>
-      <w:r>
+        <w:rPr>
+          <w:b/>
+          <w:bCs/>
+        </w:rPr>
+        <w:t>display</w:t>
+      </w:r>
+      <w:r>
+        <w:rPr>
+          <w:b/>
+          <w:bCs/>
+        </w:rPr>
+        <w:t>_</w:t>
+      </w:r>
+      <w:r>
+        <w:rPr>
+          <w:b/>
+          <w:bCs/>
+        </w:rPr>
+        <w:t>scanline</w:t>
+      </w:r>
+      <w:r>
+        <w:rPr>
+          <w:b/>
+          <w:bCs/>
+        </w:rPr>
+        <w:t>&gt;</w:t>
+      </w:r>
+      <w:r>
+        <w:t xml:space="preserve"> (2 bytes).  The </w:t>
+      </w:r>
+      <w:r>
+        <w:t xml:space="preserve">scanline </w:t>
+      </w:r>
+      <w:r>
+        <w:t xml:space="preserve">where the frame is </w:t>
+      </w:r>
+      <w:r>
+        <w:t>displayed</w:t>
+      </w:r>
+      <w:r>
+        <w:t>.</w:t>
+      </w:r>
+      <w:r>
+        <w:t xml:space="preserve">  </w:t>
+      </w:r>
+      <w:r>
+        <w:t xml:space="preserve">The value is in range </w:t>
+      </w:r>
+      <w:r>
+        <w:t>0</w:t>
+      </w:r>
+      <w:r>
+        <w:t xml:space="preserve"> to </w:t>
+      </w:r>
+      <w:r>
+        <w:t>311</w:t>
+      </w:r>
+      <w:r>
+        <w:t>.</w:t>
+      </w:r>
+    </w:p>
+    <w:p>
+      <w:pPr>
+        <w:ind w:left="1440"/>
+      </w:pPr>
+      <w:r>
+        <w:rPr>
+          <w:b/>
+          <w:bCs/>
+        </w:rPr>
+        <w:t>&lt;</w:t>
+      </w:r>
+      <w:r>
+        <w:rPr>
+          <w:b/>
+          <w:bCs/>
+        </w:rPr>
+        <w:t>display</w:t>
+      </w:r>
+      <w:r>
+        <w:rPr>
+          <w:b/>
+          <w:bCs/>
+        </w:rPr>
+        <w:t>_</w:t>
+      </w:r>
+      <w:r>
+        <w:rPr>
+          <w:b/>
+          <w:bCs/>
+        </w:rPr>
+        <w:t>flags&gt;</w:t>
+      </w:r>
+      <w:r>
+        <w:rPr>
+          <w:b/>
+          <w:bCs/>
+        </w:rPr>
         <w:t xml:space="preserve"> </w:t>
       </w:r>
       <w:r>
-        <w:t>&lt;video_ula</w:t>
-      </w:r>
-      <w:r>
-        <w:t>_state</w:t>
-      </w:r>
-      <w:r>
-        <w:t xml:space="preserve">&gt; + </w:t>
-      </w:r>
-      <w:r>
-        <w:t>&lt;crtc</w:t>
-      </w:r>
-      <w:r>
-        <w:t>_state</w:t>
-      </w:r>
-      <w:r>
-        <w:t xml:space="preserve">&gt; </w:t>
-      </w:r>
-    </w:p>
-    <w:p>
-      <w:pPr>
-        <w:ind w:left="1440" w:hanging="360"/>
-        <w:rPr>
-          <w:b/>
-          <w:bCs/>
-        </w:rPr>
-      </w:pPr>
-      <w:r>
-        <w:rPr>
-          <w:b/>
-          <w:bCs/>
-        </w:rPr>
-        <w:t>&lt;</w:t>
-      </w:r>
-      <w:r>
-        <w:rPr>
-          <w:b/>
-          <w:bCs/>
-        </w:rPr>
-        <w:t>offset</w:t>
-      </w:r>
-      <w:r>
-        <w:rPr>
-          <w:b/>
-          <w:bCs/>
-        </w:rPr>
-        <w:t>_cycle_count</w:t>
-      </w:r>
-      <w:r>
-        <w:rPr>
-          <w:b/>
-          <w:bCs/>
-        </w:rPr>
-        <w:t>&gt;</w:t>
-      </w:r>
-      <w:r>
-        <w:t xml:space="preserve"> (1 byte). </w:t>
-      </w:r>
-      <w:r>
-        <w:t xml:space="preserve"> </w:t>
-      </w:r>
-      <w:r>
-        <w:t xml:space="preserve">The number of cycles </w:t>
-      </w:r>
-      <w:r>
-        <w:t xml:space="preserve">prior to the </w:t>
-      </w:r>
-      <w:r>
-        <w:t xml:space="preserve">event when the frame </w:t>
-      </w:r>
-      <w:r>
-        <w:t xml:space="preserve">started.  If the previous instruction took </w:t>
-      </w:r>
-      <w:r>
-        <w:rPr>
-          <w:b/>
-          <w:bCs/>
-        </w:rPr>
-        <w:t>n</w:t>
-      </w:r>
-      <w:r>
-        <w:t xml:space="preserve"> cycles, the value is in the range</w:t>
-      </w:r>
-      <w:r>
-        <w:t>:</w:t>
-      </w:r>
-      <w:r>
-        <w:t xml:space="preserve"> 0..(</w:t>
-      </w:r>
-      <w:r>
-        <w:rPr>
-          <w:b/>
-          <w:bCs/>
-        </w:rPr>
-        <w:t>n</w:t>
-      </w:r>
-      <w:r>
-        <w:t xml:space="preserve"> </w:t>
-      </w:r>
-      <w:r>
-        <w:t>-</w:t>
-      </w:r>
-      <w:r>
-        <w:t xml:space="preserve"> </w:t>
-      </w:r>
-      <w:r>
-        <w:t>1).</w:t>
-      </w:r>
-    </w:p>
-    <w:p>
-      <w:pPr>
-        <w:ind w:left="1440" w:hanging="360"/>
-      </w:pPr>
-      <w:r>
-        <w:rPr>
-          <w:b/>
-          <w:bCs/>
-        </w:rPr>
-        <w:t>&lt;video_ula_state&gt;</w:t>
-      </w:r>
-      <w:r>
-        <w:t xml:space="preserve"> = </w:t>
-      </w:r>
-      <w:r>
-        <w:t>&lt;</w:t>
-      </w:r>
-      <w:r>
-        <w:t>ula_</w:t>
-      </w:r>
-      <w:r>
-        <w:t>control_register&gt;</w:t>
-      </w:r>
-      <w:r>
-        <w:t xml:space="preserve"> + </w:t>
-      </w:r>
-      <w:r>
-        <w:t>&lt;</w:t>
-      </w:r>
-      <w:r>
-        <w:t>ula_</w:t>
-      </w:r>
-      <w:r>
-        <w:t>palette&gt;</w:t>
-      </w:r>
-    </w:p>
-    <w:p>
-      <w:pPr>
-        <w:ind w:left="1440"/>
-      </w:pPr>
-      <w:r>
-        <w:rPr>
-          <w:b/>
-          <w:bCs/>
-        </w:rPr>
-        <w:t>&lt;</w:t>
-      </w:r>
-      <w:r>
-        <w:rPr>
-          <w:b/>
-          <w:bCs/>
-        </w:rPr>
-        <w:t>ula_</w:t>
-      </w:r>
-      <w:r>
-        <w:rPr>
-          <w:b/>
-          <w:bCs/>
-        </w:rPr>
-        <w:t>control_register&gt;</w:t>
-      </w:r>
-      <w:r>
-        <w:t xml:space="preserve"> (1 byte).  The value of the ULA video control register.</w:t>
-      </w:r>
-    </w:p>
-    <w:p>
-      <w:pPr>
-        <w:ind w:left="1440"/>
-      </w:pPr>
-      <w:r>
-        <w:rPr>
-          <w:b/>
-          <w:bCs/>
-        </w:rPr>
-        <w:lastRenderedPageBreak/>
-        <w:t>&lt;ula_palette&gt;</w:t>
-      </w:r>
-      <w:r>
-        <w:t xml:space="preserve"> (16 bytes).  The ULA’s 16 </w:t>
-      </w:r>
-      <w:r>
-        <w:t xml:space="preserve">color </w:t>
-      </w:r>
-      <w:r>
-        <w:t>palette</w:t>
-      </w:r>
-      <w:r>
-        <w:t xml:space="preserve">.  </w:t>
-      </w:r>
-      <w:r>
-        <w:t xml:space="preserve">Each </w:t>
-      </w:r>
-      <w:r>
-        <w:t xml:space="preserve">palette </w:t>
-      </w:r>
-      <w:r>
-        <w:t xml:space="preserve">entry is </w:t>
-      </w:r>
-      <w:r>
-        <w:t>a</w:t>
-      </w:r>
-      <w:r>
-        <w:t>n</w:t>
-      </w:r>
-      <w:r>
-        <w:t xml:space="preserve"> </w:t>
-      </w:r>
-      <w:r>
-        <w:t xml:space="preserve">actual </w:t>
-      </w:r>
-      <w:r>
-        <w:t xml:space="preserve">color </w:t>
-      </w:r>
-      <w:r>
-        <w:t xml:space="preserve">value </w:t>
-      </w:r>
-      <w:r>
-        <w:t xml:space="preserve">in the </w:t>
-      </w:r>
-      <w:r>
-        <w:t>range 0</w:t>
-      </w:r>
-      <w:r>
-        <w:t xml:space="preserve"> to</w:t>
-      </w:r>
-      <w:r>
-        <w:t xml:space="preserve"> </w:t>
-      </w:r>
-      <w:r>
-        <w:t>15</w:t>
+        <w:t>(1 byte)</w:t>
       </w:r>
       <w:r>
         <w:t>.</w:t>
       </w:r>
       <w:r>
-        <w:t xml:space="preserve">  See </w:t>
-      </w:r>
-      <w:r>
-        <w:t xml:space="preserve">the </w:t>
-      </w:r>
-      <w:r>
-        <w:t>Actual Color Field definition</w:t>
-      </w:r>
-      <w:r>
-        <w:t>s</w:t>
-      </w:r>
-      <w:r>
-        <w:t xml:space="preserve"> in the </w:t>
-      </w:r>
-      <w:r>
-        <w:t xml:space="preserve">New </w:t>
-      </w:r>
-      <w:r>
-        <w:t>Advanced User Guide</w:t>
-      </w:r>
-      <w:r>
-        <w:t xml:space="preserve"> (page 209).</w:t>
-      </w:r>
-    </w:p>
-    <w:p>
-      <w:pPr>
-        <w:ind w:left="1440" w:hanging="360"/>
-      </w:pPr>
-      <w:r>
-        <w:rPr>
-          <w:b/>
-          <w:bCs/>
-        </w:rPr>
-        <w:t>&lt;</w:t>
-      </w:r>
-      <w:r>
-        <w:rPr>
-          <w:b/>
-          <w:bCs/>
-        </w:rPr>
-        <w:t>crtc</w:t>
-      </w:r>
-      <w:r>
-        <w:rPr>
-          <w:b/>
-          <w:bCs/>
-        </w:rPr>
-        <w:t>_state&gt;</w:t>
-      </w:r>
-      <w:r>
-        <w:t xml:space="preserve"> = </w:t>
-      </w:r>
-      <w:r>
-        <w:br/>
-      </w:r>
-      <w:r>
-        <w:t>&lt;</w:t>
-      </w:r>
-      <w:r>
-        <w:t>crtc</w:t>
-      </w:r>
-      <w:r>
-        <w:t>_register_select&gt; + &lt;</w:t>
-      </w:r>
-      <w:r>
-        <w:t>crtc</w:t>
-      </w:r>
-      <w:r>
-        <w:t xml:space="preserve">_registers&gt; </w:t>
-      </w:r>
-      <w:r>
-        <w:t xml:space="preserve">+ </w:t>
-      </w:r>
-      <w:r>
-        <w:t>&lt;</w:t>
-      </w:r>
-      <w:r>
-        <w:t>crtc</w:t>
-      </w:r>
-      <w:r>
-        <w:t>_scanline&gt; +</w:t>
-      </w:r>
-      <w:r>
-        <w:rPr>
-          <w:b/>
-          <w:bCs/>
-        </w:rPr>
-        <w:t xml:space="preserve"> </w:t>
-      </w:r>
-      <w:r>
-        <w:t>&lt;</w:t>
-      </w:r>
-      <w:r>
-        <w:t>crtc</w:t>
-      </w:r>
-      <w:r>
-        <w:t>_</w:t>
+        <w:t xml:space="preserve">  Contains the following </w:t>
+      </w:r>
+      <w:r>
+        <w:t xml:space="preserve">display </w:t>
       </w:r>
       <w:r>
         <w:t>flags</w:t>
-      </w:r>
-      <w:r>
-        <w:t>&gt;</w:t>
-      </w:r>
-    </w:p>
-    <w:p>
-      <w:pPr>
-        <w:ind w:left="1440"/>
-      </w:pPr>
-      <w:r>
-        <w:rPr>
-          <w:b/>
-          <w:bCs/>
-        </w:rPr>
-        <w:t>&lt;</w:t>
-      </w:r>
-      <w:r>
-        <w:rPr>
-          <w:b/>
-          <w:bCs/>
-        </w:rPr>
-        <w:t>crtc</w:t>
-      </w:r>
-      <w:r>
-        <w:rPr>
-          <w:b/>
-          <w:bCs/>
-        </w:rPr>
-        <w:t>_register</w:t>
-      </w:r>
-      <w:r>
-        <w:rPr>
-          <w:b/>
-          <w:bCs/>
-        </w:rPr>
-        <w:t>_select</w:t>
-      </w:r>
-      <w:r>
-        <w:rPr>
-          <w:b/>
-          <w:bCs/>
-        </w:rPr>
-        <w:t xml:space="preserve">&gt; </w:t>
-      </w:r>
-      <w:r>
-        <w:t>(1 byte).  The CRTC’s ‘register select’, which is used to write values to the CRTC’s registers.  The value is in the range 0 to 17.</w:t>
-      </w:r>
-    </w:p>
-    <w:p>
-      <w:pPr>
-        <w:ind w:left="1440"/>
-      </w:pPr>
-      <w:r>
-        <w:rPr>
-          <w:b/>
-          <w:bCs/>
-        </w:rPr>
-        <w:t>&lt;</w:t>
-      </w:r>
-      <w:r>
-        <w:rPr>
-          <w:b/>
-          <w:bCs/>
-        </w:rPr>
-        <w:t>crtc</w:t>
-      </w:r>
-      <w:r>
-        <w:rPr>
-          <w:b/>
-          <w:bCs/>
-        </w:rPr>
-        <w:t xml:space="preserve">_registers&gt; </w:t>
-      </w:r>
-      <w:r>
-        <w:t>(18 bytes).  The values of the CRTC’s 18 registers.</w:t>
-      </w:r>
-    </w:p>
-    <w:p>
-      <w:pPr>
-        <w:ind w:left="1440"/>
-      </w:pPr>
-      <w:r>
-        <w:rPr>
-          <w:b/>
-          <w:bCs/>
-        </w:rPr>
-        <w:t>&lt;</w:t>
-      </w:r>
-      <w:r>
-        <w:rPr>
-          <w:b/>
-          <w:bCs/>
-        </w:rPr>
-        <w:t>crtc</w:t>
-      </w:r>
-      <w:r>
-        <w:rPr>
-          <w:b/>
-          <w:bCs/>
-        </w:rPr>
-        <w:t>_</w:t>
-      </w:r>
-      <w:r>
-        <w:rPr>
-          <w:b/>
-          <w:bCs/>
-        </w:rPr>
-        <w:t>scanline</w:t>
-      </w:r>
-      <w:r>
-        <w:rPr>
-          <w:b/>
-          <w:bCs/>
-        </w:rPr>
-        <w:t>&gt;</w:t>
-      </w:r>
-      <w:r>
-        <w:t xml:space="preserve"> (2 bytes).  The scanline</w:t>
-      </w:r>
-      <w:r>
-        <w:t xml:space="preserve"> </w:t>
-      </w:r>
-      <w:r>
-        <w:t xml:space="preserve">where the </w:t>
-      </w:r>
-      <w:r>
-        <w:t>frame</w:t>
-      </w:r>
-      <w:r>
-        <w:t xml:space="preserve"> is rendered from.  The value is in range </w:t>
-      </w:r>
-      <w:r>
-        <w:t>0</w:t>
-      </w:r>
-      <w:r>
-        <w:t xml:space="preserve"> to </w:t>
-      </w:r>
-      <w:r>
-        <w:t>311</w:t>
-      </w:r>
-      <w:r>
-        <w:t>.</w:t>
-      </w:r>
-    </w:p>
-    <w:p>
-      <w:pPr>
-        <w:ind w:left="1440"/>
-      </w:pPr>
-      <w:r>
-        <w:rPr>
-          <w:b/>
-          <w:bCs/>
-        </w:rPr>
-        <w:t>&lt;</w:t>
-      </w:r>
-      <w:r>
-        <w:rPr>
-          <w:b/>
-          <w:bCs/>
-        </w:rPr>
-        <w:t>crtc_</w:t>
-      </w:r>
-      <w:r>
-        <w:rPr>
-          <w:b/>
-          <w:bCs/>
-        </w:rPr>
-        <w:t>flags&gt;</w:t>
-      </w:r>
-      <w:r>
-        <w:rPr>
-          <w:b/>
-          <w:bCs/>
-        </w:rPr>
-        <w:t xml:space="preserve"> </w:t>
-      </w:r>
-      <w:r>
-        <w:t>(1 byte)</w:t>
-      </w:r>
-      <w:r>
-        <w:t>.</w:t>
-      </w:r>
-      <w:r>
-        <w:t xml:space="preserve">  Contains the following </w:t>
-      </w:r>
-      <w:r>
-        <w:t>bit flags</w:t>
       </w:r>
       <w:r>
         <w:t>:</w:t>
@@ -16225,7 +16030,11 @@
         <w:t>&lt;opcode_address&gt;</w:t>
       </w:r>
       <w:r>
-        <w:t xml:space="preserve"> (1, 2, or 3 bytes) The instruction’s opcode address is encoded in 1, 2 or 3 bytes as depicted in the following table, where addresses are stored in relative format if possible.</w:t>
+        <w:t xml:space="preserve"> (1, 2, or 3 bytes) The instruction’s opcode address is encoded in 1, 2 or 3 bytes as depicted in the following table, where addresses are stored in </w:t>
+      </w:r>
+      <w:r>
+        <w:lastRenderedPageBreak/>
+        <w:t>relative format if possible.</w:t>
       </w:r>
       <w:r>
         <w:t xml:space="preserve"> </w:t>
@@ -16743,7 +16552,6 @@
         <w:rPr>
           <w:noProof/>
         </w:rPr>
-        <w:lastRenderedPageBreak/>
         <w:t xml:space="preserve">lastOpcodeAddress = </w:t>
       </w:r>
       <w:r>
@@ -17208,6 +17016,7 @@
         <w:ind w:left="1080" w:hanging="720"/>
       </w:pPr>
       <w:r>
+        <w:lastRenderedPageBreak/>
         <w:tab/>
       </w:r>
       <w:r>
@@ -17438,7 +17247,6 @@
         <w:ind w:left="1080" w:hanging="720"/>
       </w:pPr>
       <w:r>
-        <w:lastRenderedPageBreak/>
         <w:tab/>
       </w:r>
       <w:r>
@@ -17764,6 +17572,7 @@
         <w:ind w:left="1440"/>
       </w:pPr>
       <w:r>
+        <w:lastRenderedPageBreak/>
         <w:t>(Zero-page), Y</w:t>
       </w:r>
     </w:p>
@@ -17856,11 +17665,7 @@
         <w:t>LDY</w:t>
       </w:r>
       <w:r>
-        <w:t xml:space="preserve">) that read from an address, excluding the stack (e.g. PLA).  Contains the value read.  </w:t>
-      </w:r>
-      <w:r>
-        <w:lastRenderedPageBreak/>
-        <w:t xml:space="preserve">This includes instructions like INC </w:t>
+        <w:t xml:space="preserve">) that read from an address, excluding the stack (e.g. PLA).  Contains the value read.  This includes instructions like INC </w:t>
       </w:r>
       <w:r>
         <w:rPr>
@@ -18051,7 +17856,13 @@
     </w:p>
     <w:p>
       <w:r>
-        <w:t xml:space="preserve">The class provides methods for starting and ending a performance session, and methods for logging executed interrupts and instructions in the emulator.  The class also encapsulates the functionality to generate a </w:t>
+        <w:t xml:space="preserve">The class provides methods for starting and ending a performance session, and methods for logging executed </w:t>
+      </w:r>
+      <w:r>
+        <w:t>event</w:t>
+      </w:r>
+      <w:r>
+        <w:t xml:space="preserve"> and instructions in the emulator.  The class also encapsulates the functionality to generate a </w:t>
       </w:r>
       <w:r>
         <w:rPr>
@@ -18653,16 +18464,41 @@
         <w:t xml:space="preserve">Added call to </w:t>
       </w:r>
       <w:r>
-        <w:t>PerfWriter_WriteFrameStartEvent</w:t>
+        <w:t>PerfWriter_Write</w:t>
+      </w:r>
+      <w:r>
+        <w:t>FrameStart</w:t>
+      </w:r>
+      <w:r>
+        <w:t>Event</w:t>
+      </w:r>
+      <w:r>
+        <w:t>()</w:t>
       </w:r>
       <w:r>
         <w:t xml:space="preserve"> to log </w:t>
       </w:r>
       <w:r>
-        <w:t>the</w:t>
-      </w:r>
-      <w:r>
-        <w:t xml:space="preserve"> frame start event. This wrapper function only invokes the PerfWriter instance during a performance capture.</w:t>
+        <w:t xml:space="preserve">when a frame </w:t>
+      </w:r>
+      <w:r>
+        <w:t xml:space="preserve">is first </w:t>
+      </w:r>
+      <w:r>
+        <w:t xml:space="preserve">displayed, when </w:t>
+      </w:r>
+      <w:r>
+        <w:rPr>
+          <w:b/>
+          <w:bCs/>
+        </w:rPr>
+        <w:t>DE</w:t>
+      </w:r>
+      <w:r>
+        <w:t xml:space="preserve"> (Display Enable) is first set high</w:t>
+      </w:r>
+      <w:r>
+        <w:t>. This wrapper function only invokes the PerfWriter instance during a performance capture.</w:t>
       </w:r>
       <w:r>
         <w:t xml:space="preserve">  The function is called from inside </w:t>
@@ -18674,16 +18510,7 @@
         <w:t>()</w:t>
       </w:r>
       <w:r>
-        <w:t xml:space="preserve"> </w:t>
-      </w:r>
-      <w:r>
-        <w:t xml:space="preserve">when </w:t>
-      </w:r>
-      <w:r>
-        <w:t xml:space="preserve">the first scanline of a frame is </w:t>
-      </w:r>
-      <w:r>
-        <w:t>rendering.</w:t>
+        <w:t>.</w:t>
       </w:r>
     </w:p>
     <w:p>
@@ -18695,55 +18522,31 @@
         </w:numPr>
       </w:pPr>
       <w:r>
-        <w:t xml:space="preserve">Added Video.DisplayScanline variable, which </w:t>
-      </w:r>
-      <w:r>
-        <w:t xml:space="preserve">holds </w:t>
-      </w:r>
-      <w:r>
-        <w:t xml:space="preserve">the </w:t>
-      </w:r>
-      <w:r>
-        <w:t>current scanline, in the range 0..</w:t>
-      </w:r>
-      <w:r>
-        <w:t>3</w:t>
-      </w:r>
-      <w:r>
-        <w:t>11</w:t>
-      </w:r>
-      <w:r>
-        <w:t>.</w:t>
-      </w:r>
-      <w:r>
-        <w:t xml:space="preserve">  This is updated in </w:t>
-      </w:r>
-      <w:r>
-        <w:t>VideoDoScanLine</w:t>
-      </w:r>
-      <w:r>
-        <w:t>().</w:t>
-      </w:r>
-      <w:r>
-        <w:t xml:space="preserve">  </w:t>
-      </w:r>
-      <w:r>
-        <w:t>Ideally</w:t>
-      </w:r>
-      <w:r>
-        <w:t>,</w:t>
-      </w:r>
-      <w:r>
-        <w:t xml:space="preserve"> we'd use PixmapLine but can't because in </w:t>
-      </w:r>
-      <w:r>
-        <w:t>t</w:t>
-      </w:r>
-      <w:r>
-        <w:t>eletext mode it's not the actual display scanline</w:t>
-      </w:r>
-      <w:r>
-        <w:t>.</w:t>
+        <w:t xml:space="preserve">Added Video.SplitScreen variable which captures if the frame is positioned beneath another one.  The value is assigned in </w:t>
+      </w:r>
+      <w:r>
+        <w:t>VideoStartOfFrame</w:t>
+      </w:r>
+      <w:r>
+        <w:t>()</w:t>
+      </w:r>
+      <w:r>
+        <w:t xml:space="preserve"> and passed to </w:t>
+      </w:r>
+      <w:r>
+        <w:t>PerfWriter_Write</w:t>
+      </w:r>
+      <w:r>
+        <w:t>FrameStart</w:t>
+      </w:r>
+      <w:r>
+        <w:t>Event</w:t>
+      </w:r>
+      <w:r>
+        <w:t>()</w:t>
+      </w:r>
+      <w:r>
+        <w:t xml:space="preserve">.  </w:t>
       </w:r>
     </w:p>
     <w:p>
@@ -18755,22 +18558,40 @@
         </w:numPr>
       </w:pPr>
       <w:r>
-        <w:t>Added Video.SplitScreen variable, which holds whether a new frame is a split frame.</w:t>
-      </w:r>
-      <w:r>
-        <w:t xml:space="preserve">  This is set in </w:t>
-      </w:r>
-      <w:r>
-        <w:t>VideoStartOfFrame</w:t>
-      </w:r>
-      <w:r>
-        <w:t>()</w:t>
+        <w:t xml:space="preserve">Updated </w:t>
+      </w:r>
+      <w:r>
+        <w:t>SaveVideoUEF</w:t>
+      </w:r>
+      <w:r>
+        <w:t xml:space="preserve">() and </w:t>
+      </w:r>
+      <w:r>
+        <w:t>LoadVideoUEF</w:t>
+      </w:r>
+      <w:r>
+        <w:t xml:space="preserve">() to serialize </w:t>
+      </w:r>
+      <w:r>
+        <w:t>Video.SplitScreen</w:t>
       </w:r>
       <w:r>
         <w:t>.</w:t>
       </w:r>
-      <w:r>
-        <w:t xml:space="preserve"> </w:t>
+    </w:p>
+    <w:p>
+      <w:pPr>
+        <w:rPr>
+          <w:b/>
+          <w:bCs/>
+        </w:rPr>
+      </w:pPr>
+      <w:r>
+        <w:rPr>
+          <w:b/>
+          <w:bCs/>
+        </w:rPr>
+        <w:t>Debug.h/cpp</w:t>
       </w:r>
     </w:p>
     <w:p>
@@ -18780,54 +18601,38 @@
           <w:ilvl w:val="0"/>
           <w:numId w:val="1"/>
         </w:numPr>
-      </w:pPr>
-      <w:r>
-        <w:t xml:space="preserve">Updated </w:t>
-      </w:r>
-      <w:r>
-        <w:t>Load</w:t>
-      </w:r>
-      <w:r>
-        <w:t>Video</w:t>
-      </w:r>
-      <w:r>
-        <w:t>UEF</w:t>
-      </w:r>
-      <w:r>
-        <w:t xml:space="preserve"> and </w:t>
-      </w:r>
-      <w:r>
-        <w:t>Save</w:t>
-      </w:r>
-      <w:r>
-        <w:t>Video</w:t>
-      </w:r>
-      <w:r>
-        <w:t>UEF</w:t>
-      </w:r>
-      <w:r>
-        <w:t xml:space="preserve"> to serialize Video.DisplayScanline and</w:t>
-      </w:r>
-      <w:r>
-        <w:t xml:space="preserve"> </w:t>
-      </w:r>
-      <w:r>
-        <w:t xml:space="preserve">Video.SplitScreen. </w:t>
-      </w:r>
-    </w:p>
-    <w:p>
-      <w:pPr>
-        <w:rPr>
-          <w:b/>
-          <w:bCs/>
-        </w:rPr>
-      </w:pPr>
-      <w:r>
-        <w:rPr>
-          <w:b/>
-          <w:bCs/>
-        </w:rPr>
-        <w:t>Debug.h/cpp</w:t>
+        <w:rPr>
+          <w:b/>
+          <w:bCs/>
+        </w:rPr>
+      </w:pPr>
+      <w:r>
+        <w:t>Externed</w:t>
+      </w:r>
+      <w:r>
+        <w:rPr>
+          <w:b/>
+          <w:bCs/>
+        </w:rPr>
+        <w:t xml:space="preserve"> Labels</w:t>
+      </w:r>
+      <w:r>
+        <w:t xml:space="preserve"> vector so the labels are accessible during snapshot serialization.</w:t>
+      </w:r>
+    </w:p>
+    <w:p>
+      <w:pPr>
+        <w:rPr>
+          <w:b/>
+          <w:bCs/>
+        </w:rPr>
+      </w:pPr>
+      <w:r>
+        <w:rPr>
+          <w:b/>
+          <w:bCs/>
+        </w:rPr>
+        <w:t>BeebWin.h/cpp, BeebWinIo.cpp</w:t>
       </w:r>
     </w:p>
     <w:p>
@@ -18843,32 +18648,88 @@
         </w:rPr>
       </w:pPr>
       <w:r>
-        <w:t>Externed</w:t>
-      </w:r>
-      <w:r>
-        <w:rPr>
-          <w:b/>
-          <w:bCs/>
-        </w:rPr>
-        <w:t xml:space="preserve"> Labels</w:t>
-      </w:r>
-      <w:r>
-        <w:t xml:space="preserve"> vector so the labels are accessible during snapshot serialization.</w:t>
-      </w:r>
-    </w:p>
-    <w:p>
-      <w:pPr>
-        <w:rPr>
-          <w:b/>
-          <w:bCs/>
-        </w:rPr>
-      </w:pPr>
-      <w:r>
-        <w:rPr>
-          <w:b/>
-          <w:bCs/>
-        </w:rPr>
-        <w:t>BeebWin.h/cpp, BeebWinIo.cpp</w:t>
+        <w:t xml:space="preserve">Added performance capture functionality in the UX.  </w:t>
+      </w:r>
+      <w:r>
+        <w:t>Added</w:t>
+      </w:r>
+      <w:r>
+        <w:rPr>
+          <w:b/>
+          <w:bCs/>
+        </w:rPr>
+        <w:t xml:space="preserve"> </w:t>
+      </w:r>
+      <w:r>
+        <w:t>UpdatePerfCaptureMenu</w:t>
+      </w:r>
+      <w:r>
+        <w:t>()</w:t>
+      </w:r>
+      <w:r>
+        <w:t>, CapturePerf</w:t>
+      </w:r>
+      <w:r>
+        <w:t>()</w:t>
+      </w:r>
+      <w:r>
+        <w:t>, EndPerfCapture</w:t>
+      </w:r>
+      <w:r>
+        <w:t>()</w:t>
+      </w:r>
+      <w:r>
+        <w:t>, and IsCapturingPerf</w:t>
+      </w:r>
+      <w:r>
+        <w:t>()</w:t>
+      </w:r>
+      <w:r>
+        <w:t xml:space="preserve"> functions</w:t>
+      </w:r>
+      <w:r>
+        <w:t xml:space="preserve"> (modelled from the existing video capture functionality) and invoked these in a similar way to how video capture is implemented.  The only notable differences are that </w:t>
+      </w:r>
+      <w:r>
+        <w:t>CapturePerf</w:t>
+      </w:r>
+      <w:r>
+        <w:rPr>
+          <w:b/>
+          <w:bCs/>
+        </w:rPr>
+        <w:t xml:space="preserve"> </w:t>
+      </w:r>
+      <w:r>
+        <w:t xml:space="preserve">creates an instance of the PerfWriter class, initializes it, and </w:t>
+      </w:r>
+      <w:r>
+        <w:t>EndPerfCapture</w:t>
+      </w:r>
+      <w:r>
+        <w:rPr>
+          <w:b/>
+          <w:bCs/>
+        </w:rPr>
+        <w:t xml:space="preserve"> </w:t>
+      </w:r>
+      <w:r>
+        <w:t>closes the capture, and deletes the PerfWriter instance.</w:t>
+      </w:r>
+    </w:p>
+    <w:p>
+      <w:pPr>
+        <w:rPr>
+          <w:b/>
+          <w:bCs/>
+        </w:rPr>
+      </w:pPr>
+      <w:r>
+        <w:rPr>
+          <w:b/>
+          <w:bCs/>
+        </w:rPr>
+        <w:t>BeebWinPrefs.h/cpp</w:t>
       </w:r>
     </w:p>
     <w:p>
@@ -18878,94 +18739,37 @@
           <w:ilvl w:val="0"/>
           <w:numId w:val="1"/>
         </w:numPr>
-        <w:rPr>
-          <w:b/>
-          <w:bCs/>
-        </w:rPr>
-      </w:pPr>
-      <w:r>
-        <w:t xml:space="preserve">Added performance capture functionality in the UX.  </w:t>
-      </w:r>
-      <w:r>
-        <w:t>Added</w:t>
-      </w:r>
-      <w:r>
-        <w:rPr>
-          <w:b/>
-          <w:bCs/>
-        </w:rPr>
-        <w:t xml:space="preserve"> </w:t>
-      </w:r>
-      <w:r>
-        <w:t>UpdatePerfCaptureMenu</w:t>
-      </w:r>
-      <w:r>
-        <w:t>()</w:t>
-      </w:r>
-      <w:r>
-        <w:t>, CapturePerf</w:t>
-      </w:r>
-      <w:r>
-        <w:t>()</w:t>
-      </w:r>
-      <w:r>
-        <w:t>, EndPerfCapture</w:t>
-      </w:r>
-      <w:r>
-        <w:t>()</w:t>
-      </w:r>
-      <w:r>
-        <w:t>, and IsCapturingPerf</w:t>
-      </w:r>
-      <w:r>
-        <w:t>()</w:t>
-      </w:r>
-      <w:r>
-        <w:t xml:space="preserve"> functions</w:t>
-      </w:r>
-      <w:r>
-        <w:t xml:space="preserve"> (modelled from the existing video capture functionality) and invoked these in a similar way to how video capture is implemented.  The only notable differences are that </w:t>
-      </w:r>
-      <w:r>
-        <w:t>CapturePerf</w:t>
-      </w:r>
-      <w:r>
-        <w:rPr>
-          <w:b/>
-          <w:bCs/>
-        </w:rPr>
-        <w:t xml:space="preserve"> </w:t>
-      </w:r>
-      <w:r>
-        <w:t xml:space="preserve">creates an instance of the PerfWriter class, initializes it, and </w:t>
-      </w:r>
-      <w:r>
-        <w:t>EndPerfCapture</w:t>
-      </w:r>
-      <w:r>
-        <w:rPr>
-          <w:b/>
-          <w:bCs/>
-        </w:rPr>
-        <w:t xml:space="preserve"> </w:t>
-      </w:r>
-      <w:r>
-        <w:t>closes the capture, and deletes the PerfWriter instance.</w:t>
-      </w:r>
-    </w:p>
-    <w:p>
-      <w:pPr>
-        <w:rPr>
-          <w:b/>
-          <w:bCs/>
-        </w:rPr>
-      </w:pPr>
-      <w:r>
-        <w:rPr>
-          <w:b/>
-          <w:bCs/>
-        </w:rPr>
-        <w:t>BeebWinPrefs.h/cpp</w:t>
+      </w:pPr>
+      <w:r>
+        <w:t xml:space="preserve">Added a </w:t>
+      </w:r>
+      <w:r>
+        <w:t xml:space="preserve">performance capture file path preference, used to remember the location of the last written </w:t>
+      </w:r>
+      <w:r>
+        <w:rPr>
+          <w:b/>
+          <w:bCs/>
+        </w:rPr>
+        <w:t>.perf</w:t>
+      </w:r>
+      <w:r>
+        <w:t xml:space="preserve"> file.</w:t>
+      </w:r>
+    </w:p>
+    <w:p>
+      <w:pPr>
+        <w:rPr>
+          <w:b/>
+          <w:bCs/>
+        </w:rPr>
+      </w:pPr>
+      <w:r>
+        <w:rPr>
+          <w:b/>
+          <w:bCs/>
+        </w:rPr>
+        <w:t>UefState.cpp</w:t>
       </w:r>
     </w:p>
     <w:p>
@@ -18975,22 +18779,36 @@
           <w:ilvl w:val="0"/>
           <w:numId w:val="1"/>
         </w:numPr>
-      </w:pPr>
-      <w:r>
-        <w:t xml:space="preserve">Added a </w:t>
-      </w:r>
-      <w:r>
-        <w:t xml:space="preserve">performance capture file path preference, used to remember the location of the last written </w:t>
-      </w:r>
-      <w:r>
-        <w:rPr>
-          <w:b/>
-          <w:bCs/>
-        </w:rPr>
-        <w:t>.perf</w:t>
-      </w:r>
-      <w:r>
-        <w:t xml:space="preserve"> file.</w:t>
+        <w:rPr>
+          <w:b/>
+          <w:bCs/>
+        </w:rPr>
+      </w:pPr>
+      <w:r>
+        <w:t>Incremented</w:t>
+      </w:r>
+      <w:r>
+        <w:rPr>
+          <w:b/>
+          <w:bCs/>
+        </w:rPr>
+        <w:t xml:space="preserve"> </w:t>
+      </w:r>
+      <w:r>
+        <w:rPr>
+          <w:b/>
+          <w:bCs/>
+        </w:rPr>
+        <w:t>UEFSTATE_VERSION</w:t>
+      </w:r>
+      <w:r>
+        <w:t xml:space="preserve"> as the call stack is </w:t>
+      </w:r>
+      <w:r>
+        <w:t xml:space="preserve">now </w:t>
+      </w:r>
+      <w:r>
+        <w:t>serialized.</w:t>
       </w:r>
     </w:p>
     <w:p>
@@ -19006,60 +18824,6 @@
           <w:bCs/>
         </w:rPr>
         <w:lastRenderedPageBreak/>
-        <w:t>UefState.cpp</w:t>
-      </w:r>
-    </w:p>
-    <w:p>
-      <w:pPr>
-        <w:pStyle w:val="ListParagraph"/>
-        <w:numPr>
-          <w:ilvl w:val="0"/>
-          <w:numId w:val="1"/>
-        </w:numPr>
-        <w:rPr>
-          <w:b/>
-          <w:bCs/>
-        </w:rPr>
-      </w:pPr>
-      <w:r>
-        <w:t>Incremented</w:t>
-      </w:r>
-      <w:r>
-        <w:rPr>
-          <w:b/>
-          <w:bCs/>
-        </w:rPr>
-        <w:t xml:space="preserve"> </w:t>
-      </w:r>
-      <w:r>
-        <w:rPr>
-          <w:b/>
-          <w:bCs/>
-        </w:rPr>
-        <w:t>UEFSTATE_VERSION</w:t>
-      </w:r>
-      <w:r>
-        <w:t xml:space="preserve"> as the call stack is </w:t>
-      </w:r>
-      <w:r>
-        <w:t xml:space="preserve">now </w:t>
-      </w:r>
-      <w:r>
-        <w:t>serialized.</w:t>
-      </w:r>
-    </w:p>
-    <w:p>
-      <w:pPr>
-        <w:rPr>
-          <w:b/>
-          <w:bCs/>
-        </w:rPr>
-      </w:pPr>
-      <w:r>
-        <w:rPr>
-          <w:b/>
-          <w:bCs/>
-        </w:rPr>
         <w:t>BeebEm.rc, Resource.h</w:t>
       </w:r>
     </w:p>
@@ -22213,7 +21977,6 @@
   <w:style w:type="character" w:default="1" w:styleId="DefaultParagraphFont">
     <w:name w:val="Default Paragraph Font"/>
     <w:uiPriority w:val="1"/>
-    <w:semiHidden/>
     <w:unhideWhenUsed/>
   </w:style>
   <w:style w:type="table" w:default="1" w:styleId="TableNormal">

</xml_diff>

<commit_message>
Three changes:  - Updated toolbar labels and images  - Updated Labels dialog to only list .per file if it contains embedded labels  - Updated documentation (WIP)
</commit_message>
<xml_diff>
--- a/docs/BeebPerf.docx
+++ b/docs/BeebPerf.docx
@@ -2103,62 +2103,11 @@
     </w:p>
     <w:p>
       <w:r>
-        <w:t xml:space="preserve">The </w:t>
-      </w:r>
-      <w:r>
-        <w:t xml:space="preserve">general </w:t>
-      </w:r>
-      <w:r>
-        <w:t>layout</w:t>
-      </w:r>
-      <w:r>
-        <w:t xml:space="preserve"> </w:t>
-      </w:r>
-      <w:r>
-        <w:t xml:space="preserve">of </w:t>
-      </w:r>
-      <w:r>
-        <w:rPr>
-          <w:b/>
-          <w:bCs/>
-        </w:rPr>
-        <w:t>BeebPerf</w:t>
-      </w:r>
-      <w:r>
-        <w:t xml:space="preserve"> </w:t>
-      </w:r>
-      <w:r>
-        <w:t xml:space="preserve">is </w:t>
-      </w:r>
-      <w:r>
-        <w:t>shown belo</w:t>
-      </w:r>
-      <w:r>
-        <w:t>w</w:t>
-      </w:r>
-      <w:r>
-        <w:t xml:space="preserve">.  The layout is divided into three </w:t>
-      </w:r>
-      <w:r>
-        <w:t xml:space="preserve">horizontal resizable </w:t>
-      </w:r>
-      <w:r>
-        <w:t>regions</w:t>
-      </w:r>
-      <w:r>
-        <w:t>.</w:t>
-      </w:r>
-    </w:p>
-    <w:p>
-      <w:r>
-        <w:rPr>
-          <w:noProof/>
-        </w:rPr>
         <w:drawing>
-          <wp:inline distT="0" distB="0" distL="0" distR="0" wp14:anchorId="4C937D06" wp14:editId="33957879">
-            <wp:extent cx="5943600" cy="4537075"/>
-            <wp:effectExtent l="38100" t="38100" r="95250" b="92075"/>
-            <wp:docPr id="2133652090" name="Picture 1"/>
+          <wp:inline distT="0" distB="0" distL="0" distR="0" wp14:anchorId="40496D9E" wp14:editId="347DEAE6">
+            <wp:extent cx="5943600" cy="4648835"/>
+            <wp:effectExtent l="38100" t="38100" r="95250" b="94615"/>
+            <wp:docPr id="517112135" name="Picture 1"/>
             <wp:cNvGraphicFramePr>
               <a:graphicFrameLocks xmlns:a="http://schemas.openxmlformats.org/drawingml/2006/main" noChangeAspect="1"/>
             </wp:cNvGraphicFramePr>
@@ -2166,7 +2115,7 @@
               <a:graphicData uri="http://schemas.openxmlformats.org/drawingml/2006/picture">
                 <pic:pic xmlns:pic="http://schemas.openxmlformats.org/drawingml/2006/picture">
                   <pic:nvPicPr>
-                    <pic:cNvPr id="2133652090" name=""/>
+                    <pic:cNvPr id="517112135" name=""/>
                     <pic:cNvPicPr/>
                   </pic:nvPicPr>
                   <pic:blipFill>
@@ -2178,7 +2127,7 @@
                   <pic:spPr>
                     <a:xfrm>
                       <a:off x="0" y="0"/>
-                      <a:ext cx="5943600" cy="4537075"/>
+                      <a:ext cx="5943600" cy="4648835"/>
                     </a:xfrm>
                     <a:prstGeom prst="rect">
                       <a:avLst/>
@@ -2199,113 +2148,29 @@
       </w:r>
     </w:p>
     <w:p>
-      <w:r>
-        <w:t xml:space="preserve">The top row, positioned beneath the toolbar, contains the timeline and associated </w:t>
-      </w:r>
-      <w:r>
-        <w:t>display-frame</w:t>
-      </w:r>
-      <w:r>
-        <w:t xml:space="preserve">s.  The current analysis time range is </w:t>
-      </w:r>
-      <w:r>
-        <w:t xml:space="preserve">highlighted </w:t>
-      </w:r>
-      <w:r>
-        <w:t>in blue.</w:t>
-      </w:r>
-    </w:p>
-    <w:p>
-      <w:r>
-        <w:lastRenderedPageBreak/>
-        <w:t>The middle row contains a set of tabbed views,</w:t>
-      </w:r>
-      <w:r>
-        <w:t xml:space="preserve"> </w:t>
-      </w:r>
-      <w:r>
-        <w:t xml:space="preserve">each providing a different view of the </w:t>
-      </w:r>
-      <w:r>
-        <w:t>analysis results</w:t>
-      </w:r>
-      <w:r>
-        <w:t>, for the selected time range</w:t>
-      </w:r>
-      <w:r>
-        <w:t xml:space="preserve">.  </w:t>
-      </w:r>
-      <w:r>
-        <w:t xml:space="preserve">In the image </w:t>
-      </w:r>
-      <w:r>
-        <w:t>above</w:t>
-      </w:r>
-      <w:r>
-        <w:t xml:space="preserve">, </w:t>
-      </w:r>
-      <w:r>
-        <w:t xml:space="preserve">the </w:t>
-      </w:r>
-      <w:r>
-        <w:t xml:space="preserve">Routines tab </w:t>
-      </w:r>
-      <w:r>
-        <w:t>is selected and viewed.</w:t>
-      </w:r>
-    </w:p>
-    <w:p>
-      <w:r>
-        <w:t>The bottom row shows the selected routine</w:t>
-      </w:r>
-      <w:r>
-        <w:t>’</w:t>
-      </w:r>
-      <w:r>
-        <w:t>s executed instruction</w:t>
-      </w:r>
-      <w:r>
-        <w:t>s</w:t>
-      </w:r>
-      <w:r>
-        <w:t xml:space="preserve">, with </w:t>
-      </w:r>
-      <w:r>
-        <w:t xml:space="preserve">their </w:t>
-      </w:r>
-      <w:r>
-        <w:t>associated metrics.</w:t>
-      </w:r>
-    </w:p>
-    <w:p>
-      <w:r>
-        <w:t>Here is a more detailed description of each section</w:t>
-      </w:r>
-      <w:r>
-        <w:t>:</w:t>
-      </w:r>
-    </w:p>
-    <w:p>
       <w:pPr>
         <w:pStyle w:val="Heading3"/>
       </w:pPr>
       <w:r>
-        <w:t>Timeline</w:t>
-      </w:r>
-      <w:r>
-        <w:t xml:space="preserve"> panel</w:t>
-      </w:r>
-    </w:p>
-    <w:p>
-      <w:r>
-        <w:rPr>
-          <w:noProof/>
-        </w:rPr>
+        <w:t xml:space="preserve">The </w:t>
+      </w:r>
+      <w:r>
+        <w:t xml:space="preserve">Caption and </w:t>
+      </w:r>
+      <w:r>
+        <w:t>T</w:t>
+      </w:r>
+      <w:r>
+        <w:t>oolbar</w:t>
+      </w:r>
+    </w:p>
+    <w:p>
+      <w:r>
         <w:drawing>
-          <wp:inline distT="0" distB="0" distL="0" distR="0" wp14:anchorId="39C0E9B3" wp14:editId="49C1BD4E">
-            <wp:extent cx="5943600" cy="1011555"/>
-            <wp:effectExtent l="38100" t="38100" r="95250" b="93345"/>
-            <wp:docPr id="1593819213" name="Picture 1"/>
+          <wp:inline distT="0" distB="0" distL="0" distR="0" wp14:anchorId="68C496A0" wp14:editId="626CFA63">
+            <wp:extent cx="5943600" cy="292100"/>
+            <wp:effectExtent l="38100" t="38100" r="95250" b="88900"/>
+            <wp:docPr id="1898916840" name="Picture 1"/>
             <wp:cNvGraphicFramePr>
               <a:graphicFrameLocks xmlns:a="http://schemas.openxmlformats.org/drawingml/2006/main" noChangeAspect="1"/>
             </wp:cNvGraphicFramePr>
@@ -2313,7 +2178,7 @@
               <a:graphicData uri="http://schemas.openxmlformats.org/drawingml/2006/picture">
                 <pic:pic xmlns:pic="http://schemas.openxmlformats.org/drawingml/2006/picture">
                   <pic:nvPicPr>
-                    <pic:cNvPr id="1593819213" name=""/>
+                    <pic:cNvPr id="1898916840" name=""/>
                     <pic:cNvPicPr/>
                   </pic:nvPicPr>
                   <pic:blipFill>
@@ -2325,7 +2190,7 @@
                   <pic:spPr>
                     <a:xfrm>
                       <a:off x="0" y="0"/>
-                      <a:ext cx="5943600" cy="1011555"/>
+                      <a:ext cx="5943600" cy="292100"/>
                     </a:xfrm>
                     <a:prstGeom prst="rect">
                       <a:avLst/>
@@ -2347,6 +2212,499 @@
     </w:p>
     <w:p>
       <w:r>
+        <w:t>The caption shows the name of the currently opened .</w:t>
+      </w:r>
+      <w:r>
+        <w:rPr>
+          <w:b/>
+          <w:bCs/>
+        </w:rPr>
+        <w:t>perf</w:t>
+      </w:r>
+      <w:r>
+        <w:t xml:space="preserve"> file, its duration, and </w:t>
+      </w:r>
+      <w:r>
+        <w:t>the selection’s</w:t>
+      </w:r>
+      <w:r>
+        <w:t xml:space="preserve"> time range</w:t>
+      </w:r>
+      <w:r>
+        <w:t>, if this differs from the duration.</w:t>
+      </w:r>
+    </w:p>
+    <w:p>
+      <w:r>
+        <w:lastRenderedPageBreak/>
+        <w:t>The toolbar contains the following buttons</w:t>
+      </w:r>
+      <w:r>
+        <w:t xml:space="preserve"> which perform the following actions:</w:t>
+      </w:r>
+    </w:p>
+    <w:p>
+      <w:pPr>
+        <w:pStyle w:val="ListParagraph"/>
+        <w:numPr>
+          <w:ilvl w:val="1"/>
+          <w:numId w:val="1"/>
+        </w:numPr>
+      </w:pPr>
+      <w:r>
+        <w:rPr>
+          <w:b/>
+          <w:bCs/>
+        </w:rPr>
+        <w:t>Open</w:t>
+      </w:r>
+      <w:r>
+        <w:t xml:space="preserve"> – Opens a </w:t>
+      </w:r>
+      <w:r>
+        <w:rPr>
+          <w:b/>
+          <w:bCs/>
+        </w:rPr>
+        <w:t>.Perf</w:t>
+      </w:r>
+      <w:r>
+        <w:t xml:space="preserve"> file.</w:t>
+      </w:r>
+    </w:p>
+    <w:p>
+      <w:pPr>
+        <w:pStyle w:val="ListParagraph"/>
+        <w:numPr>
+          <w:ilvl w:val="1"/>
+          <w:numId w:val="1"/>
+        </w:numPr>
+      </w:pPr>
+      <w:r>
+        <w:rPr>
+          <w:b/>
+          <w:bCs/>
+        </w:rPr>
+        <w:t>Hot</w:t>
+      </w:r>
+      <w:r>
+        <w:t xml:space="preserve"> </w:t>
+      </w:r>
+      <w:r>
+        <w:rPr>
+          <w:b/>
+          <w:bCs/>
+        </w:rPr>
+        <w:t>Paths</w:t>
+      </w:r>
+      <w:r>
+        <w:t xml:space="preserve"> – Selects the Call Tree tab, showing the hot paths in the current selected time range.  The hot path</w:t>
+      </w:r>
+      <w:r>
+        <w:t>s</w:t>
+      </w:r>
+      <w:r>
+        <w:t xml:space="preserve"> </w:t>
+      </w:r>
+      <w:r>
+        <w:t xml:space="preserve">are </w:t>
+      </w:r>
+      <w:r>
+        <w:t>whe</w:t>
+      </w:r>
+      <w:r>
+        <w:t>re</w:t>
+      </w:r>
+      <w:r>
+        <w:t xml:space="preserve"> the code is spending most of </w:t>
+      </w:r>
+      <w:r>
+        <w:t xml:space="preserve">its </w:t>
+      </w:r>
+      <w:r>
+        <w:t>time.</w:t>
+      </w:r>
+    </w:p>
+    <w:p>
+      <w:pPr>
+        <w:pStyle w:val="ListParagraph"/>
+        <w:numPr>
+          <w:ilvl w:val="1"/>
+          <w:numId w:val="1"/>
+        </w:numPr>
+      </w:pPr>
+      <w:r>
+        <w:rPr>
+          <w:b/>
+          <w:bCs/>
+        </w:rPr>
+        <w:t>Hot Routines</w:t>
+      </w:r>
+      <w:r>
+        <w:t xml:space="preserve"> – Selects the </w:t>
+      </w:r>
+      <w:r>
+        <w:t xml:space="preserve">Routines </w:t>
+      </w:r>
+      <w:r>
+        <w:t xml:space="preserve">tab, showing the hot </w:t>
+      </w:r>
+      <w:r>
+        <w:t>routines</w:t>
+      </w:r>
+      <w:r>
+        <w:t xml:space="preserve"> in the current selected time range.  The hot </w:t>
+      </w:r>
+      <w:r>
+        <w:t xml:space="preserve">routines </w:t>
+      </w:r>
+      <w:r>
+        <w:t xml:space="preserve">are </w:t>
+      </w:r>
+      <w:r>
+        <w:t>where the code is spending most of its time</w:t>
+      </w:r>
+      <w:r>
+        <w:t>, within the routines themselves.</w:t>
+      </w:r>
+    </w:p>
+    <w:p>
+      <w:pPr>
+        <w:pStyle w:val="ListParagraph"/>
+        <w:numPr>
+          <w:ilvl w:val="1"/>
+          <w:numId w:val="1"/>
+        </w:numPr>
+      </w:pPr>
+      <w:r>
+        <w:rPr>
+          <w:b/>
+          <w:bCs/>
+        </w:rPr>
+        <w:t>Undo &amp; Redo</w:t>
+      </w:r>
+      <w:r>
+        <w:t xml:space="preserve"> – Undo or redo the last action.  Most actions within the application are undoable and redoable.</w:t>
+      </w:r>
+    </w:p>
+    <w:p>
+      <w:pPr>
+        <w:pStyle w:val="ListParagraph"/>
+        <w:numPr>
+          <w:ilvl w:val="1"/>
+          <w:numId w:val="1"/>
+        </w:numPr>
+      </w:pPr>
+      <w:r>
+        <w:rPr>
+          <w:b/>
+          <w:bCs/>
+        </w:rPr>
+        <w:t>Reset All</w:t>
+      </w:r>
+      <w:r>
+        <w:t xml:space="preserve"> – Resets the selection and zoom.</w:t>
+      </w:r>
+    </w:p>
+    <w:p>
+      <w:pPr>
+        <w:pStyle w:val="ListParagraph"/>
+        <w:numPr>
+          <w:ilvl w:val="1"/>
+          <w:numId w:val="1"/>
+        </w:numPr>
+      </w:pPr>
+      <w:r>
+        <w:rPr>
+          <w:b/>
+          <w:bCs/>
+        </w:rPr>
+        <w:t>Zoom in &amp; Zoom</w:t>
+      </w:r>
+      <w:r>
+        <w:t xml:space="preserve"> </w:t>
+      </w:r>
+      <w:r>
+        <w:t>– Zoom in and out of the timeline.</w:t>
+      </w:r>
+    </w:p>
+    <w:p>
+      <w:pPr>
+        <w:pStyle w:val="ListParagraph"/>
+        <w:numPr>
+          <w:ilvl w:val="1"/>
+          <w:numId w:val="1"/>
+        </w:numPr>
+      </w:pPr>
+      <w:r>
+        <w:rPr>
+          <w:b/>
+          <w:bCs/>
+        </w:rPr>
+        <w:t xml:space="preserve">Fit </w:t>
+      </w:r>
+      <w:r>
+        <w:rPr>
+          <w:b/>
+          <w:bCs/>
+        </w:rPr>
+        <w:t>S</w:t>
+      </w:r>
+      <w:r>
+        <w:rPr>
+          <w:b/>
+          <w:bCs/>
+        </w:rPr>
+        <w:t>election</w:t>
+      </w:r>
+      <w:r>
+        <w:t xml:space="preserve"> – Zooms and scrolls the timeline to show the selected time range spans the window.</w:t>
+      </w:r>
+    </w:p>
+    <w:p>
+      <w:pPr>
+        <w:pStyle w:val="ListParagraph"/>
+        <w:numPr>
+          <w:ilvl w:val="1"/>
+          <w:numId w:val="1"/>
+        </w:numPr>
+      </w:pPr>
+      <w:r>
+        <w:rPr>
+          <w:b/>
+          <w:bCs/>
+        </w:rPr>
+        <w:t xml:space="preserve">Fit </w:t>
+      </w:r>
+      <w:r>
+        <w:rPr>
+          <w:b/>
+          <w:bCs/>
+        </w:rPr>
+        <w:t>D</w:t>
+      </w:r>
+      <w:r>
+        <w:rPr>
+          <w:b/>
+          <w:bCs/>
+        </w:rPr>
+        <w:t xml:space="preserve">isplay </w:t>
+      </w:r>
+      <w:r>
+        <w:rPr>
+          <w:b/>
+          <w:bCs/>
+        </w:rPr>
+        <w:t>F</w:t>
+      </w:r>
+      <w:r>
+        <w:rPr>
+          <w:b/>
+          <w:bCs/>
+        </w:rPr>
+        <w:t>rames</w:t>
+      </w:r>
+      <w:r>
+        <w:t xml:space="preserve"> – </w:t>
+      </w:r>
+      <w:r>
+        <w:t>Zooms</w:t>
+      </w:r>
+      <w:r>
+        <w:t xml:space="preserve"> the timeline to layout the display frames sequentially across the window.</w:t>
+      </w:r>
+    </w:p>
+    <w:p>
+      <w:pPr>
+        <w:pStyle w:val="ListParagraph"/>
+        <w:numPr>
+          <w:ilvl w:val="1"/>
+          <w:numId w:val="1"/>
+        </w:numPr>
+      </w:pPr>
+      <w:r>
+        <w:rPr>
+          <w:b/>
+          <w:bCs/>
+        </w:rPr>
+        <w:t>Labels</w:t>
+      </w:r>
+      <w:r>
+        <w:rPr>
+          <w:b/>
+          <w:bCs/>
+        </w:rPr>
+        <w:t xml:space="preserve"> –</w:t>
+      </w:r>
+      <w:r>
+        <w:t xml:space="preserve"> </w:t>
+      </w:r>
+      <w:r>
+        <w:t xml:space="preserve">Shows </w:t>
+      </w:r>
+      <w:r>
+        <w:t>the Labels dialog.</w:t>
+      </w:r>
+    </w:p>
+    <w:p>
+      <w:pPr>
+        <w:pStyle w:val="ListParagraph"/>
+        <w:numPr>
+          <w:ilvl w:val="1"/>
+          <w:numId w:val="1"/>
+        </w:numPr>
+      </w:pPr>
+      <w:r>
+        <w:rPr>
+          <w:b/>
+          <w:bCs/>
+        </w:rPr>
+        <w:t xml:space="preserve">Display </w:t>
+      </w:r>
+      <w:r>
+        <w:rPr>
+          <w:b/>
+          <w:bCs/>
+        </w:rPr>
+        <w:t>Settings</w:t>
+      </w:r>
+      <w:r>
+        <w:t xml:space="preserve"> – </w:t>
+      </w:r>
+      <w:r>
+        <w:t xml:space="preserve">Shows </w:t>
+      </w:r>
+      <w:r>
+        <w:t xml:space="preserve">the </w:t>
+      </w:r>
+      <w:r>
+        <w:t xml:space="preserve">Displays </w:t>
+      </w:r>
+      <w:r>
+        <w:t>Settings dialog.</w:t>
+      </w:r>
+    </w:p>
+    <w:p>
+      <w:pPr>
+        <w:pStyle w:val="ListParagraph"/>
+        <w:numPr>
+          <w:ilvl w:val="1"/>
+          <w:numId w:val="1"/>
+        </w:numPr>
+      </w:pPr>
+      <w:r>
+        <w:rPr>
+          <w:b/>
+          <w:bCs/>
+        </w:rPr>
+        <w:t>Help</w:t>
+      </w:r>
+      <w:r>
+        <w:t xml:space="preserve"> – </w:t>
+      </w:r>
+      <w:r>
+        <w:t xml:space="preserve">Shows </w:t>
+      </w:r>
+      <w:r>
+        <w:t xml:space="preserve">the </w:t>
+      </w:r>
+      <w:r>
+        <w:t>H</w:t>
+      </w:r>
+      <w:r>
+        <w:t>elp window.</w:t>
+      </w:r>
+    </w:p>
+    <w:p>
+      <w:pPr>
+        <w:pStyle w:val="Callout"/>
+      </w:pPr>
+      <w:r>
+        <w:t xml:space="preserve">Use the </w:t>
+      </w:r>
+      <w:r>
+        <w:rPr>
+          <w:b/>
+          <w:bCs/>
+        </w:rPr>
+        <w:t>Hot paths</w:t>
+      </w:r>
+      <w:r>
+        <w:t xml:space="preserve"> and </w:t>
+      </w:r>
+      <w:r>
+        <w:rPr>
+          <w:b/>
+          <w:bCs/>
+        </w:rPr>
+        <w:t>Hot routine</w:t>
+      </w:r>
+      <w:r>
+        <w:t xml:space="preserve"> buttons to identify where the code is spending most of its time, for the current selected time range.</w:t>
+      </w:r>
+    </w:p>
+    <w:p>
+      <w:pPr>
+        <w:pStyle w:val="Heading3"/>
+      </w:pPr>
+      <w:r>
+        <w:t xml:space="preserve">The </w:t>
+      </w:r>
+      <w:r>
+        <w:t>Timeline</w:t>
+      </w:r>
+      <w:r>
+        <w:t xml:space="preserve"> panel</w:t>
+      </w:r>
+    </w:p>
+    <w:p>
+      <w:r>
+        <w:drawing>
+          <wp:inline distT="0" distB="0" distL="0" distR="0" wp14:anchorId="478A9E05" wp14:editId="13A734B0">
+            <wp:extent cx="5943600" cy="1010285"/>
+            <wp:effectExtent l="38100" t="38100" r="95250" b="94615"/>
+            <wp:docPr id="1383992795" name="Picture 1"/>
+            <wp:cNvGraphicFramePr>
+              <a:graphicFrameLocks xmlns:a="http://schemas.openxmlformats.org/drawingml/2006/main" noChangeAspect="1"/>
+            </wp:cNvGraphicFramePr>
+            <a:graphic xmlns:a="http://schemas.openxmlformats.org/drawingml/2006/main">
+              <a:graphicData uri="http://schemas.openxmlformats.org/drawingml/2006/picture">
+                <pic:pic xmlns:pic="http://schemas.openxmlformats.org/drawingml/2006/picture">
+                  <pic:nvPicPr>
+                    <pic:cNvPr id="1383992795" name=""/>
+                    <pic:cNvPicPr/>
+                  </pic:nvPicPr>
+                  <pic:blipFill>
+                    <a:blip r:embed="rId14"/>
+                    <a:stretch>
+                      <a:fillRect/>
+                    </a:stretch>
+                  </pic:blipFill>
+                  <pic:spPr>
+                    <a:xfrm>
+                      <a:off x="0" y="0"/>
+                      <a:ext cx="5943600" cy="1010285"/>
+                    </a:xfrm>
+                    <a:prstGeom prst="rect">
+                      <a:avLst/>
+                    </a:prstGeom>
+                    <a:effectLst>
+                      <a:outerShdw blurRad="50800" dist="38100" dir="2700000" algn="tl" rotWithShape="0">
+                        <a:prstClr val="black">
+                          <a:alpha val="40000"/>
+                        </a:prstClr>
+                      </a:outerShdw>
+                    </a:effectLst>
+                  </pic:spPr>
+                </pic:pic>
+              </a:graphicData>
+            </a:graphic>
+          </wp:inline>
+        </w:drawing>
+      </w:r>
+    </w:p>
+    <w:p>
+      <w:r>
         <w:t>Show</w:t>
       </w:r>
       <w:r>
@@ -2425,7 +2783,14 @@
           <w:b/>
           <w:bCs/>
         </w:rPr>
-        <w:t>edit selection</w:t>
+        <w:t>E</w:t>
+      </w:r>
+      <w:r>
+        <w:rPr>
+          <w:b/>
+          <w:bCs/>
+        </w:rPr>
+        <w:t>dit selection</w:t>
       </w:r>
       <w:r>
         <w:t xml:space="preserve"> button</w:t>
@@ -2437,6 +2802,121 @@
         <w:t>(far right)</w:t>
       </w:r>
       <w:r>
+        <w:t>, which displays the following dialog</w:t>
+      </w:r>
+      <w:r>
+        <w:t xml:space="preserve"> which allows the selection to </w:t>
+      </w:r>
+      <w:r>
+        <w:t>specified in seconds or CPU cycles.</w:t>
+      </w:r>
+    </w:p>
+    <w:p>
+      <w:pPr>
+        <w:jc w:val="center"/>
+      </w:pPr>
+      <w:r>
+        <w:lastRenderedPageBreak/>
+        <w:drawing>
+          <wp:inline distT="0" distB="0" distL="0" distR="0" wp14:anchorId="1F737DD4" wp14:editId="68CBC4A5">
+            <wp:extent cx="2603500" cy="1369409"/>
+            <wp:effectExtent l="38100" t="38100" r="101600" b="97790"/>
+            <wp:docPr id="1812393592" name="Picture 1"/>
+            <wp:cNvGraphicFramePr>
+              <a:graphicFrameLocks xmlns:a="http://schemas.openxmlformats.org/drawingml/2006/main" noChangeAspect="1"/>
+            </wp:cNvGraphicFramePr>
+            <a:graphic xmlns:a="http://schemas.openxmlformats.org/drawingml/2006/main">
+              <a:graphicData uri="http://schemas.openxmlformats.org/drawingml/2006/picture">
+                <pic:pic xmlns:pic="http://schemas.openxmlformats.org/drawingml/2006/picture">
+                  <pic:nvPicPr>
+                    <pic:cNvPr id="1812393592" name=""/>
+                    <pic:cNvPicPr/>
+                  </pic:nvPicPr>
+                  <pic:blipFill>
+                    <a:blip r:embed="rId15"/>
+                    <a:stretch>
+                      <a:fillRect/>
+                    </a:stretch>
+                  </pic:blipFill>
+                  <pic:spPr>
+                    <a:xfrm>
+                      <a:off x="0" y="0"/>
+                      <a:ext cx="2611168" cy="1373442"/>
+                    </a:xfrm>
+                    <a:prstGeom prst="rect">
+                      <a:avLst/>
+                    </a:prstGeom>
+                    <a:effectLst>
+                      <a:outerShdw blurRad="50800" dist="38100" dir="2700000" algn="tl" rotWithShape="0">
+                        <a:prstClr val="black">
+                          <a:alpha val="40000"/>
+                        </a:prstClr>
+                      </a:outerShdw>
+                    </a:effectLst>
+                  </pic:spPr>
+                </pic:pic>
+              </a:graphicData>
+            </a:graphic>
+          </wp:inline>
+        </w:drawing>
+      </w:r>
+    </w:p>
+    <w:p>
+      <w:r>
+        <w:t xml:space="preserve">The </w:t>
+      </w:r>
+      <w:r>
+        <w:rPr>
+          <w:b/>
+          <w:bCs/>
+        </w:rPr>
+        <w:t xml:space="preserve">Zoom </w:t>
+      </w:r>
+      <w:r>
+        <w:rPr>
+          <w:b/>
+          <w:bCs/>
+        </w:rPr>
+        <w:t>i</w:t>
+      </w:r>
+      <w:r>
+        <w:rPr>
+          <w:b/>
+          <w:bCs/>
+        </w:rPr>
+        <w:t>n</w:t>
+      </w:r>
+      <w:r>
+        <w:t xml:space="preserve"> and </w:t>
+      </w:r>
+      <w:r>
+        <w:rPr>
+          <w:b/>
+          <w:bCs/>
+        </w:rPr>
+        <w:t xml:space="preserve">Zoom </w:t>
+      </w:r>
+      <w:r>
+        <w:rPr>
+          <w:b/>
+          <w:bCs/>
+        </w:rPr>
+        <w:t>o</w:t>
+      </w:r>
+      <w:r>
+        <w:rPr>
+          <w:b/>
+          <w:bCs/>
+        </w:rPr>
+        <w:t>ut</w:t>
+      </w:r>
+      <w:r>
+        <w:t xml:space="preserve"> button</w:t>
+      </w:r>
+      <w:r>
+        <w:t>s change the scale</w:t>
+      </w:r>
+      <w:r>
         <w:t>.</w:t>
       </w:r>
     </w:p>
@@ -2449,61 +2929,21 @@
           <w:b/>
           <w:bCs/>
         </w:rPr>
-        <w:t xml:space="preserve">Zoom </w:t>
-      </w:r>
-      <w:r>
-        <w:rPr>
-          <w:b/>
-          <w:bCs/>
-        </w:rPr>
-        <w:t>i</w:t>
-      </w:r>
-      <w:r>
-        <w:rPr>
-          <w:b/>
-          <w:bCs/>
-        </w:rPr>
-        <w:t>n</w:t>
-      </w:r>
-      <w:r>
-        <w:t xml:space="preserve"> and </w:t>
-      </w:r>
-      <w:r>
-        <w:rPr>
-          <w:b/>
-          <w:bCs/>
-        </w:rPr>
-        <w:t xml:space="preserve">Zoom </w:t>
-      </w:r>
-      <w:r>
-        <w:rPr>
-          <w:b/>
-          <w:bCs/>
-        </w:rPr>
-        <w:t>o</w:t>
-      </w:r>
-      <w:r>
-        <w:rPr>
-          <w:b/>
-          <w:bCs/>
-        </w:rPr>
-        <w:t>ut</w:t>
-      </w:r>
-      <w:r>
-        <w:t xml:space="preserve"> button</w:t>
-      </w:r>
-      <w:r>
-        <w:t>s change the scale</w:t>
-      </w:r>
-      <w:r>
-        <w:t xml:space="preserve">.  The </w:t>
-      </w:r>
-      <w:r>
-        <w:rPr>
-          <w:b/>
-          <w:bCs/>
-        </w:rPr>
-        <w:t>Fit selection</w:t>
+        <w:t xml:space="preserve">Fit </w:t>
+      </w:r>
+      <w:r>
+        <w:rPr>
+          <w:b/>
+          <w:bCs/>
+        </w:rPr>
+        <w:t>S</w:t>
+      </w:r>
+      <w:r>
+        <w:rPr>
+          <w:b/>
+          <w:bCs/>
+        </w:rPr>
+        <w:t>election</w:t>
       </w:r>
       <w:r>
         <w:rPr>
@@ -2538,7 +2978,7 @@
         <w:t xml:space="preserve"> the view </w:t>
       </w:r>
       <w:r>
-        <w:t xml:space="preserve">as appropriate.  </w:t>
+        <w:t>so that the it fits across the window.</w:t>
       </w:r>
     </w:p>
     <w:p>
@@ -2602,6 +3042,93 @@
     </w:p>
     <w:p>
       <w:r>
+        <w:t>If the timeline is zoomed in far, arrows appear to the left and right of the display</w:t>
+      </w:r>
+      <w:r>
+        <w:t>-frames.</w:t>
+      </w:r>
+      <w:r>
+        <w:t xml:space="preserve"> </w:t>
+      </w:r>
+      <w:r>
+        <w:t xml:space="preserve"> These indicate the start and end </w:t>
+      </w:r>
+      <w:r>
+        <w:t xml:space="preserve">times </w:t>
+      </w:r>
+      <w:r>
+        <w:t xml:space="preserve">of when the image was displayed on </w:t>
+      </w:r>
+      <w:r>
+        <w:t>the screen</w:t>
+      </w:r>
+      <w:r>
+        <w:t xml:space="preserve"> - </w:t>
+      </w:r>
+      <w:r>
+        <w:t xml:space="preserve">  </w:t>
+      </w:r>
+      <w:r>
+        <w:t>w</w:t>
+      </w:r>
+      <w:r>
+        <w:t xml:space="preserve">hen the CRTC started and ended scanning the screen memory to display the </w:t>
+      </w:r>
+      <w:r>
+        <w:t>image</w:t>
+      </w:r>
+      <w:r>
+        <w:t>.</w:t>
+      </w:r>
+    </w:p>
+    <w:p>
+      <w:r>
+        <w:drawing>
+          <wp:inline distT="0" distB="0" distL="0" distR="0" wp14:anchorId="3D0753D5" wp14:editId="03E81A07">
+            <wp:extent cx="5943600" cy="1016000"/>
+            <wp:effectExtent l="38100" t="38100" r="95250" b="88900"/>
+            <wp:docPr id="1047902104" name="Picture 1"/>
+            <wp:cNvGraphicFramePr>
+              <a:graphicFrameLocks xmlns:a="http://schemas.openxmlformats.org/drawingml/2006/main" noChangeAspect="1"/>
+            </wp:cNvGraphicFramePr>
+            <a:graphic xmlns:a="http://schemas.openxmlformats.org/drawingml/2006/main">
+              <a:graphicData uri="http://schemas.openxmlformats.org/drawingml/2006/picture">
+                <pic:pic xmlns:pic="http://schemas.openxmlformats.org/drawingml/2006/picture">
+                  <pic:nvPicPr>
+                    <pic:cNvPr id="1047902104" name=""/>
+                    <pic:cNvPicPr/>
+                  </pic:nvPicPr>
+                  <pic:blipFill>
+                    <a:blip r:embed="rId16"/>
+                    <a:stretch>
+                      <a:fillRect/>
+                    </a:stretch>
+                  </pic:blipFill>
+                  <pic:spPr>
+                    <a:xfrm>
+                      <a:off x="0" y="0"/>
+                      <a:ext cx="5943600" cy="1016000"/>
+                    </a:xfrm>
+                    <a:prstGeom prst="rect">
+                      <a:avLst/>
+                    </a:prstGeom>
+                    <a:effectLst>
+                      <a:outerShdw blurRad="50800" dist="38100" dir="2700000" algn="tl" rotWithShape="0">
+                        <a:prstClr val="black">
+                          <a:alpha val="40000"/>
+                        </a:prstClr>
+                      </a:outerShdw>
+                    </a:effectLst>
+                  </pic:spPr>
+                </pic:pic>
+              </a:graphicData>
+            </a:graphic>
+          </wp:inline>
+        </w:drawing>
+      </w:r>
+    </w:p>
+    <w:p>
+      <w:r>
         <w:t xml:space="preserve">The </w:t>
       </w:r>
       <w:r>
@@ -2616,7 +3143,14 @@
           <w:b/>
           <w:bCs/>
         </w:rPr>
-        <w:t>display</w:t>
+        <w:t>D</w:t>
+      </w:r>
+      <w:r>
+        <w:rPr>
+          <w:b/>
+          <w:bCs/>
+        </w:rPr>
+        <w:t>isplay</w:t>
       </w:r>
       <w:r>
         <w:rPr>
@@ -2630,7 +3164,14 @@
           <w:b/>
           <w:bCs/>
         </w:rPr>
-        <w:t>frame</w:t>
+        <w:t>F</w:t>
+      </w:r>
+      <w:r>
+        <w:rPr>
+          <w:b/>
+          <w:bCs/>
+        </w:rPr>
+        <w:t>rame</w:t>
       </w:r>
       <w:r>
         <w:rPr>
@@ -2646,25 +3187,80 @@
         <w:t>timeline</w:t>
       </w:r>
       <w:r>
-        <w:t xml:space="preserve"> so </w:t>
-      </w:r>
-      <w:r>
-        <w:t xml:space="preserve">display </w:t>
-      </w:r>
-      <w:r>
-        <w:t xml:space="preserve">frames are </w:t>
-      </w:r>
-      <w:r>
-        <w:t xml:space="preserve">sequentially </w:t>
-      </w:r>
-      <w:r>
-        <w:t>tiled across the screen.</w:t>
+        <w:t xml:space="preserve"> </w:t>
+      </w:r>
+      <w:r>
+        <w:t>t</w:t>
+      </w:r>
+      <w:r>
+        <w:t xml:space="preserve">o </w:t>
+      </w:r>
+      <w:r>
+        <w:t>tile</w:t>
+      </w:r>
+      <w:r>
+        <w:t xml:space="preserve"> the display frames </w:t>
+      </w:r>
+      <w:r>
+        <w:t xml:space="preserve">across the </w:t>
+      </w:r>
+      <w:r>
+        <w:t>window</w:t>
+      </w:r>
+      <w:r>
+        <w:t>, allowing a sequence of frames to be visually inspected</w:t>
+      </w:r>
+      <w:r>
+        <w:t>.</w:t>
+      </w:r>
+    </w:p>
+    <w:p>
+      <w:r>
+        <w:drawing>
+          <wp:inline distT="0" distB="0" distL="0" distR="0" wp14:anchorId="05A43878" wp14:editId="381F1610">
+            <wp:extent cx="5943600" cy="1478280"/>
+            <wp:effectExtent l="0" t="0" r="0" b="7620"/>
+            <wp:docPr id="1782341569" name="Picture 1"/>
+            <wp:cNvGraphicFramePr>
+              <a:graphicFrameLocks xmlns:a="http://schemas.openxmlformats.org/drawingml/2006/main" noChangeAspect="1"/>
+            </wp:cNvGraphicFramePr>
+            <a:graphic xmlns:a="http://schemas.openxmlformats.org/drawingml/2006/main">
+              <a:graphicData uri="http://schemas.openxmlformats.org/drawingml/2006/picture">
+                <pic:pic xmlns:pic="http://schemas.openxmlformats.org/drawingml/2006/picture">
+                  <pic:nvPicPr>
+                    <pic:cNvPr id="1782341569" name=""/>
+                    <pic:cNvPicPr/>
+                  </pic:nvPicPr>
+                  <pic:blipFill>
+                    <a:blip r:embed="rId17"/>
+                    <a:stretch>
+                      <a:fillRect/>
+                    </a:stretch>
+                  </pic:blipFill>
+                  <pic:spPr>
+                    <a:xfrm>
+                      <a:off x="0" y="0"/>
+                      <a:ext cx="5943600" cy="1478280"/>
+                    </a:xfrm>
+                    <a:prstGeom prst="rect">
+                      <a:avLst/>
+                    </a:prstGeom>
+                  </pic:spPr>
+                </pic:pic>
+              </a:graphicData>
+            </a:graphic>
+          </wp:inline>
+        </w:drawing>
       </w:r>
     </w:p>
     <w:p>
       <w:pPr>
         <w:pStyle w:val="Heading3"/>
       </w:pPr>
+      <w:r>
+        <w:lastRenderedPageBreak/>
+        <w:t xml:space="preserve">The </w:t>
+      </w:r>
       <w:r>
         <w:t xml:space="preserve">Call Tree </w:t>
       </w:r>
@@ -2701,7 +3297,7 @@
                     <pic:cNvPicPr/>
                   </pic:nvPicPr>
                   <pic:blipFill>
-                    <a:blip r:embed="rId14"/>
+                    <a:blip r:embed="rId18"/>
                     <a:stretch>
                       <a:fillRect/>
                     </a:stretch>
@@ -2816,13 +3412,50 @@
     </w:p>
     <w:p>
       <w:r>
-        <w:lastRenderedPageBreak/>
-        <w:t>The call tree shows all the routine’s call paths, sorted by total CPU cycles.  The top-level nodes represent the program and interrupt entry points.  Each node in the tree shows metrics for the context in which it was invoked.</w:t>
-      </w:r>
-    </w:p>
-    <w:p>
-      <w:r>
-        <w:t>Note how Total CPU counts decline through descendants.</w:t>
+        <w:t xml:space="preserve">The call tree shows all the routine’s call paths, sorted by </w:t>
+      </w:r>
+      <w:r>
+        <w:t>T</w:t>
+      </w:r>
+      <w:r>
+        <w:t>otal CPU cycles.  The top-level nodes represent the program and interrupt entry points.  Each node in the tree shows metrics for the context in which it was invoked.</w:t>
+      </w:r>
+    </w:p>
+    <w:p>
+      <w:r>
+        <w:t>Clicking on a routine makes it the selected routine.</w:t>
+      </w:r>
+    </w:p>
+    <w:p>
+      <w:r>
+        <w:t xml:space="preserve">A flame icon is displayed </w:t>
+      </w:r>
+      <w:r>
+        <w:t xml:space="preserve">for </w:t>
+      </w:r>
+      <w:r>
+        <w:t>r</w:t>
+      </w:r>
+      <w:r>
+        <w:t>outines</w:t>
+      </w:r>
+      <w:r>
+        <w:t xml:space="preserve"> in the ‘hot paths’</w:t>
+      </w:r>
+      <w:r>
+        <w:t>, those with the highest Total CPU times.</w:t>
+      </w:r>
+      <w:r>
+        <w:t xml:space="preserve">  </w:t>
+      </w:r>
+      <w:r>
+        <w:t xml:space="preserve">Note how </w:t>
+      </w:r>
+      <w:r>
+        <w:t xml:space="preserve">the </w:t>
+      </w:r>
+      <w:r>
+        <w:t>Total CPU counts decline through descendants.</w:t>
       </w:r>
     </w:p>
     <w:p>
@@ -2890,7 +3523,7 @@
                 <w:b/>
                 <w:bCs/>
               </w:rPr>
-              <w:t>Term</w:t>
+              <w:t>Column</w:t>
             </w:r>
           </w:p>
         </w:tc>
@@ -3053,6 +3686,7 @@
         </w:rPr>
       </w:pPr>
       <w:r>
+        <w:lastRenderedPageBreak/>
         <w:t>The relationship between</w:t>
       </w:r>
       <w:r>
@@ -3125,13 +3759,7 @@
     </w:p>
     <w:p>
       <w:pPr>
-        <w:pBdr>
-          <w:top w:val="single" w:sz="4" w:space="1" w:color="auto"/>
-          <w:left w:val="single" w:sz="4" w:space="4" w:color="auto"/>
-          <w:bottom w:val="single" w:sz="4" w:space="1" w:color="auto"/>
-          <w:right w:val="single" w:sz="4" w:space="4" w:color="auto"/>
-        </w:pBdr>
-        <w:shd w:val="clear" w:color="auto" w:fill="DAE9F7" w:themeFill="text2" w:themeFillTint="1A"/>
+        <w:pStyle w:val="Callout"/>
       </w:pPr>
       <w:r>
         <w:t xml:space="preserve">A </w:t>
@@ -3186,7 +3814,13 @@
         <w:t>, but takes up less code bytes.</w:t>
       </w:r>
       <w:r>
-        <w:t xml:space="preserve">  For a branch its an optimized way to perform a conditional </w:t>
+        <w:t xml:space="preserve">  For a branch it</w:t>
+      </w:r>
+      <w:r>
+        <w:t>’</w:t>
+      </w:r>
+      <w:r>
+        <w:t xml:space="preserve">s an optimized way to perform a conditional </w:t>
       </w:r>
       <w:r>
         <w:rPr>
@@ -3228,13 +3862,7 @@
     </w:p>
     <w:p>
       <w:pPr>
-        <w:pBdr>
-          <w:top w:val="single" w:sz="4" w:space="1" w:color="auto"/>
-          <w:left w:val="single" w:sz="4" w:space="4" w:color="auto"/>
-          <w:bottom w:val="single" w:sz="4" w:space="1" w:color="auto"/>
-          <w:right w:val="single" w:sz="4" w:space="4" w:color="auto"/>
-        </w:pBdr>
-        <w:shd w:val="clear" w:color="auto" w:fill="DAE9F7" w:themeFill="text2" w:themeFillTint="1A"/>
+        <w:pStyle w:val="Callout"/>
       </w:pPr>
       <w:r>
         <w:t xml:space="preserve">A </w:t>
@@ -3255,8 +3883,16 @@
         <w:pStyle w:val="Heading3"/>
       </w:pPr>
       <w:r>
-        <w:lastRenderedPageBreak/>
-        <w:t xml:space="preserve">Flame graph </w:t>
+        <w:t xml:space="preserve">The </w:t>
+      </w:r>
+      <w:r>
+        <w:t xml:space="preserve">Flame </w:t>
+      </w:r>
+      <w:r>
+        <w:t>G</w:t>
+      </w:r>
+      <w:r>
+        <w:t xml:space="preserve">raph </w:t>
       </w:r>
       <w:r>
         <w:t>tab</w:t>
@@ -3285,7 +3921,7 @@
                     <pic:cNvPicPr/>
                   </pic:nvPicPr>
                   <pic:blipFill>
-                    <a:blip r:embed="rId15"/>
+                    <a:blip r:embed="rId19"/>
                     <a:stretch>
                       <a:fillRect/>
                     </a:stretch>
@@ -3398,14 +4034,26 @@
     </w:p>
     <w:p>
       <w:r>
-        <w:t xml:space="preserve">The tail-call and fall-through routines can be showed by pressing the </w:t>
-      </w:r>
-      <w:r>
-        <w:rPr>
-          <w:b/>
-          <w:bCs/>
-        </w:rPr>
-        <w:t>c</w:t>
+        <w:t xml:space="preserve">The </w:t>
+      </w:r>
+      <w:r>
+        <w:t xml:space="preserve">routine call types (how they were invoked) </w:t>
+      </w:r>
+      <w:r>
+        <w:t>can be show</w:t>
+      </w:r>
+      <w:r>
+        <w:t>n</w:t>
+      </w:r>
+      <w:r>
+        <w:t xml:space="preserve"> by pressing the </w:t>
+      </w:r>
+      <w:r>
+        <w:rPr>
+          <w:b/>
+          <w:bCs/>
+        </w:rPr>
+        <w:t>C</w:t>
       </w:r>
       <w:r>
         <w:rPr>
@@ -3417,18 +4065,13 @@
       <w:r>
         <w:t xml:space="preserve"> button.</w:t>
       </w:r>
-      <w:r>
-        <w:t xml:space="preserve"> </w:t>
-      </w:r>
-      <w:r>
-        <w:t xml:space="preserve"> </w:t>
-      </w:r>
     </w:p>
     <w:p>
       <w:r>
         <w:rPr>
           <w:noProof/>
         </w:rPr>
+        <w:lastRenderedPageBreak/>
         <w:drawing>
           <wp:inline distT="0" distB="0" distL="0" distR="0" wp14:anchorId="2ECFBAB8" wp14:editId="43526CD3">
             <wp:extent cx="5943600" cy="1561465"/>
@@ -3445,7 +4088,7 @@
                     <pic:cNvPicPr/>
                   </pic:nvPicPr>
                   <pic:blipFill>
-                    <a:blip r:embed="rId16"/>
+                    <a:blip r:embed="rId20"/>
                     <a:stretch>
                       <a:fillRect/>
                     </a:stretch>
@@ -3524,7 +4167,9 @@
         <w:pStyle w:val="Heading3"/>
       </w:pPr>
       <w:r>
-        <w:lastRenderedPageBreak/>
+        <w:t xml:space="preserve">The </w:t>
+      </w:r>
+      <w:r>
         <w:t xml:space="preserve">Routines </w:t>
       </w:r>
       <w:r>
@@ -3560,7 +4205,7 @@
                     <pic:cNvPicPr/>
                   </pic:nvPicPr>
                   <pic:blipFill>
-                    <a:blip r:embed="rId17"/>
+                    <a:blip r:embed="rId21"/>
                     <a:stretch>
                       <a:fillRect/>
                     </a:stretch>
@@ -3590,7 +4235,84 @@
     </w:p>
     <w:p>
       <w:r>
-        <w:t>Shows the routines in the program, sorted by self-CPU counts.  The routines with the highest self-CPU usage are marked as ‘hot’.  The routines can also be sorted by total CPU, elapsed CPU, interrupts, and execution count.</w:t>
+        <w:t xml:space="preserve">Shows the routines in the program, sorted by </w:t>
+      </w:r>
+      <w:r>
+        <w:t>S</w:t>
+      </w:r>
+      <w:r>
+        <w:t xml:space="preserve">elf-CPU counts.  </w:t>
+      </w:r>
+      <w:r>
+        <w:t xml:space="preserve">A flame icon is </w:t>
+      </w:r>
+      <w:r>
+        <w:t xml:space="preserve">displayed </w:t>
+      </w:r>
+      <w:r>
+        <w:t xml:space="preserve">against </w:t>
+      </w:r>
+      <w:r>
+        <w:t xml:space="preserve">the </w:t>
+      </w:r>
+      <w:r>
+        <w:t>‘</w:t>
+      </w:r>
+      <w:r>
+        <w:t>hot</w:t>
+      </w:r>
+      <w:r>
+        <w:t>’</w:t>
+      </w:r>
+      <w:r>
+        <w:t xml:space="preserve"> </w:t>
+      </w:r>
+      <w:r>
+        <w:t>routines</w:t>
+      </w:r>
+      <w:r>
+        <w:t xml:space="preserve">, those with </w:t>
+      </w:r>
+      <w:r>
+        <w:t xml:space="preserve">the highest </w:t>
+      </w:r>
+      <w:r>
+        <w:t>S</w:t>
+      </w:r>
+      <w:r>
+        <w:t xml:space="preserve">elf-CPU </w:t>
+      </w:r>
+      <w:r>
+        <w:t>counts</w:t>
+      </w:r>
+      <w:r>
+        <w:t xml:space="preserve">.  The routines can also be sorted by </w:t>
+      </w:r>
+      <w:r>
+        <w:t>T</w:t>
+      </w:r>
+      <w:r>
+        <w:t xml:space="preserve">otal CPU, </w:t>
+      </w:r>
+      <w:r>
+        <w:t>Interrupt CPU</w:t>
+      </w:r>
+      <w:r>
+        <w:t>, E</w:t>
+      </w:r>
+      <w:r>
+        <w:t xml:space="preserve">lapsed CPU, and </w:t>
+      </w:r>
+      <w:r>
+        <w:t>E</w:t>
+      </w:r>
+      <w:r>
+        <w:t>xecution count.</w:t>
+      </w:r>
+    </w:p>
+    <w:p>
+      <w:r>
+        <w:t>Clicking on a routine makes it the selected routine.</w:t>
       </w:r>
     </w:p>
     <w:p>
@@ -3605,6 +4327,10 @@
       <w:pPr>
         <w:pStyle w:val="Heading3"/>
       </w:pPr>
+      <w:r>
+        <w:lastRenderedPageBreak/>
+        <w:t xml:space="preserve">The </w:t>
+      </w:r>
       <w:r>
         <w:t xml:space="preserve">Caller \ Callee </w:t>
       </w:r>
@@ -3633,7 +4359,7 @@
                     <pic:cNvPicPr/>
                   </pic:nvPicPr>
                   <pic:blipFill>
-                    <a:blip r:embed="rId18"/>
+                    <a:blip r:embed="rId22"/>
                     <a:stretch>
                       <a:fillRect/>
                     </a:stretch>
@@ -3751,23 +4477,175 @@
         <w:pStyle w:val="Heading3"/>
       </w:pPr>
       <w:r>
+        <w:t xml:space="preserve">The </w:t>
+      </w:r>
+      <w:r>
+        <w:t xml:space="preserve">Memory </w:t>
+      </w:r>
+      <w:r>
+        <w:t>tab</w:t>
+      </w:r>
+    </w:p>
+    <w:p>
+      <w:r>
+        <w:t xml:space="preserve">The memory </w:t>
+      </w:r>
+      <w:r>
+        <w:t xml:space="preserve">tab </w:t>
+      </w:r>
+      <w:r>
+        <w:t xml:space="preserve">lists the highest </w:t>
+      </w:r>
+      <w:r>
+        <w:t xml:space="preserve">to </w:t>
+      </w:r>
+      <w:r>
+        <w:t xml:space="preserve">lowest </w:t>
+      </w:r>
+      <w:r>
+        <w:t>accessed</w:t>
+      </w:r>
+      <w:r>
+        <w:t xml:space="preserve"> memory </w:t>
+      </w:r>
+      <w:r>
+        <w:t xml:space="preserve">addresses </w:t>
+      </w:r>
+      <w:r>
+        <w:t>in the application</w:t>
+      </w:r>
+      <w:r>
+        <w:t>.</w:t>
+      </w:r>
+      <w:r>
+        <w:t xml:space="preserve">  The memory ca</w:t>
+      </w:r>
+      <w:r>
+        <w:t>n optionally be filtered to just zero-page</w:t>
+      </w:r>
+      <w:r>
+        <w:t xml:space="preserve"> addresses</w:t>
+      </w:r>
+      <w:r>
+        <w:t>.</w:t>
+      </w:r>
+    </w:p>
+    <w:p>
+      <w:pPr>
+        <w:pStyle w:val="Callout"/>
+      </w:pPr>
+      <w:r>
+        <w:t xml:space="preserve">Inspecting the highest accessed memory addresses is a useful exercise as it may reveal that certain addresses are accessed </w:t>
+      </w:r>
+      <w:r>
+        <w:t xml:space="preserve">far </w:t>
+      </w:r>
+      <w:r>
+        <w:t xml:space="preserve">more frequently than expected, indicating a potential bug.  Inspection may also reveal that </w:t>
+      </w:r>
+      <w:r>
+        <w:t>one or more of the accesses are not in zero page, providing an optimization opportunity.</w:t>
+      </w:r>
+    </w:p>
+    <w:p>
+      <w:pPr>
+        <w:pStyle w:val="Callout"/>
+      </w:pPr>
+      <w:r>
+        <w:t xml:space="preserve">Instructions that use zero page addressing </w:t>
+      </w:r>
+      <w:r>
+        <w:t xml:space="preserve">use less CPU cycles and </w:t>
+      </w:r>
+      <w:r>
+        <w:t xml:space="preserve">code space than instructions that don’t </w:t>
+      </w:r>
+      <w:r>
+        <w:t xml:space="preserve">use </w:t>
+      </w:r>
+      <w:r>
+        <w:t>zero-page addressing modes.</w:t>
+      </w:r>
+    </w:p>
+    <w:p>
+      <w:r>
+        <w:t xml:space="preserve">Selecting an address </w:t>
+      </w:r>
+      <w:r>
+        <w:t>populates</w:t>
+      </w:r>
+      <w:r>
+        <w:t xml:space="preserve"> </w:t>
+      </w:r>
+      <w:r>
+        <w:t>the</w:t>
+      </w:r>
+      <w:r>
+        <w:t xml:space="preserve"> panel on the right </w:t>
+      </w:r>
+      <w:r>
+        <w:t>with</w:t>
+      </w:r>
+      <w:r>
+        <w:t xml:space="preserve"> all the routines which read or write to </w:t>
+      </w:r>
+      <w:r>
+        <w:t xml:space="preserve">the selected </w:t>
+      </w:r>
+      <w:r>
+        <w:t xml:space="preserve">address, </w:t>
+      </w:r>
+      <w:r>
+        <w:t xml:space="preserve">with </w:t>
+      </w:r>
+      <w:r>
+        <w:t xml:space="preserve">their </w:t>
+      </w:r>
+      <w:r>
+        <w:t xml:space="preserve">respective </w:t>
+      </w:r>
+      <w:r>
+        <w:t>read</w:t>
+      </w:r>
+      <w:r>
+        <w:t xml:space="preserve"> </w:t>
+      </w:r>
+      <w:r>
+        <w:t>and write counts.</w:t>
+      </w:r>
+      <w:r>
+        <w:t xml:space="preserve">  Selecting a routine </w:t>
+      </w:r>
+      <w:r>
+        <w:t xml:space="preserve">from the list </w:t>
+      </w:r>
+      <w:r>
+        <w:t xml:space="preserve">selects the routine in the code </w:t>
+      </w:r>
+      <w:r>
+        <w:t>panel</w:t>
+      </w:r>
+      <w:r>
+        <w:t>,</w:t>
+      </w:r>
+      <w:r>
+        <w:t xml:space="preserve"> in which the read and write counts are </w:t>
+      </w:r>
+      <w:r>
+        <w:t xml:space="preserve">also </w:t>
+      </w:r>
+      <w:r>
+        <w:t>shown.</w:t>
+      </w:r>
+    </w:p>
+    <w:p>
+      <w:r>
         <w:lastRenderedPageBreak/>
-        <w:t xml:space="preserve">Memory </w:t>
-      </w:r>
-      <w:r>
-        <w:t>tab</w:t>
-      </w:r>
-    </w:p>
-    <w:p>
-      <w:r>
-        <w:rPr>
-          <w:noProof/>
-        </w:rPr>
         <w:drawing>
-          <wp:inline distT="0" distB="0" distL="0" distR="0" wp14:anchorId="1116DFCF" wp14:editId="57F4F251">
-            <wp:extent cx="5943600" cy="1816100"/>
-            <wp:effectExtent l="38100" t="38100" r="95250" b="88900"/>
-            <wp:docPr id="436065853" name="Picture 1"/>
+          <wp:inline distT="0" distB="0" distL="0" distR="0" wp14:anchorId="73768F33" wp14:editId="7385911F">
+            <wp:extent cx="5943600" cy="1964690"/>
+            <wp:effectExtent l="38100" t="38100" r="95250" b="92710"/>
+            <wp:docPr id="1462793872" name="Picture 1"/>
             <wp:cNvGraphicFramePr>
               <a:graphicFrameLocks xmlns:a="http://schemas.openxmlformats.org/drawingml/2006/main" noChangeAspect="1"/>
             </wp:cNvGraphicFramePr>
@@ -3775,11 +4653,11 @@
               <a:graphicData uri="http://schemas.openxmlformats.org/drawingml/2006/picture">
                 <pic:pic xmlns:pic="http://schemas.openxmlformats.org/drawingml/2006/picture">
                   <pic:nvPicPr>
-                    <pic:cNvPr id="436065853" name=""/>
+                    <pic:cNvPr id="1462793872" name=""/>
                     <pic:cNvPicPr/>
                   </pic:nvPicPr>
                   <pic:blipFill>
-                    <a:blip r:embed="rId19"/>
+                    <a:blip r:embed="rId23"/>
                     <a:stretch>
                       <a:fillRect/>
                     </a:stretch>
@@ -3787,7 +4665,7 @@
                   <pic:spPr>
                     <a:xfrm>
                       <a:off x="0" y="0"/>
-                      <a:ext cx="5943600" cy="1816100"/>
+                      <a:ext cx="5943600" cy="1964690"/>
                     </a:xfrm>
                     <a:prstGeom prst="rect">
                       <a:avLst/>
@@ -3809,115 +4687,6 @@
     </w:p>
     <w:p>
       <w:r>
-        <w:t xml:space="preserve">The memory </w:t>
-      </w:r>
-      <w:r>
-        <w:t xml:space="preserve">tab </w:t>
-      </w:r>
-      <w:r>
-        <w:t xml:space="preserve">lists the highest </w:t>
-      </w:r>
-      <w:r>
-        <w:t xml:space="preserve">to </w:t>
-      </w:r>
-      <w:r>
-        <w:t xml:space="preserve">lowest </w:t>
-      </w:r>
-      <w:r>
-        <w:t>accessed</w:t>
-      </w:r>
-      <w:r>
-        <w:t xml:space="preserve"> memory </w:t>
-      </w:r>
-      <w:r>
-        <w:t xml:space="preserve">addresses </w:t>
-      </w:r>
-      <w:r>
-        <w:t>in the application</w:t>
-      </w:r>
-      <w:r>
-        <w:t>.</w:t>
-      </w:r>
-      <w:r>
-        <w:t xml:space="preserve">  The memory ca</w:t>
-      </w:r>
-      <w:r>
-        <w:t>n optionally be filtered to just zero-page</w:t>
-      </w:r>
-      <w:r>
-        <w:t xml:space="preserve"> addresses</w:t>
-      </w:r>
-      <w:r>
-        <w:t>.</w:t>
-      </w:r>
-    </w:p>
-    <w:p>
-      <w:r>
-        <w:t xml:space="preserve">Selecting an address </w:t>
-      </w:r>
-      <w:r>
-        <w:t>populates</w:t>
-      </w:r>
-      <w:r>
-        <w:t xml:space="preserve"> </w:t>
-      </w:r>
-      <w:r>
-        <w:t>the</w:t>
-      </w:r>
-      <w:r>
-        <w:t xml:space="preserve"> panel on the right </w:t>
-      </w:r>
-      <w:r>
-        <w:t>with</w:t>
-      </w:r>
-      <w:r>
-        <w:t xml:space="preserve"> all the routines which read or write to </w:t>
-      </w:r>
-      <w:r>
-        <w:t xml:space="preserve">the selected </w:t>
-      </w:r>
-      <w:r>
-        <w:t xml:space="preserve">address, </w:t>
-      </w:r>
-      <w:r>
-        <w:t xml:space="preserve">with </w:t>
-      </w:r>
-      <w:r>
-        <w:t xml:space="preserve">their </w:t>
-      </w:r>
-      <w:r>
-        <w:t xml:space="preserve">respective </w:t>
-      </w:r>
-      <w:r>
-        <w:t>read</w:t>
-      </w:r>
-      <w:r>
-        <w:t xml:space="preserve"> </w:t>
-      </w:r>
-      <w:r>
-        <w:t>and write counts.</w:t>
-      </w:r>
-      <w:r>
-        <w:t xml:space="preserve">  Selecting a routine </w:t>
-      </w:r>
-      <w:r>
-        <w:t xml:space="preserve">from the list </w:t>
-      </w:r>
-      <w:r>
-        <w:t xml:space="preserve">selects the routine in the code </w:t>
-      </w:r>
-      <w:r>
-        <w:t>panel</w:t>
-      </w:r>
-      <w:r>
-        <w:t>,</w:t>
-      </w:r>
-      <w:r>
-        <w:t xml:space="preserve"> in which the read and write counts are shown.</w:t>
-      </w:r>
-    </w:p>
-    <w:p>
-      <w:r>
         <w:t xml:space="preserve">The </w:t>
       </w:r>
       <w:r>
@@ -3948,9 +4717,17 @@
       </w:r>
     </w:p>
     <w:p>
+      <w:r>
+        <w:t>So ideally the most frequently accessed memory addresses should be in zero-page.</w:t>
+      </w:r>
+    </w:p>
+    <w:p>
       <w:pPr>
         <w:pStyle w:val="Heading3"/>
       </w:pPr>
+      <w:r>
+        <w:t xml:space="preserve">The </w:t>
+      </w:r>
       <w:r>
         <w:t>Metrics</w:t>
       </w:r>
@@ -3982,7 +4759,7 @@
                     <pic:cNvPicPr/>
                   </pic:nvPicPr>
                   <pic:blipFill>
-                    <a:blip r:embed="rId20"/>
+                    <a:blip r:embed="rId24"/>
                     <a:stretch>
                       <a:fillRect/>
                     </a:stretch>
@@ -4022,127 +4799,204 @@
         <w:t>Metrics tab</w:t>
       </w:r>
       <w:r>
-        <w:t xml:space="preserve"> allows the creation of user definable metrics which allows one to gain insights into the specific performance of a routine or span of code.</w:t>
+        <w:t xml:space="preserve"> allows the creation of user definable metrics which allows one to gain insights into </w:t>
+      </w:r>
+      <w:r>
+        <w:t xml:space="preserve">how specific </w:t>
+      </w:r>
+      <w:r>
+        <w:t>routine</w:t>
+      </w:r>
+      <w:r>
+        <w:t xml:space="preserve">s, </w:t>
+      </w:r>
+      <w:r>
+        <w:t>or span</w:t>
+      </w:r>
+      <w:r>
+        <w:t>s</w:t>
+      </w:r>
+      <w:r>
+        <w:t xml:space="preserve"> of code</w:t>
+      </w:r>
+      <w:r>
+        <w:t xml:space="preserve">, behavior across </w:t>
+      </w:r>
+      <w:r>
+        <w:t>invocation/iteration.</w:t>
+      </w:r>
+    </w:p>
+    <w:p>
+      <w:r>
+        <w:t xml:space="preserve">For example, one could define a metric for a game’s game loop, to see how long each iteration </w:t>
+      </w:r>
+      <w:r>
+        <w:t xml:space="preserve">of the game loop </w:t>
+      </w:r>
+      <w:r>
+        <w:t xml:space="preserve">takes, and whether </w:t>
+      </w:r>
+      <w:r>
+        <w:t xml:space="preserve">any </w:t>
+      </w:r>
+      <w:r>
+        <w:t>take longer than 1/50th of a second.</w:t>
+      </w:r>
+      <w:r>
+        <w:t xml:space="preserve">  One could also define a metric for a background worker routine to see how it performs across </w:t>
+      </w:r>
+      <w:r>
+        <w:t>invocations</w:t>
+      </w:r>
+      <w:r>
+        <w:t>.</w:t>
+      </w:r>
+    </w:p>
+    <w:p>
+      <w:r>
+        <w:t xml:space="preserve">The </w:t>
+      </w:r>
+      <w:r>
+        <w:t xml:space="preserve">selected </w:t>
+      </w:r>
+      <w:r>
+        <w:t xml:space="preserve">metric’s iterations are </w:t>
+      </w:r>
+      <w:r>
+        <w:t>show</w:t>
+      </w:r>
+      <w:r>
+        <w:t>n</w:t>
+      </w:r>
+      <w:r>
+        <w:t xml:space="preserve"> in </w:t>
+      </w:r>
+      <w:r>
+        <w:t>a table</w:t>
+      </w:r>
+      <w:r>
+        <w:t xml:space="preserve">, with </w:t>
+      </w:r>
+      <w:r>
+        <w:t>duration</w:t>
+      </w:r>
+      <w:r>
+        <w:t>s that</w:t>
+      </w:r>
+      <w:r>
+        <w:t xml:space="preserve"> exceed the </w:t>
+      </w:r>
+      <w:r>
+        <w:t xml:space="preserve">metric’s </w:t>
+      </w:r>
+      <w:r>
+        <w:t>threshold highlighted.</w:t>
+      </w:r>
+      <w:r>
+        <w:t xml:space="preserve">  </w:t>
+      </w:r>
+      <w:r>
+        <w:t xml:space="preserve">The visualization column provides a </w:t>
+      </w:r>
+      <w:r>
+        <w:t>visualization of the iteration’s duration against the defined threshold.</w:t>
+      </w:r>
+      <w:r>
+        <w:t xml:space="preserve">  The Duration and Iteration columns can be sorted.</w:t>
       </w:r>
     </w:p>
     <w:p>
       <w:r>
         <w:lastRenderedPageBreak/>
-        <w:t xml:space="preserve">For example, one could define a metric for a game’s game loop, to see how long each iteration takes, and whether </w:t>
-      </w:r>
-      <w:r>
-        <w:t xml:space="preserve">any </w:t>
-      </w:r>
-      <w:r>
-        <w:t>take longer than 1/50th of a second.</w:t>
-      </w:r>
-      <w:r>
-        <w:t xml:space="preserve">  One could also define a metric for a background worker routine to see how it performs across iterations.</w:t>
-      </w:r>
-    </w:p>
-    <w:p>
-      <w:r>
-        <w:t xml:space="preserve">A metric’s iterations are </w:t>
-      </w:r>
-      <w:r>
-        <w:t>listed in a table</w:t>
-      </w:r>
-      <w:r>
-        <w:t xml:space="preserve">, with each iteration duration </w:t>
-      </w:r>
-      <w:r>
-        <w:t>shown.  Iterations who</w:t>
+        <w:t xml:space="preserve">The status bar </w:t>
+      </w:r>
+      <w:r>
+        <w:t xml:space="preserve">displays </w:t>
+      </w:r>
+      <w:r>
+        <w:t>the percentage of iterations that exceed the threshold.</w:t>
+      </w:r>
+    </w:p>
+    <w:p>
+      <w:r>
+        <w:t xml:space="preserve">The </w:t>
+      </w:r>
+      <w:r>
+        <w:rPr>
+          <w:b/>
+          <w:bCs/>
+        </w:rPr>
+        <w:t>Copy</w:t>
+      </w:r>
+      <w:r>
+        <w:t xml:space="preserve"> and </w:t>
+      </w:r>
+      <w:r>
+        <w:rPr>
+          <w:b/>
+          <w:bCs/>
+        </w:rPr>
+        <w:t>Export</w:t>
+      </w:r>
+      <w:r>
+        <w:t xml:space="preserve"> buttons copy all the data to the clipboard or export the data to a CSV file.</w:t>
+      </w:r>
+    </w:p>
+    <w:p>
+      <w:pPr>
+        <w:pStyle w:val="Heading4"/>
+      </w:pPr>
+      <w:r>
+        <w:t>Metric creation</w:t>
+      </w:r>
+    </w:p>
+    <w:p>
+      <w:r>
+        <w:t xml:space="preserve">Metrics are created by clicking on the </w:t>
+      </w:r>
+      <w:r>
+        <w:rPr>
+          <w:b/>
+          <w:bCs/>
+        </w:rPr>
+        <w:t>Add…</w:t>
+      </w:r>
+      <w:r>
+        <w:rPr>
+          <w:b/>
+          <w:bCs/>
+        </w:rPr>
+        <w:t xml:space="preserve"> </w:t>
+      </w:r>
+      <w:r>
+        <w:t>button</w:t>
+      </w:r>
+      <w:r>
+        <w:t>, naming the metric and setting its properties.  Metric</w:t>
       </w:r>
       <w:r>
         <w:t>s</w:t>
       </w:r>
       <w:r>
-        <w:t>e duration exceeds the threshold are highlighted.</w:t>
-      </w:r>
-    </w:p>
-    <w:p>
-      <w:r>
-        <w:t xml:space="preserve">The visualization column provides a </w:t>
-      </w:r>
-      <w:r>
-        <w:t>visualization of the iteration’s duration against the defined threshold.</w:t>
-      </w:r>
-    </w:p>
-    <w:p>
-      <w:r>
-        <w:t xml:space="preserve">The </w:t>
-      </w:r>
-      <w:r>
-        <w:rPr>
-          <w:b/>
-          <w:bCs/>
-        </w:rPr>
-        <w:t>Copy</w:t>
-      </w:r>
-      <w:r>
-        <w:t xml:space="preserve"> and </w:t>
-      </w:r>
-      <w:r>
-        <w:rPr>
-          <w:b/>
-          <w:bCs/>
-        </w:rPr>
-        <w:t>Export</w:t>
-      </w:r>
-      <w:r>
-        <w:t xml:space="preserve"> buttons copy all the data to the clipboard or export the data to a CSV file.</w:t>
-      </w:r>
-    </w:p>
-    <w:p>
-      <w:pPr>
-        <w:rPr>
-          <w:b/>
-          <w:bCs/>
-        </w:rPr>
-      </w:pPr>
-      <w:r>
-        <w:rPr>
-          <w:b/>
-          <w:bCs/>
-        </w:rPr>
-        <w:t>Metric creation</w:t>
-      </w:r>
-    </w:p>
-    <w:p>
-      <w:r>
-        <w:t xml:space="preserve">Metrics are created by clicking on the </w:t>
-      </w:r>
-      <w:r>
-        <w:rPr>
-          <w:b/>
-          <w:bCs/>
-        </w:rPr>
-        <w:t>Add…</w:t>
-      </w:r>
-      <w:r>
-        <w:rPr>
-          <w:b/>
-          <w:bCs/>
-        </w:rPr>
         <w:t xml:space="preserve"> </w:t>
       </w:r>
       <w:r>
-        <w:t>button</w:t>
-      </w:r>
-      <w:r>
-        <w:t>, naming the metric and setting its properties.  Metric</w:t>
+        <w:t xml:space="preserve">are </w:t>
+      </w:r>
+      <w:r>
+        <w:t xml:space="preserve">persisted across </w:t>
+      </w:r>
+      <w:r>
+        <w:t xml:space="preserve">application </w:t>
+      </w:r>
+      <w:r>
+        <w:t>session</w:t>
       </w:r>
       <w:r>
         <w:t>s</w:t>
       </w:r>
       <w:r>
-        <w:t xml:space="preserve"> </w:t>
-      </w:r>
-      <w:r>
-        <w:t xml:space="preserve">are </w:t>
-      </w:r>
-      <w:r>
-        <w:t>persisted across sessions, and the view shows the iteration</w:t>
+        <w:t>, and the view shows the iteration</w:t>
       </w:r>
       <w:r>
         <w:t>s</w:t>
@@ -4182,7 +5036,7 @@
                     <pic:cNvPicPr/>
                   </pic:nvPicPr>
                   <pic:blipFill>
-                    <a:blip r:embed="rId21"/>
+                    <a:blip r:embed="rId25"/>
                     <a:stretch>
                       <a:fillRect/>
                     </a:stretch>
@@ -4233,88 +5087,88 @@
     </w:p>
     <w:p>
       <w:r>
+        <w:t>The start address is set to just after the WaitForVSync routine returns</w:t>
+      </w:r>
+      <w:r>
+        <w:t xml:space="preserve"> (</w:t>
+      </w:r>
+      <w:r>
+        <w:t>just after v-sync has occurred</w:t>
+      </w:r>
+      <w:r>
+        <w:t>)</w:t>
+      </w:r>
+      <w:r>
+        <w:t xml:space="preserve"> and the end address is set to the end of the game loop, when all processing has completed.</w:t>
+      </w:r>
+    </w:p>
+    <w:p>
+      <w:r>
+        <w:t xml:space="preserve">The </w:t>
+      </w:r>
+      <w:r>
+        <w:t>t</w:t>
+      </w:r>
+      <w:r>
+        <w:t>hreshold is set to 1/50</w:t>
+      </w:r>
+      <w:r>
+        <w:rPr>
+          <w:vertAlign w:val="superscript"/>
+        </w:rPr>
+        <w:t>th</w:t>
+      </w:r>
+      <w:r>
+        <w:t xml:space="preserve"> of a second and the </w:t>
+      </w:r>
+      <w:r>
+        <w:rPr>
+          <w:b/>
+          <w:bCs/>
+        </w:rPr>
+        <w:t>P</w:t>
+      </w:r>
+      <w:r>
+        <w:rPr>
+          <w:b/>
+          <w:bCs/>
+        </w:rPr>
+        <w:t>erform display analysis</w:t>
+      </w:r>
+      <w:r>
+        <w:t xml:space="preserve"> checkbox is </w:t>
+      </w:r>
+      <w:r>
+        <w:t xml:space="preserve">also </w:t>
+      </w:r>
+      <w:r>
+        <w:t>checked</w:t>
+      </w:r>
+      <w:r>
+        <w:t>.</w:t>
+      </w:r>
+      <w:r>
+        <w:t xml:space="preserve">  Checking this box is useful </w:t>
+      </w:r>
+      <w:r>
+        <w:t xml:space="preserve">for identifying </w:t>
+      </w:r>
+      <w:r>
+        <w:t xml:space="preserve">potential v-sync alignment </w:t>
+      </w:r>
+      <w:r>
+        <w:t>and display tearing</w:t>
+      </w:r>
+      <w:r>
+        <w:t xml:space="preserve"> issues</w:t>
+      </w:r>
+      <w:r>
+        <w:t>.</w:t>
+      </w:r>
+    </w:p>
+    <w:p>
+      <w:r>
         <w:lastRenderedPageBreak/>
-        <w:t>The start address is set to just after the WaitForVSync routine returns</w:t>
-      </w:r>
-      <w:r>
-        <w:t xml:space="preserve"> (</w:t>
-      </w:r>
-      <w:r>
-        <w:t>just after v-sync has occurred</w:t>
-      </w:r>
-      <w:r>
-        <w:t>)</w:t>
-      </w:r>
-      <w:r>
-        <w:t xml:space="preserve"> and the end address is set to the end of the game loop, when all processing has completed.</w:t>
-      </w:r>
-    </w:p>
-    <w:p>
-      <w:r>
-        <w:t xml:space="preserve">The </w:t>
-      </w:r>
-      <w:r>
-        <w:t>t</w:t>
-      </w:r>
-      <w:r>
-        <w:t>hreshold is set to 1/50</w:t>
-      </w:r>
-      <w:r>
-        <w:rPr>
-          <w:vertAlign w:val="superscript"/>
-        </w:rPr>
-        <w:t>th</w:t>
-      </w:r>
-      <w:r>
-        <w:t xml:space="preserve"> of a second and the </w:t>
-      </w:r>
-      <w:r>
-        <w:rPr>
-          <w:b/>
-          <w:bCs/>
-        </w:rPr>
-        <w:t>P</w:t>
-      </w:r>
-      <w:r>
-        <w:rPr>
-          <w:b/>
-          <w:bCs/>
-        </w:rPr>
-        <w:t>erform display analysis</w:t>
-      </w:r>
-      <w:r>
-        <w:t xml:space="preserve"> checkbox is </w:t>
-      </w:r>
-      <w:r>
-        <w:t xml:space="preserve">also </w:t>
-      </w:r>
-      <w:r>
-        <w:t>checked</w:t>
-      </w:r>
-      <w:r>
-        <w:t>.</w:t>
-      </w:r>
-      <w:r>
-        <w:t xml:space="preserve">  Checking this box is useful </w:t>
-      </w:r>
-      <w:r>
-        <w:t xml:space="preserve">for identifying </w:t>
-      </w:r>
-      <w:r>
-        <w:t xml:space="preserve">potential v-sync alignment </w:t>
-      </w:r>
-      <w:r>
-        <w:t>and display tearing</w:t>
-      </w:r>
-      <w:r>
-        <w:t xml:space="preserve"> issues</w:t>
-      </w:r>
-      <w:r>
-        <w:t>.</w:t>
-      </w:r>
-    </w:p>
-    <w:p>
-      <w:r>
         <w:t xml:space="preserve">V-Sync alignment issues occur when </w:t>
       </w:r>
       <w:r>
@@ -4473,7 +5327,13 @@
               <w:t>N</w:t>
             </w:r>
             <w:r>
-              <w:t>umber of cycles to the beginning of the CRTC screen memory scan.  A negative number indicates that the CRTC screen memory scan occurred earlier that the start of the iteration</w:t>
+              <w:t>umber of cycles to the beginning of the CRTC screen memory scan.  A negative number indicates that the CRTC screen memory scan occurred earlier tha</w:t>
+            </w:r>
+            <w:r>
+              <w:t>n</w:t>
+            </w:r>
+            <w:r>
+              <w:t xml:space="preserve"> the start of the iteration</w:t>
             </w:r>
             <w:r>
               <w:t>.</w:t>
@@ -4560,7 +5420,6 @@
         <w:rPr>
           <w:noProof/>
         </w:rPr>
-        <w:lastRenderedPageBreak/>
         <w:drawing>
           <wp:inline distT="0" distB="0" distL="0" distR="0" wp14:anchorId="1263DA2F" wp14:editId="0428CE24">
             <wp:extent cx="5943600" cy="2440940"/>
@@ -4577,7 +5436,7 @@
                     <pic:cNvPicPr/>
                   </pic:nvPicPr>
                   <pic:blipFill>
-                    <a:blip r:embed="rId22"/>
+                    <a:blip r:embed="rId26"/>
                     <a:stretch>
                       <a:fillRect/>
                     </a:stretch>
@@ -4610,6 +5469,9 @@
         <w:pStyle w:val="Heading3"/>
       </w:pPr>
       <w:r>
+        <w:t xml:space="preserve">The </w:t>
+      </w:r>
+      <w:r>
         <w:t>Code panel</w:t>
       </w:r>
     </w:p>
@@ -4620,6 +5482,10 @@
     </w:p>
     <w:p>
       <w:r>
+        <w:rPr>
+          <w:noProof/>
+        </w:rPr>
+        <w:lastRenderedPageBreak/>
         <w:drawing>
           <wp:inline distT="0" distB="0" distL="0" distR="0" wp14:anchorId="7E94AD81" wp14:editId="355A189F">
             <wp:extent cx="5943600" cy="2090420"/>
@@ -4636,7 +5502,7 @@
                     <pic:cNvPicPr/>
                   </pic:nvPicPr>
                   <pic:blipFill>
-                    <a:blip r:embed="rId23"/>
+                    <a:blip r:embed="rId27"/>
                     <a:stretch>
                       <a:fillRect/>
                     </a:stretch>
@@ -4769,11 +5635,6 @@
           <w:color w:val="000000"/>
         </w:rPr>
         <w:t xml:space="preserve"> also displayed.</w:t>
-      </w:r>
-    </w:p>
-    <w:p>
-      <w:r>
-        <w:t xml:space="preserve">Whether a JMP or branch instruction invokes a tail call. </w:t>
       </w:r>
     </w:p>
     <w:tbl>
@@ -4803,7 +5664,7 @@
                 <w:b/>
                 <w:bCs/>
               </w:rPr>
-              <w:t>Term</w:t>
+              <w:t>Column</w:t>
             </w:r>
           </w:p>
         </w:tc>
@@ -4863,7 +5724,7 @@
               <w:t xml:space="preserve"> A </w:t>
             </w:r>
             <w:r>
-              <w:t xml:space="preserve"> tail call is a JMP or branch instruction that jumps to another routine which returns with a RTS or RTI.  For a JMP, it’s equivalent to a </w:t>
+              <w:t xml:space="preserve">tail call is a JMP or branch instruction that jumps to another routine which returns with a RTS or RTI.  For a JMP, it’s equivalent to a </w:t>
             </w:r>
             <w:r>
               <w:rPr>
@@ -4939,7 +5800,6 @@
           </w:tcPr>
           <w:p>
             <w:r>
-              <w:lastRenderedPageBreak/>
               <w:t>Total CPU</w:t>
             </w:r>
           </w:p>
@@ -5011,10 +5871,7 @@
           </w:tcPr>
           <w:p>
             <w:r>
-              <w:t>Self</w:t>
-            </w:r>
-            <w:r>
-              <w:t xml:space="preserve"> CPU</w:t>
+              <w:t>Self CPU</w:t>
             </w:r>
           </w:p>
         </w:tc>
@@ -5093,6 +5950,7 @@
     <w:p/>
     <w:p>
       <w:r>
+        <w:lastRenderedPageBreak/>
         <w:t xml:space="preserve">The </w:t>
       </w:r>
       <w:r>
@@ -5127,22 +5985,192 @@
         <w:pStyle w:val="Heading3"/>
       </w:pPr>
       <w:r>
+        <w:t xml:space="preserve">The </w:t>
+      </w:r>
+      <w:r>
         <w:t>Labels</w:t>
       </w:r>
-    </w:p>
-    <w:p>
-      <w:r>
-        <w:t>The labels</w:t>
-      </w:r>
-      <w:r>
-        <w:t xml:space="preserve"> dialog allows label</w:t>
+      <w:r>
+        <w:t xml:space="preserve"> </w:t>
+      </w:r>
+      <w:r>
+        <w:t>d</w:t>
+      </w:r>
+      <w:r>
+        <w:t>ialog</w:t>
+      </w:r>
+    </w:p>
+    <w:p>
+      <w:r>
+        <w:t>L</w:t>
+      </w:r>
+      <w:r>
+        <w:t>abel</w:t>
       </w:r>
       <w:r>
         <w:t>s</w:t>
       </w:r>
       <w:r>
-        <w:t xml:space="preserve"> to be loaded from files and enabled/disabled.  </w:t>
-      </w:r>
+        <w:t xml:space="preserve"> to be </w:t>
+      </w:r>
+      <w:r>
+        <w:t xml:space="preserve">loaded </w:t>
+      </w:r>
+      <w:r>
+        <w:t>into the application</w:t>
+      </w:r>
+      <w:r>
+        <w:t xml:space="preserve"> </w:t>
+      </w:r>
+      <w:r>
+        <w:t>using the Label dialog</w:t>
+      </w:r>
+      <w:r>
+        <w:t xml:space="preserve">.  </w:t>
+      </w:r>
+      <w:r>
+        <w:t xml:space="preserve">The labels </w:t>
+      </w:r>
+      <w:r>
+        <w:t>persist across application session</w:t>
+      </w:r>
+      <w:r>
+        <w:t>s</w:t>
+      </w:r>
+      <w:r>
+        <w:t>.</w:t>
+      </w:r>
+      <w:r>
+        <w:t xml:space="preserve">  The dialog is shown using the </w:t>
+      </w:r>
+      <w:r>
+        <w:rPr>
+          <w:b/>
+          <w:bCs/>
+        </w:rPr>
+        <w:t>Label</w:t>
+      </w:r>
+      <w:r>
+        <w:rPr>
+          <w:b/>
+          <w:bCs/>
+        </w:rPr>
+        <w:t>s</w:t>
+      </w:r>
+      <w:r>
+        <w:t xml:space="preserve"> toolbar button.</w:t>
+      </w:r>
+    </w:p>
+    <w:p>
+      <w:r>
+        <w:t xml:space="preserve">Labels can be </w:t>
+      </w:r>
+      <w:r>
+        <w:t xml:space="preserve">imported </w:t>
+      </w:r>
+      <w:r>
+        <w:t>from</w:t>
+      </w:r>
+      <w:r>
+        <w:t xml:space="preserve"> l</w:t>
+      </w:r>
+      <w:r>
+        <w:t xml:space="preserve">abel files created </w:t>
+      </w:r>
+      <w:r>
+        <w:t xml:space="preserve">using </w:t>
+      </w:r>
+      <w:r>
+        <w:rPr>
+          <w:b/>
+          <w:bCs/>
+        </w:rPr>
+        <w:t>BeebAsm.exe</w:t>
+      </w:r>
+      <w:r>
+        <w:t xml:space="preserve"> </w:t>
+      </w:r>
+      <w:r>
+        <w:rPr>
+          <w:b/>
+          <w:bCs/>
+        </w:rPr>
+        <w:t>-labels</w:t>
+      </w:r>
+      <w:r>
+        <w:t xml:space="preserve"> </w:t>
+      </w:r>
+      <w:r>
+        <w:rPr>
+          <w:b/>
+          <w:bCs/>
+        </w:rPr>
+        <w:t>&lt;file&gt;</w:t>
+      </w:r>
+      <w:r>
+        <w:t xml:space="preserve"> command-line option</w:t>
+      </w:r>
+      <w:r>
+        <w:t>, or a</w:t>
+      </w:r>
+      <w:r>
+        <w:t xml:space="preserve">ssembler listings </w:t>
+      </w:r>
+      <w:r>
+        <w:t xml:space="preserve">files </w:t>
+      </w:r>
+      <w:r>
+        <w:t xml:space="preserve">created using </w:t>
+      </w:r>
+      <w:r>
+        <w:rPr>
+          <w:b/>
+          <w:bCs/>
+        </w:rPr>
+        <w:t>BeebAsm</w:t>
+      </w:r>
+      <w:r>
+        <w:t xml:space="preserve">, </w:t>
+      </w:r>
+      <w:r>
+        <w:rPr>
+          <w:b/>
+          <w:bCs/>
+        </w:rPr>
+        <w:t>Baron</w:t>
+      </w:r>
+      <w:r>
+        <w:t xml:space="preserve">, </w:t>
+      </w:r>
+      <w:r>
+        <w:t xml:space="preserve">and </w:t>
+      </w:r>
+      <w:r>
+        <w:rPr>
+          <w:b/>
+          <w:bCs/>
+        </w:rPr>
+        <w:t>Acme</w:t>
+      </w:r>
+      <w:r>
+        <w:t>.</w:t>
+      </w:r>
+    </w:p>
+    <w:p>
+      <w:r>
+        <w:t>The labels for MOS 1.2 and MOS 2.0 are automatically loaded</w:t>
+      </w:r>
+      <w:r>
+        <w:t xml:space="preserve"> and listed</w:t>
+      </w:r>
+      <w:r>
+        <w:t>,</w:t>
+      </w:r>
+      <w:r>
+        <w:t xml:space="preserve"> if applicable.</w:t>
+      </w:r>
+    </w:p>
+    <w:p>
       <w:r>
         <w:t>L</w:t>
       </w:r>
@@ -5159,6 +6187,12 @@
         <w:t xml:space="preserve"> </w:t>
       </w:r>
       <w:r>
+        <w:t xml:space="preserve">the </w:t>
+      </w:r>
+      <w:r>
+        <w:t xml:space="preserve">open </w:t>
+      </w:r>
+      <w:r>
         <w:rPr>
           <w:b/>
           <w:bCs/>
@@ -5166,29 +6200,49 @@
         <w:t>.perf</w:t>
       </w:r>
       <w:r>
-        <w:t xml:space="preserve"> file</w:t>
-      </w:r>
-      <w:r>
-        <w:t>s</w:t>
-      </w:r>
-      <w:r>
-        <w:t xml:space="preserve"> are also listed. </w:t>
-      </w:r>
-      <w:r>
-        <w:t xml:space="preserve"> Labels for MOS 1.2 and MOS 2.0 are also automatically listed.</w:t>
-      </w:r>
-      <w:r>
-        <w:t xml:space="preserve"> Labels can be extracted from </w:t>
-      </w:r>
-      <w:r>
-        <w:rPr>
-          <w:b/>
-          <w:bCs/>
-        </w:rPr>
-        <w:t>BeebAsm.exe</w:t>
-      </w:r>
-      <w:r>
-        <w:t xml:space="preserve"> output or </w:t>
+        <w:t xml:space="preserve"> file </w:t>
+      </w:r>
+      <w:r>
+        <w:t>are also listed, if these exist.</w:t>
+      </w:r>
+      <w:r>
+        <w:t xml:space="preserve">  </w:t>
+      </w:r>
+      <w:r>
+        <w:rPr>
+          <w:b/>
+          <w:bCs/>
+        </w:rPr>
+        <w:t>.Perf</w:t>
+      </w:r>
+      <w:r>
+        <w:t xml:space="preserve"> files can be </w:t>
+      </w:r>
+      <w:r>
+        <w:t xml:space="preserve">created with </w:t>
+      </w:r>
+      <w:r>
+        <w:t xml:space="preserve">embedded labels </w:t>
+      </w:r>
+      <w:r>
+        <w:t xml:space="preserve">by </w:t>
+      </w:r>
+      <w:r>
+        <w:t xml:space="preserve">using the </w:t>
+      </w:r>
+      <w:r>
+        <w:rPr>
+          <w:b/>
+          <w:bCs/>
+        </w:rPr>
+        <w:t>BeebEm</w:t>
+      </w:r>
+      <w:r>
+        <w:rPr>
+          <w:b/>
+          <w:bCs/>
+        </w:rPr>
+        <w:t xml:space="preserve">.exe </w:t>
       </w:r>
       <w:r>
         <w:rPr>
@@ -5202,23 +6256,43 @@
           <w:b/>
           <w:bCs/>
         </w:rPr>
-        <w:t>l</w:t>
-      </w:r>
-      <w:r>
-        <w:rPr>
-          <w:b/>
-          <w:bCs/>
-        </w:rPr>
-        <w:t>abels</w:t>
-      </w:r>
-      <w:r>
-        <w:t xml:space="preserve"> option </w:t>
-      </w:r>
-      <w:r>
-        <w:t xml:space="preserve">generated </w:t>
-      </w:r>
-      <w:r>
-        <w:t>files.</w:t>
+        <w:t xml:space="preserve">DebugLabels </w:t>
+      </w:r>
+      <w:r>
+        <w:rPr>
+          <w:b/>
+          <w:bCs/>
+        </w:rPr>
+        <w:t>&lt;file&gt;</w:t>
+      </w:r>
+      <w:r>
+        <w:t xml:space="preserve"> </w:t>
+      </w:r>
+      <w:r>
+        <w:t>command</w:t>
+      </w:r>
+      <w:r>
+        <w:t>-</w:t>
+      </w:r>
+      <w:r>
+        <w:t xml:space="preserve">line </w:t>
+      </w:r>
+      <w:r>
+        <w:t>option.</w:t>
+      </w:r>
+    </w:p>
+    <w:p>
+      <w:r>
+        <w:t>L</w:t>
+      </w:r>
+      <w:r>
+        <w:t>abels can be selectively enabled / disabled</w:t>
+      </w:r>
+      <w:r>
+        <w:t xml:space="preserve">, which </w:t>
+      </w:r>
+      <w:r>
+        <w:t>is useful when working on multiple projects.</w:t>
       </w:r>
     </w:p>
     <w:p>
@@ -5226,6 +6300,9 @@
         <w:jc w:val="center"/>
       </w:pPr>
       <w:r>
+        <w:rPr>
+          <w:noProof/>
+        </w:rPr>
         <w:drawing>
           <wp:inline distT="0" distB="0" distL="0" distR="0" wp14:anchorId="3C649868" wp14:editId="07D9B999">
             <wp:extent cx="4114800" cy="1857698"/>
@@ -5242,7 +6319,7 @@
                     <pic:cNvPicPr/>
                   </pic:nvPicPr>
                   <pic:blipFill>
-                    <a:blip r:embed="rId24"/>
+                    <a:blip r:embed="rId28"/>
                     <a:stretch>
                       <a:fillRect/>
                     </a:stretch>
@@ -5275,21 +6352,51 @@
         <w:pStyle w:val="Heading3"/>
       </w:pPr>
       <w:r>
+        <w:t xml:space="preserve">The </w:t>
+      </w:r>
+      <w:r>
+        <w:t xml:space="preserve">Display </w:t>
+      </w:r>
+      <w:r>
         <w:t>Settings</w:t>
       </w:r>
+      <w:r>
+        <w:t xml:space="preserve"> dialog</w:t>
+      </w:r>
     </w:p>
     <w:p>
       <w:r>
         <w:t xml:space="preserve">The </w:t>
       </w:r>
       <w:r>
-        <w:t xml:space="preserve">settings dialog allows </w:t>
+        <w:t>Display S</w:t>
+      </w:r>
+      <w:r>
+        <w:t xml:space="preserve">ettings dialog allows </w:t>
       </w:r>
       <w:r>
         <w:t>several</w:t>
       </w:r>
       <w:r>
         <w:t xml:space="preserve"> display options to be set, including the default font scaling, theme (light or dark mode), and code formatting and color options.</w:t>
+      </w:r>
+    </w:p>
+    <w:p>
+      <w:r>
+        <w:t xml:space="preserve">The dialog is shown using the </w:t>
+      </w:r>
+      <w:r>
+        <w:rPr>
+          <w:b/>
+          <w:bCs/>
+        </w:rPr>
+        <w:t>Display Settings</w:t>
+      </w:r>
+      <w:r>
+        <w:t xml:space="preserve"> </w:t>
+      </w:r>
+      <w:r>
+        <w:t>toolbar button.</w:t>
       </w:r>
     </w:p>
     <w:p>
@@ -5317,7 +6424,7 @@
                     <pic:cNvPicPr/>
                   </pic:nvPicPr>
                   <pic:blipFill>
-                    <a:blip r:embed="rId25"/>
+                    <a:blip r:embed="rId29"/>
                     <a:stretch>
                       <a:fillRect/>
                     </a:stretch>
@@ -5350,8 +6457,14 @@
         <w:pStyle w:val="Heading3"/>
       </w:pPr>
       <w:r>
+        <w:t xml:space="preserve">The </w:t>
+      </w:r>
+      <w:r>
         <w:t>Help</w:t>
       </w:r>
+      <w:r>
+        <w:t xml:space="preserve"> window</w:t>
+      </w:r>
     </w:p>
     <w:p>
       <w:r>
@@ -5364,7 +6477,7 @@
         <w:t xml:space="preserve">elp </w:t>
       </w:r>
       <w:r>
-        <w:t xml:space="preserve">dialog </w:t>
+        <w:t xml:space="preserve">windows </w:t>
       </w:r>
       <w:r>
         <w:t>displays getting started instructions, and other information.</w:t>
@@ -12681,12 +13794,12 @@
     </w:p>
     <w:p/>
     <w:sectPr>
-      <w:headerReference w:type="even" r:id="rId26"/>
-      <w:headerReference w:type="default" r:id="rId27"/>
-      <w:footerReference w:type="even" r:id="rId28"/>
-      <w:footerReference w:type="default" r:id="rId29"/>
-      <w:headerReference w:type="first" r:id="rId30"/>
-      <w:footerReference w:type="first" r:id="rId31"/>
+      <w:headerReference w:type="even" r:id="rId30"/>
+      <w:headerReference w:type="default" r:id="rId31"/>
+      <w:footerReference w:type="even" r:id="rId32"/>
+      <w:footerReference w:type="default" r:id="rId33"/>
+      <w:headerReference w:type="first" r:id="rId34"/>
+      <w:footerReference w:type="first" r:id="rId35"/>
       <w:pgSz w:w="12240" w:h="15840"/>
       <w:pgMar w:top="1440" w:right="1440" w:bottom="1440" w:left="1440" w:header="720" w:footer="720" w:gutter="0"/>
       <w:cols w:space="720"/>
@@ -16532,6 +17645,31 @@
       <w:szCs w:val="20"/>
     </w:rPr>
   </w:style>
+  <w:style w:type="paragraph" w:customStyle="1" w:styleId="Callout">
+    <w:name w:val="Callout"/>
+    <w:basedOn w:val="Normal"/>
+    <w:link w:val="CalloutChar"/>
+    <w:qFormat/>
+    <w:rsid w:val="00B75232"/>
+    <w:pPr>
+      <w:pBdr>
+        <w:top w:val="single" w:sz="4" w:space="1" w:color="auto"/>
+        <w:left w:val="single" w:sz="4" w:space="4" w:color="auto"/>
+        <w:bottom w:val="single" w:sz="4" w:space="1" w:color="auto"/>
+        <w:right w:val="single" w:sz="4" w:space="4" w:color="auto"/>
+      </w:pBdr>
+      <w:shd w:val="clear" w:color="auto" w:fill="FFFFCC"/>
+    </w:pPr>
+  </w:style>
+  <w:style w:type="character" w:customStyle="1" w:styleId="CalloutChar">
+    <w:name w:val="Callout Char"/>
+    <w:basedOn w:val="DefaultParagraphFont"/>
+    <w:link w:val="Callout"/>
+    <w:rsid w:val="00B75232"/>
+    <w:rPr>
+      <w:shd w:val="clear" w:color="auto" w:fill="FFFFCC"/>
+    </w:rPr>
+  </w:style>
 </w:styles>
 </file>
 

</xml_diff>

<commit_message>
Pulled out the DisplayFrame and MetricIteration classes
</commit_message>
<xml_diff>
--- a/docs/BeebPerf.docx
+++ b/docs/BeebPerf.docx
@@ -1950,9 +1950,6 @@
       <w:r>
         <w:t>.</w:t>
       </w:r>
-      <w:r>
-        <w:t xml:space="preserve"> </w:t>
-      </w:r>
     </w:p>
     <w:p>
       <w:pPr>
@@ -2103,6 +2100,9 @@
     </w:p>
     <w:p>
       <w:r>
+        <w:rPr>
+          <w:noProof/>
+        </w:rPr>
         <w:drawing>
           <wp:inline distT="0" distB="0" distL="0" distR="0" wp14:anchorId="40496D9E" wp14:editId="347DEAE6">
             <wp:extent cx="5943600" cy="4648835"/>
@@ -2152,10 +2152,7 @@
         <w:pStyle w:val="Heading3"/>
       </w:pPr>
       <w:r>
-        <w:t xml:space="preserve">The </w:t>
-      </w:r>
-      <w:r>
-        <w:t xml:space="preserve">Caption and </w:t>
+        <w:t xml:space="preserve">The Caption and </w:t>
       </w:r>
       <w:r>
         <w:t>T</w:t>
@@ -2166,6 +2163,9 @@
     </w:p>
     <w:p>
       <w:r>
+        <w:rPr>
+          <w:noProof/>
+        </w:rPr>
         <w:drawing>
           <wp:inline distT="0" distB="0" distL="0" distR="0" wp14:anchorId="68C496A0" wp14:editId="626CFA63">
             <wp:extent cx="5943600" cy="292100"/>
@@ -2341,22 +2341,7 @@
         <w:t>Hot Routines</w:t>
       </w:r>
       <w:r>
-        <w:t xml:space="preserve"> – Selects the </w:t>
-      </w:r>
-      <w:r>
-        <w:t xml:space="preserve">Routines </w:t>
-      </w:r>
-      <w:r>
-        <w:t xml:space="preserve">tab, showing the hot </w:t>
-      </w:r>
-      <w:r>
-        <w:t>routines</w:t>
-      </w:r>
-      <w:r>
-        <w:t xml:space="preserve"> in the current selected time range.  The hot </w:t>
-      </w:r>
-      <w:r>
-        <w:t xml:space="preserve">routines </w:t>
+        <w:t xml:space="preserve"> – Selects the Routines tab, showing the hot routines in the current selected time range.  The hot routines </w:t>
       </w:r>
       <w:r>
         <w:t xml:space="preserve">are </w:t>
@@ -2505,13 +2490,7 @@
         <w:t>rames</w:t>
       </w:r>
       <w:r>
-        <w:t xml:space="preserve"> – </w:t>
-      </w:r>
-      <w:r>
-        <w:t>Zooms</w:t>
-      </w:r>
-      <w:r>
-        <w:t xml:space="preserve"> the timeline to layout the display frames sequentially across the window.</w:t>
+        <w:t xml:space="preserve"> – Zooms the timeline to layout the display frames sequentially across the window.</w:t>
       </w:r>
     </w:p>
     <w:p>
@@ -2659,6 +2638,9 @@
     </w:p>
     <w:p>
       <w:r>
+        <w:rPr>
+          <w:noProof/>
+        </w:rPr>
         <w:drawing>
           <wp:inline distT="0" distB="0" distL="0" distR="0" wp14:anchorId="478A9E05" wp14:editId="13A734B0">
             <wp:extent cx="5943600" cy="1010285"/>
@@ -2816,6 +2798,9 @@
         <w:jc w:val="center"/>
       </w:pPr>
       <w:r>
+        <w:rPr>
+          <w:noProof/>
+        </w:rPr>
         <w:lastRenderedPageBreak/>
         <w:drawing>
           <wp:inline distT="0" distB="0" distL="0" distR="0" wp14:anchorId="1F737DD4" wp14:editId="68CBC4A5">
@@ -3042,22 +3027,13 @@
     </w:p>
     <w:p>
       <w:r>
-        <w:t>If the timeline is zoomed in far, arrows appear to the left and right of the display</w:t>
-      </w:r>
-      <w:r>
-        <w:t>-frames.</w:t>
+        <w:t>If the timeline is zoomed in far, arrows appear to the left and right of the display-frames.</w:t>
       </w:r>
       <w:r>
         <w:t xml:space="preserve"> </w:t>
       </w:r>
       <w:r>
-        <w:t xml:space="preserve"> These indicate the start and end </w:t>
-      </w:r>
-      <w:r>
-        <w:t xml:space="preserve">times </w:t>
-      </w:r>
-      <w:r>
-        <w:t xml:space="preserve">of when the image was displayed on </w:t>
+        <w:t xml:space="preserve"> These indicate the start and end times of when the image was displayed on </w:t>
       </w:r>
       <w:r>
         <w:t>the screen</w:t>
@@ -3083,6 +3059,9 @@
     </w:p>
     <w:p>
       <w:r>
+        <w:rPr>
+          <w:noProof/>
+        </w:rPr>
         <w:drawing>
           <wp:inline distT="0" distB="0" distL="0" distR="0" wp14:anchorId="3D0753D5" wp14:editId="03E81A07">
             <wp:extent cx="5943600" cy="1016000"/>
@@ -3216,6 +3195,9 @@
     </w:p>
     <w:p>
       <w:r>
+        <w:rPr>
+          <w:noProof/>
+        </w:rPr>
         <w:drawing>
           <wp:inline distT="0" distB="0" distL="0" distR="0" wp14:anchorId="05A43878" wp14:editId="381F1610">
             <wp:extent cx="5943600" cy="1478280"/>
@@ -4295,10 +4277,7 @@
         <w:t xml:space="preserve">otal CPU, </w:t>
       </w:r>
       <w:r>
-        <w:t>Interrupt CPU</w:t>
-      </w:r>
-      <w:r>
-        <w:t>, E</w:t>
+        <w:t>Interrupt CPU, E</w:t>
       </w:r>
       <w:r>
         <w:t xml:space="preserve">lapsed CPU, and </w:t>
@@ -4640,6 +4619,9 @@
     </w:p>
     <w:p>
       <w:r>
+        <w:rPr>
+          <w:noProof/>
+        </w:rPr>
         <w:lastRenderedPageBreak/>
         <w:drawing>
           <wp:inline distT="0" distB="0" distL="0" distR="0" wp14:anchorId="73768F33" wp14:editId="7385911F">
@@ -4823,7 +4805,13 @@
         <w:t xml:space="preserve">, behavior across </w:t>
       </w:r>
       <w:r>
-        <w:t>invocation/iteration.</w:t>
+        <w:t>iteration</w:t>
+      </w:r>
+      <w:r>
+        <w:t>s</w:t>
+      </w:r>
+      <w:r>
+        <w:t>.</w:t>
       </w:r>
     </w:p>
     <w:p>
@@ -4863,13 +4851,7 @@
         <w:t xml:space="preserve">metric’s iterations are </w:t>
       </w:r>
       <w:r>
-        <w:t>show</w:t>
-      </w:r>
-      <w:r>
-        <w:t>n</w:t>
-      </w:r>
-      <w:r>
-        <w:t xml:space="preserve"> in </w:t>
+        <w:t xml:space="preserve">in </w:t>
       </w:r>
       <w:r>
         <w:t>a table</w:t>
@@ -4899,7 +4881,13 @@
         <w:t xml:space="preserve">The visualization column provides a </w:t>
       </w:r>
       <w:r>
-        <w:t>visualization of the iteration’s duration against the defined threshold.</w:t>
+        <w:t>visualization of iteration duration</w:t>
+      </w:r>
+      <w:r>
+        <w:t>s</w:t>
+      </w:r>
+      <w:r>
+        <w:t xml:space="preserve"> against the defined threshold.</w:t>
       </w:r>
       <w:r>
         <w:t xml:space="preserve">  The Duration and Iteration columns can be sorted.</w:t>
@@ -5465,10 +5453,31 @@
       </w:r>
     </w:p>
     <w:p>
+      <w:r>
+        <w:t xml:space="preserve">The status bar </w:t>
+      </w:r>
+      <w:r>
+        <w:t xml:space="preserve">also shows </w:t>
+      </w:r>
+      <w:r>
+        <w:t xml:space="preserve">the </w:t>
+      </w:r>
+      <w:r>
+        <w:t>percentage of iterations that contain mistimes writes</w:t>
+      </w:r>
+      <w:r>
+        <w:t>,</w:t>
+      </w:r>
+      <w:r>
+        <w:t xml:space="preserve"> and the percentage of mistimed writes overall.</w:t>
+      </w:r>
+    </w:p>
+    <w:p>
       <w:pPr>
         <w:pStyle w:val="Heading3"/>
       </w:pPr>
       <w:r>
+        <w:lastRenderedPageBreak/>
         <w:t xml:space="preserve">The </w:t>
       </w:r>
       <w:r>
@@ -5485,7 +5494,6 @@
         <w:rPr>
           <w:noProof/>
         </w:rPr>
-        <w:lastRenderedPageBreak/>
         <w:drawing>
           <wp:inline distT="0" distB="0" distL="0" distR="0" wp14:anchorId="7E94AD81" wp14:editId="355A189F">
             <wp:extent cx="5943600" cy="2090420"/>
@@ -5925,6 +5933,7 @@
           </w:tcPr>
           <w:p>
             <w:r>
+              <w:lastRenderedPageBreak/>
               <w:t>Execution count</w:t>
             </w:r>
           </w:p>
@@ -5950,7 +5959,6 @@
     <w:p/>
     <w:p>
       <w:r>
-        <w:lastRenderedPageBreak/>
         <w:t xml:space="preserve">The </w:t>
       </w:r>
       <w:r>
@@ -6393,10 +6401,7 @@
         <w:t>Display Settings</w:t>
       </w:r>
       <w:r>
-        <w:t xml:space="preserve"> </w:t>
-      </w:r>
-      <w:r>
-        <w:t>toolbar button.</w:t>
+        <w:t xml:space="preserve"> toolbar button.</w:t>
       </w:r>
     </w:p>
     <w:p>
@@ -6480,7 +6485,16 @@
         <w:t xml:space="preserve">windows </w:t>
       </w:r>
       <w:r>
-        <w:t>displays getting started instructions, and other information.</w:t>
+        <w:t>display</w:t>
+      </w:r>
+      <w:r>
+        <w:t>s</w:t>
+      </w:r>
+      <w:r>
+        <w:t xml:space="preserve"> </w:t>
+      </w:r>
+      <w:r>
+        <w:t>useful information.</w:t>
       </w:r>
     </w:p>
     <w:p>
@@ -7133,7 +7147,7 @@
         <w:t xml:space="preserve"> file loading and analysis, leveraging CPU, memory, and </w:t>
       </w:r>
       <w:r>
-        <w:t xml:space="preserve">frame </w:t>
+        <w:t xml:space="preserve">video </w:t>
       </w:r>
       <w:r>
         <w:t>analysis components (owned by the form)</w:t>
@@ -7233,7 +7247,19 @@
         <w:t>s</w:t>
       </w:r>
       <w:r>
-        <w:t xml:space="preserve"> setting changes (changes to fonts, scaling, theme</w:t>
+        <w:t xml:space="preserve"> </w:t>
+      </w:r>
+      <w:r>
+        <w:t xml:space="preserve">display </w:t>
+      </w:r>
+      <w:r>
+        <w:t>setting</w:t>
+      </w:r>
+      <w:r>
+        <w:t>s</w:t>
+      </w:r>
+      <w:r>
+        <w:t xml:space="preserve"> changes (changes to fonts, scaling, theme</w:t>
       </w:r>
       <w:r>
         <w:t xml:space="preserve"> etc.</w:t>
@@ -7585,7 +7611,13 @@
         </w:numPr>
       </w:pPr>
       <w:r>
-        <w:t>Register values</w:t>
+        <w:t xml:space="preserve">CPU </w:t>
+      </w:r>
+      <w:r>
+        <w:t>R</w:t>
+      </w:r>
+      <w:r>
+        <w:t>egister values</w:t>
       </w:r>
     </w:p>
     <w:p>
@@ -8197,55 +8229,52 @@
         <w:t xml:space="preserve"> file is loaded</w:t>
       </w:r>
       <w:r>
+        <w:t xml:space="preserve">, by the </w:t>
+      </w:r>
+      <w:r>
+        <w:rPr>
+          <w:b/>
+          <w:bCs/>
+        </w:rPr>
+        <w:t>CPU</w:t>
+      </w:r>
+      <w:r>
+        <w:rPr>
+          <w:b/>
+          <w:bCs/>
+        </w:rPr>
+        <w:t>A</w:t>
+      </w:r>
+      <w:r>
+        <w:rPr>
+          <w:b/>
+          <w:bCs/>
+        </w:rPr>
+        <w:t>nalysi</w:t>
+      </w:r>
+      <w:r>
+        <w:rPr>
+          <w:b/>
+          <w:bCs/>
+        </w:rPr>
+        <w:t>s</w:t>
+      </w:r>
+      <w:r>
+        <w:t xml:space="preserve"> class </w:t>
+      </w:r>
+      <w:r>
+        <w:t>asynchronously</w:t>
+      </w:r>
+      <w:r>
         <w:t>.</w:t>
       </w:r>
-    </w:p>
-    <w:p>
-      <w:r>
-        <w:t xml:space="preserve">The form class asynchronously </w:t>
-      </w:r>
-      <w:r>
-        <w:t xml:space="preserve">invokes </w:t>
-      </w:r>
-      <w:r>
-        <w:t xml:space="preserve">static </w:t>
-      </w:r>
-      <w:r>
-        <w:t xml:space="preserve">CPU and </w:t>
-      </w:r>
-      <w:r>
-        <w:t>frame</w:t>
-      </w:r>
-      <w:r>
-        <w:t xml:space="preserve"> analysis in parallel</w:t>
-      </w:r>
-      <w:r>
-        <w:t xml:space="preserve">, </w:t>
-      </w:r>
-      <w:r>
-        <w:t>unless frame analysis is dependent on CPU analysis</w:t>
-      </w:r>
       <w:r>
         <w:t xml:space="preserve"> </w:t>
       </w:r>
-      <w:r>
-        <w:t xml:space="preserve">results, </w:t>
-      </w:r>
-      <w:r>
-        <w:t>in which case it is scheduled afterwards.</w:t>
-      </w:r>
-    </w:p>
-    <w:p>
-      <w:pPr>
-        <w:pStyle w:val="Heading3"/>
-      </w:pPr>
-      <w:r>
-        <w:t>Static CPU analysis</w:t>
-      </w:r>
-    </w:p>
-    <w:p>
-      <w:r>
-        <w:t>The goal of static CPU analysis is:</w:t>
+    </w:p>
+    <w:p>
+      <w:r>
+        <w:t>The goal of static analysis is:</w:t>
       </w:r>
     </w:p>
     <w:p>
@@ -8544,7 +8573,6 @@
         </w:numPr>
       </w:pPr>
       <w:r>
-        <w:lastRenderedPageBreak/>
         <w:t>First and last instruction indices</w:t>
       </w:r>
     </w:p>
@@ -8617,6 +8645,7 @@
           <w:b/>
           <w:bCs/>
         </w:rPr>
+        <w:lastRenderedPageBreak/>
         <w:t>CallStack</w:t>
       </w:r>
       <w:r>
@@ -8777,7 +8806,10 @@
         </w:numPr>
       </w:pPr>
       <w:r>
-        <w:t xml:space="preserve">Identify all routines in the program.  This is tricky as one must deal with interrupt code, tail call optimizations, indirect call optimizations, and call chaining. </w:t>
+        <w:t>Identify all routines in the program.  This is tricky as one must deal with interrupt code, tail call optimizations, indirect call optimizations, call chaining</w:t>
+      </w:r>
+      <w:r>
+        <w:t>, and stack manipulations.</w:t>
       </w:r>
     </w:p>
     <w:p>
@@ -8926,24 +8958,27 @@
         <w:t xml:space="preserve">A stack-frame tree is created by </w:t>
       </w:r>
       <w:r>
-        <w:t xml:space="preserve">first constructing an initial stack-tree from the snapshot call stack, before </w:t>
-      </w:r>
-      <w:r>
-        <w:t xml:space="preserve">iterating over all the recorded instructions, creating </w:t>
-      </w:r>
+        <w:t>first constructing an initial stack</w:t>
+      </w:r>
+      <w:r>
+        <w:t xml:space="preserve">-frame </w:t>
+      </w:r>
+      <w:r>
+        <w:t xml:space="preserve">tree from the snapshot call stack, before </w:t>
+      </w:r>
+      <w:r>
+        <w:t>iterating over all the recorded instructions, creating nested stack-frames as code traverses over the routines and interrupts in the program.</w:t>
+      </w:r>
+      <w:r>
+        <w:t xml:space="preserve">  Tail-call and fall-through stack frames are also created as part of this process.</w:t>
+      </w:r>
+    </w:p>
+    <w:p>
+      <w:pPr>
+        <w:ind w:left="720"/>
+      </w:pPr>
       <w:r>
         <w:lastRenderedPageBreak/>
-        <w:t>nested stack-frames as code traverses over the routines and interrupts in the program.</w:t>
-      </w:r>
-      <w:r>
-        <w:t xml:space="preserve">  Tail-call and fall-through stack frames are also created as part of this process.</w:t>
-      </w:r>
-    </w:p>
-    <w:p>
-      <w:pPr>
-        <w:ind w:left="720"/>
-      </w:pPr>
-      <w:r>
         <w:t xml:space="preserve">Note that the BeebEm changes include code to maintain the call-stack, </w:t>
       </w:r>
       <w:r>
@@ -9143,10 +9178,202 @@
     </w:p>
     <w:p>
       <w:pPr>
+        <w:pStyle w:val="Heading2"/>
+      </w:pPr>
+      <w:r>
+        <w:t>Dynamic analysis</w:t>
+      </w:r>
+    </w:p>
+    <w:p>
+      <w:r>
+        <w:t xml:space="preserve">Dynamic analysis is performed after static </w:t>
+      </w:r>
+      <w:r>
+        <w:t xml:space="preserve">CPU </w:t>
+      </w:r>
+      <w:r>
+        <w:t>analysis</w:t>
+      </w:r>
+      <w:r>
+        <w:t xml:space="preserve"> </w:t>
+      </w:r>
+      <w:r>
+        <w:t>is completed</w:t>
+      </w:r>
+      <w:r>
+        <w:t>, and whenever the analysis time</w:t>
+      </w:r>
+      <w:r>
+        <w:t xml:space="preserve"> range</w:t>
+      </w:r>
+      <w:r>
+        <w:t xml:space="preserve"> is changed by the user.  </w:t>
+      </w:r>
+    </w:p>
+    <w:p>
+      <w:r>
+        <w:t xml:space="preserve">The form class asynchronously </w:t>
+      </w:r>
+      <w:r>
+        <w:t xml:space="preserve">invokes </w:t>
+      </w:r>
+      <w:r>
+        <w:t>dynamic CPU and memory analysis in parallel.</w:t>
+      </w:r>
+    </w:p>
+    <w:p>
+      <w:pPr>
         <w:pStyle w:val="Heading3"/>
       </w:pPr>
       <w:r>
-        <w:t>Frame analysis</w:t>
+        <w:t>Dynamic CPU analysis</w:t>
+      </w:r>
+    </w:p>
+    <w:p>
+      <w:pPr>
+        <w:pStyle w:val="ListParagraph"/>
+        <w:numPr>
+          <w:ilvl w:val="0"/>
+          <w:numId w:val="6"/>
+        </w:numPr>
+      </w:pPr>
+      <w:r>
+        <w:t>Calculate the CPU metrics for every routine, for a specific timespan</w:t>
+      </w:r>
+    </w:p>
+    <w:p>
+      <w:pPr>
+        <w:pStyle w:val="ListParagraph"/>
+        <w:numPr>
+          <w:ilvl w:val="0"/>
+          <w:numId w:val="6"/>
+        </w:numPr>
+      </w:pPr>
+      <w:r>
+        <w:t>Use the CPU metrics to generate the hot routine list - routines with the highest self-CPU values.</w:t>
+      </w:r>
+    </w:p>
+    <w:p>
+      <w:pPr>
+        <w:pStyle w:val="ListParagraph"/>
+        <w:numPr>
+          <w:ilvl w:val="0"/>
+          <w:numId w:val="6"/>
+        </w:numPr>
+      </w:pPr>
+      <w:r>
+        <w:t xml:space="preserve">Use the CPU metrics to generate a call tree, </w:t>
+      </w:r>
+      <w:r>
+        <w:t>w</w:t>
+      </w:r>
+      <w:r>
+        <w:t>h</w:t>
+      </w:r>
+      <w:r>
+        <w:t>ere child nodes are ordered by their</w:t>
+      </w:r>
+      <w:r>
+        <w:rPr>
+          <w:b/>
+          <w:bCs/>
+        </w:rPr>
+        <w:t xml:space="preserve"> </w:t>
+      </w:r>
+      <w:r>
+        <w:t>inclusive-CPU metrics.</w:t>
+      </w:r>
+    </w:p>
+    <w:p>
+      <w:pPr>
+        <w:pStyle w:val="Heading3"/>
+      </w:pPr>
+      <w:r>
+        <w:t>Dynamic Memory analysis</w:t>
+      </w:r>
+    </w:p>
+    <w:p>
+      <w:pPr>
+        <w:pStyle w:val="ListParagraph"/>
+        <w:numPr>
+          <w:ilvl w:val="0"/>
+          <w:numId w:val="6"/>
+        </w:numPr>
+      </w:pPr>
+      <w:r>
+        <w:t>Calculate the memory usage metrics, for a specific timespan.  Iterate</w:t>
+      </w:r>
+      <w:r>
+        <w:t>s</w:t>
+      </w:r>
+      <w:r>
+        <w:t xml:space="preserve"> over all instructions within the timespan populating a dictionary mapping memory address </w:t>
+      </w:r>
+      <w:r>
+        <w:sym w:font="Wingdings" w:char="F0E0"/>
+      </w:r>
+      <w:r>
+        <w:t xml:space="preserve"> read/write counts.</w:t>
+      </w:r>
+    </w:p>
+    <w:p>
+      <w:pPr>
+        <w:pStyle w:val="ListParagraph"/>
+        <w:numPr>
+          <w:ilvl w:val="0"/>
+          <w:numId w:val="6"/>
+        </w:numPr>
+      </w:pPr>
+      <w:r>
+        <w:t>Use the memory access map to identify the highest and lowest memory usage lists.</w:t>
+      </w:r>
+      <w:r>
+        <w:br w:type="page"/>
+      </w:r>
+    </w:p>
+    <w:p>
+      <w:pPr>
+        <w:pStyle w:val="Heading2"/>
+      </w:pPr>
+      <w:r>
+        <w:lastRenderedPageBreak/>
+        <w:t>Video analysis</w:t>
+      </w:r>
+    </w:p>
+    <w:p>
+      <w:r>
+        <w:t xml:space="preserve">Video </w:t>
+      </w:r>
+      <w:r>
+        <w:t>analysis is performed afte</w:t>
+      </w:r>
+      <w:r>
+        <w:t xml:space="preserve">r a </w:t>
+      </w:r>
+      <w:r>
+        <w:rPr>
+          <w:b/>
+          <w:bCs/>
+        </w:rPr>
+        <w:t xml:space="preserve">.perf </w:t>
+      </w:r>
+      <w:r>
+        <w:t>is loaded, either in parallel to, or after</w:t>
+      </w:r>
+      <w:r>
+        <w:t>,</w:t>
+      </w:r>
+      <w:r>
+        <w:t xml:space="preserve"> static analysis</w:t>
+      </w:r>
+      <w:r>
+        <w:t xml:space="preserve">.  </w:t>
+      </w:r>
+      <w:r>
+        <w:t xml:space="preserve">It is also </w:t>
+      </w:r>
+      <w:r>
+        <w:t>performed if the current Metric changes.</w:t>
       </w:r>
     </w:p>
     <w:p>
@@ -9156,37 +9383,7 @@
         <w:contextualSpacing w:val="0"/>
       </w:pPr>
       <w:r>
-        <w:t>The goal of frame analysis is to produce two frame lists.  The display</w:t>
-      </w:r>
-      <w:r>
-        <w:t>-</w:t>
-      </w:r>
-      <w:r>
-        <w:t xml:space="preserve">frame list, and the </w:t>
-      </w:r>
-      <w:r>
-        <w:t>programmatic</w:t>
-      </w:r>
-      <w:r>
-        <w:t>-</w:t>
-      </w:r>
-      <w:r>
-        <w:t xml:space="preserve">frame list (e.g. </w:t>
-      </w:r>
-      <w:r>
-        <w:t xml:space="preserve">the </w:t>
-      </w:r>
-      <w:r>
-        <w:t>game-loop</w:t>
-      </w:r>
-      <w:r>
-        <w:t xml:space="preserve"> frame list</w:t>
-      </w:r>
-      <w:r>
-        <w:t>)</w:t>
-      </w:r>
-      <w:r>
-        <w:t>.</w:t>
+        <w:t>The primary goal of video analysis is to reconstruct the display frames which were shown on the CRT screen.  These are displayed under the timeline.</w:t>
       </w:r>
     </w:p>
     <w:p>
@@ -9196,43 +9393,15 @@
         <w:contextualSpacing w:val="0"/>
       </w:pPr>
       <w:r>
-        <w:t xml:space="preserve">The </w:t>
-      </w:r>
-      <w:r>
-        <w:t>display-frame</w:t>
-      </w:r>
-      <w:r>
-        <w:t xml:space="preserve"> list contains</w:t>
-      </w:r>
-      <w:r>
-        <w:t xml:space="preserve"> all the </w:t>
-      </w:r>
-      <w:r>
-        <w:t>display-frame</w:t>
-      </w:r>
-      <w:r>
-        <w:t xml:space="preserve"> snapshots</w:t>
-      </w:r>
-      <w:r>
-        <w:t>.  The frames that were displayed on the CRT display.  The</w:t>
-      </w:r>
-      <w:r>
-        <w:t>s</w:t>
-      </w:r>
-      <w:r>
-        <w:t>e</w:t>
-      </w:r>
-      <w:r>
-        <w:t xml:space="preserve"> </w:t>
-      </w:r>
-      <w:r>
-        <w:t>frame</w:t>
-      </w:r>
-      <w:r>
-        <w:t xml:space="preserve"> snapshots</w:t>
-      </w:r>
-      <w:r>
-        <w:t xml:space="preserve"> are displayed under the timeline.</w:t>
+        <w:t>As part of this process, the current selected Metric is also evaluated, with a list of Metric Iterations produced.  These are listed in the Metrics tab.</w:t>
+      </w:r>
+    </w:p>
+    <w:p>
+      <w:pPr>
+        <w:pStyle w:val="Heading3"/>
+      </w:pPr>
+      <w:r>
+        <w:t>Display-frame generation</w:t>
       </w:r>
     </w:p>
     <w:p>
@@ -9242,63 +9411,298 @@
         <w:contextualSpacing w:val="0"/>
       </w:pPr>
       <w:r>
-        <w:t xml:space="preserve">The </w:t>
-      </w:r>
-      <w:r>
-        <w:t>programmatic</w:t>
-      </w:r>
-      <w:r>
-        <w:t xml:space="preserve"> frame list contains all the </w:t>
-      </w:r>
-      <w:r>
-        <w:t xml:space="preserve">programmatic </w:t>
-      </w:r>
-      <w:r>
-        <w:t>frames, capturing their durations, how they align with display</w:t>
-      </w:r>
-      <w:r>
-        <w:t>-</w:t>
-      </w:r>
-      <w:r>
-        <w:t xml:space="preserve">frames, and how many screen memory writes occur before and after the </w:t>
-      </w:r>
-      <w:r>
-        <w:t xml:space="preserve">display </w:t>
-      </w:r>
-      <w:r>
-        <w:t xml:space="preserve">screen memory </w:t>
-      </w:r>
-      <w:r>
-        <w:t xml:space="preserve">scan </w:t>
-      </w:r>
-      <w:r>
-        <w:t>read.  These frames are displayed in the Frame</w:t>
-      </w:r>
-      <w:r>
-        <w:t>s</w:t>
-      </w:r>
-      <w:r>
-        <w:t xml:space="preserve"> tab.</w:t>
-      </w:r>
-      <w:r>
-        <w:t xml:space="preserve">  What constitutes a </w:t>
-      </w:r>
-      <w:r>
-        <w:t xml:space="preserve">programmatic frame </w:t>
-      </w:r>
-      <w:r>
-        <w:t>is defined using the Frames settings dialog.</w:t>
-      </w:r>
-      <w:r>
-        <w:t xml:space="preserve">  These settings are typically set to match the game-loop.</w:t>
-      </w:r>
-    </w:p>
-    <w:p>
-      <w:pPr>
-        <w:pStyle w:val="Heading4"/>
-      </w:pPr>
-      <w:r>
-        <w:t>Display-frame generation</w:t>
+        <w:t xml:space="preserve">Display frames are generated by emulating the BBC’s video hardware: The </w:t>
+      </w:r>
+      <w:r>
+        <w:rPr>
+          <w:b/>
+          <w:bCs/>
+        </w:rPr>
+        <w:t>CRTC</w:t>
+      </w:r>
+      <w:r>
+        <w:t xml:space="preserve"> (MC6845) chip, the </w:t>
+      </w:r>
+      <w:r>
+        <w:rPr>
+          <w:b/>
+          <w:bCs/>
+        </w:rPr>
+        <w:t>Teletext</w:t>
+      </w:r>
+      <w:r>
+        <w:t xml:space="preserve"> (SAA5050)</w:t>
+      </w:r>
+      <w:r>
+        <w:rPr>
+          <w:b/>
+          <w:bCs/>
+        </w:rPr>
+        <w:t xml:space="preserve"> </w:t>
+      </w:r>
+      <w:r>
+        <w:t xml:space="preserve">chip, and the </w:t>
+      </w:r>
+      <w:r>
+        <w:rPr>
+          <w:b/>
+          <w:bCs/>
+        </w:rPr>
+        <w:t>Video</w:t>
+      </w:r>
+      <w:r>
+        <w:t xml:space="preserve"> </w:t>
+      </w:r>
+      <w:r>
+        <w:rPr>
+          <w:b/>
+          <w:bCs/>
+        </w:rPr>
+        <w:t>ULA</w:t>
+      </w:r>
+      <w:r>
+        <w:t xml:space="preserve"> chip.</w:t>
+      </w:r>
+      <w:r>
+        <w:t xml:space="preserve">  A display frame is represented by the following type:</w:t>
+      </w:r>
+    </w:p>
+    <w:p>
+      <w:r>
+        <w:rPr>
+          <w:b/>
+          <w:bCs/>
+        </w:rPr>
+        <w:t>DisplayFrame</w:t>
+      </w:r>
+      <w:r>
+        <w:t xml:space="preserve"> – represents a </w:t>
+      </w:r>
+      <w:r>
+        <w:t>display frame</w:t>
+      </w:r>
+      <w:r>
+        <w:t>.  Contains the following fields:</w:t>
+      </w:r>
+    </w:p>
+    <w:p>
+      <w:pPr>
+        <w:pStyle w:val="ListParagraph"/>
+        <w:numPr>
+          <w:ilvl w:val="0"/>
+          <w:numId w:val="2"/>
+        </w:numPr>
+      </w:pPr>
+      <w:r>
+        <w:t>Frame number</w:t>
+      </w:r>
+    </w:p>
+    <w:p>
+      <w:pPr>
+        <w:pStyle w:val="ListParagraph"/>
+        <w:numPr>
+          <w:ilvl w:val="0"/>
+          <w:numId w:val="2"/>
+        </w:numPr>
+      </w:pPr>
+      <w:r>
+        <w:t>Start &amp; end cycle counts</w:t>
+      </w:r>
+    </w:p>
+    <w:p>
+      <w:pPr>
+        <w:pStyle w:val="ListParagraph"/>
+        <w:numPr>
+          <w:ilvl w:val="0"/>
+          <w:numId w:val="2"/>
+        </w:numPr>
+      </w:pPr>
+      <w:r>
+        <w:t>Bitmap</w:t>
+      </w:r>
+    </w:p>
+    <w:p>
+      <w:pPr>
+        <w:pStyle w:val="ListParagraph"/>
+        <w:numPr>
+          <w:ilvl w:val="0"/>
+          <w:numId w:val="2"/>
+        </w:numPr>
+      </w:pPr>
+      <w:r>
+        <w:t>Aspect ratio</w:t>
+      </w:r>
+    </w:p>
+    <w:p>
+      <w:pPr>
+        <w:pStyle w:val="ListParagraph"/>
+        <w:ind w:left="0"/>
+      </w:pPr>
+    </w:p>
+    <w:p>
+      <w:pPr>
+        <w:pStyle w:val="ListParagraph"/>
+        <w:ind w:left="0"/>
+      </w:pPr>
+      <w:r>
+        <w:t>The emulation uses frame start events in the execution log to synchronize generated display-frames.  These events are emitted when a frame’s first scanline is displayed, when DE (Display Enable) is first enabled.</w:t>
+      </w:r>
+    </w:p>
+    <w:p>
+      <w:r>
+        <w:t xml:space="preserve">Different emulator implementations handle screen mode changes slightly differently, causing timing variations that </w:t>
+      </w:r>
+      <w:r>
+        <w:rPr>
+          <w:b/>
+          <w:bCs/>
+        </w:rPr>
+        <w:t>BeebPerf</w:t>
+      </w:r>
+      <w:r>
+        <w:t xml:space="preserve"> cannot reconcile without this event.</w:t>
+      </w:r>
+    </w:p>
+    <w:p>
+      <w:pPr>
+        <w:rPr>
+          <w:rFonts w:ascii="Aptos" w:hAnsi="Aptos"/>
+          <w:color w:val="000000"/>
+        </w:rPr>
+      </w:pPr>
+      <w:r>
+        <w:t xml:space="preserve">The code is </w:t>
+      </w:r>
+      <w:r>
+        <w:t xml:space="preserve">largely </w:t>
+      </w:r>
+      <w:r>
+        <w:t>based on BeebEm’s</w:t>
+      </w:r>
+      <w:r>
+        <w:rPr>
+          <w:rFonts w:ascii="Aptos" w:hAnsi="Aptos"/>
+          <w:color w:val="000000"/>
+        </w:rPr>
+        <w:t xml:space="preserve"> implementation (see video.cpp) but runs at character-level fidelity.</w:t>
+      </w:r>
+    </w:p>
+    <w:p>
+      <w:pPr>
+        <w:rPr>
+          <w:rFonts w:ascii="Aptos" w:hAnsi="Aptos"/>
+          <w:color w:val="000000"/>
+        </w:rPr>
+      </w:pPr>
+      <w:r>
+        <w:rPr>
+          <w:rFonts w:ascii="Aptos" w:hAnsi="Aptos"/>
+          <w:color w:val="000000"/>
+        </w:rPr>
+        <w:t xml:space="preserve">The emulation </w:t>
+      </w:r>
+      <w:r>
+        <w:rPr>
+          <w:rFonts w:ascii="Aptos" w:hAnsi="Aptos"/>
+          <w:color w:val="000000"/>
+        </w:rPr>
+        <w:t xml:space="preserve">writes </w:t>
+      </w:r>
+      <w:r>
+        <w:rPr>
+          <w:rFonts w:ascii="Aptos" w:hAnsi="Aptos"/>
+          <w:color w:val="000000"/>
+        </w:rPr>
+        <w:t xml:space="preserve">pixels </w:t>
+      </w:r>
+      <w:r>
+        <w:rPr>
+          <w:rFonts w:ascii="Aptos" w:hAnsi="Aptos"/>
+          <w:color w:val="000000"/>
+        </w:rPr>
+        <w:t xml:space="preserve">to </w:t>
+      </w:r>
+      <w:r>
+        <w:rPr>
+          <w:rFonts w:ascii="Aptos" w:hAnsi="Aptos"/>
+          <w:color w:val="000000"/>
+        </w:rPr>
+        <w:t>a 4bpp framebuffer, where each value indexes a fixed palette of BBC physical colors.</w:t>
+      </w:r>
+    </w:p>
+    <w:p>
+      <w:pPr>
+        <w:rPr>
+          <w:rFonts w:ascii="Aptos" w:hAnsi="Aptos"/>
+          <w:color w:val="000000"/>
+        </w:rPr>
+      </w:pPr>
+      <w:r>
+        <w:rPr>
+          <w:rFonts w:ascii="Aptos" w:hAnsi="Aptos"/>
+          <w:color w:val="000000"/>
+        </w:rPr>
+        <w:t xml:space="preserve">The effective resolution of the frame buffer </w:t>
+      </w:r>
+      <w:r>
+        <w:t xml:space="preserve">is </w:t>
+      </w:r>
+      <w:r>
+        <w:rPr>
+          <w:b/>
+          <w:bCs/>
+        </w:rPr>
+        <w:t>1024 x 624</w:t>
+      </w:r>
+      <w:r>
+        <w:t xml:space="preserve"> </w:t>
+      </w:r>
+      <w:r>
+        <w:t>in</w:t>
+      </w:r>
+      <w:r>
+        <w:t xml:space="preserve"> non-teletext modes, and </w:t>
+      </w:r>
+      <w:r>
+        <w:rPr>
+          <w:b/>
+          <w:bCs/>
+        </w:rPr>
+        <w:t>768 x 624</w:t>
+      </w:r>
+      <w:r>
+        <w:t xml:space="preserve"> </w:t>
+      </w:r>
+      <w:r>
+        <w:t>in</w:t>
+      </w:r>
+      <w:r>
+        <w:t xml:space="preserve"> teletext mode.</w:t>
+      </w:r>
+      <w:r>
+        <w:t xml:space="preserve">  </w:t>
+      </w:r>
+      <w:r>
+        <w:rPr>
+          <w:rFonts w:ascii="Aptos" w:hAnsi="Aptos"/>
+          <w:color w:val="000000"/>
+        </w:rPr>
+        <w:t>Pixels written into the framebuffer are scaled up to match these resolutions.</w:t>
+      </w:r>
+    </w:p>
+    <w:p>
+      <w:pPr>
+        <w:rPr>
+          <w:rFonts w:ascii="Aptos" w:hAnsi="Aptos"/>
+          <w:color w:val="000000"/>
+        </w:rPr>
+      </w:pPr>
+      <w:r>
+        <w:rPr>
+          <w:rFonts w:ascii="Aptos" w:hAnsi="Aptos"/>
+          <w:color w:val="000000"/>
+        </w:rPr>
+        <w:t>This approach leads to more accurate renditions of frames which include mid-frame register changes.</w:t>
       </w:r>
     </w:p>
     <w:p>
@@ -9308,476 +9712,8 @@
         <w:contextualSpacing w:val="0"/>
       </w:pPr>
       <w:r>
-        <w:t>Display frames are generated by emulating the BBC’s video hardware</w:t>
-      </w:r>
-      <w:r>
-        <w:t xml:space="preserve">: </w:t>
-      </w:r>
-      <w:r>
-        <w:t xml:space="preserve">The </w:t>
-      </w:r>
-      <w:r>
-        <w:rPr>
-          <w:b/>
-          <w:bCs/>
-        </w:rPr>
-        <w:t>CRTC</w:t>
-      </w:r>
-      <w:r>
-        <w:t xml:space="preserve"> </w:t>
-      </w:r>
-      <w:r>
-        <w:t>(MC6845) chip</w:t>
-      </w:r>
-      <w:r>
-        <w:t xml:space="preserve">, </w:t>
-      </w:r>
-      <w:r>
-        <w:t xml:space="preserve">the </w:t>
-      </w:r>
-      <w:r>
-        <w:rPr>
-          <w:b/>
-          <w:bCs/>
-        </w:rPr>
-        <w:t>Teletext</w:t>
-      </w:r>
-      <w:r>
-        <w:t xml:space="preserve"> (</w:t>
-      </w:r>
-      <w:r>
-        <w:t>SAA5050</w:t>
-      </w:r>
-      <w:r>
-        <w:t>)</w:t>
-      </w:r>
-      <w:r>
-        <w:rPr>
-          <w:b/>
-          <w:bCs/>
-        </w:rPr>
-        <w:t xml:space="preserve"> </w:t>
-      </w:r>
-      <w:r>
-        <w:t>chip</w:t>
-      </w:r>
-      <w:r>
-        <w:t xml:space="preserve">, and the </w:t>
-      </w:r>
-      <w:r>
-        <w:rPr>
-          <w:b/>
-          <w:bCs/>
-        </w:rPr>
-        <w:t>V</w:t>
-      </w:r>
-      <w:r>
-        <w:rPr>
-          <w:b/>
-          <w:bCs/>
-        </w:rPr>
-        <w:t>ideo</w:t>
-      </w:r>
-      <w:r>
-        <w:t xml:space="preserve"> </w:t>
-      </w:r>
-      <w:r>
-        <w:rPr>
-          <w:b/>
-          <w:bCs/>
-        </w:rPr>
-        <w:t>ULA</w:t>
-      </w:r>
-      <w:r>
-        <w:t xml:space="preserve"> </w:t>
-      </w:r>
-      <w:r>
-        <w:t>chip</w:t>
-      </w:r>
-      <w:r>
-        <w:t>.</w:t>
-      </w:r>
-    </w:p>
-    <w:p>
-      <w:pPr>
-        <w:pStyle w:val="ListParagraph"/>
-        <w:ind w:left="0"/>
-      </w:pPr>
-      <w:r>
         <w:lastRenderedPageBreak/>
-        <w:t xml:space="preserve">The emulation uses </w:t>
-      </w:r>
-      <w:r>
-        <w:t xml:space="preserve">frame start </w:t>
-      </w:r>
-      <w:r>
-        <w:t xml:space="preserve">events in the execution log to synchronize generated display-frames.  These events are emitted </w:t>
-      </w:r>
-      <w:r>
-        <w:t>when a frame’s first scanline is d</w:t>
-      </w:r>
-      <w:r>
-        <w:t>isplayed</w:t>
-      </w:r>
-      <w:r>
-        <w:t>, when DE (</w:t>
-      </w:r>
-      <w:r>
-        <w:t xml:space="preserve">Display Enable) is </w:t>
-      </w:r>
-      <w:r>
-        <w:t>first enabled</w:t>
-      </w:r>
-      <w:r>
-        <w:t>.</w:t>
-      </w:r>
-    </w:p>
-    <w:p>
-      <w:r>
-        <w:t xml:space="preserve">Different emulator implementations handle screen mode changes slightly differently, causing timing variations that </w:t>
-      </w:r>
-      <w:r>
-        <w:rPr>
-          <w:b/>
-          <w:bCs/>
-        </w:rPr>
-        <w:t>BeebPerf</w:t>
-      </w:r>
-      <w:r>
-        <w:t xml:space="preserve"> cannot reconcile without this event.</w:t>
-      </w:r>
-    </w:p>
-    <w:p>
-      <w:pPr>
-        <w:rPr>
-          <w:rFonts w:ascii="Aptos" w:hAnsi="Aptos"/>
-          <w:color w:val="000000"/>
-        </w:rPr>
-      </w:pPr>
-      <w:r>
-        <w:t>The</w:t>
-      </w:r>
-      <w:r>
-        <w:t xml:space="preserve"> </w:t>
-      </w:r>
-      <w:r>
-        <w:t xml:space="preserve">code </w:t>
-      </w:r>
-      <w:r>
-        <w:t xml:space="preserve">is </w:t>
-      </w:r>
-      <w:r>
-        <w:t xml:space="preserve">largely </w:t>
-      </w:r>
-      <w:r>
-        <w:t>based on BeebEm’s</w:t>
-      </w:r>
-      <w:r>
-        <w:rPr>
-          <w:rFonts w:ascii="Aptos" w:hAnsi="Aptos"/>
-          <w:color w:val="000000"/>
-        </w:rPr>
-        <w:t xml:space="preserve"> implementation</w:t>
-      </w:r>
-      <w:r>
-        <w:rPr>
-          <w:rFonts w:ascii="Aptos" w:hAnsi="Aptos"/>
-          <w:color w:val="000000"/>
-        </w:rPr>
-        <w:t xml:space="preserve"> (see video.cpp)</w:t>
-      </w:r>
-      <w:r>
-        <w:rPr>
-          <w:rFonts w:ascii="Aptos" w:hAnsi="Aptos"/>
-          <w:color w:val="000000"/>
-        </w:rPr>
-        <w:t xml:space="preserve"> but runs at character</w:t>
-      </w:r>
-      <w:r>
-        <w:rPr>
-          <w:rFonts w:ascii="Aptos" w:hAnsi="Aptos"/>
-          <w:color w:val="000000"/>
-        </w:rPr>
-        <w:t xml:space="preserve">-level </w:t>
-      </w:r>
-      <w:r>
-        <w:rPr>
-          <w:rFonts w:ascii="Aptos" w:hAnsi="Aptos"/>
-          <w:color w:val="000000"/>
-        </w:rPr>
-        <w:t>fidelity.</w:t>
-      </w:r>
-    </w:p>
-    <w:p>
-      <w:pPr>
-        <w:rPr>
-          <w:rFonts w:ascii="Aptos" w:hAnsi="Aptos"/>
-          <w:color w:val="000000"/>
-        </w:rPr>
-      </w:pPr>
-      <w:r>
-        <w:rPr>
-          <w:rFonts w:ascii="Aptos" w:hAnsi="Aptos"/>
-          <w:color w:val="000000"/>
-        </w:rPr>
-        <w:t xml:space="preserve">The emulation </w:t>
-      </w:r>
-      <w:r>
-        <w:rPr>
-          <w:rFonts w:ascii="Aptos" w:hAnsi="Aptos"/>
-          <w:color w:val="000000"/>
-        </w:rPr>
-        <w:t xml:space="preserve">writes </w:t>
-      </w:r>
-      <w:r>
-        <w:rPr>
-          <w:rFonts w:ascii="Aptos" w:hAnsi="Aptos"/>
-          <w:color w:val="000000"/>
-        </w:rPr>
-        <w:t xml:space="preserve">pixels </w:t>
-      </w:r>
-      <w:r>
-        <w:rPr>
-          <w:rFonts w:ascii="Aptos" w:hAnsi="Aptos"/>
-          <w:color w:val="000000"/>
-        </w:rPr>
-        <w:t xml:space="preserve">to </w:t>
-      </w:r>
-      <w:r>
-        <w:rPr>
-          <w:rFonts w:ascii="Aptos" w:hAnsi="Aptos"/>
-          <w:color w:val="000000"/>
-        </w:rPr>
-        <w:t>a 4bpp framebuffer, where each value indexes a fixed palette of BBC physical colors: 0 black, 1 red, 2 green, 3 yellow, 4 blue, 5 magenta, 6 cyan, and 7 white.</w:t>
-      </w:r>
-    </w:p>
-    <w:p>
-      <w:pPr>
-        <w:rPr>
-          <w:rFonts w:ascii="Aptos" w:hAnsi="Aptos"/>
-          <w:color w:val="000000"/>
-        </w:rPr>
-      </w:pPr>
-      <w:r>
-        <w:rPr>
-          <w:rFonts w:ascii="Aptos" w:hAnsi="Aptos"/>
-          <w:color w:val="000000"/>
-        </w:rPr>
-        <w:t xml:space="preserve">The effective resolution of the frame buffer </w:t>
-      </w:r>
-      <w:r>
-        <w:t xml:space="preserve">is </w:t>
-      </w:r>
-      <w:r>
-        <w:rPr>
-          <w:b/>
-          <w:bCs/>
-        </w:rPr>
-        <w:t>1024 x 624</w:t>
-      </w:r>
-      <w:r>
-        <w:t xml:space="preserve"> </w:t>
-      </w:r>
-      <w:r>
-        <w:t>in</w:t>
-      </w:r>
-      <w:r>
-        <w:t xml:space="preserve"> non-teletext modes, and </w:t>
-      </w:r>
-      <w:r>
-        <w:rPr>
-          <w:b/>
-          <w:bCs/>
-        </w:rPr>
-        <w:t>768 x 624</w:t>
-      </w:r>
-      <w:r>
-        <w:t xml:space="preserve"> </w:t>
-      </w:r>
-      <w:r>
-        <w:t>in</w:t>
-      </w:r>
-      <w:r>
-        <w:t xml:space="preserve"> teletext mode.</w:t>
-      </w:r>
-      <w:r>
-        <w:t xml:space="preserve">  </w:t>
-      </w:r>
-      <w:r>
-        <w:rPr>
-          <w:rFonts w:ascii="Aptos" w:hAnsi="Aptos"/>
-          <w:color w:val="000000"/>
-        </w:rPr>
-        <w:t xml:space="preserve">Pixels written into the framebuffer </w:t>
-      </w:r>
-      <w:r>
-        <w:rPr>
-          <w:rFonts w:ascii="Aptos" w:hAnsi="Aptos"/>
-          <w:color w:val="000000"/>
-        </w:rPr>
-        <w:t xml:space="preserve">are </w:t>
-      </w:r>
-      <w:r>
-        <w:rPr>
-          <w:rFonts w:ascii="Aptos" w:hAnsi="Aptos"/>
-          <w:color w:val="000000"/>
-        </w:rPr>
-        <w:t>scaled</w:t>
-      </w:r>
-      <w:r>
-        <w:rPr>
-          <w:rFonts w:ascii="Aptos" w:hAnsi="Aptos"/>
-          <w:color w:val="000000"/>
-        </w:rPr>
-        <w:t xml:space="preserve"> </w:t>
-      </w:r>
-      <w:r>
-        <w:rPr>
-          <w:rFonts w:ascii="Aptos" w:hAnsi="Aptos"/>
-          <w:color w:val="000000"/>
-        </w:rPr>
-        <w:t xml:space="preserve">up </w:t>
-      </w:r>
-      <w:r>
-        <w:rPr>
-          <w:rFonts w:ascii="Aptos" w:hAnsi="Aptos"/>
-          <w:color w:val="000000"/>
-        </w:rPr>
-        <w:t xml:space="preserve">to match these </w:t>
-      </w:r>
-      <w:r>
-        <w:rPr>
-          <w:rFonts w:ascii="Aptos" w:hAnsi="Aptos"/>
-          <w:color w:val="000000"/>
-        </w:rPr>
-        <w:t>resolution</w:t>
-      </w:r>
-      <w:r>
-        <w:rPr>
-          <w:rFonts w:ascii="Aptos" w:hAnsi="Aptos"/>
-          <w:color w:val="000000"/>
-        </w:rPr>
-        <w:t>s</w:t>
-      </w:r>
-      <w:r>
-        <w:rPr>
-          <w:rFonts w:ascii="Aptos" w:hAnsi="Aptos"/>
-          <w:color w:val="000000"/>
-        </w:rPr>
-        <w:t>.</w:t>
-      </w:r>
-    </w:p>
-    <w:p>
-      <w:pPr>
-        <w:rPr>
-          <w:rFonts w:ascii="Aptos" w:hAnsi="Aptos"/>
-          <w:color w:val="000000"/>
-        </w:rPr>
-      </w:pPr>
-      <w:r>
-        <w:rPr>
-          <w:rFonts w:ascii="Aptos" w:hAnsi="Aptos"/>
-          <w:color w:val="000000"/>
-        </w:rPr>
-        <w:t>This approach leads to more accurate renditions</w:t>
-      </w:r>
-      <w:r>
-        <w:rPr>
-          <w:rFonts w:ascii="Aptos" w:hAnsi="Aptos"/>
-          <w:color w:val="000000"/>
-        </w:rPr>
-        <w:t xml:space="preserve"> </w:t>
-      </w:r>
-      <w:r>
-        <w:rPr>
-          <w:rFonts w:ascii="Aptos" w:hAnsi="Aptos"/>
-          <w:color w:val="000000"/>
-        </w:rPr>
-        <w:t>of frames which</w:t>
-      </w:r>
-      <w:r>
-        <w:rPr>
-          <w:rFonts w:ascii="Aptos" w:hAnsi="Aptos"/>
-          <w:color w:val="000000"/>
-        </w:rPr>
-        <w:t xml:space="preserve"> </w:t>
-      </w:r>
-      <w:r>
-        <w:rPr>
-          <w:rFonts w:ascii="Aptos" w:hAnsi="Aptos"/>
-          <w:color w:val="000000"/>
-        </w:rPr>
-        <w:t xml:space="preserve">include mid-frame </w:t>
-      </w:r>
-      <w:r>
-        <w:rPr>
-          <w:rFonts w:ascii="Aptos" w:hAnsi="Aptos"/>
-          <w:color w:val="000000"/>
-        </w:rPr>
-        <w:t xml:space="preserve">register </w:t>
-      </w:r>
-      <w:r>
-        <w:rPr>
-          <w:rFonts w:ascii="Aptos" w:hAnsi="Aptos"/>
-          <w:color w:val="000000"/>
-        </w:rPr>
-        <w:t>changes</w:t>
-      </w:r>
-      <w:r>
-        <w:rPr>
-          <w:rFonts w:ascii="Aptos" w:hAnsi="Aptos"/>
-          <w:color w:val="000000"/>
-        </w:rPr>
-        <w:t>.</w:t>
-      </w:r>
-    </w:p>
-    <w:p>
-      <w:pPr>
-        <w:pStyle w:val="ListParagraph"/>
-        <w:ind w:left="0"/>
-        <w:contextualSpacing w:val="0"/>
-      </w:pPr>
-      <w:r>
-        <w:t xml:space="preserve">The </w:t>
-      </w:r>
-      <w:r>
-        <w:t xml:space="preserve">standard and </w:t>
-      </w:r>
-      <w:r>
-        <w:t>maximum resolution</w:t>
-      </w:r>
-      <w:r>
-        <w:t>s</w:t>
-      </w:r>
-      <w:r>
-        <w:t xml:space="preserve"> (with overscan)</w:t>
-      </w:r>
-      <w:r>
-        <w:t xml:space="preserve">, </w:t>
-      </w:r>
-      <w:r>
-        <w:t>and aspect ratio</w:t>
-      </w:r>
-      <w:r>
-        <w:t>s</w:t>
-      </w:r>
-      <w:r>
-        <w:t>,</w:t>
-      </w:r>
-      <w:r>
-        <w:t xml:space="preserve"> of </w:t>
-      </w:r>
-      <w:r>
-        <w:t xml:space="preserve">extracted </w:t>
-      </w:r>
-      <w:r>
-        <w:t xml:space="preserve">images </w:t>
-      </w:r>
-      <w:r>
-        <w:t>are</w:t>
-      </w:r>
-      <w:r>
-        <w:t xml:space="preserve"> shown in the following table:</w:t>
+        <w:t>The standard and maximum resolutions (with overscan), and aspect ratios, of extracted images are shown in the following table:</w:t>
       </w:r>
     </w:p>
     <w:tbl>
@@ -10055,16 +9991,13 @@
     </w:p>
     <w:p>
       <w:pPr>
-        <w:pStyle w:val="Heading5"/>
+        <w:pStyle w:val="Heading4"/>
       </w:pPr>
       <w:r>
         <w:t>Non-teletext screen mode</w:t>
       </w:r>
       <w:r>
-        <w:t xml:space="preserve"> details</w:t>
-      </w:r>
-      <w:r>
-        <w:t>:</w:t>
+        <w:t xml:space="preserve"> details:</w:t>
       </w:r>
     </w:p>
     <w:p>
@@ -10079,257 +10012,255 @@
           <w:rFonts w:ascii="Aptos" w:hAnsi="Aptos"/>
           <w:color w:val="000000"/>
         </w:rPr>
-        <w:t>I</w:t>
-      </w:r>
-      <w:r>
+        <w:t>Images are extracted from the framebuffer at half the vertical resolution by reading just the even scanlines.</w:t>
+      </w:r>
+    </w:p>
+    <w:p>
+      <w:pPr>
+        <w:pStyle w:val="Heading4"/>
+      </w:pPr>
+      <w:r>
+        <w:t>Teletext screen mode (Mode 7)</w:t>
+      </w:r>
+      <w:r>
+        <w:t xml:space="preserve"> </w:t>
+      </w:r>
+      <w:r>
+        <w:t>details:</w:t>
+      </w:r>
+    </w:p>
+    <w:p>
+      <w:pPr>
         <w:rPr>
           <w:rFonts w:ascii="Aptos" w:hAnsi="Aptos"/>
           <w:color w:val="000000"/>
         </w:rPr>
-        <w:t xml:space="preserve">mages are </w:t>
-      </w:r>
+      </w:pPr>
       <w:r>
         <w:rPr>
           <w:rFonts w:ascii="Aptos" w:hAnsi="Aptos"/>
           <w:color w:val="000000"/>
         </w:rPr>
-        <w:t>extracted from the framebuffer at half the vertical resolution by reading just the even scanlines</w:t>
+        <w:t xml:space="preserve">Mode 7 uses interlaced sync </w:t>
       </w:r>
       <w:r>
         <w:rPr>
           <w:rFonts w:ascii="Aptos" w:hAnsi="Aptos"/>
           <w:color w:val="000000"/>
         </w:rPr>
-        <w:t>.</w:t>
-      </w:r>
-    </w:p>
-    <w:p>
-      <w:pPr>
-        <w:pStyle w:val="Heading5"/>
-      </w:pPr>
-      <w:r>
-        <w:t>Teletext screen mode (Mode 7)</w:t>
-      </w:r>
-      <w:r>
-        <w:t xml:space="preserve"> </w:t>
-      </w:r>
-      <w:r>
-        <w:t>details</w:t>
-      </w:r>
-      <w:r>
-        <w:t>:</w:t>
-      </w:r>
-    </w:p>
-    <w:p>
-      <w:pPr>
+        <w:t xml:space="preserve">&amp; </w:t>
+      </w:r>
+      <w:r>
         <w:rPr>
           <w:rFonts w:ascii="Aptos" w:hAnsi="Aptos"/>
           <w:color w:val="000000"/>
         </w:rPr>
-      </w:pPr>
+        <w:t>video</w:t>
+      </w:r>
       <w:r>
         <w:rPr>
           <w:rFonts w:ascii="Aptos" w:hAnsi="Aptos"/>
           <w:color w:val="000000"/>
         </w:rPr>
-        <w:t xml:space="preserve">Mode 7 uses interlaced sync </w:t>
+        <w:t xml:space="preserve"> mode</w:t>
       </w:r>
       <w:r>
         <w:rPr>
           <w:rFonts w:ascii="Aptos" w:hAnsi="Aptos"/>
           <w:color w:val="000000"/>
         </w:rPr>
-        <w:t xml:space="preserve">&amp; </w:t>
+        <w:t xml:space="preserve">, </w:t>
       </w:r>
       <w:r>
         <w:rPr>
           <w:rFonts w:ascii="Aptos" w:hAnsi="Aptos"/>
           <w:color w:val="000000"/>
         </w:rPr>
-        <w:t>video</w:t>
+        <w:t xml:space="preserve">displaying </w:t>
       </w:r>
       <w:r>
         <w:rPr>
           <w:rFonts w:ascii="Aptos" w:hAnsi="Aptos"/>
           <w:color w:val="000000"/>
         </w:rPr>
-        <w:t xml:space="preserve"> mode</w:t>
+        <w:t>250 lines (or 25 rows of text</w:t>
       </w:r>
       <w:r>
         <w:rPr>
           <w:rFonts w:ascii="Aptos" w:hAnsi="Aptos"/>
           <w:color w:val="000000"/>
         </w:rPr>
-        <w:t xml:space="preserve">, </w:t>
+        <w:t>, each with ten even or ten odd scanlines</w:t>
       </w:r>
       <w:r>
         <w:rPr>
           <w:rFonts w:ascii="Aptos" w:hAnsi="Aptos"/>
           <w:color w:val="000000"/>
         </w:rPr>
-        <w:t xml:space="preserve">displaying </w:t>
+        <w:t xml:space="preserve">) per field. </w:t>
       </w:r>
       <w:r>
         <w:rPr>
           <w:rFonts w:ascii="Aptos" w:hAnsi="Aptos"/>
           <w:color w:val="000000"/>
         </w:rPr>
-        <w:t>250 lines (or 25 rows of text</w:t>
+        <w:t xml:space="preserve"> </w:t>
       </w:r>
       <w:r>
         <w:rPr>
           <w:rFonts w:ascii="Aptos" w:hAnsi="Aptos"/>
           <w:color w:val="000000"/>
         </w:rPr>
-        <w:t xml:space="preserve">, each with </w:t>
+        <w:t>Th</w:t>
       </w:r>
       <w:r>
         <w:rPr>
           <w:rFonts w:ascii="Aptos" w:hAnsi="Aptos"/>
           <w:color w:val="000000"/>
         </w:rPr>
-        <w:t xml:space="preserve">ten even or ten odd </w:t>
+        <w:t>ese</w:t>
       </w:r>
       <w:r>
         <w:rPr>
           <w:rFonts w:ascii="Aptos" w:hAnsi="Aptos"/>
           <w:color w:val="000000"/>
         </w:rPr>
-        <w:t>scanlines</w:t>
+        <w:t xml:space="preserve"> interleaving </w:t>
       </w:r>
       <w:r>
         <w:rPr>
           <w:rFonts w:ascii="Aptos" w:hAnsi="Aptos"/>
           <w:color w:val="000000"/>
         </w:rPr>
-        <w:t xml:space="preserve">) per field. </w:t>
+        <w:t xml:space="preserve">fields </w:t>
       </w:r>
       <w:r>
         <w:rPr>
           <w:rFonts w:ascii="Aptos" w:hAnsi="Aptos"/>
           <w:color w:val="000000"/>
         </w:rPr>
-        <w:t xml:space="preserve"> </w:t>
+        <w:t>produce a</w:t>
       </w:r>
       <w:r>
         <w:rPr>
           <w:rFonts w:ascii="Aptos" w:hAnsi="Aptos"/>
           <w:color w:val="000000"/>
         </w:rPr>
-        <w:t>Th</w:t>
+        <w:t xml:space="preserve"> </w:t>
       </w:r>
       <w:r>
         <w:rPr>
           <w:rFonts w:ascii="Aptos" w:hAnsi="Aptos"/>
           <w:color w:val="000000"/>
         </w:rPr>
-        <w:t>ese</w:t>
+        <w:t xml:space="preserve">500-line </w:t>
       </w:r>
       <w:r>
         <w:rPr>
           <w:rFonts w:ascii="Aptos" w:hAnsi="Aptos"/>
           <w:color w:val="000000"/>
         </w:rPr>
-        <w:t xml:space="preserve"> interleaving </w:t>
+        <w:t xml:space="preserve">interlaced </w:t>
       </w:r>
       <w:r>
         <w:rPr>
           <w:rFonts w:ascii="Aptos" w:hAnsi="Aptos"/>
           <w:color w:val="000000"/>
         </w:rPr>
-        <w:t xml:space="preserve">fields </w:t>
+        <w:t>image</w:t>
       </w:r>
       <w:r>
         <w:rPr>
           <w:rFonts w:ascii="Aptos" w:hAnsi="Aptos"/>
           <w:color w:val="000000"/>
         </w:rPr>
-        <w:t>produce a</w:t>
+        <w:t xml:space="preserve"> on the display</w:t>
       </w:r>
       <w:r>
         <w:rPr>
           <w:rFonts w:ascii="Aptos" w:hAnsi="Aptos"/>
           <w:color w:val="000000"/>
         </w:rPr>
-        <w:t xml:space="preserve"> </w:t>
-      </w:r>
-      <w:r>
+        <w:t>.</w:t>
+      </w:r>
+    </w:p>
+    <w:p>
+      <w:pPr>
         <w:rPr>
           <w:rFonts w:ascii="Aptos" w:hAnsi="Aptos"/>
           <w:color w:val="000000"/>
         </w:rPr>
-        <w:t xml:space="preserve">500-line </w:t>
-      </w:r>
+      </w:pPr>
       <w:r>
         <w:rPr>
           <w:rFonts w:ascii="Aptos" w:hAnsi="Aptos"/>
           <w:color w:val="000000"/>
         </w:rPr>
-        <w:t xml:space="preserve">interlaced </w:t>
+        <w:t xml:space="preserve">To enhance text quality </w:t>
       </w:r>
       <w:r>
         <w:rPr>
           <w:rFonts w:ascii="Aptos" w:hAnsi="Aptos"/>
           <w:color w:val="000000"/>
         </w:rPr>
-        <w:t>image</w:t>
+        <w:t xml:space="preserve">of </w:t>
       </w:r>
       <w:r>
         <w:rPr>
           <w:rFonts w:ascii="Aptos" w:hAnsi="Aptos"/>
           <w:color w:val="000000"/>
         </w:rPr>
-        <w:t xml:space="preserve"> </w:t>
+        <w:t>teletext screens, the emulat</w:t>
       </w:r>
       <w:r>
         <w:rPr>
           <w:rFonts w:ascii="Aptos" w:hAnsi="Aptos"/>
           <w:color w:val="000000"/>
         </w:rPr>
-        <w:t>on the display</w:t>
+        <w:t>ion</w:t>
       </w:r>
       <w:r>
         <w:rPr>
           <w:rFonts w:ascii="Aptos" w:hAnsi="Aptos"/>
           <w:color w:val="000000"/>
         </w:rPr>
-        <w:t>.</w:t>
-      </w:r>
-    </w:p>
-    <w:p>
-      <w:pPr>
+        <w:t xml:space="preserve"> </w:t>
+      </w:r>
+      <w:r>
         <w:rPr>
           <w:rFonts w:ascii="Aptos" w:hAnsi="Aptos"/>
           <w:color w:val="000000"/>
         </w:rPr>
-      </w:pPr>
+        <w:t xml:space="preserve">generates a </w:t>
+      </w:r>
       <w:r>
         <w:rPr>
           <w:rFonts w:ascii="Aptos" w:hAnsi="Aptos"/>
           <w:color w:val="000000"/>
         </w:rPr>
-        <w:t xml:space="preserve">To enhance text quality </w:t>
+        <w:t>500-line composite image</w:t>
       </w:r>
       <w:r>
         <w:rPr>
           <w:rFonts w:ascii="Aptos" w:hAnsi="Aptos"/>
           <w:color w:val="000000"/>
         </w:rPr>
-        <w:t xml:space="preserve">of </w:t>
-      </w:r>
-      <w:r>
+        <w:t>.</w:t>
+      </w:r>
+    </w:p>
+    <w:p>
+      <w:pPr>
         <w:rPr>
           <w:rFonts w:ascii="Aptos" w:hAnsi="Aptos"/>
           <w:color w:val="000000"/>
         </w:rPr>
-        <w:t>teletext screens, the emulat</w:t>
-      </w:r>
+      </w:pPr>
       <w:r>
         <w:rPr>
           <w:rFonts w:ascii="Aptos" w:hAnsi="Aptos"/>
           <w:color w:val="000000"/>
         </w:rPr>
-        <w:t>ion</w:t>
+        <w:t xml:space="preserve">The CRTC works as usual, producing ten scanlines for each character row. </w:t>
       </w:r>
       <w:r>
         <w:rPr>
@@ -10343,37 +10274,36 @@
           <w:rFonts w:ascii="Aptos" w:hAnsi="Aptos"/>
           <w:color w:val="000000"/>
         </w:rPr>
-        <w:t xml:space="preserve">generates a </w:t>
-      </w:r>
-      <w:r>
+        <w:t xml:space="preserve">In even fields, these are: [0,2,4,6,8,10,12,14,16,18], while in odd fields, they are: [1,3,5,7,9,11,13,15,17,19]. </w:t>
+      </w:r>
+    </w:p>
+    <w:p>
+      <w:pPr>
         <w:rPr>
           <w:rFonts w:ascii="Aptos" w:hAnsi="Aptos"/>
           <w:color w:val="000000"/>
         </w:rPr>
-        <w:t>500-line composite image</w:t>
-      </w:r>
+      </w:pPr>
       <w:r>
         <w:rPr>
           <w:rFonts w:ascii="Aptos" w:hAnsi="Aptos"/>
           <w:color w:val="000000"/>
         </w:rPr>
-        <w:t>.</w:t>
-      </w:r>
-    </w:p>
-    <w:p>
-      <w:pPr>
+        <w:t xml:space="preserve">The teletext (SAA5050) is emulated by rounding each CRTC character scanline to the nearest even number and drawing its pixels </w:t>
+      </w:r>
+      <w:r>
         <w:rPr>
           <w:rFonts w:ascii="Aptos" w:hAnsi="Aptos"/>
           <w:color w:val="000000"/>
         </w:rPr>
-      </w:pPr>
+        <w:t>i</w:t>
+      </w:r>
       <w:r>
         <w:rPr>
           <w:rFonts w:ascii="Aptos" w:hAnsi="Aptos"/>
           <w:color w:val="000000"/>
         </w:rPr>
-        <w:lastRenderedPageBreak/>
-        <w:t xml:space="preserve">The CRTC works as usual, producing ten scanlines for each character row. </w:t>
+        <w:t xml:space="preserve">nto the framebuffer. </w:t>
       </w:r>
       <w:r>
         <w:rPr>
@@ -10387,70 +10317,27 @@
           <w:rFonts w:ascii="Aptos" w:hAnsi="Aptos"/>
           <w:color w:val="000000"/>
         </w:rPr>
-        <w:t xml:space="preserve">In even fields, these are: [0,2,4,6,8,10,12,14,16,18], while in odd fields, they are: [1,3,5,7,9,11,13,15,17,19]. </w:t>
-      </w:r>
-    </w:p>
-    <w:p>
-      <w:pPr>
+        <w:t xml:space="preserve">The rounded value is </w:t>
+      </w:r>
+      <w:r>
         <w:rPr>
           <w:rFonts w:ascii="Aptos" w:hAnsi="Aptos"/>
           <w:color w:val="000000"/>
         </w:rPr>
-      </w:pPr>
+        <w:t xml:space="preserve">then </w:t>
+      </w:r>
       <w:r>
         <w:rPr>
           <w:rFonts w:ascii="Aptos" w:hAnsi="Aptos"/>
           <w:color w:val="000000"/>
         </w:rPr>
-        <w:t xml:space="preserve">The teletext (SAA5050) is emulated by rounding each CRTC character scanline to the nearest even number and drawing its pixels </w:t>
+        <w:t>incremented, and the process repeats, resulting in two scanlines for every CRTC character scanline</w:t>
       </w:r>
       <w:r>
         <w:rPr>
           <w:rFonts w:ascii="Aptos" w:hAnsi="Aptos"/>
           <w:color w:val="000000"/>
         </w:rPr>
-        <w:t>i</w:t>
-      </w:r>
-      <w:r>
-        <w:rPr>
-          <w:rFonts w:ascii="Aptos" w:hAnsi="Aptos"/>
-          <w:color w:val="000000"/>
-        </w:rPr>
-        <w:t xml:space="preserve">nto the framebuffer. </w:t>
-      </w:r>
-      <w:r>
-        <w:rPr>
-          <w:rFonts w:ascii="Aptos" w:hAnsi="Aptos"/>
-          <w:color w:val="000000"/>
-        </w:rPr>
-        <w:t xml:space="preserve"> </w:t>
-      </w:r>
-      <w:r>
-        <w:rPr>
-          <w:rFonts w:ascii="Aptos" w:hAnsi="Aptos"/>
-          <w:color w:val="000000"/>
-        </w:rPr>
-        <w:t xml:space="preserve">The rounded value is </w:t>
-      </w:r>
-      <w:r>
-        <w:rPr>
-          <w:rFonts w:ascii="Aptos" w:hAnsi="Aptos"/>
-          <w:color w:val="000000"/>
-        </w:rPr>
-        <w:t xml:space="preserve">then </w:t>
-      </w:r>
-      <w:r>
-        <w:rPr>
-          <w:rFonts w:ascii="Aptos" w:hAnsi="Aptos"/>
-          <w:color w:val="000000"/>
-        </w:rPr>
-        <w:t>incremented, and the process repeats, resulting in two scanlines for every CRTC character scanline</w:t>
-      </w:r>
-      <w:r>
-        <w:rPr>
-          <w:rFonts w:ascii="Aptos" w:hAnsi="Aptos"/>
-          <w:color w:val="000000"/>
-        </w:rPr>
         <w:t xml:space="preserve"> enumerated by the CRTC.</w:t>
       </w:r>
     </w:p>
@@ -10459,10 +10346,7 @@
         <w:pStyle w:val="Heading4"/>
       </w:pPr>
       <w:r>
-        <w:t>Supported features</w:t>
-      </w:r>
-      <w:r>
-        <w:t>:</w:t>
+        <w:t>Supported features:</w:t>
       </w:r>
     </w:p>
     <w:p>
@@ -10558,10 +10442,7 @@
         <w:t>Hardware scrolling</w:t>
       </w:r>
       <w:r>
-        <w:t xml:space="preserve"> and split screen</w:t>
-      </w:r>
-      <w:r>
-        <w:t xml:space="preserve"> support</w:t>
+        <w:t xml:space="preserve"> and split screen support</w:t>
       </w:r>
     </w:p>
     <w:p>
@@ -10611,6 +10492,7 @@
         </w:numPr>
       </w:pPr>
       <w:r>
+        <w:lastRenderedPageBreak/>
         <w:t xml:space="preserve">No support for custom ULA </w:t>
       </w:r>
       <w:r>
@@ -10619,145 +10501,58 @@
     </w:p>
     <w:p>
       <w:pPr>
-        <w:pStyle w:val="Heading4"/>
-      </w:pPr>
-      <w:r>
-        <w:t>Programmatic-frame generation</w:t>
-      </w:r>
-    </w:p>
-    <w:p>
-      <w:r>
-        <w:t>Programmatic</w:t>
-      </w:r>
-      <w:r>
-        <w:t>-</w:t>
-      </w:r>
-      <w:r>
-        <w:t xml:space="preserve">frames are generated by determining the next </w:t>
-      </w:r>
-      <w:r>
-        <w:t>programmatic-</w:t>
-      </w:r>
-      <w:r>
-        <w:t>frame’s start instruction index, and when this is encountered, start</w:t>
-      </w:r>
-      <w:r>
-        <w:t>s</w:t>
-      </w:r>
-      <w:r>
-        <w:t xml:space="preserve"> the frame.  As part of this the </w:t>
-      </w:r>
-      <w:r>
-        <w:t>programmatic-</w:t>
-      </w:r>
-      <w:r>
-        <w:t>frame’s end instruction index is calculated, based on the frame settings.  When the frame end instruction index is encountered, the frame is added to the list, and the process repeats.</w:t>
-      </w:r>
-    </w:p>
-    <w:p>
-      <w:r>
-        <w:t xml:space="preserve">The only complication is that </w:t>
-      </w:r>
-      <w:r>
-        <w:t xml:space="preserve">the </w:t>
-      </w:r>
-      <w:r>
-        <w:t>memory ‘writes before display’ and ‘writes after display’ counts need to be calculated</w:t>
-      </w:r>
-      <w:r>
-        <w:t xml:space="preserve"> during processing</w:t>
-      </w:r>
-      <w:r>
-        <w:t xml:space="preserve">.  Mirrored screen memory pages, storing the last </w:t>
-      </w:r>
-      <w:r>
-        <w:t>display-frame</w:t>
-      </w:r>
-      <w:r>
-        <w:t xml:space="preserve"> number, are used to </w:t>
-      </w:r>
-      <w:r>
-        <w:t>accomplish this.</w:t>
-      </w:r>
-    </w:p>
-    <w:p>
-      <w:r>
-        <w:t>One subtly is that the end of a display frame can only be determined reliably when the next display frame starts, so two sets of writes</w:t>
-      </w:r>
-      <w:r>
-        <w:t>-</w:t>
-      </w:r>
-      <w:r>
-        <w:t xml:space="preserve">before and </w:t>
-      </w:r>
-      <w:r>
-        <w:t>writes-</w:t>
-      </w:r>
-      <w:r>
-        <w:t>after accumulators are needed, with one set applied to the current display frame, and the other to the next display frame.  The set used is determined when the display frames are associated with programmatic frames</w:t>
-      </w:r>
-      <w:r>
-        <w:t xml:space="preserve">, when their </w:t>
-      </w:r>
-      <w:r>
-        <w:t xml:space="preserve">durations </w:t>
-      </w:r>
-      <w:r>
-        <w:t>are known.</w:t>
-      </w:r>
-    </w:p>
-    <w:p>
-      <w:pPr>
-        <w:pStyle w:val="Heading2"/>
-      </w:pPr>
-      <w:r>
-        <w:lastRenderedPageBreak/>
-        <w:t>Dynamic analysis</w:t>
-      </w:r>
-    </w:p>
-    <w:p>
-      <w:r>
-        <w:t xml:space="preserve">Dynamic analysis is performed after static </w:t>
-      </w:r>
-      <w:r>
-        <w:t xml:space="preserve">CPU </w:t>
-      </w:r>
-      <w:r>
-        <w:t>analysis</w:t>
-      </w:r>
-      <w:r>
-        <w:t xml:space="preserve"> </w:t>
-      </w:r>
-      <w:r>
-        <w:t>is completed</w:t>
-      </w:r>
-      <w:r>
-        <w:t>, and whenever the analysis time</w:t>
-      </w:r>
-      <w:r>
-        <w:t xml:space="preserve"> range</w:t>
-      </w:r>
-      <w:r>
-        <w:t xml:space="preserve"> is changed by the user.  </w:t>
-      </w:r>
-    </w:p>
-    <w:p>
-      <w:r>
-        <w:t xml:space="preserve">The form class asynchronously </w:t>
-      </w:r>
-      <w:r>
-        <w:t xml:space="preserve">invokes </w:t>
-      </w:r>
-      <w:r>
-        <w:t>dynamic CPU and memory analysis in parallel.</w:t>
-      </w:r>
-    </w:p>
-    <w:p>
-      <w:pPr>
         <w:pStyle w:val="Heading3"/>
       </w:pPr>
       <w:r>
-        <w:t>Dynamic CPU analysis</w:t>
+        <w:t>Metric Evaluation</w:t>
+      </w:r>
+    </w:p>
+    <w:p>
+      <w:pPr>
+        <w:pStyle w:val="ListParagraph"/>
+        <w:ind w:left="0"/>
+        <w:contextualSpacing w:val="0"/>
+      </w:pPr>
+      <w:r>
+        <w:t>The selected metric is also evaluated as part of video analysis, with the generated metric iterations listed in the Metrics tab.</w:t>
+      </w:r>
+    </w:p>
+    <w:p>
+      <w:pPr>
+        <w:pStyle w:val="ListParagraph"/>
+        <w:ind w:left="0"/>
+        <w:contextualSpacing w:val="0"/>
+      </w:pPr>
+      <w:r>
+        <w:t xml:space="preserve">Each generated iteration captures the iteration’s durations, how it aligns with the current or next display-frame, and how many screen memory writes occur before and after the CRTC display screen memory scan read. </w:t>
+      </w:r>
+    </w:p>
+    <w:p>
+      <w:pPr>
+        <w:pStyle w:val="ListParagraph"/>
+        <w:ind w:left="0"/>
+        <w:contextualSpacing w:val="0"/>
+      </w:pPr>
+      <w:r>
+        <w:t>A metric iteration is represented using the following type:</w:t>
+      </w:r>
+    </w:p>
+    <w:p>
+      <w:r>
+        <w:rPr>
+          <w:b/>
+          <w:bCs/>
+        </w:rPr>
+        <w:t>MetricIteration</w:t>
+      </w:r>
+      <w:r>
+        <w:t xml:space="preserve"> – represents a </w:t>
+      </w:r>
+      <w:r>
+        <w:t>metric iteration</w:t>
+      </w:r>
+      <w:r>
+        <w:t>.  Contains the following fields:</w:t>
       </w:r>
     </w:p>
     <w:p>
@@ -10765,11 +10560,11 @@
         <w:pStyle w:val="ListParagraph"/>
         <w:numPr>
           <w:ilvl w:val="0"/>
-          <w:numId w:val="6"/>
-        </w:numPr>
-      </w:pPr>
-      <w:r>
-        <w:t>Calculate the CPU metrics for every routine, for a specific timespan</w:t>
+          <w:numId w:val="2"/>
+        </w:numPr>
+      </w:pPr>
+      <w:r>
+        <w:t>Iteration number</w:t>
       </w:r>
     </w:p>
     <w:p>
@@ -10777,11 +10572,11 @@
         <w:pStyle w:val="ListParagraph"/>
         <w:numPr>
           <w:ilvl w:val="0"/>
-          <w:numId w:val="6"/>
-        </w:numPr>
-      </w:pPr>
-      <w:r>
-        <w:t>Use the CPU metrics to generate the hot routine list - routines with the highest self-CPU values.</w:t>
+          <w:numId w:val="2"/>
+        </w:numPr>
+      </w:pPr>
+      <w:r>
+        <w:t>Start &amp; end cycle counts</w:t>
       </w:r>
     </w:p>
     <w:p>
@@ -10789,38 +10584,14 @@
         <w:pStyle w:val="ListParagraph"/>
         <w:numPr>
           <w:ilvl w:val="0"/>
-          <w:numId w:val="6"/>
-        </w:numPr>
-      </w:pPr>
-      <w:r>
-        <w:t xml:space="preserve">Use the CPU metrics to generate a call tree, </w:t>
-      </w:r>
-      <w:r>
-        <w:t>w</w:t>
-      </w:r>
-      <w:r>
-        <w:t>h</w:t>
-      </w:r>
-      <w:r>
-        <w:t>ere child nodes are ordered by their</w:t>
-      </w:r>
-      <w:r>
-        <w:rPr>
-          <w:b/>
-          <w:bCs/>
-        </w:rPr>
-        <w:t xml:space="preserve"> </w:t>
-      </w:r>
-      <w:r>
-        <w:t>inclusive-CPU metrics.</w:t>
-      </w:r>
-    </w:p>
-    <w:p>
-      <w:pPr>
-        <w:pStyle w:val="Heading3"/>
-      </w:pPr>
-      <w:r>
-        <w:t>Dynamic Memory analysis</w:t>
+          <w:numId w:val="2"/>
+        </w:numPr>
+      </w:pPr>
+      <w:r>
+        <w:t xml:space="preserve">Writes before </w:t>
+      </w:r>
+      <w:r>
+        <w:t>CRTC’s screen memory scan</w:t>
       </w:r>
     </w:p>
     <w:p>
@@ -10828,23 +10599,17 @@
         <w:pStyle w:val="ListParagraph"/>
         <w:numPr>
           <w:ilvl w:val="0"/>
-          <w:numId w:val="6"/>
-        </w:numPr>
-      </w:pPr>
-      <w:r>
-        <w:t>Calculate the memory usage metrics, for a specific timespan.  Iterate</w:t>
-      </w:r>
-      <w:r>
-        <w:t>s</w:t>
-      </w:r>
-      <w:r>
-        <w:t xml:space="preserve"> over all instructions within the timespan populating a dictionary mapping memory address </w:t>
-      </w:r>
-      <w:r>
-        <w:sym w:font="Wingdings" w:char="F0E0"/>
-      </w:r>
-      <w:r>
-        <w:t xml:space="preserve"> read/write counts.</w:t>
+          <w:numId w:val="2"/>
+        </w:numPr>
+      </w:pPr>
+      <w:r>
+        <w:t xml:space="preserve">Writes </w:t>
+      </w:r>
+      <w:r>
+        <w:t xml:space="preserve">after </w:t>
+      </w:r>
+      <w:r>
+        <w:t>CRTC’s screen memory scan</w:t>
       </w:r>
     </w:p>
     <w:p>
@@ -10852,14 +10617,98 @@
         <w:pStyle w:val="ListParagraph"/>
         <w:numPr>
           <w:ilvl w:val="0"/>
-          <w:numId w:val="6"/>
-        </w:numPr>
-      </w:pPr>
-      <w:r>
-        <w:t>Use the memory access map to identify the highest and lowest memory usage lists.</w:t>
-      </w:r>
-      <w:r>
-        <w:br w:type="page"/>
+          <w:numId w:val="2"/>
+        </w:numPr>
+      </w:pPr>
+      <w:r>
+        <w:t>Display frame offset</w:t>
+      </w:r>
+    </w:p>
+    <w:p>
+      <w:pPr>
+        <w:pStyle w:val="ListParagraph"/>
+        <w:numPr>
+          <w:ilvl w:val="0"/>
+          <w:numId w:val="2"/>
+        </w:numPr>
+      </w:pPr>
+      <w:r>
+        <w:t>Display frame index</w:t>
+      </w:r>
+    </w:p>
+    <w:p>
+      <w:pPr>
+        <w:pStyle w:val="ListParagraph"/>
+        <w:numPr>
+          <w:ilvl w:val="0"/>
+          <w:numId w:val="2"/>
+        </w:numPr>
+      </w:pPr>
+      <w:r>
+        <w:t>List of DisplayFrameSpan</w:t>
+      </w:r>
+      <w:r>
+        <w:t xml:space="preserve"> where</w:t>
+      </w:r>
+      <w:r>
+        <w:t>:</w:t>
+      </w:r>
+    </w:p>
+    <w:p>
+      <w:r>
+        <w:rPr>
+          <w:b/>
+          <w:bCs/>
+        </w:rPr>
+        <w:t>DisplayFrameSpan</w:t>
+      </w:r>
+      <w:r>
+        <w:t xml:space="preserve"> – represents a display frame span</w:t>
+      </w:r>
+      <w:r>
+        <w:t>.</w:t>
+      </w:r>
+      <w:r>
+        <w:t xml:space="preserve">  Contains the following fields:</w:t>
+      </w:r>
+    </w:p>
+    <w:p>
+      <w:pPr>
+        <w:pStyle w:val="ListParagraph"/>
+        <w:numPr>
+          <w:ilvl w:val="0"/>
+          <w:numId w:val="2"/>
+        </w:numPr>
+      </w:pPr>
+      <w:r>
+        <w:t>Frame number</w:t>
+      </w:r>
+    </w:p>
+    <w:p>
+      <w:pPr>
+        <w:pStyle w:val="ListParagraph"/>
+        <w:numPr>
+          <w:ilvl w:val="0"/>
+          <w:numId w:val="2"/>
+        </w:numPr>
+      </w:pPr>
+      <w:r>
+        <w:t>Start &amp; end cycle counts</w:t>
+      </w:r>
+    </w:p>
+    <w:p>
+      <w:r>
+        <w:t>Metric iterations are generated by determining the next iteration’s start instruction index, and when this is encountered, the iteration is started.  The iteration’s end instruction index is then calculated based on the Metric’s settings.  When the iteration’s end instruction index is encountered, the iteration is created and added to the list, and the process repeats.</w:t>
+      </w:r>
+    </w:p>
+    <w:p>
+      <w:r>
+        <w:t>The only complication is that the memory ‘writes before display’ and ‘writes after display’ counts need to be calculated during processing.  Mirrored screen memory pages, storing the last display-frame number, are used to accomplish this.</w:t>
+      </w:r>
+    </w:p>
+    <w:p>
+      <w:r>
+        <w:t>One subtly is that the end of a display frame can only be determined reliably when the next display frame starts, so two sets of writes-before and writes-after accumulators are needed, with one set applied to the current display frame, and the other to the next display frame.  The set used is determined when the display frames are associated with the metric’s iterations, when their durations are known.</w:t>
       </w:r>
     </w:p>
     <w:p>
@@ -11406,7 +11255,10 @@
               <w:ind w:left="4320" w:hanging="4320"/>
             </w:pPr>
             <w:r>
-              <w:t>FrameView</w:t>
+              <w:t>Metrics</w:t>
+            </w:r>
+            <w:r>
+              <w:t>View</w:t>
             </w:r>
           </w:p>
         </w:tc>
@@ -11433,7 +11285,10 @@
               <w:jc w:val="both"/>
             </w:pPr>
             <w:r>
-              <w:t>Frame view</w:t>
+              <w:t>Metrics</w:t>
+            </w:r>
+            <w:r>
+              <w:t xml:space="preserve"> view</w:t>
             </w:r>
           </w:p>
         </w:tc>
@@ -11451,7 +11306,10 @@
               <w:ind w:left="4320" w:hanging="4320"/>
             </w:pPr>
             <w:r>
-              <w:t>FrameGridView</w:t>
+              <w:t>Metrics</w:t>
+            </w:r>
+            <w:r>
+              <w:t>GridView</w:t>
             </w:r>
           </w:p>
         </w:tc>
@@ -11478,7 +11336,10 @@
               <w:jc w:val="both"/>
             </w:pPr>
             <w:r>
-              <w:t>Frame view grid</w:t>
+              <w:t>Metrics</w:t>
+            </w:r>
+            <w:r>
+              <w:t xml:space="preserve"> view grid</w:t>
             </w:r>
           </w:p>
         </w:tc>
@@ -11616,6 +11477,9 @@
               <w:ind w:left="4320" w:hanging="4320"/>
             </w:pPr>
             <w:r>
+              <w:t>Display</w:t>
+            </w:r>
+            <w:r>
               <w:t>SettingsDialog</w:t>
             </w:r>
           </w:p>
@@ -11642,7 +11506,10 @@
               <w:ind w:left="4320" w:hanging="4320"/>
             </w:pPr>
             <w:r>
-              <w:t>Settings dialog</w:t>
+              <w:t>Display s</w:t>
+            </w:r>
+            <w:r>
+              <w:t>ettings dialog</w:t>
             </w:r>
           </w:p>
         </w:tc>
@@ -12383,27 +12250,6 @@
       </w:r>
     </w:p>
     <w:p>
-      <w:r>
-        <w:t xml:space="preserve">The </w:t>
-      </w:r>
-      <w:r>
-        <w:rPr>
-          <w:b/>
-          <w:bCs/>
-        </w:rPr>
-        <w:t>PerfReader</w:t>
-      </w:r>
-      <w:r>
-        <w:t xml:space="preserve"> class calls the zlib apis using </w:t>
-      </w:r>
-      <w:r>
-        <w:t>P/Invoke</w:t>
-      </w:r>
-      <w:r>
-        <w:t>.</w:t>
-      </w:r>
-    </w:p>
-    <w:p>
       <w:pPr>
         <w:rPr>
           <w:rFonts w:asciiTheme="majorHAnsi" w:eastAsiaTheme="majorEastAsia" w:hAnsiTheme="majorHAnsi" w:cstheme="majorBidi"/>
@@ -12412,6 +12258,25 @@
           <w:szCs w:val="40"/>
         </w:rPr>
       </w:pPr>
+      <w:r>
+        <w:t xml:space="preserve">The </w:t>
+      </w:r>
+      <w:r>
+        <w:rPr>
+          <w:b/>
+          <w:bCs/>
+        </w:rPr>
+        <w:t>PerfReader</w:t>
+      </w:r>
+      <w:r>
+        <w:t xml:space="preserve"> class calls the zlib apis using </w:t>
+      </w:r>
+      <w:r>
+        <w:t>P/Invoke</w:t>
+      </w:r>
+      <w:r>
+        <w:t>.</w:t>
+      </w:r>
       <w:r>
         <w:br w:type="page"/>
       </w:r>
@@ -16906,7 +16771,6 @@
     <w:next w:val="Normal"/>
     <w:link w:val="Heading6Char"/>
     <w:uiPriority w:val="9"/>
-    <w:semiHidden/>
     <w:unhideWhenUsed/>
     <w:qFormat/>
     <w:rsid w:val="00A461C6"/>
@@ -17082,7 +16946,6 @@
     <w:basedOn w:val="DefaultParagraphFont"/>
     <w:link w:val="Heading6"/>
     <w:uiPriority w:val="9"/>
-    <w:semiHidden/>
     <w:rsid w:val="00A461C6"/>
     <w:rPr>
       <w:rFonts w:eastAsiaTheme="majorEastAsia" w:cstheme="majorBidi"/>

</xml_diff>

<commit_message>
Updated help text.  This is now displayed as a PDF using the WebView2 control.  Also updated the PlatformToolset to 'v143', and the .Net TargetFramework to 'net10.0-windows8.0' which support the WebView2 control and dark mode
</commit_message>
<xml_diff>
--- a/docs/BeebPerf.docx
+++ b/docs/BeebPerf.docx
@@ -1915,10 +1915,7 @@
         <w:t xml:space="preserve">  </w:t>
       </w:r>
       <w:r>
-        <w:t xml:space="preserve">The utility </w:t>
-      </w:r>
-      <w:r>
-        <w:t xml:space="preserve">can extract labels from listing files created </w:t>
+        <w:t xml:space="preserve">The utility can extract labels from listing files created </w:t>
       </w:r>
       <w:r>
         <w:t xml:space="preserve">with </w:t>
@@ -2006,19 +2003,7 @@
         <w:rPr>
           <w:color w:val="FFFFFF" w:themeColor="background1"/>
         </w:rPr>
-        <w:t xml:space="preserve">-o </w:t>
-      </w:r>
-      <w:r>
-        <w:rPr>
-          <w:color w:val="FFFFFF" w:themeColor="background1"/>
-        </w:rPr>
-        <w:t>labels.txt</w:t>
-      </w:r>
-      <w:r>
-        <w:rPr>
-          <w:color w:val="FFFFFF" w:themeColor="background1"/>
-        </w:rPr>
-        <w:t xml:space="preserve">  listing</w:t>
+        <w:t>-o labels.txt  listing</w:t>
       </w:r>
       <w:r>
         <w:rPr>
@@ -2274,7 +2259,55 @@
     </w:p>
     <w:p>
       <w:r>
+        <w:rPr>
+          <w:noProof/>
+        </w:rPr>
         <w:lastRenderedPageBreak/>
+        <w:drawing>
+          <wp:inline distT="0" distB="0" distL="0" distR="0" wp14:anchorId="46CA8D7C" wp14:editId="04848540">
+            <wp:extent cx="5943600" cy="393065"/>
+            <wp:effectExtent l="0" t="0" r="0" b="6985"/>
+            <wp:docPr id="2022272775" name="Picture 1"/>
+            <wp:cNvGraphicFramePr>
+              <a:graphicFrameLocks xmlns:a="http://schemas.openxmlformats.org/drawingml/2006/main" noChangeAspect="1"/>
+            </wp:cNvGraphicFramePr>
+            <a:graphic xmlns:a="http://schemas.openxmlformats.org/drawingml/2006/main">
+              <a:graphicData uri="http://schemas.openxmlformats.org/drawingml/2006/picture">
+                <pic:pic xmlns:pic="http://schemas.openxmlformats.org/drawingml/2006/picture">
+                  <pic:nvPicPr>
+                    <pic:cNvPr id="2022272775" name="Picture 2022272775"/>
+                    <pic:cNvPicPr/>
+                  </pic:nvPicPr>
+                  <pic:blipFill>
+                    <a:blip r:embed="rId14">
+                      <a:extLst>
+                        <a:ext uri="{28A0092B-C50C-407E-A947-70E740481C1C}">
+                          <a14:useLocalDpi xmlns:a14="http://schemas.microsoft.com/office/drawing/2010/main" val="0"/>
+                        </a:ext>
+                      </a:extLst>
+                    </a:blip>
+                    <a:stretch>
+                      <a:fillRect/>
+                    </a:stretch>
+                  </pic:blipFill>
+                  <pic:spPr>
+                    <a:xfrm>
+                      <a:off x="0" y="0"/>
+                      <a:ext cx="5943600" cy="393065"/>
+                    </a:xfrm>
+                    <a:prstGeom prst="rect">
+                      <a:avLst/>
+                    </a:prstGeom>
+                  </pic:spPr>
+                </pic:pic>
+              </a:graphicData>
+            </a:graphic>
+          </wp:inline>
+        </w:drawing>
+      </w:r>
+    </w:p>
+    <w:p>
+      <w:r>
         <w:t>The toolbar contains the following buttons</w:t>
       </w:r>
       <w:r>
@@ -2669,9 +2702,6 @@
       </w:r>
       <w:r>
         <w:t>Timeline</w:t>
-      </w:r>
-      <w:r>
-        <w:t xml:space="preserve"> panel</w:t>
       </w:r>
     </w:p>
     <w:p>
@@ -2695,7 +2725,7 @@
                     <pic:cNvPicPr/>
                   </pic:nvPicPr>
                   <pic:blipFill>
-                    <a:blip r:embed="rId14"/>
+                    <a:blip r:embed="rId15"/>
                     <a:stretch>
                       <a:fillRect/>
                     </a:stretch>
@@ -2856,7 +2886,7 @@
                     <pic:cNvPicPr/>
                   </pic:nvPicPr>
                   <pic:blipFill>
-                    <a:blip r:embed="rId15"/>
+                    <a:blip r:embed="rId16"/>
                     <a:stretch>
                       <a:fillRect/>
                     </a:stretch>
@@ -3116,7 +3146,7 @@
                     <pic:cNvPicPr/>
                   </pic:nvPicPr>
                   <pic:blipFill>
-                    <a:blip r:embed="rId16"/>
+                    <a:blip r:embed="rId17"/>
                     <a:stretch>
                       <a:fillRect/>
                     </a:stretch>
@@ -3252,7 +3282,7 @@
                     <pic:cNvPicPr/>
                   </pic:nvPicPr>
                   <pic:blipFill>
-                    <a:blip r:embed="rId17"/>
+                    <a:blip r:embed="rId18"/>
                     <a:stretch>
                       <a:fillRect/>
                     </a:stretch>
@@ -3317,7 +3347,7 @@
                     <pic:cNvPicPr/>
                   </pic:nvPicPr>
                   <pic:blipFill>
-                    <a:blip r:embed="rId18"/>
+                    <a:blip r:embed="rId19"/>
                     <a:stretch>
                       <a:fillRect/>
                     </a:stretch>
@@ -3780,6 +3810,9 @@
     <w:p>
       <w:pPr>
         <w:pStyle w:val="Callout"/>
+        <w:pBdr>
+          <w:bottom w:val="single" w:sz="4" w:space="0" w:color="auto"/>
+        </w:pBdr>
       </w:pPr>
       <w:r>
         <w:t xml:space="preserve">A </w:t>
@@ -3883,6 +3916,9 @@
     <w:p>
       <w:pPr>
         <w:pStyle w:val="Callout"/>
+        <w:pBdr>
+          <w:bottom w:val="single" w:sz="4" w:space="0" w:color="auto"/>
+        </w:pBdr>
       </w:pPr>
       <w:r>
         <w:t xml:space="preserve">A </w:t>
@@ -3941,7 +3977,7 @@
                     <pic:cNvPicPr/>
                   </pic:nvPicPr>
                   <pic:blipFill>
-                    <a:blip r:embed="rId19"/>
+                    <a:blip r:embed="rId20"/>
                     <a:stretch>
                       <a:fillRect/>
                     </a:stretch>
@@ -4108,7 +4144,7 @@
                     <pic:cNvPicPr/>
                   </pic:nvPicPr>
                   <pic:blipFill>
-                    <a:blip r:embed="rId20"/>
+                    <a:blip r:embed="rId21"/>
                     <a:stretch>
                       <a:fillRect/>
                     </a:stretch>
@@ -4225,7 +4261,7 @@
                     <pic:cNvPicPr/>
                   </pic:nvPicPr>
                   <pic:blipFill>
-                    <a:blip r:embed="rId21"/>
+                    <a:blip r:embed="rId22"/>
                     <a:stretch>
                       <a:fillRect/>
                     </a:stretch>
@@ -4376,7 +4412,7 @@
                     <pic:cNvPicPr/>
                   </pic:nvPicPr>
                   <pic:blipFill>
-                    <a:blip r:embed="rId22"/>
+                    <a:blip r:embed="rId23"/>
                     <a:stretch>
                       <a:fillRect/>
                     </a:stretch>
@@ -4552,6 +4588,20 @@
         <w:pStyle w:val="Callout"/>
       </w:pPr>
       <w:r>
+        <w:t>Ideally</w:t>
+      </w:r>
+      <w:r>
+        <w:t>,</w:t>
+      </w:r>
+      <w:r>
+        <w:t xml:space="preserve"> the most frequently accessed memory addresses should be in zero-page.</w:t>
+      </w:r>
+    </w:p>
+    <w:p>
+      <w:pPr>
+        <w:pStyle w:val="Callout"/>
+      </w:pPr>
+      <w:r>
         <w:t xml:space="preserve">Inspecting the highest accessed memory addresses is a useful exercise as it may reveal that certain addresses are accessed </w:t>
       </w:r>
       <w:r>
@@ -4677,7 +4727,7 @@
                     <pic:cNvPicPr/>
                   </pic:nvPicPr>
                   <pic:blipFill>
-                    <a:blip r:embed="rId23"/>
+                    <a:blip r:embed="rId24"/>
                     <a:stretch>
                       <a:fillRect/>
                     </a:stretch>
@@ -4737,11 +4787,6 @@
       </w:r>
     </w:p>
     <w:p>
-      <w:r>
-        <w:t>So ideally the most frequently accessed memory addresses should be in zero-page.</w:t>
-      </w:r>
-    </w:p>
-    <w:p>
       <w:pPr>
         <w:pStyle w:val="Heading3"/>
       </w:pPr>
@@ -4779,7 +4824,7 @@
                     <pic:cNvPicPr/>
                   </pic:nvPicPr>
                   <pic:blipFill>
-                    <a:blip r:embed="rId24"/>
+                    <a:blip r:embed="rId25"/>
                     <a:stretch>
                       <a:fillRect/>
                     </a:stretch>
@@ -4933,18 +4978,18 @@
     </w:p>
     <w:p>
       <w:r>
+        <w:t xml:space="preserve">The status bar </w:t>
+      </w:r>
+      <w:r>
+        <w:t xml:space="preserve">displays </w:t>
+      </w:r>
+      <w:r>
+        <w:t>the percentage of iterations that exceed the threshold.</w:t>
+      </w:r>
+    </w:p>
+    <w:p>
+      <w:r>
         <w:lastRenderedPageBreak/>
-        <w:t xml:space="preserve">The status bar </w:t>
-      </w:r>
-      <w:r>
-        <w:t xml:space="preserve">displays </w:t>
-      </w:r>
-      <w:r>
-        <w:t>the percentage of iterations that exceed the threshold.</w:t>
-      </w:r>
-    </w:p>
-    <w:p>
-      <w:r>
         <w:t xml:space="preserve">The </w:t>
       </w:r>
       <w:r>
@@ -5062,7 +5107,7 @@
                     <pic:cNvPicPr/>
                   </pic:nvPicPr>
                   <pic:blipFill>
-                    <a:blip r:embed="rId25"/>
+                    <a:blip r:embed="rId26"/>
                     <a:stretch>
                       <a:fillRect/>
                     </a:stretch>
@@ -5194,51 +5239,51 @@
     </w:p>
     <w:p>
       <w:r>
+        <w:t xml:space="preserve">V-Sync alignment issues occur when </w:t>
+      </w:r>
+      <w:r>
+        <w:t xml:space="preserve">preceding iterations </w:t>
+      </w:r>
+      <w:r>
+        <w:t xml:space="preserve">take </w:t>
+      </w:r>
+      <w:r>
+        <w:t>longer tha</w:t>
+      </w:r>
+      <w:r>
+        <w:t>n</w:t>
+      </w:r>
+      <w:r>
+        <w:t xml:space="preserve"> 1/50</w:t>
+      </w:r>
+      <w:r>
+        <w:rPr>
+          <w:vertAlign w:val="superscript"/>
+        </w:rPr>
+        <w:t>th</w:t>
+      </w:r>
+      <w:r>
+        <w:t xml:space="preserve"> of a second</w:t>
+      </w:r>
+      <w:r>
+        <w:t xml:space="preserve">, causing the </w:t>
+      </w:r>
+      <w:r>
+        <w:t xml:space="preserve">next </w:t>
+      </w:r>
+      <w:r>
+        <w:t xml:space="preserve">game loop </w:t>
+      </w:r>
+      <w:r>
+        <w:t xml:space="preserve">iteration </w:t>
+      </w:r>
+      <w:r>
+        <w:t>to start sometime after v-sync occurred.</w:t>
+      </w:r>
+    </w:p>
+    <w:p>
+      <w:r>
         <w:lastRenderedPageBreak/>
-        <w:t xml:space="preserve">V-Sync alignment issues occur when </w:t>
-      </w:r>
-      <w:r>
-        <w:t xml:space="preserve">preceding iterations </w:t>
-      </w:r>
-      <w:r>
-        <w:t xml:space="preserve">take </w:t>
-      </w:r>
-      <w:r>
-        <w:t>longer tha</w:t>
-      </w:r>
-      <w:r>
-        <w:t>n</w:t>
-      </w:r>
-      <w:r>
-        <w:t xml:space="preserve"> 1/50</w:t>
-      </w:r>
-      <w:r>
-        <w:rPr>
-          <w:vertAlign w:val="superscript"/>
-        </w:rPr>
-        <w:t>th</w:t>
-      </w:r>
-      <w:r>
-        <w:t xml:space="preserve"> of a second</w:t>
-      </w:r>
-      <w:r>
-        <w:t xml:space="preserve">, causing the </w:t>
-      </w:r>
-      <w:r>
-        <w:t xml:space="preserve">next </w:t>
-      </w:r>
-      <w:r>
-        <w:t xml:space="preserve">game loop </w:t>
-      </w:r>
-      <w:r>
-        <w:t xml:space="preserve">iteration </w:t>
-      </w:r>
-      <w:r>
-        <w:t>to start sometime after v-sync occurred.</w:t>
-      </w:r>
-    </w:p>
-    <w:p>
-      <w:r>
         <w:t>Display tearing occurs when screen memory writes occur after the CRTC’s screen memory scan</w:t>
       </w:r>
       <w:r>
@@ -5462,7 +5507,7 @@
                     <pic:cNvPicPr/>
                   </pic:nvPicPr>
                   <pic:blipFill>
-                    <a:blip r:embed="rId26"/>
+                    <a:blip r:embed="rId27"/>
                     <a:stretch>
                       <a:fillRect/>
                     </a:stretch>
@@ -5512,23 +5557,23 @@
         <w:pStyle w:val="Heading3"/>
       </w:pPr>
       <w:r>
+        <w:t xml:space="preserve">The </w:t>
+      </w:r>
+      <w:r>
+        <w:t>Code panel</w:t>
+      </w:r>
+    </w:p>
+    <w:p>
+      <w:r>
+        <w:t>Used to view the performance of a routine’s instructions.</w:t>
+      </w:r>
+    </w:p>
+    <w:p>
+      <w:r>
+        <w:rPr>
+          <w:noProof/>
+        </w:rPr>
         <w:lastRenderedPageBreak/>
-        <w:t xml:space="preserve">The </w:t>
-      </w:r>
-      <w:r>
-        <w:t>Code panel</w:t>
-      </w:r>
-    </w:p>
-    <w:p>
-      <w:r>
-        <w:t>Used to view the performance of a routine’s instructions.</w:t>
-      </w:r>
-    </w:p>
-    <w:p>
-      <w:r>
-        <w:rPr>
-          <w:noProof/>
-        </w:rPr>
         <w:drawing>
           <wp:inline distT="0" distB="0" distL="0" distR="0" wp14:anchorId="7E94AD81" wp14:editId="355A189F">
             <wp:extent cx="5943600" cy="2090420"/>
@@ -5545,7 +5590,7 @@
                     <pic:cNvPicPr/>
                   </pic:nvPicPr>
                   <pic:blipFill>
-                    <a:blip r:embed="rId27"/>
+                    <a:blip r:embed="rId28"/>
                     <a:stretch>
                       <a:fillRect/>
                     </a:stretch>
@@ -5968,7 +6013,6 @@
           </w:tcPr>
           <w:p>
             <w:r>
-              <w:lastRenderedPageBreak/>
               <w:t>Execution count</w:t>
             </w:r>
           </w:p>
@@ -5994,6 +6038,7 @@
     <w:p/>
     <w:p>
       <w:r>
+        <w:lastRenderedPageBreak/>
         <w:t xml:space="preserve">The </w:t>
       </w:r>
       <w:r>
@@ -6362,7 +6407,7 @@
                     <pic:cNvPicPr/>
                   </pic:nvPicPr>
                   <pic:blipFill>
-                    <a:blip r:embed="rId28"/>
+                    <a:blip r:embed="rId29"/>
                     <a:stretch>
                       <a:fillRect/>
                     </a:stretch>
@@ -6464,7 +6509,7 @@
                     <pic:cNvPicPr/>
                   </pic:nvPicPr>
                   <pic:blipFill>
-                    <a:blip r:embed="rId29"/>
+                    <a:blip r:embed="rId30"/>
                     <a:stretch>
                       <a:fillRect/>
                     </a:stretch>
@@ -13456,7 +13501,7 @@
         <w:t>Updated PlatformToolset to v14</w:t>
       </w:r>
       <w:r>
-        <w:t>5</w:t>
+        <w:t>3</w:t>
       </w:r>
       <w:r>
         <w:t>.</w:t>
@@ -13516,7 +13561,13 @@
         <w:t>Directories</w:t>
       </w:r>
       <w:r>
-        <w:t xml:space="preserve"> (as this is not included in the v142 Platform Toolset)</w:t>
+        <w:t xml:space="preserve"> (as this is not included in the v14</w:t>
+      </w:r>
+      <w:r>
+        <w:t>3</w:t>
+      </w:r>
+      <w:r>
+        <w:t xml:space="preserve"> Platform Toolset)</w:t>
       </w:r>
     </w:p>
     <w:p>
@@ -13546,7 +13597,13 @@
         <w:t>Directories</w:t>
       </w:r>
       <w:r>
-        <w:t xml:space="preserve"> (as this is not included in the v142 Platform Toolset)</w:t>
+        <w:t xml:space="preserve"> (as this is not included in the v14</w:t>
+      </w:r>
+      <w:r>
+        <w:t>3</w:t>
+      </w:r>
+      <w:r>
+        <w:t xml:space="preserve"> Platform Toolset)</w:t>
       </w:r>
     </w:p>
     <w:p>
@@ -13676,12 +13733,12 @@
     </w:p>
     <w:p/>
     <w:sectPr>
-      <w:headerReference w:type="even" r:id="rId30"/>
-      <w:headerReference w:type="default" r:id="rId31"/>
-      <w:footerReference w:type="even" r:id="rId32"/>
-      <w:footerReference w:type="default" r:id="rId33"/>
-      <w:headerReference w:type="first" r:id="rId34"/>
-      <w:footerReference w:type="first" r:id="rId35"/>
+      <w:headerReference w:type="even" r:id="rId31"/>
+      <w:headerReference w:type="default" r:id="rId32"/>
+      <w:footerReference w:type="even" r:id="rId33"/>
+      <w:footerReference w:type="default" r:id="rId34"/>
+      <w:headerReference w:type="first" r:id="rId35"/>
+      <w:footerReference w:type="first" r:id="rId36"/>
       <w:pgSz w:w="12240" w:h="15840"/>
       <w:pgMar w:top="1440" w:right="1440" w:bottom="1440" w:left="1440" w:header="720" w:footer="720" w:gutter="0"/>
       <w:cols w:space="720"/>

</xml_diff>

<commit_message>
Updated app version to 1.1.0 and the .perf format to 2.0.
</commit_message>
<xml_diff>
--- a/docs/BeebPerf.docx
+++ b/docs/BeebPerf.docx
@@ -483,7 +483,6 @@
       <w:r>
         <w:t xml:space="preserve">, </w:t>
       </w:r>
-      <w:proofErr w:type="spellStart"/>
       <w:r>
         <w:rPr>
           <w:b/>
@@ -491,7 +490,6 @@
         </w:rPr>
         <w:t>BeebPerf</w:t>
       </w:r>
-      <w:proofErr w:type="spellEnd"/>
       <w:r>
         <w:t xml:space="preserve">, </w:t>
       </w:r>
@@ -556,22 +554,12 @@
         <w:pStyle w:val="Heading1"/>
       </w:pPr>
       <w:r>
-        <w:t xml:space="preserve">Building </w:t>
-      </w:r>
-      <w:proofErr w:type="spellStart"/>
-      <w:r>
-        <w:t>BeebPerf</w:t>
-      </w:r>
-      <w:proofErr w:type="spellEnd"/>
-    </w:p>
-    <w:p>
-      <w:proofErr w:type="spellStart"/>
-      <w:r>
-        <w:t>BeebPerf</w:t>
-      </w:r>
-      <w:proofErr w:type="spellEnd"/>
-      <w:r>
-        <w:t xml:space="preserve"> can be built using Visual Studio 2022 or 2026 using the following instructions:</w:t>
+        <w:t>Building BeebPerf</w:t>
+      </w:r>
+    </w:p>
+    <w:p>
+      <w:r>
+        <w:t>BeebPerf can be built using Visual Studio 2022 or 2026 using the following instructions:</w:t>
       </w:r>
     </w:p>
     <w:p>
@@ -721,7 +709,6 @@
       <w:r>
         <w:t xml:space="preserve">menu item, clone the </w:t>
       </w:r>
-      <w:proofErr w:type="spellStart"/>
       <w:r>
         <w:rPr>
           <w:b/>
@@ -729,7 +716,6 @@
         </w:rPr>
         <w:t>BeebPerf</w:t>
       </w:r>
-      <w:proofErr w:type="spellEnd"/>
       <w:r>
         <w:t xml:space="preserve"> repository: </w:t>
       </w:r>
@@ -738,35 +724,7 @@
           <w:rPr>
             <w:rStyle w:val="Hyperlink"/>
           </w:rPr>
-          <w:t>‘https://github.com/</w:t>
-        </w:r>
-        <w:proofErr w:type="spellStart"/>
-        <w:r>
-          <w:rPr>
-            <w:rStyle w:val="Hyperlink"/>
-          </w:rPr>
-          <w:t>stardot</w:t>
-        </w:r>
-        <w:proofErr w:type="spellEnd"/>
-        <w:r>
-          <w:rPr>
-            <w:rStyle w:val="Hyperlink"/>
-          </w:rPr>
-          <w:t>/</w:t>
-        </w:r>
-        <w:proofErr w:type="spellStart"/>
-        <w:r>
-          <w:rPr>
-            <w:rStyle w:val="Hyperlink"/>
-          </w:rPr>
-          <w:t>beebem-windows.git</w:t>
-        </w:r>
-        <w:proofErr w:type="spellEnd"/>
-        <w:r>
-          <w:rPr>
-            <w:rStyle w:val="Hyperlink"/>
-          </w:rPr>
-          <w:t>’</w:t>
+          <w:t>‘https://github.com/stardot/beebem-windows.git’</w:t>
         </w:r>
       </w:hyperlink>
       <w:r>
@@ -786,7 +744,6 @@
         <w:lastRenderedPageBreak/>
         <w:t xml:space="preserve">If you are using Visual Studio 2022, you will need to update the </w:t>
       </w:r>
-      <w:proofErr w:type="spellStart"/>
       <w:r>
         <w:rPr>
           <w:b/>
@@ -794,7 +751,6 @@
         </w:rPr>
         <w:t>Zlib</w:t>
       </w:r>
-      <w:proofErr w:type="spellEnd"/>
       <w:r>
         <w:t xml:space="preserve"> project</w:t>
       </w:r>
@@ -854,7 +810,6 @@
       <w:r>
         <w:t xml:space="preserve">Run </w:t>
       </w:r>
-      <w:proofErr w:type="spellStart"/>
       <w:r>
         <w:rPr>
           <w:b/>
@@ -869,31 +824,14 @@
         </w:rPr>
         <w:t>Perf</w:t>
       </w:r>
-      <w:proofErr w:type="spellEnd"/>
-      <w:r>
-        <w:t xml:space="preserve">.   You may need to set the </w:t>
-      </w:r>
-      <w:proofErr w:type="spellStart"/>
-      <w:r>
-        <w:t>BeebPerf</w:t>
-      </w:r>
-      <w:proofErr w:type="spellEnd"/>
-      <w:r>
-        <w:t xml:space="preserve"> project as the Startup Project. </w:t>
+      <w:r>
+        <w:t xml:space="preserve">.   You may need to set the BeebPerf project as the Startup Project. </w:t>
       </w:r>
       <w:r>
         <w:t xml:space="preserve"> </w:t>
       </w:r>
       <w:r>
-        <w:t xml:space="preserve">This can be achieved by right-clicking on the </w:t>
-      </w:r>
-      <w:proofErr w:type="spellStart"/>
-      <w:r>
-        <w:t>BeebPerf</w:t>
-      </w:r>
-      <w:proofErr w:type="spellEnd"/>
-      <w:r>
-        <w:t xml:space="preserve"> project and selecting ‘</w:t>
+        <w:t>This can be achieved by right-clicking on the BeebPerf project and selecting ‘</w:t>
       </w:r>
       <w:r>
         <w:rPr>
@@ -1257,21 +1195,8 @@
         <w:t xml:space="preserve"> </w:t>
       </w:r>
       <w:r>
-        <w:t xml:space="preserve">needed for </w:t>
-      </w:r>
-      <w:proofErr w:type="spellStart"/>
-      <w:r>
-        <w:t>afxres.h</w:t>
-      </w:r>
-      <w:proofErr w:type="spellEnd"/>
-      <w:r>
-        <w:t>/</w:t>
-      </w:r>
-      <w:proofErr w:type="spellStart"/>
-      <w:r>
-        <w:t>rc</w:t>
-      </w:r>
-      <w:proofErr w:type="spellEnd"/>
+        <w:t>needed for afxres.h/rc</w:t>
+      </w:r>
     </w:p>
     <w:p>
       <w:pPr>
@@ -1294,53 +1219,48 @@
         <w:spacing w:before="120" w:after="0"/>
         <w:contextualSpacing w:val="0"/>
       </w:pPr>
-      <w:proofErr w:type="gramStart"/>
       <w:r>
         <w:t xml:space="preserve">Using </w:t>
       </w:r>
       <w:r>
-        <w:t xml:space="preserve"> the</w:t>
-      </w:r>
-      <w:proofErr w:type="gramEnd"/>
-      <w:r>
+        <w:t xml:space="preserve"> the </w:t>
+      </w:r>
+      <w:r>
+        <w:rPr>
+          <w:b/>
+          <w:bCs/>
+        </w:rPr>
+        <w:t xml:space="preserve">Git </w:t>
+      </w:r>
+      <w:r>
+        <w:rPr>
+          <w:b/>
+          <w:bCs/>
+        </w:rPr>
+        <w:sym w:font="Wingdings" w:char="F0E0"/>
+      </w:r>
+      <w:r>
+        <w:rPr>
+          <w:b/>
+          <w:bCs/>
+        </w:rPr>
+        <w:t xml:space="preserve"> Clone Repository</w:t>
+      </w:r>
+      <w:r>
+        <w:rPr>
+          <w:b/>
+          <w:bCs/>
+        </w:rPr>
+        <w:t>…</w:t>
+      </w:r>
+      <w:r>
+        <w:rPr>
+          <w:b/>
+          <w:bCs/>
+        </w:rPr>
         <w:t xml:space="preserve"> </w:t>
       </w:r>
       <w:r>
-        <w:rPr>
-          <w:b/>
-          <w:bCs/>
-        </w:rPr>
-        <w:t xml:space="preserve">Git </w:t>
-      </w:r>
-      <w:r>
-        <w:rPr>
-          <w:b/>
-          <w:bCs/>
-        </w:rPr>
-        <w:sym w:font="Wingdings" w:char="F0E0"/>
-      </w:r>
-      <w:r>
-        <w:rPr>
-          <w:b/>
-          <w:bCs/>
-        </w:rPr>
-        <w:t xml:space="preserve"> Clone Repository</w:t>
-      </w:r>
-      <w:r>
-        <w:rPr>
-          <w:b/>
-          <w:bCs/>
-        </w:rPr>
-        <w:t>…</w:t>
-      </w:r>
-      <w:r>
-        <w:rPr>
-          <w:b/>
-          <w:bCs/>
-        </w:rPr>
-        <w:t xml:space="preserve"> </w:t>
-      </w:r>
-      <w:r>
         <w:t>menu item</w:t>
       </w:r>
       <w:r>
@@ -1363,21 +1283,8 @@
         <w:t>‘</w:t>
       </w:r>
       <w:r>
-        <w:t>https://github.com/</w:t>
-      </w:r>
-      <w:proofErr w:type="spellStart"/>
-      <w:r>
-        <w:t>stardot</w:t>
-      </w:r>
-      <w:proofErr w:type="spellEnd"/>
-      <w:r>
-        <w:t>/</w:t>
-      </w:r>
-      <w:proofErr w:type="spellStart"/>
-      <w:r>
-        <w:t>beebem-windows.git</w:t>
-      </w:r>
-      <w:proofErr w:type="spellEnd"/>
+        <w:t>https://github.com/stardot/beebem-windows.git</w:t>
+      </w:r>
       <w:r>
         <w:t>’</w:t>
       </w:r>
@@ -1487,48 +1394,24 @@
         </w:rPr>
         <w:t xml:space="preserve">   </w:t>
       </w:r>
-      <w:proofErr w:type="gramStart"/>
       <w:r>
         <w:rPr>
           <w:color w:val="FFFFFF" w:themeColor="background1"/>
         </w:rPr>
-        <w:t>git</w:t>
-      </w:r>
-      <w:proofErr w:type="gramEnd"/>
+        <w:t xml:space="preserve">git </w:t>
+      </w:r>
       <w:r>
         <w:rPr>
           <w:color w:val="FFFFFF" w:themeColor="background1"/>
         </w:rPr>
-        <w:t xml:space="preserve"> </w:t>
+        <w:t>apply ..\</w:t>
       </w:r>
       <w:r>
         <w:rPr>
           <w:color w:val="FFFFFF" w:themeColor="background1"/>
         </w:rPr>
-        <w:t>apply ..\</w:t>
-      </w:r>
-      <w:proofErr w:type="spellStart"/>
-      <w:r>
-        <w:rPr>
-          <w:color w:val="FFFFFF" w:themeColor="background1"/>
-        </w:rPr>
-        <w:t>beebperf</w:t>
-      </w:r>
-      <w:proofErr w:type="spellEnd"/>
-      <w:r>
-        <w:rPr>
-          <w:color w:val="FFFFFF" w:themeColor="background1"/>
-        </w:rPr>
-        <w:t>\</w:t>
-      </w:r>
-      <w:proofErr w:type="spellStart"/>
-      <w:r>
-        <w:rPr>
-          <w:color w:val="FFFFFF" w:themeColor="background1"/>
-        </w:rPr>
-        <w:t>beebem_changelist.diff</w:t>
-      </w:r>
-      <w:proofErr w:type="spellEnd"/>
+        <w:t>beebperf\beebem_changelist.diff</w:t>
+      </w:r>
     </w:p>
     <w:p>
       <w:pPr>
@@ -1550,7 +1433,6 @@
       <w:r>
         <w:t xml:space="preserve">and </w:t>
       </w:r>
-      <w:proofErr w:type="gramStart"/>
       <w:r>
         <w:rPr>
           <w:b/>
@@ -1565,7 +1447,6 @@
         </w:rPr>
         <w:t>ebuild</w:t>
       </w:r>
-      <w:proofErr w:type="gramEnd"/>
       <w:r>
         <w:rPr>
           <w:b/>
@@ -1798,16 +1679,11 @@
       <w:r>
         <w:t xml:space="preserve">Microsoft Visual C++ 2010 </w:t>
       </w:r>
-      <w:proofErr w:type="spellStart"/>
       <w:r>
         <w:t>r</w:t>
       </w:r>
       <w:r>
-        <w:t>edistributables</w:t>
-      </w:r>
-      <w:proofErr w:type="spellEnd"/>
-      <w:r>
-        <w:t xml:space="preserve"> are installed on the system.</w:t>
+        <w:t>edistributables are installed on the system.</w:t>
       </w:r>
       <w:r>
         <w:t xml:space="preserve"> </w:t>
@@ -1819,23 +1695,10 @@
         <w:t xml:space="preserve">the </w:t>
       </w:r>
       <w:r>
-        <w:t xml:space="preserve">newer VC++ 2010 x86/x64 </w:t>
-      </w:r>
-      <w:proofErr w:type="spellStart"/>
-      <w:proofErr w:type="gramStart"/>
-      <w:r>
-        <w:t>redistributables</w:t>
-      </w:r>
-      <w:proofErr w:type="spellEnd"/>
-      <w:r>
-        <w:t xml:space="preserve">, </w:t>
-      </w:r>
-      <w:r>
-        <w:t>and</w:t>
-      </w:r>
-      <w:proofErr w:type="gramEnd"/>
-      <w:r>
-        <w:t xml:space="preserve"> </w:t>
+        <w:t xml:space="preserve">newer VC++ 2010 x86/x64 redistributables, </w:t>
+      </w:r>
+      <w:r>
+        <w:t xml:space="preserve">and </w:t>
       </w:r>
       <w:r>
         <w:t xml:space="preserve">then </w:t>
@@ -1983,15 +1846,7 @@
         <w:t xml:space="preserve">ccess) </w:t>
       </w:r>
       <w:r>
-        <w:t xml:space="preserve">blocks </w:t>
-      </w:r>
-      <w:proofErr w:type="gramStart"/>
-      <w:r>
-        <w:t>writes</w:t>
-      </w:r>
-      <w:proofErr w:type="gramEnd"/>
-      <w:r>
-        <w:t xml:space="preserve"> to the documents folder, which is where BeebEm stores its preferences. </w:t>
+        <w:t xml:space="preserve">blocks writes to the documents folder, which is where BeebEm stores its preferences. </w:t>
       </w:r>
     </w:p>
     <w:p>
@@ -2121,7 +1976,6 @@
       <w:r>
         <w:t xml:space="preserve">seconds to load in </w:t>
       </w:r>
-      <w:proofErr w:type="spellStart"/>
       <w:r>
         <w:rPr>
           <w:b/>
@@ -2129,7 +1983,6 @@
         </w:rPr>
         <w:t>BeebPerf</w:t>
       </w:r>
-      <w:proofErr w:type="spellEnd"/>
       <w:r>
         <w:t>.</w:t>
       </w:r>
@@ -2159,21 +2012,12 @@
       <w:r>
         <w:t xml:space="preserve"> </w:t>
       </w:r>
-      <w:proofErr w:type="spellStart"/>
-      <w:r>
-        <w:rPr>
-          <w:b/>
-          <w:bCs/>
-        </w:rPr>
-        <w:t>BeebPerf</w:t>
-      </w:r>
-      <w:proofErr w:type="spellEnd"/>
-      <w:r>
-        <w:rPr>
-          <w:b/>
-          <w:bCs/>
-        </w:rPr>
-        <w:t xml:space="preserve"> </w:t>
+      <w:r>
+        <w:rPr>
+          <w:b/>
+          <w:bCs/>
+        </w:rPr>
+        <w:t xml:space="preserve">BeebPerf </w:t>
       </w:r>
       <w:r>
         <w:t>can</w:t>
@@ -2250,30 +2094,21 @@
           <w:b/>
           <w:bCs/>
         </w:rPr>
+        <w:t>-DebugLabels</w:t>
+      </w:r>
+      <w:r>
+        <w:rPr>
+          <w:b/>
+          <w:bCs/>
+        </w:rPr>
+        <w:t xml:space="preserve"> &lt;file&gt;</w:t>
+      </w:r>
+      <w:r>
+        <w:t xml:space="preserve"> command</w:t>
+      </w:r>
+      <w:r>
         <w:t>-</w:t>
       </w:r>
-      <w:proofErr w:type="spellStart"/>
-      <w:r>
-        <w:rPr>
-          <w:b/>
-          <w:bCs/>
-        </w:rPr>
-        <w:t>DebugLabels</w:t>
-      </w:r>
-      <w:proofErr w:type="spellEnd"/>
-      <w:r>
-        <w:rPr>
-          <w:b/>
-          <w:bCs/>
-        </w:rPr>
-        <w:t xml:space="preserve"> &lt;file&gt;</w:t>
-      </w:r>
-      <w:r>
-        <w:t xml:space="preserve"> command</w:t>
-      </w:r>
-      <w:r>
-        <w:t>-</w:t>
-      </w:r>
       <w:r>
         <w:t xml:space="preserve">line option </w:t>
       </w:r>
@@ -2289,7 +2124,6 @@
       <w:r>
         <w:t xml:space="preserve">the </w:t>
       </w:r>
-      <w:proofErr w:type="spellStart"/>
       <w:r>
         <w:rPr>
           <w:b/>
@@ -2297,7 +2131,6 @@
         </w:rPr>
         <w:t>BeebPerf</w:t>
       </w:r>
-      <w:proofErr w:type="spellEnd"/>
       <w:r>
         <w:rPr>
           <w:b/>
@@ -2344,17 +2177,8 @@
           <w:b/>
           <w:bCs/>
         </w:rPr>
-        <w:t>-</w:t>
-      </w:r>
-      <w:proofErr w:type="spellStart"/>
-      <w:r>
-        <w:rPr>
-          <w:b/>
-          <w:bCs/>
-        </w:rPr>
-        <w:t>DebugLabels</w:t>
-      </w:r>
-      <w:proofErr w:type="spellEnd"/>
+        <w:t>-DebugLabels</w:t>
+      </w:r>
       <w:r>
         <w:t xml:space="preserve"> option include:</w:t>
       </w:r>
@@ -2429,7 +2253,6 @@
       <w:r>
         <w:t xml:space="preserve">Labels files generated using the </w:t>
       </w:r>
-      <w:proofErr w:type="spellStart"/>
       <w:r>
         <w:rPr>
           <w:b/>
@@ -2437,7 +2260,6 @@
         </w:rPr>
         <w:t>ExtractLabels</w:t>
       </w:r>
-      <w:proofErr w:type="spellEnd"/>
       <w:r>
         <w:t xml:space="preserve"> </w:t>
       </w:r>
@@ -2447,7 +2269,6 @@
       <w:r>
         <w:t xml:space="preserve">, which is built as part of the </w:t>
       </w:r>
-      <w:proofErr w:type="spellStart"/>
       <w:r>
         <w:rPr>
           <w:b/>
@@ -2455,7 +2276,6 @@
         </w:rPr>
         <w:t>BeebPerf</w:t>
       </w:r>
-      <w:proofErr w:type="spellEnd"/>
       <w:r>
         <w:t xml:space="preserve"> solution</w:t>
       </w:r>
@@ -2554,27 +2374,13 @@
         <w:rPr>
           <w:color w:val="FFFFFF" w:themeColor="background1"/>
         </w:rPr>
-        <w:t xml:space="preserve">-o </w:t>
-      </w:r>
-      <w:proofErr w:type="gramStart"/>
+        <w:t>-o labels.txt  listing</w:t>
+      </w:r>
       <w:r>
         <w:rPr>
           <w:color w:val="FFFFFF" w:themeColor="background1"/>
         </w:rPr>
-        <w:t>labels.txt  listing</w:t>
-      </w:r>
-      <w:r>
-        <w:rPr>
-          <w:color w:val="FFFFFF" w:themeColor="background1"/>
-        </w:rPr>
-        <w:t>.txt</w:t>
-      </w:r>
-      <w:proofErr w:type="gramEnd"/>
-      <w:r>
-        <w:rPr>
-          <w:color w:val="FFFFFF" w:themeColor="background1"/>
-        </w:rPr>
-        <w:t xml:space="preserve">  </w:t>
+        <w:t xml:space="preserve">.txt  </w:t>
       </w:r>
       <w:r>
         <w:br w:type="page"/>
@@ -2584,7 +2390,6 @@
       <w:pPr>
         <w:pStyle w:val="Heading1"/>
       </w:pPr>
-      <w:proofErr w:type="spellStart"/>
       <w:r>
         <w:lastRenderedPageBreak/>
         <w:t>Bee</w:t>
@@ -2595,16 +2400,10 @@
       <w:r>
         <w:t>Perf</w:t>
       </w:r>
-      <w:proofErr w:type="spellEnd"/>
-    </w:p>
-    <w:p>
-      <w:proofErr w:type="spellStart"/>
-      <w:r>
-        <w:t>BeebPerf</w:t>
-      </w:r>
-      <w:proofErr w:type="spellEnd"/>
-      <w:r>
-        <w:t xml:space="preserve"> is a standalone </w:t>
+    </w:p>
+    <w:p>
+      <w:r>
+        <w:t xml:space="preserve">BeebPerf is a standalone </w:t>
       </w:r>
       <w:r>
         <w:t xml:space="preserve">Windows </w:t>
@@ -3012,15 +2811,7 @@
         <w:t>Undo &amp; Redo</w:t>
       </w:r>
       <w:r>
-        <w:t xml:space="preserve"> – Undo or redo the last action.  Most actions within the application are undoable and </w:t>
-      </w:r>
-      <w:proofErr w:type="spellStart"/>
-      <w:r>
-        <w:t>redoable</w:t>
-      </w:r>
-      <w:proofErr w:type="spellEnd"/>
-      <w:r>
-        <w:t>.</w:t>
+        <w:t xml:space="preserve"> – Undo or redo the last action.  Most actions within the application are undoable and redoable.</w:t>
       </w:r>
     </w:p>
     <w:p>
@@ -3522,15 +3313,62 @@
       <w:r>
         <w:t xml:space="preserve"> and </w:t>
       </w:r>
-      <w:proofErr w:type="gramStart"/>
-      <w:r>
-        <w:rPr>
-          <w:b/>
-          <w:bCs/>
-        </w:rPr>
-        <w:t>Zoom</w:t>
-      </w:r>
-      <w:proofErr w:type="gramEnd"/>
+      <w:r>
+        <w:rPr>
+          <w:b/>
+          <w:bCs/>
+        </w:rPr>
+        <w:t xml:space="preserve">Zoom </w:t>
+      </w:r>
+      <w:r>
+        <w:rPr>
+          <w:b/>
+          <w:bCs/>
+        </w:rPr>
+        <w:t>o</w:t>
+      </w:r>
+      <w:r>
+        <w:rPr>
+          <w:b/>
+          <w:bCs/>
+        </w:rPr>
+        <w:t>ut</w:t>
+      </w:r>
+      <w:r>
+        <w:t xml:space="preserve"> button</w:t>
+      </w:r>
+      <w:r>
+        <w:t>s change the scale</w:t>
+      </w:r>
+      <w:r>
+        <w:t>.</w:t>
+      </w:r>
+    </w:p>
+    <w:p>
+      <w:r>
+        <w:t xml:space="preserve">The </w:t>
+      </w:r>
+      <w:r>
+        <w:rPr>
+          <w:b/>
+          <w:bCs/>
+        </w:rPr>
+        <w:t xml:space="preserve">Fit </w:t>
+      </w:r>
+      <w:r>
+        <w:rPr>
+          <w:b/>
+          <w:bCs/>
+        </w:rPr>
+        <w:t>S</w:t>
+      </w:r>
+      <w:r>
+        <w:rPr>
+          <w:b/>
+          <w:bCs/>
+        </w:rPr>
+        <w:t>election</w:t>
+      </w:r>
       <w:r>
         <w:rPr>
           <w:b/>
@@ -3539,53 +3377,7 @@
         <w:t xml:space="preserve"> </w:t>
       </w:r>
       <w:r>
-        <w:rPr>
-          <w:b/>
-          <w:bCs/>
-        </w:rPr>
-        <w:t>o</w:t>
-      </w:r>
-      <w:r>
-        <w:rPr>
-          <w:b/>
-          <w:bCs/>
-        </w:rPr>
-        <w:t>ut</w:t>
-      </w:r>
-      <w:r>
-        <w:t xml:space="preserve"> button</w:t>
-      </w:r>
-      <w:r>
-        <w:t>s change the scale</w:t>
-      </w:r>
-      <w:r>
-        <w:t>.</w:t>
-      </w:r>
-    </w:p>
-    <w:p>
-      <w:r>
-        <w:t xml:space="preserve">The </w:t>
-      </w:r>
-      <w:r>
-        <w:rPr>
-          <w:b/>
-          <w:bCs/>
-        </w:rPr>
-        <w:t xml:space="preserve">Fit </w:t>
-      </w:r>
-      <w:r>
-        <w:rPr>
-          <w:b/>
-          <w:bCs/>
-        </w:rPr>
-        <w:t>S</w:t>
-      </w:r>
-      <w:r>
-        <w:rPr>
-          <w:b/>
-          <w:bCs/>
-        </w:rPr>
-        <w:t>election</w:t>
+        <w:t>button</w:t>
       </w:r>
       <w:r>
         <w:rPr>
@@ -3595,16 +3387,6 @@
         <w:t xml:space="preserve"> </w:t>
       </w:r>
       <w:r>
-        <w:t>button</w:t>
-      </w:r>
-      <w:r>
-        <w:rPr>
-          <w:b/>
-          <w:bCs/>
-        </w:rPr>
-        <w:t xml:space="preserve"> </w:t>
-      </w:r>
-      <w:r>
         <w:t>scale</w:t>
       </w:r>
       <w:r>
@@ -3620,15 +3402,7 @@
         <w:t xml:space="preserve"> the view </w:t>
       </w:r>
       <w:r>
-        <w:t xml:space="preserve">so that </w:t>
-      </w:r>
-      <w:proofErr w:type="gramStart"/>
-      <w:r>
-        <w:t>the it</w:t>
-      </w:r>
-      <w:proofErr w:type="gramEnd"/>
-      <w:r>
-        <w:t xml:space="preserve"> fits across the window.</w:t>
+        <w:t>so that the it fits across the window.</w:t>
       </w:r>
     </w:p>
     <w:p>
@@ -4201,11 +3975,9 @@
             <w:tcW w:w="1975" w:type="dxa"/>
           </w:tcPr>
           <w:p>
-            <w:proofErr w:type="spellStart"/>
             <w:r>
               <w:t>Self CPU</w:t>
             </w:r>
-            <w:proofErr w:type="spellEnd"/>
           </w:p>
         </w:tc>
         <w:tc>
@@ -4380,15 +4152,7 @@
         <w:t xml:space="preserve"> Elapsed CPU</w:t>
       </w:r>
       <w:r>
-        <w:t xml:space="preserve"> </w:t>
-      </w:r>
-      <w:proofErr w:type="gramStart"/>
-      <w:r>
-        <w:t>is</w:t>
-      </w:r>
-      <w:proofErr w:type="gramEnd"/>
-      <w:r>
-        <w:t>:</w:t>
+        <w:t xml:space="preserve"> is:</w:t>
       </w:r>
     </w:p>
     <w:p>
@@ -4447,7 +4211,6 @@
         </w:rPr>
         <w:t xml:space="preserve">JSR </w:t>
       </w:r>
-      <w:proofErr w:type="gramStart"/>
       <w:r>
         <w:rPr>
           <w:b/>
@@ -4469,15 +4232,7 @@
           <w:b/>
           <w:bCs/>
         </w:rPr>
-        <w:t>:</w:t>
-      </w:r>
-      <w:proofErr w:type="gramEnd"/>
-      <w:r>
-        <w:rPr>
-          <w:b/>
-          <w:bCs/>
-        </w:rPr>
-        <w:t xml:space="preserve"> RTN</w:t>
+        <w:t>: RTN</w:t>
       </w:r>
       <w:r>
         <w:t>, but takes up less code bytes.</w:t>
@@ -4732,17 +4487,8 @@
           <w:b/>
           <w:bCs/>
         </w:rPr>
-        <w:t xml:space="preserve">all </w:t>
-      </w:r>
-      <w:proofErr w:type="gramStart"/>
-      <w:r>
-        <w:rPr>
-          <w:b/>
-          <w:bCs/>
-        </w:rPr>
-        <w:t>types</w:t>
-      </w:r>
-      <w:proofErr w:type="gramEnd"/>
+        <w:t>all types</w:t>
+      </w:r>
       <w:r>
         <w:t xml:space="preserve"> button.</w:t>
       </w:r>
@@ -5009,13 +4755,8 @@
         <w:lastRenderedPageBreak/>
         <w:t xml:space="preserve">The </w:t>
       </w:r>
-      <w:proofErr w:type="gramStart"/>
-      <w:r>
-        <w:t>Caller \</w:t>
-      </w:r>
-      <w:proofErr w:type="gramEnd"/>
-      <w:r>
-        <w:t xml:space="preserve"> Callee </w:t>
+      <w:r>
+        <w:t xml:space="preserve">Caller \ Callee </w:t>
       </w:r>
       <w:r>
         <w:t>tab</w:t>
@@ -5224,15 +4965,7 @@
         <w:t>,</w:t>
       </w:r>
       <w:r>
-        <w:t xml:space="preserve"> the most frequently accessed memory addresses should be </w:t>
-      </w:r>
-      <w:proofErr w:type="gramStart"/>
-      <w:r>
-        <w:t>in</w:t>
-      </w:r>
-      <w:proofErr w:type="gramEnd"/>
-      <w:r>
-        <w:t xml:space="preserve"> zero-page.</w:t>
+        <w:t xml:space="preserve"> the most frequently accessed memory addresses should be in zero-page.</w:t>
       </w:r>
     </w:p>
     <w:p>
@@ -5689,16 +5422,11 @@
       <w:r>
         <w:t xml:space="preserve"> </w:t>
       </w:r>
-      <w:proofErr w:type="gramStart"/>
       <w:r>
         <w:t xml:space="preserve">are </w:t>
       </w:r>
       <w:r>
-        <w:t>persisted</w:t>
-      </w:r>
-      <w:proofErr w:type="gramEnd"/>
-      <w:r>
-        <w:t xml:space="preserve"> across </w:t>
+        <w:t xml:space="preserve">persisted across </w:t>
       </w:r>
       <w:r>
         <w:t xml:space="preserve">application </w:t>
@@ -5801,15 +5529,7 @@
     </w:p>
     <w:p>
       <w:r>
-        <w:t xml:space="preserve">The start address is set to just after the </w:t>
-      </w:r>
-      <w:proofErr w:type="spellStart"/>
-      <w:r>
-        <w:t>WaitForVSync</w:t>
-      </w:r>
-      <w:proofErr w:type="spellEnd"/>
-      <w:r>
-        <w:t xml:space="preserve"> routine returns</w:t>
+        <w:t>The start address is set to just after the WaitForVSync routine returns</w:t>
       </w:r>
       <w:r>
         <w:t xml:space="preserve"> (</w:t>
@@ -6472,7 +6192,6 @@
               </w:rPr>
               <w:t xml:space="preserve">JSR </w:t>
             </w:r>
-            <w:proofErr w:type="gramStart"/>
             <w:r>
               <w:rPr>
                 <w:b/>
@@ -6487,15 +6206,7 @@
                 <w:b/>
                 <w:bCs/>
               </w:rPr>
-              <w:t xml:space="preserve"> :</w:t>
-            </w:r>
-            <w:proofErr w:type="gramEnd"/>
-            <w:r>
-              <w:rPr>
-                <w:b/>
-                <w:bCs/>
-              </w:rPr>
-              <w:t xml:space="preserve"> RTN</w:t>
+              <w:t xml:space="preserve"> : RTN</w:t>
             </w:r>
             <w:r>
               <w:t>, but takes up less code bytes.  For a branch it</w:t>
@@ -6513,7 +6224,6 @@
               </w:rPr>
               <w:t xml:space="preserve">JSR </w:t>
             </w:r>
-            <w:proofErr w:type="gramStart"/>
             <w:r>
               <w:rPr>
                 <w:b/>
@@ -6537,15 +6247,7 @@
                 <w:b/>
                 <w:bCs/>
               </w:rPr>
-              <w:t>:</w:t>
-            </w:r>
-            <w:proofErr w:type="gramEnd"/>
-            <w:r>
-              <w:rPr>
-                <w:b/>
-                <w:bCs/>
-              </w:rPr>
-              <w:t xml:space="preserve"> RTS</w:t>
+              <w:t>: RTS</w:t>
             </w:r>
           </w:p>
         </w:tc>
@@ -6627,11 +6329,9 @@
             <w:tcW w:w="1975" w:type="dxa"/>
           </w:tcPr>
           <w:p>
-            <w:proofErr w:type="spellStart"/>
             <w:r>
               <w:t>Self CPU</w:t>
             </w:r>
-            <w:proofErr w:type="spellEnd"/>
           </w:p>
         </w:tc>
         <w:tc>
@@ -7010,21 +6710,12 @@
         </w:rPr>
         <w:t>-</w:t>
       </w:r>
-      <w:proofErr w:type="spellStart"/>
-      <w:r>
-        <w:rPr>
-          <w:b/>
-          <w:bCs/>
-        </w:rPr>
-        <w:t>DebugLabels</w:t>
-      </w:r>
-      <w:proofErr w:type="spellEnd"/>
-      <w:r>
-        <w:rPr>
-          <w:b/>
-          <w:bCs/>
-        </w:rPr>
-        <w:t xml:space="preserve"> </w:t>
+      <w:r>
+        <w:rPr>
+          <w:b/>
+          <w:bCs/>
+        </w:rPr>
+        <w:t xml:space="preserve">DebugLabels </w:t>
       </w:r>
       <w:r>
         <w:rPr>
@@ -7244,14 +6935,12 @@
       <w:r>
         <w:t xml:space="preserve">windows </w:t>
       </w:r>
-      <w:proofErr w:type="gramStart"/>
       <w:r>
         <w:t>display</w:t>
       </w:r>
       <w:r>
         <w:t>s</w:t>
       </w:r>
-      <w:proofErr w:type="gramEnd"/>
       <w:r>
         <w:t xml:space="preserve"> </w:t>
       </w:r>
@@ -7760,18 +7449,62 @@
       <w:pPr>
         <w:pStyle w:val="Heading1"/>
       </w:pPr>
-      <w:proofErr w:type="spellStart"/>
       <w:r>
         <w:lastRenderedPageBreak/>
+        <w:t>BeebPerf Design</w:t>
+      </w:r>
+    </w:p>
+    <w:p>
+      <w:r>
+        <w:rPr>
+          <w:b/>
+          <w:bCs/>
+        </w:rPr>
         <w:t>BeebPerf</w:t>
       </w:r>
-      <w:proofErr w:type="spellEnd"/>
-      <w:r>
-        <w:t xml:space="preserve"> Design</w:t>
-      </w:r>
-    </w:p>
-    <w:p>
-      <w:proofErr w:type="spellStart"/>
+      <w:r>
+        <w:t xml:space="preserve"> is a .NET Windows Forms app, written in C#. </w:t>
+      </w:r>
+      <w:r>
+        <w:t xml:space="preserve"> </w:t>
+      </w:r>
+      <w:r>
+        <w:t>Whil</w:t>
+      </w:r>
+      <w:r>
+        <w:t>e</w:t>
+      </w:r>
+      <w:r>
+        <w:t xml:space="preserve"> alternative tech stacks could have been used, this combination is well suited for building a Visual Studio Profiler like experience.</w:t>
+      </w:r>
+      <w:r>
+        <w:t xml:space="preserve"> </w:t>
+      </w:r>
+    </w:p>
+    <w:p>
+      <w:r>
+        <w:t>I considered implementing the analysis components in C++ to reduce memory usage, but th</w:t>
+      </w:r>
+      <w:r>
+        <w:t>is</w:t>
+      </w:r>
+      <w:r>
+        <w:t xml:space="preserve"> proved unnecessary.</w:t>
+      </w:r>
+    </w:p>
+    <w:p>
+      <w:r>
+        <w:t>The application is buil</w:t>
+      </w:r>
+      <w:r>
+        <w:t>t</w:t>
+      </w:r>
+      <w:r>
+        <w:t xml:space="preserve"> around a </w:t>
+      </w:r>
+      <w:r>
+        <w:t xml:space="preserve">single </w:t>
+      </w:r>
       <w:r>
         <w:rPr>
           <w:b/>
@@ -7779,59 +7512,6 @@
         </w:rPr>
         <w:t>BeebPerf</w:t>
       </w:r>
-      <w:proofErr w:type="spellEnd"/>
-      <w:r>
-        <w:t xml:space="preserve"> is a .NET Windows Forms app, written in C#. </w:t>
-      </w:r>
-      <w:r>
-        <w:t xml:space="preserve"> </w:t>
-      </w:r>
-      <w:r>
-        <w:t>Whil</w:t>
-      </w:r>
-      <w:r>
-        <w:t>e</w:t>
-      </w:r>
-      <w:r>
-        <w:t xml:space="preserve"> alternative tech stacks could have been used, this combination is well suited for building a Visual Studio Profiler like experience.</w:t>
-      </w:r>
-      <w:r>
-        <w:t xml:space="preserve"> </w:t>
-      </w:r>
-    </w:p>
-    <w:p>
-      <w:r>
-        <w:t>I considered implementing the analysis components in C++ to reduce memory usage, but th</w:t>
-      </w:r>
-      <w:r>
-        <w:t>is</w:t>
-      </w:r>
-      <w:r>
-        <w:t xml:space="preserve"> proved unnecessary.</w:t>
-      </w:r>
-    </w:p>
-    <w:p>
-      <w:r>
-        <w:t>The application is buil</w:t>
-      </w:r>
-      <w:r>
-        <w:t>t</w:t>
-      </w:r>
-      <w:r>
-        <w:t xml:space="preserve"> around a </w:t>
-      </w:r>
-      <w:r>
-        <w:t xml:space="preserve">single </w:t>
-      </w:r>
-      <w:proofErr w:type="spellStart"/>
-      <w:r>
-        <w:rPr>
-          <w:b/>
-          <w:bCs/>
-        </w:rPr>
-        <w:t>BeebPerf</w:t>
-      </w:r>
-      <w:proofErr w:type="spellEnd"/>
       <w:r>
         <w:t xml:space="preserve"> </w:t>
       </w:r>
@@ -7871,7 +7551,6 @@
       <w:r>
         <w:t xml:space="preserve">  All the UX components, including the main form, are in the </w:t>
       </w:r>
-      <w:proofErr w:type="spellStart"/>
       <w:r>
         <w:rPr>
           <w:b/>
@@ -7879,7 +7558,6 @@
         </w:rPr>
         <w:t>ux</w:t>
       </w:r>
-      <w:proofErr w:type="spellEnd"/>
       <w:r>
         <w:t xml:space="preserve"> folder.</w:t>
       </w:r>
@@ -8143,7 +7821,6 @@
       <w:r>
         <w:t xml:space="preserve">Loading the labels files (uses the </w:t>
       </w:r>
-      <w:proofErr w:type="spellStart"/>
       <w:r>
         <w:rPr>
           <w:b/>
@@ -8151,7 +7828,6 @@
         </w:rPr>
         <w:t>LabelsFileReader</w:t>
       </w:r>
-      <w:proofErr w:type="spellEnd"/>
       <w:r>
         <w:t xml:space="preserve"> class defined in the project root folder).</w:t>
       </w:r>
@@ -8264,7 +7940,6 @@
       <w:r>
         <w:t xml:space="preserve">using the </w:t>
       </w:r>
-      <w:proofErr w:type="spellStart"/>
       <w:r>
         <w:rPr>
           <w:b/>
@@ -8272,7 +7947,6 @@
         </w:rPr>
         <w:t>PerfReader</w:t>
       </w:r>
-      <w:proofErr w:type="spellEnd"/>
       <w:r>
         <w:t xml:space="preserve"> class</w:t>
       </w:r>
@@ -8617,15 +8291,7 @@
         <w:t xml:space="preserve">All the events and instructions defined across </w:t>
       </w:r>
       <w:r>
-        <w:t xml:space="preserve">the </w:t>
-      </w:r>
-      <w:proofErr w:type="gramStart"/>
-      <w:r>
-        <w:t>read .perf</w:t>
-      </w:r>
-      <w:proofErr w:type="gramEnd"/>
-      <w:r>
-        <w:t xml:space="preserve"> file’s </w:t>
+        <w:t xml:space="preserve">the read .perf file’s </w:t>
       </w:r>
       <w:r>
         <w:t xml:space="preserve">execution chunks are put in a single </w:t>
@@ -8907,7 +8573,13 @@
         <w:t xml:space="preserve">fixed </w:t>
       </w:r>
       <w:r>
-        <w:t xml:space="preserve">12-byte sized </w:t>
+        <w:t>1</w:t>
+      </w:r>
+      <w:r>
+        <w:t>6</w:t>
+      </w:r>
+      <w:r>
+        <w:t xml:space="preserve">-byte sized </w:t>
       </w:r>
       <w:r>
         <w:rPr>
@@ -8926,7 +8598,6 @@
       </w:r>
     </w:p>
     <w:p>
-      <w:proofErr w:type="spellStart"/>
       <w:r>
         <w:rPr>
           <w:b/>
@@ -8934,7 +8605,6 @@
         </w:rPr>
         <w:t>MiniStackFrame</w:t>
       </w:r>
-      <w:proofErr w:type="spellEnd"/>
       <w:r>
         <w:t xml:space="preserve"> – represents a mini stack frame.  Contains the following fields:</w:t>
       </w:r>
@@ -9018,7 +8688,6 @@
       <w:r>
         <w:t xml:space="preserve">, by the </w:t>
       </w:r>
-      <w:proofErr w:type="spellStart"/>
       <w:r>
         <w:rPr>
           <w:b/>
@@ -9047,7 +8716,6 @@
         </w:rPr>
         <w:t>s</w:t>
       </w:r>
-      <w:proofErr w:type="spellEnd"/>
       <w:r>
         <w:t xml:space="preserve"> class </w:t>
       </w:r>
@@ -9188,15 +8856,7 @@
         </w:numPr>
       </w:pPr>
       <w:r>
-        <w:t xml:space="preserve">Aggregated CPU Metrics, by </w:t>
-      </w:r>
-      <w:proofErr w:type="spellStart"/>
-      <w:r>
-        <w:t>CallStack</w:t>
-      </w:r>
-      <w:proofErr w:type="spellEnd"/>
-      <w:r>
-        <w:t xml:space="preserve"> – </w:t>
+        <w:t xml:space="preserve">Aggregated CPU Metrics, by CallStack – </w:t>
       </w:r>
       <w:r>
         <w:rPr>
@@ -9308,7 +8968,6 @@
       </w:r>
     </w:p>
     <w:p>
-      <w:proofErr w:type="spellStart"/>
       <w:r>
         <w:rPr>
           <w:b/>
@@ -9316,7 +8975,6 @@
         </w:rPr>
         <w:t>StackFrame</w:t>
       </w:r>
-      <w:proofErr w:type="spellEnd"/>
       <w:r>
         <w:t xml:space="preserve"> – represents a unique stack-frame within the recorded program.  Contains the following fields:</w:t>
       </w:r>
@@ -9439,7 +9097,6 @@
       </w:r>
     </w:p>
     <w:p>
-      <w:proofErr w:type="spellStart"/>
       <w:r>
         <w:rPr>
           <w:b/>
@@ -9448,7 +9105,6 @@
         <w:lastRenderedPageBreak/>
         <w:t>CallStack</w:t>
       </w:r>
-      <w:proofErr w:type="spellEnd"/>
       <w:r>
         <w:t xml:space="preserve"> – represents a call stack within the recorded program. </w:t>
       </w:r>
@@ -9563,15 +9219,7 @@
         <w:t>t</w:t>
       </w:r>
       <w:r>
-        <w:t xml:space="preserve">y of a </w:t>
-      </w:r>
-      <w:proofErr w:type="spellStart"/>
-      <w:r>
-        <w:t>CallStack</w:t>
-      </w:r>
-      <w:proofErr w:type="spellEnd"/>
-      <w:r>
-        <w:t xml:space="preserve"> is defined by the sequence of addresses up through the parent chain, ending at the root or a call stack that has an ISR</w:t>
+        <w:t>y of a CallStack is defined by the sequence of addresses up through the parent chain, ending at the root or a call stack that has an ISR</w:t>
       </w:r>
       <w:r>
         <w:t xml:space="preserve">, </w:t>
@@ -9650,15 +9298,7 @@
         </w:numPr>
       </w:pPr>
       <w:r>
-        <w:t xml:space="preserve">Every JSR destination address is </w:t>
-      </w:r>
-      <w:proofErr w:type="gramStart"/>
-      <w:r>
-        <w:t>by definition a</w:t>
-      </w:r>
-      <w:proofErr w:type="gramEnd"/>
-      <w:r>
-        <w:t xml:space="preserve"> routine.</w:t>
+        <w:t>Every JSR destination address is by definition a routine.</w:t>
       </w:r>
     </w:p>
     <w:p>
@@ -9670,15 +9310,7 @@
         </w:numPr>
       </w:pPr>
       <w:r>
-        <w:t xml:space="preserve">Every Interrupt destination address is </w:t>
-      </w:r>
-      <w:proofErr w:type="gramStart"/>
-      <w:r>
-        <w:t>by definition a</w:t>
-      </w:r>
-      <w:proofErr w:type="gramEnd"/>
-      <w:r>
-        <w:t xml:space="preserve"> routine. </w:t>
+        <w:t xml:space="preserve">Every Interrupt destination address is by definition a routine. </w:t>
       </w:r>
     </w:p>
     <w:p>
@@ -10167,26 +9799,14 @@
     </w:p>
     <w:p>
       <w:r>
-        <w:t xml:space="preserve">Video analysis is performed after </w:t>
-      </w:r>
-      <w:proofErr w:type="gramStart"/>
-      <w:r>
-        <w:t xml:space="preserve">a </w:t>
-      </w:r>
-      <w:r>
-        <w:rPr>
-          <w:b/>
-          <w:bCs/>
-        </w:rPr>
-        <w:t>.perf</w:t>
-      </w:r>
-      <w:proofErr w:type="gramEnd"/>
-      <w:r>
-        <w:rPr>
-          <w:b/>
-          <w:bCs/>
-        </w:rPr>
-        <w:t xml:space="preserve"> </w:t>
+        <w:t xml:space="preserve">Video analysis is performed after a </w:t>
+      </w:r>
+      <w:r>
+        <w:rPr>
+          <w:b/>
+          <w:bCs/>
+        </w:rPr>
+        <w:t xml:space="preserve">.perf </w:t>
       </w:r>
       <w:r>
         <w:t>is loaded, either in parallel to, or after</w:t>
@@ -10299,7 +9919,6 @@
       </w:r>
     </w:p>
     <w:p>
-      <w:proofErr w:type="spellStart"/>
       <w:r>
         <w:rPr>
           <w:b/>
@@ -10307,7 +9926,6 @@
         </w:rPr>
         <w:t>DisplayFrame</w:t>
       </w:r>
-      <w:proofErr w:type="spellEnd"/>
       <w:r>
         <w:t xml:space="preserve"> – represents a </w:t>
       </w:r>
@@ -10385,7 +10003,6 @@
       <w:r>
         <w:t xml:space="preserve">Different emulator implementations handle screen mode changes slightly differently, causing timing variations that </w:t>
       </w:r>
-      <w:proofErr w:type="spellStart"/>
       <w:r>
         <w:rPr>
           <w:b/>
@@ -10393,7 +10010,6 @@
         </w:rPr>
         <w:t>BeebPerf</w:t>
       </w:r>
-      <w:proofErr w:type="spellEnd"/>
       <w:r>
         <w:t xml:space="preserve"> cannot reconcile without this event.</w:t>
       </w:r>
@@ -10412,13 +10028,8 @@
         <w:t xml:space="preserve">largely </w:t>
       </w:r>
       <w:r>
-        <w:t xml:space="preserve">based on </w:t>
-      </w:r>
-      <w:proofErr w:type="spellStart"/>
-      <w:r>
-        <w:t>BeebEm’s</w:t>
-      </w:r>
-      <w:proofErr w:type="spellEnd"/>
+        <w:t>based on BeebEm’s</w:t>
+      </w:r>
       <w:r>
         <w:rPr>
           <w:rFonts w:ascii="Aptos" w:hAnsi="Aptos"/>
@@ -11364,15 +10975,7 @@
         <w:contextualSpacing w:val="0"/>
       </w:pPr>
       <w:r>
-        <w:t xml:space="preserve">Each generated iteration captures the iteration’s </w:t>
-      </w:r>
-      <w:proofErr w:type="gramStart"/>
-      <w:r>
-        <w:t>durations</w:t>
-      </w:r>
-      <w:proofErr w:type="gramEnd"/>
-      <w:r>
-        <w:t xml:space="preserve">, how it aligns with the current or next display-frame, and how many screen memory writes occur before and after the CRTC display screen memory scan read. </w:t>
+        <w:t xml:space="preserve">Each generated iteration captures the iteration’s durations, how it aligns with the current or next display-frame, and how many screen memory writes occur before and after the CRTC display screen memory scan read. </w:t>
       </w:r>
     </w:p>
     <w:p>
@@ -11386,7 +10989,6 @@
       </w:r>
     </w:p>
     <w:p>
-      <w:proofErr w:type="spellStart"/>
       <w:r>
         <w:rPr>
           <w:b/>
@@ -11394,7 +10996,6 @@
         </w:rPr>
         <w:t>MetricIteration</w:t>
       </w:r>
-      <w:proofErr w:type="spellEnd"/>
       <w:r>
         <w:t xml:space="preserve"> – represents a metric iteration.  Contains the following fields:</w:t>
       </w:r>
@@ -11486,30 +11087,23 @@
         </w:numPr>
       </w:pPr>
       <w:r>
-        <w:t xml:space="preserve">List of </w:t>
-      </w:r>
-      <w:proofErr w:type="spellStart"/>
-      <w:r>
+        <w:t>List of DisplayFrameSpan</w:t>
+      </w:r>
+      <w:r>
+        <w:t xml:space="preserve"> where</w:t>
+      </w:r>
+      <w:r>
+        <w:t>:</w:t>
+      </w:r>
+    </w:p>
+    <w:p>
+      <w:r>
+        <w:rPr>
+          <w:b/>
+          <w:bCs/>
+        </w:rPr>
         <w:t>DisplayFrameSpan</w:t>
       </w:r>
-      <w:proofErr w:type="spellEnd"/>
-      <w:r>
-        <w:t xml:space="preserve"> where</w:t>
-      </w:r>
-      <w:r>
-        <w:t>:</w:t>
-      </w:r>
-    </w:p>
-    <w:p>
-      <w:proofErr w:type="spellStart"/>
-      <w:r>
-        <w:rPr>
-          <w:b/>
-          <w:bCs/>
-        </w:rPr>
-        <w:t>DisplayFrameSpan</w:t>
-      </w:r>
-      <w:proofErr w:type="spellEnd"/>
       <w:r>
         <w:t xml:space="preserve"> – represents a display frame span</w:t>
       </w:r>
@@ -11578,7 +11172,6 @@
       <w:r>
         <w:t>application is built around a main Form (</w:t>
       </w:r>
-      <w:proofErr w:type="spellStart"/>
       <w:r>
         <w:rPr>
           <w:b/>
@@ -11586,7 +11179,6 @@
         </w:rPr>
         <w:t>BeebPerfForm</w:t>
       </w:r>
-      <w:proofErr w:type="spellEnd"/>
       <w:r>
         <w:t xml:space="preserve">) which </w:t>
       </w:r>
@@ -11696,11 +11288,9 @@
             <w:tcW w:w="2700" w:type="dxa"/>
           </w:tcPr>
           <w:p>
-            <w:proofErr w:type="spellStart"/>
             <w:r>
               <w:t>BeepPerfForm</w:t>
             </w:r>
-            <w:proofErr w:type="spellEnd"/>
           </w:p>
         </w:tc>
         <w:tc>
@@ -11768,11 +11358,9 @@
             <w:tcW w:w="2700" w:type="dxa"/>
           </w:tcPr>
           <w:p>
-            <w:proofErr w:type="spellStart"/>
             <w:r>
               <w:t>TabControlEx</w:t>
             </w:r>
-            <w:proofErr w:type="spellEnd"/>
           </w:p>
         </w:tc>
         <w:tc>
@@ -11802,11 +11390,9 @@
             <w:tcW w:w="2700" w:type="dxa"/>
           </w:tcPr>
           <w:p>
-            <w:proofErr w:type="spellStart"/>
             <w:r>
               <w:t>GridView</w:t>
             </w:r>
-            <w:proofErr w:type="spellEnd"/>
           </w:p>
         </w:tc>
         <w:tc>
@@ -11814,11 +11400,9 @@
             <w:tcW w:w="1710" w:type="dxa"/>
           </w:tcPr>
           <w:p>
-            <w:proofErr w:type="spellStart"/>
             <w:r>
               <w:t>DataGridView</w:t>
             </w:r>
-            <w:proofErr w:type="spellEnd"/>
           </w:p>
         </w:tc>
         <w:tc>
@@ -11856,11 +11440,9 @@
             <w:pPr>
               <w:ind w:left="4320" w:hanging="4320"/>
             </w:pPr>
-            <w:proofErr w:type="spellStart"/>
             <w:r>
               <w:t>RoutinesView</w:t>
             </w:r>
-            <w:proofErr w:type="spellEnd"/>
           </w:p>
         </w:tc>
         <w:tc>
@@ -11871,11 +11453,9 @@
             <w:pPr>
               <w:ind w:left="4320" w:hanging="4320"/>
             </w:pPr>
-            <w:proofErr w:type="spellStart"/>
             <w:r>
               <w:t>GridView</w:t>
             </w:r>
-            <w:proofErr w:type="spellEnd"/>
           </w:p>
         </w:tc>
         <w:tc>
@@ -11901,11 +11481,9 @@
             <w:pPr>
               <w:ind w:left="4320" w:hanging="4320"/>
             </w:pPr>
-            <w:proofErr w:type="spellStart"/>
             <w:r>
               <w:t>CallerCalleeView</w:t>
             </w:r>
-            <w:proofErr w:type="spellEnd"/>
           </w:p>
         </w:tc>
         <w:tc>
@@ -11944,11 +11522,9 @@
             <w:pPr>
               <w:ind w:left="4320" w:hanging="4320"/>
             </w:pPr>
-            <w:proofErr w:type="spellStart"/>
             <w:r>
               <w:t>CallTreeView</w:t>
             </w:r>
-            <w:proofErr w:type="spellEnd"/>
           </w:p>
         </w:tc>
         <w:tc>
@@ -11959,11 +11535,9 @@
             <w:pPr>
               <w:ind w:left="4320" w:hanging="4320"/>
             </w:pPr>
-            <w:proofErr w:type="spellStart"/>
             <w:r>
               <w:t>GridView</w:t>
             </w:r>
-            <w:proofErr w:type="spellEnd"/>
           </w:p>
         </w:tc>
         <w:tc>
@@ -11989,11 +11563,9 @@
             <w:pPr>
               <w:ind w:left="4320" w:hanging="4320"/>
             </w:pPr>
-            <w:proofErr w:type="spellStart"/>
             <w:r>
               <w:t>FlameGraph</w:t>
             </w:r>
-            <w:proofErr w:type="spellEnd"/>
           </w:p>
         </w:tc>
         <w:tc>
@@ -12032,11 +11604,9 @@
             <w:pPr>
               <w:ind w:left="4320" w:hanging="4320"/>
             </w:pPr>
-            <w:proofErr w:type="spellStart"/>
             <w:r>
               <w:t>MemoryView</w:t>
             </w:r>
-            <w:proofErr w:type="spellEnd"/>
           </w:p>
         </w:tc>
         <w:tc>
@@ -12047,11 +11617,9 @@
             <w:pPr>
               <w:ind w:left="4320" w:hanging="4320"/>
             </w:pPr>
-            <w:proofErr w:type="spellStart"/>
             <w:r>
               <w:t>GridView</w:t>
             </w:r>
-            <w:proofErr w:type="spellEnd"/>
           </w:p>
         </w:tc>
         <w:tc>
@@ -12080,11 +11648,9 @@
             <w:pPr>
               <w:ind w:left="4320" w:hanging="4320"/>
             </w:pPr>
-            <w:proofErr w:type="spellStart"/>
             <w:r>
               <w:t>MemoryRoutinesView</w:t>
             </w:r>
-            <w:proofErr w:type="spellEnd"/>
           </w:p>
         </w:tc>
         <w:tc>
@@ -12095,11 +11661,9 @@
             <w:pPr>
               <w:ind w:left="4320" w:hanging="4320"/>
             </w:pPr>
-            <w:proofErr w:type="spellStart"/>
             <w:r>
               <w:t>GridView</w:t>
             </w:r>
-            <w:proofErr w:type="spellEnd"/>
           </w:p>
         </w:tc>
         <w:tc>
@@ -12129,14 +11693,12 @@
             <w:pPr>
               <w:ind w:left="4320" w:hanging="4320"/>
             </w:pPr>
-            <w:proofErr w:type="spellStart"/>
             <w:r>
               <w:t>Metrics</w:t>
             </w:r>
             <w:r>
               <w:t>View</w:t>
             </w:r>
-            <w:proofErr w:type="spellEnd"/>
           </w:p>
         </w:tc>
         <w:tc>
@@ -12182,14 +11744,12 @@
             <w:pPr>
               <w:ind w:left="4320" w:hanging="4320"/>
             </w:pPr>
-            <w:proofErr w:type="spellStart"/>
             <w:r>
               <w:t>Metrics</w:t>
             </w:r>
             <w:r>
               <w:t>GridView</w:t>
             </w:r>
-            <w:proofErr w:type="spellEnd"/>
           </w:p>
         </w:tc>
         <w:tc>
@@ -12200,11 +11760,9 @@
             <w:pPr>
               <w:ind w:left="4320" w:hanging="4320"/>
             </w:pPr>
-            <w:proofErr w:type="spellStart"/>
             <w:r>
               <w:t>GridView</w:t>
             </w:r>
-            <w:proofErr w:type="spellEnd"/>
           </w:p>
         </w:tc>
         <w:tc>
@@ -12247,11 +11805,9 @@
             <w:pPr>
               <w:ind w:left="4320" w:hanging="4320"/>
             </w:pPr>
-            <w:proofErr w:type="spellStart"/>
             <w:r>
               <w:t>GridView</w:t>
             </w:r>
-            <w:proofErr w:type="spellEnd"/>
           </w:p>
         </w:tc>
         <w:tc>
@@ -12318,11 +11874,9 @@
             <w:pPr>
               <w:ind w:left="4320" w:hanging="4320"/>
             </w:pPr>
-            <w:proofErr w:type="spellStart"/>
             <w:r>
               <w:t>LabelsDialog</w:t>
             </w:r>
-            <w:proofErr w:type="spellEnd"/>
           </w:p>
         </w:tc>
         <w:tc>
@@ -12361,14 +11915,12 @@
             <w:pPr>
               <w:ind w:left="4320" w:hanging="4320"/>
             </w:pPr>
-            <w:proofErr w:type="spellStart"/>
             <w:r>
               <w:t>Display</w:t>
             </w:r>
             <w:r>
               <w:t>SettingsDialog</w:t>
             </w:r>
-            <w:proofErr w:type="spellEnd"/>
           </w:p>
         </w:tc>
         <w:tc>
@@ -12410,11 +11962,9 @@
             <w:pPr>
               <w:ind w:left="4320" w:hanging="4320"/>
             </w:pPr>
-            <w:proofErr w:type="spellStart"/>
             <w:r>
               <w:t>SampleCodePanel</w:t>
             </w:r>
-            <w:proofErr w:type="spellEnd"/>
           </w:p>
         </w:tc>
         <w:tc>
@@ -12456,11 +12006,9 @@
             <w:tcW w:w="2700" w:type="dxa"/>
           </w:tcPr>
           <w:p>
-            <w:proofErr w:type="spellStart"/>
             <w:r>
               <w:t>HelpDialog</w:t>
             </w:r>
-            <w:proofErr w:type="spellEnd"/>
           </w:p>
         </w:tc>
         <w:tc>
@@ -12496,7 +12044,6 @@
       <w:r>
         <w:t xml:space="preserve">the </w:t>
       </w:r>
-      <w:proofErr w:type="spellStart"/>
       <w:r>
         <w:rPr>
           <w:b/>
@@ -12504,7 +12051,6 @@
         </w:rPr>
         <w:t>ReentrancyGuard</w:t>
       </w:r>
-      <w:proofErr w:type="spellEnd"/>
       <w:r>
         <w:rPr>
           <w:b/>
@@ -12515,7 +12061,6 @@
       <w:r>
         <w:t xml:space="preserve">(also in </w:t>
       </w:r>
-      <w:proofErr w:type="spellStart"/>
       <w:r>
         <w:rPr>
           <w:b/>
@@ -12523,98 +12068,72 @@
         </w:rPr>
         <w:t>ux</w:t>
       </w:r>
-      <w:proofErr w:type="spellEnd"/>
       <w:r>
         <w:t xml:space="preserve"> folder)</w:t>
       </w:r>
       <w:r>
         <w:t xml:space="preserve"> which is used to stop cyclic </w:t>
       </w:r>
-      <w:proofErr w:type="spellStart"/>
-      <w:r>
-        <w:rPr>
-          <w:b/>
-          <w:bCs/>
-        </w:rPr>
-        <w:t>api</w:t>
-      </w:r>
-      <w:proofErr w:type="spellEnd"/>
-      <w:r>
-        <w:rPr>
-          <w:b/>
-          <w:bCs/>
-        </w:rPr>
+      <w:r>
+        <w:rPr>
+          <w:b/>
+          <w:bCs/>
+        </w:rPr>
+        <w:t xml:space="preserve">api </w:t>
+      </w:r>
+      <w:r>
+        <w:rPr>
+          <w:b/>
+          <w:bCs/>
+        </w:rPr>
+        <w:sym w:font="Wingdings" w:char="F0E0"/>
+      </w:r>
+      <w:r>
+        <w:rPr>
+          <w:b/>
+          <w:bCs/>
+        </w:rPr>
+        <w:t xml:space="preserve"> event </w:t>
+      </w:r>
+      <w:r>
+        <w:rPr>
+          <w:b/>
+          <w:bCs/>
+        </w:rPr>
+        <w:sym w:font="Wingdings" w:char="F0E0"/>
+      </w:r>
+      <w:r>
+        <w:rPr>
+          <w:b/>
+          <w:bCs/>
+        </w:rPr>
+        <w:t xml:space="preserve"> api </w:t>
+      </w:r>
+      <w:r>
+        <w:rPr>
+          <w:b/>
+          <w:bCs/>
+        </w:rPr>
+        <w:sym w:font="Wingdings" w:char="F0E0"/>
+      </w:r>
+      <w:r>
+        <w:rPr>
+          <w:b/>
+          <w:bCs/>
+        </w:rPr>
+        <w:t xml:space="preserve"> event</w:t>
+      </w:r>
+      <w:r>
+        <w:rPr>
+          <w:b/>
+          <w:bCs/>
+        </w:rPr>
+        <w:t xml:space="preserve"> …</w:t>
+      </w:r>
+      <w:r>
         <w:t xml:space="preserve"> </w:t>
       </w:r>
       <w:r>
-        <w:rPr>
-          <w:b/>
-          <w:bCs/>
-        </w:rPr>
-        <w:sym w:font="Wingdings" w:char="F0E0"/>
-      </w:r>
-      <w:r>
-        <w:rPr>
-          <w:b/>
-          <w:bCs/>
-        </w:rPr>
-        <w:t xml:space="preserve"> event </w:t>
-      </w:r>
-      <w:r>
-        <w:rPr>
-          <w:b/>
-          <w:bCs/>
-        </w:rPr>
-        <w:sym w:font="Wingdings" w:char="F0E0"/>
-      </w:r>
-      <w:r>
-        <w:rPr>
-          <w:b/>
-          <w:bCs/>
-        </w:rPr>
-        <w:t xml:space="preserve"> </w:t>
-      </w:r>
-      <w:proofErr w:type="spellStart"/>
-      <w:r>
-        <w:rPr>
-          <w:b/>
-          <w:bCs/>
-        </w:rPr>
-        <w:t>api</w:t>
-      </w:r>
-      <w:proofErr w:type="spellEnd"/>
-      <w:r>
-        <w:rPr>
-          <w:b/>
-          <w:bCs/>
-        </w:rPr>
-        <w:t xml:space="preserve"> </w:t>
-      </w:r>
-      <w:r>
-        <w:rPr>
-          <w:b/>
-          <w:bCs/>
-        </w:rPr>
-        <w:sym w:font="Wingdings" w:char="F0E0"/>
-      </w:r>
-      <w:r>
-        <w:rPr>
-          <w:b/>
-          <w:bCs/>
-        </w:rPr>
-        <w:t xml:space="preserve"> event</w:t>
-      </w:r>
-      <w:r>
-        <w:rPr>
-          <w:b/>
-          <w:bCs/>
-        </w:rPr>
-        <w:t xml:space="preserve"> …</w:t>
-      </w:r>
-      <w:r>
-        <w:t xml:space="preserve"> </w:t>
-      </w:r>
-      <w:r>
         <w:t xml:space="preserve"> loop</w:t>
       </w:r>
       <w:r>
@@ -12654,7 +12173,6 @@
       <w:r>
         <w:t>The undo / redo history class (</w:t>
       </w:r>
-      <w:proofErr w:type="spellStart"/>
       <w:r>
         <w:rPr>
           <w:b/>
@@ -12662,7 +12180,6 @@
         </w:rPr>
         <w:t>UndoRedoHistory</w:t>
       </w:r>
-      <w:proofErr w:type="spellEnd"/>
       <w:r>
         <w:t>)</w:t>
       </w:r>
@@ -12678,19 +12195,9 @@
           <w:numId w:val="12"/>
         </w:numPr>
       </w:pPr>
-      <w:proofErr w:type="gramStart"/>
-      <w:r>
-        <w:t>bool</w:t>
-      </w:r>
-      <w:proofErr w:type="gramEnd"/>
-      <w:r>
-        <w:t xml:space="preserve"> </w:t>
-      </w:r>
-      <w:proofErr w:type="gramStart"/>
-      <w:r>
-        <w:t>Execute(</w:t>
-      </w:r>
-      <w:proofErr w:type="gramEnd"/>
+      <w:r>
+        <w:t>bool Execute(</w:t>
+      </w:r>
       <w:r>
         <w:rPr>
           <w:b/>
@@ -12711,20 +12218,7 @@
         </w:numPr>
       </w:pPr>
       <w:r>
-        <w:t xml:space="preserve">bool </w:t>
-      </w:r>
-      <w:proofErr w:type="spellStart"/>
-      <w:proofErr w:type="gramStart"/>
-      <w:r>
-        <w:t>CanUndo</w:t>
-      </w:r>
-      <w:proofErr w:type="spellEnd"/>
-      <w:r>
-        <w:t>(</w:t>
-      </w:r>
-      <w:proofErr w:type="gramEnd"/>
-      <w:r>
-        <w:t>)</w:t>
+        <w:t>bool CanUndo()</w:t>
       </w:r>
     </w:p>
     <w:p>
@@ -12736,20 +12230,7 @@
         </w:numPr>
       </w:pPr>
       <w:r>
-        <w:t xml:space="preserve">bool </w:t>
-      </w:r>
-      <w:proofErr w:type="spellStart"/>
-      <w:proofErr w:type="gramStart"/>
-      <w:r>
-        <w:t>CanRedo</w:t>
-      </w:r>
-      <w:proofErr w:type="spellEnd"/>
-      <w:r>
-        <w:t>(</w:t>
-      </w:r>
-      <w:proofErr w:type="gramEnd"/>
-      <w:r>
-        <w:t>)</w:t>
+        <w:t>bool CanRedo()</w:t>
       </w:r>
     </w:p>
     <w:p>
@@ -12761,15 +12242,7 @@
         </w:numPr>
       </w:pPr>
       <w:r>
-        <w:t xml:space="preserve">void </w:t>
-      </w:r>
-      <w:proofErr w:type="gramStart"/>
-      <w:r>
-        <w:t>Undo(</w:t>
-      </w:r>
-      <w:proofErr w:type="gramEnd"/>
-      <w:r>
-        <w:t>)</w:t>
+        <w:t>void Undo()</w:t>
       </w:r>
     </w:p>
     <w:p>
@@ -12781,15 +12254,7 @@
         </w:numPr>
       </w:pPr>
       <w:r>
-        <w:t xml:space="preserve">void </w:t>
-      </w:r>
-      <w:proofErr w:type="gramStart"/>
-      <w:r>
-        <w:t>Redo(</w:t>
-      </w:r>
-      <w:proofErr w:type="gramEnd"/>
-      <w:r>
-        <w:t>)</w:t>
+        <w:t>void Redo()</w:t>
       </w:r>
     </w:p>
     <w:p>
@@ -12800,22 +12265,9 @@
           <w:numId w:val="12"/>
         </w:numPr>
       </w:pPr>
-      <w:proofErr w:type="gramStart"/>
       <w:r>
         <w:lastRenderedPageBreak/>
-        <w:t>void</w:t>
-      </w:r>
-      <w:proofErr w:type="gramEnd"/>
-      <w:r>
-        <w:t xml:space="preserve"> </w:t>
-      </w:r>
-      <w:proofErr w:type="gramStart"/>
-      <w:r>
-        <w:t>Clear(</w:t>
-      </w:r>
-      <w:proofErr w:type="gramEnd"/>
-      <w:r>
-        <w:t>)</w:t>
+        <w:t>void Clear()</w:t>
       </w:r>
     </w:p>
     <w:p>
@@ -12850,21 +12302,8 @@
           <w:numId w:val="12"/>
         </w:numPr>
       </w:pPr>
-      <w:proofErr w:type="gramStart"/>
-      <w:r>
-        <w:t>bool</w:t>
-      </w:r>
-      <w:proofErr w:type="gramEnd"/>
-      <w:r>
-        <w:t xml:space="preserve"> </w:t>
-      </w:r>
-      <w:proofErr w:type="gramStart"/>
-      <w:r>
-        <w:t>Execute(</w:t>
-      </w:r>
-      <w:proofErr w:type="gramEnd"/>
-      <w:r>
-        <w:t>)</w:t>
+      <w:r>
+        <w:t>bool Execute()</w:t>
       </w:r>
     </w:p>
     <w:p>
@@ -12876,15 +12315,7 @@
         </w:numPr>
       </w:pPr>
       <w:r>
-        <w:t xml:space="preserve">void </w:t>
-      </w:r>
-      <w:proofErr w:type="gramStart"/>
-      <w:r>
-        <w:t>Undo(</w:t>
-      </w:r>
-      <w:proofErr w:type="gramEnd"/>
-      <w:r>
-        <w:t>)</w:t>
+        <w:t>void Undo()</w:t>
       </w:r>
     </w:p>
     <w:p>
@@ -12896,22 +12327,13 @@
         </w:numPr>
       </w:pPr>
       <w:r>
-        <w:t xml:space="preserve">void </w:t>
-      </w:r>
-      <w:proofErr w:type="gramStart"/>
-      <w:r>
-        <w:t>Redo(</w:t>
-      </w:r>
-      <w:proofErr w:type="gramEnd"/>
-      <w:r>
-        <w:t>)</w:t>
+        <w:t>void Redo()</w:t>
       </w:r>
     </w:p>
     <w:p>
       <w:r>
         <w:t xml:space="preserve">The </w:t>
       </w:r>
-      <w:proofErr w:type="spellStart"/>
       <w:r>
         <w:rPr>
           <w:b/>
@@ -12919,7 +12341,6 @@
         </w:rPr>
         <w:t>UndoRedoHistory</w:t>
       </w:r>
-      <w:proofErr w:type="spellEnd"/>
       <w:r>
         <w:t xml:space="preserve"> class internally </w:t>
       </w:r>
@@ -12959,21 +12380,12 @@
       <w:r>
         <w:t xml:space="preserve">The </w:t>
       </w:r>
-      <w:proofErr w:type="gramStart"/>
-      <w:r>
-        <w:rPr>
-          <w:b/>
-          <w:bCs/>
-        </w:rPr>
-        <w:t>Execute(</w:t>
-      </w:r>
-      <w:proofErr w:type="gramEnd"/>
-      <w:r>
-        <w:rPr>
-          <w:b/>
-          <w:bCs/>
-        </w:rPr>
-        <w:t>Operation</w:t>
+      <w:r>
+        <w:rPr>
+          <w:b/>
+          <w:bCs/>
+        </w:rPr>
+        <w:t>Execute(Operation</w:t>
       </w:r>
       <w:r>
         <w:t xml:space="preserve"> op)</w:t>
@@ -13136,15 +12548,7 @@
         <w:t>implemented as an operation.</w:t>
       </w:r>
       <w:r>
-        <w:t xml:space="preserve">  These </w:t>
-      </w:r>
-      <w:proofErr w:type="gramStart"/>
-      <w:r>
-        <w:t>are located in</w:t>
-      </w:r>
-      <w:proofErr w:type="gramEnd"/>
-      <w:r>
-        <w:t xml:space="preserve"> the </w:t>
+        <w:t xml:space="preserve">  These are located in the </w:t>
       </w:r>
       <w:r>
         <w:rPr>
@@ -13185,116 +12589,87 @@
         <w:t>–</w:t>
       </w:r>
       <w:r>
-        <w:t xml:space="preserve"> </w:t>
-      </w:r>
-      <w:proofErr w:type="spellStart"/>
-      <w:r>
+        <w:t xml:space="preserve"> zlib</w:t>
+      </w:r>
+    </w:p>
+    <w:p>
+      <w:r>
+        <w:t xml:space="preserve">The </w:t>
+      </w:r>
+      <w:r>
+        <w:rPr>
+          <w:b/>
+          <w:bCs/>
+        </w:rPr>
+        <w:t>PerfReader</w:t>
+      </w:r>
+      <w:r>
+        <w:t xml:space="preserve"> class uncompresses chuck</w:t>
+      </w:r>
+      <w:r>
+        <w:t xml:space="preserve"> data</w:t>
+      </w:r>
+      <w:r>
+        <w:t xml:space="preserve"> using the </w:t>
+      </w:r>
+      <w:r>
+        <w:t xml:space="preserve">open source </w:t>
+      </w:r>
+      <w:r>
+        <w:rPr>
+          <w:b/>
+          <w:bCs/>
+        </w:rPr>
         <w:t>zlib</w:t>
       </w:r>
-      <w:proofErr w:type="spellEnd"/>
-    </w:p>
-    <w:p>
+      <w:r>
+        <w:t xml:space="preserve"> library</w:t>
+      </w:r>
+      <w:r>
+        <w:t xml:space="preserve">.  </w:t>
+      </w:r>
+      <w:r>
+        <w:t>Copyright (C) 1995-2024 Jean-loup Gailly and Mark Adler</w:t>
+      </w:r>
+      <w:r>
+        <w:t>.</w:t>
+      </w:r>
+    </w:p>
+    <w:p>
+      <w:r>
+        <w:t xml:space="preserve">The sources can be found in the </w:t>
+      </w:r>
+      <w:r>
+        <w:rPr>
+          <w:b/>
+          <w:bCs/>
+        </w:rPr>
+        <w:t>zlib</w:t>
+      </w:r>
+      <w:r>
+        <w:t xml:space="preserve"> project</w:t>
+      </w:r>
+      <w:r>
+        <w:t xml:space="preserve"> within </w:t>
+      </w:r>
+      <w:r>
+        <w:t xml:space="preserve">the </w:t>
+      </w:r>
+      <w:r>
+        <w:rPr>
+          <w:b/>
+          <w:bCs/>
+        </w:rPr>
+        <w:t>BeebPerf</w:t>
+      </w:r>
+      <w:r>
+        <w:t xml:space="preserve"> solution.  </w:t>
+      </w:r>
       <w:r>
         <w:t xml:space="preserve">The </w:t>
       </w:r>
-      <w:proofErr w:type="spellStart"/>
-      <w:r>
-        <w:rPr>
-          <w:b/>
-          <w:bCs/>
-        </w:rPr>
-        <w:t>PerfReader</w:t>
-      </w:r>
-      <w:proofErr w:type="spellEnd"/>
-      <w:r>
-        <w:t xml:space="preserve"> class uncompresses chuck</w:t>
-      </w:r>
-      <w:r>
-        <w:t xml:space="preserve"> data</w:t>
-      </w:r>
-      <w:r>
-        <w:t xml:space="preserve"> using the </w:t>
-      </w:r>
-      <w:r>
-        <w:t xml:space="preserve">open source </w:t>
-      </w:r>
-      <w:proofErr w:type="spellStart"/>
-      <w:r>
-        <w:rPr>
-          <w:b/>
-          <w:bCs/>
-        </w:rPr>
-        <w:t>zlib</w:t>
-      </w:r>
-      <w:proofErr w:type="spellEnd"/>
-      <w:r>
-        <w:t xml:space="preserve"> library</w:t>
-      </w:r>
-      <w:r>
-        <w:t xml:space="preserve">.  </w:t>
-      </w:r>
-      <w:r>
-        <w:t xml:space="preserve">Copyright (C) 1995-2024 Jean-loup </w:t>
-      </w:r>
-      <w:proofErr w:type="spellStart"/>
-      <w:r>
-        <w:t>Gailly</w:t>
-      </w:r>
-      <w:proofErr w:type="spellEnd"/>
-      <w:r>
-        <w:t xml:space="preserve"> and Mark Adler</w:t>
-      </w:r>
-      <w:r>
-        <w:t>.</w:t>
-      </w:r>
-    </w:p>
-    <w:p>
-      <w:r>
-        <w:t xml:space="preserve">The sources can be found in the </w:t>
-      </w:r>
-      <w:proofErr w:type="spellStart"/>
-      <w:r>
-        <w:rPr>
-          <w:b/>
-          <w:bCs/>
-        </w:rPr>
-        <w:t>zlib</w:t>
-      </w:r>
-      <w:proofErr w:type="spellEnd"/>
-      <w:r>
-        <w:t xml:space="preserve"> project</w:t>
-      </w:r>
-      <w:r>
-        <w:t xml:space="preserve"> within </w:t>
-      </w:r>
-      <w:r>
-        <w:t xml:space="preserve">the </w:t>
-      </w:r>
-      <w:proofErr w:type="spellStart"/>
-      <w:r>
-        <w:rPr>
-          <w:b/>
-          <w:bCs/>
-        </w:rPr>
-        <w:t>BeebPerf</w:t>
-      </w:r>
-      <w:proofErr w:type="spellEnd"/>
-      <w:r>
-        <w:t xml:space="preserve"> solution.  </w:t>
-      </w:r>
-      <w:r>
-        <w:t xml:space="preserve">The </w:t>
-      </w:r>
-      <w:r>
-        <w:t xml:space="preserve">project </w:t>
-      </w:r>
-      <w:proofErr w:type="gramStart"/>
-      <w:r>
-        <w:t>builds</w:t>
-      </w:r>
-      <w:proofErr w:type="gramEnd"/>
-      <w:r>
-        <w:t xml:space="preserve"> </w:t>
+      <w:r>
+        <w:t xml:space="preserve">project builds </w:t>
       </w:r>
       <w:r>
         <w:t xml:space="preserve">to create </w:t>
@@ -13325,7 +12700,6 @@
       <w:r>
         <w:t xml:space="preserve">The </w:t>
       </w:r>
-      <w:proofErr w:type="spellStart"/>
       <w:r>
         <w:rPr>
           <w:b/>
@@ -13333,25 +12707,8 @@
         </w:rPr>
         <w:t>PerfReader</w:t>
       </w:r>
-      <w:proofErr w:type="spellEnd"/>
-      <w:r>
-        <w:t xml:space="preserve"> class calls the </w:t>
-      </w:r>
-      <w:proofErr w:type="spellStart"/>
-      <w:r>
-        <w:t>zlib</w:t>
-      </w:r>
-      <w:proofErr w:type="spellEnd"/>
-      <w:r>
-        <w:t xml:space="preserve"> </w:t>
-      </w:r>
-      <w:proofErr w:type="spellStart"/>
-      <w:r>
-        <w:t>apis</w:t>
-      </w:r>
-      <w:proofErr w:type="spellEnd"/>
-      <w:r>
-        <w:t xml:space="preserve"> using </w:t>
+      <w:r>
+        <w:t xml:space="preserve"> class calls the zlib apis using </w:t>
       </w:r>
       <w:r>
         <w:t>P/Invoke</w:t>
@@ -13388,7 +12745,6 @@
       <w:r>
         <w:t xml:space="preserve">The performance functionality is encapsulated within a </w:t>
       </w:r>
-      <w:proofErr w:type="spellStart"/>
       <w:r>
         <w:rPr>
           <w:b/>
@@ -13396,36 +12752,17 @@
         </w:rPr>
         <w:t>PerfWriter</w:t>
       </w:r>
-      <w:proofErr w:type="spellEnd"/>
-      <w:r>
-        <w:t xml:space="preserve"> class (</w:t>
-      </w:r>
-      <w:proofErr w:type="spellStart"/>
-      <w:r>
-        <w:t>PerfWriter.h</w:t>
-      </w:r>
-      <w:proofErr w:type="spellEnd"/>
-      <w:r>
-        <w:t>/</w:t>
-      </w:r>
-      <w:proofErr w:type="spellStart"/>
-      <w:r>
-        <w:t>cpp</w:t>
-      </w:r>
-      <w:proofErr w:type="spellEnd"/>
-      <w:r>
-        <w:t xml:space="preserve">) </w:t>
+      <w:r>
+        <w:t xml:space="preserve"> class (PerfWriter.h/cpp) </w:t>
       </w:r>
     </w:p>
     <w:p>
       <w:r>
         <w:t xml:space="preserve">The class provides methods for starting and ending a performance session, and methods for logging executed </w:t>
       </w:r>
-      <w:proofErr w:type="gramStart"/>
       <w:r>
         <w:t>event</w:t>
       </w:r>
-      <w:proofErr w:type="gramEnd"/>
       <w:r>
         <w:t xml:space="preserve"> and instructions in the emulator.  The class also encapsulates the functionality to generate a </w:t>
       </w:r>
@@ -13585,17 +12922,8 @@
           <w:b/>
           <w:bCs/>
         </w:rPr>
-        <w:t>/</w:t>
-      </w:r>
-      <w:proofErr w:type="spellStart"/>
-      <w:r>
-        <w:rPr>
-          <w:b/>
-          <w:bCs/>
-        </w:rPr>
-        <w:t>cpp</w:t>
-      </w:r>
-      <w:proofErr w:type="spellEnd"/>
+        <w:t>/cpp</w:t>
+      </w:r>
     </w:p>
     <w:p>
       <w:pPr>
@@ -13608,53 +12936,36 @@
       <w:r>
         <w:t xml:space="preserve">Added calls to </w:t>
       </w:r>
-      <w:proofErr w:type="spellStart"/>
-      <w:r>
-        <w:t>PerfWriter_</w:t>
-      </w:r>
-      <w:proofErr w:type="gramStart"/>
-      <w:r>
-        <w:t>WriteInstruction</w:t>
-      </w:r>
-      <w:proofErr w:type="spellEnd"/>
+      <w:r>
+        <w:t>PerfWriter_WriteInstruction(</w:t>
+      </w:r>
+      <w:r>
+        <w:t>…</w:t>
+      </w:r>
+      <w:r>
+        <w:t>)</w:t>
+      </w:r>
+      <w:r>
+        <w:t xml:space="preserve"> and</w:t>
+      </w:r>
+      <w:r>
+        <w:t xml:space="preserve"> </w:t>
+      </w:r>
+      <w:r>
+        <w:t>PerfWriter_WriteI</w:t>
+      </w:r>
+      <w:r>
+        <w:t>nterrupt</w:t>
+      </w:r>
       <w:r>
         <w:t>(</w:t>
       </w:r>
-      <w:proofErr w:type="gramEnd"/>
-      <w:r>
-        <w:t>…</w:t>
-      </w:r>
-      <w:r>
-        <w:t>)</w:t>
-      </w:r>
-      <w:r>
-        <w:t xml:space="preserve"> and</w:t>
+      <w:r>
+        <w:t>…)</w:t>
       </w:r>
       <w:r>
         <w:t xml:space="preserve"> </w:t>
       </w:r>
-      <w:proofErr w:type="spellStart"/>
-      <w:r>
-        <w:t>PerfWriter_</w:t>
-      </w:r>
-      <w:proofErr w:type="gramStart"/>
-      <w:r>
-        <w:t>WriteI</w:t>
-      </w:r>
-      <w:r>
-        <w:t>nterrupt</w:t>
-      </w:r>
-      <w:proofErr w:type="spellEnd"/>
-      <w:r>
-        <w:t>(</w:t>
-      </w:r>
-      <w:proofErr w:type="gramEnd"/>
-      <w:r>
-        <w:t>…)</w:t>
-      </w:r>
-      <w:r>
-        <w:t xml:space="preserve"> </w:t>
-      </w:r>
       <w:r>
         <w:t xml:space="preserve">to </w:t>
       </w:r>
@@ -13665,15 +12976,7 @@
         <w:t xml:space="preserve"> and </w:t>
       </w:r>
       <w:r>
-        <w:t xml:space="preserve">interrupts.  These wrapper functions only invoke the </w:t>
-      </w:r>
-      <w:proofErr w:type="spellStart"/>
-      <w:r>
-        <w:t>PerfWriter</w:t>
-      </w:r>
-      <w:proofErr w:type="spellEnd"/>
-      <w:r>
-        <w:t xml:space="preserve"> instance during a performance capture.</w:t>
+        <w:t>interrupts.  These wrapper functions only invoke the PerfWriter instance during a performance capture.</w:t>
       </w:r>
     </w:p>
     <w:p>
@@ -13687,75 +12990,51 @@
       <w:r>
         <w:t>Added static variables (</w:t>
       </w:r>
-      <w:proofErr w:type="spellStart"/>
       <w:r>
         <w:t>LastReadWriteAddress</w:t>
       </w:r>
-      <w:proofErr w:type="spellEnd"/>
       <w:r>
         <w:t xml:space="preserve">, </w:t>
       </w:r>
-      <w:proofErr w:type="spellStart"/>
       <w:r>
         <w:t>LastReadValue</w:t>
       </w:r>
-      <w:proofErr w:type="spellEnd"/>
       <w:r>
         <w:t xml:space="preserve">, and </w:t>
       </w:r>
-      <w:proofErr w:type="spellStart"/>
       <w:r>
         <w:t>LastWriteValue</w:t>
       </w:r>
-      <w:proofErr w:type="spellEnd"/>
       <w:r>
         <w:t xml:space="preserve">) to store the last accessed memory address, read value, and write value.  These values are passed to </w:t>
       </w:r>
-      <w:proofErr w:type="spellStart"/>
-      <w:r>
-        <w:t>PerfWriter_</w:t>
-      </w:r>
-      <w:proofErr w:type="gramStart"/>
-      <w:r>
-        <w:t>WriteInstruction</w:t>
-      </w:r>
-      <w:proofErr w:type="spellEnd"/>
-      <w:r>
-        <w:t>(</w:t>
-      </w:r>
-      <w:proofErr w:type="gramEnd"/>
+      <w:r>
+        <w:t>PerfWriter_WriteInstruction(</w:t>
+      </w:r>
       <w:r>
         <w:t>…).  Added helpers (</w:t>
       </w:r>
-      <w:proofErr w:type="spellStart"/>
       <w:r>
         <w:t>ReadZeroPage</w:t>
       </w:r>
-      <w:proofErr w:type="spellEnd"/>
       <w:r>
         <w:t xml:space="preserve">, </w:t>
       </w:r>
-      <w:proofErr w:type="spellStart"/>
       <w:r>
         <w:t>WriteZeroPage</w:t>
       </w:r>
-      <w:proofErr w:type="spellEnd"/>
       <w:r>
         <w:t xml:space="preserve">, </w:t>
       </w:r>
-      <w:proofErr w:type="spellStart"/>
       <w:r>
         <w:t>ReadPaged</w:t>
       </w:r>
-      <w:proofErr w:type="spellEnd"/>
       <w:r>
         <w:t xml:space="preserve">, </w:t>
       </w:r>
-      <w:proofErr w:type="spellStart"/>
       <w:r>
         <w:t>WritePaged</w:t>
       </w:r>
-      <w:proofErr w:type="spellEnd"/>
       <w:r>
         <w:t>) which wrap the respective functionality whilst updating these variables.  Updated the emulator interpretation code to use the new helpers.</w:t>
       </w:r>
@@ -13769,61 +13048,29 @@
         </w:numPr>
       </w:pPr>
       <w:r>
-        <w:t>Defined new struct (</w:t>
-      </w:r>
-      <w:proofErr w:type="spellStart"/>
-      <w:r>
-        <w:t>StackFrame</w:t>
-      </w:r>
-      <w:proofErr w:type="spellEnd"/>
-      <w:r>
-        <w:t>) and static variables (</w:t>
-      </w:r>
-      <w:proofErr w:type="spellStart"/>
-      <w:r>
-        <w:t>StackFrames</w:t>
-      </w:r>
-      <w:proofErr w:type="spellEnd"/>
+        <w:t>Defined new struct (StackFrame) and static variables (</w:t>
+      </w:r>
+      <w:r>
+        <w:t>StackFrames, StackFrameCount</w:t>
+      </w:r>
+      <w:r>
+        <w:t>) to capture the current call stack, and added helpers (</w:t>
+      </w:r>
+      <w:r>
+        <w:t>PushStackFrame</w:t>
+      </w:r>
       <w:r>
         <w:t xml:space="preserve">, </w:t>
       </w:r>
-      <w:proofErr w:type="spellStart"/>
-      <w:r>
-        <w:t>StackFrameCount</w:t>
-      </w:r>
-      <w:proofErr w:type="spellEnd"/>
-      <w:r>
-        <w:t>) to capture the current call stack, and added helpers (</w:t>
-      </w:r>
-      <w:proofErr w:type="spellStart"/>
-      <w:r>
-        <w:t>PushStackFrame</w:t>
-      </w:r>
-      <w:proofErr w:type="spellEnd"/>
-      <w:r>
-        <w:t xml:space="preserve">, </w:t>
-      </w:r>
-      <w:proofErr w:type="spellStart"/>
       <w:r>
         <w:t>SyncStackFrames</w:t>
       </w:r>
-      <w:proofErr w:type="spellEnd"/>
-      <w:r>
-        <w:t xml:space="preserve">, </w:t>
-      </w:r>
-      <w:proofErr w:type="spellStart"/>
-      <w:r>
-        <w:t>SetStackFrame</w:t>
-      </w:r>
-      <w:proofErr w:type="spellEnd"/>
-      <w:r>
-        <w:t xml:space="preserve">, </w:t>
-      </w:r>
-      <w:proofErr w:type="spellStart"/>
+      <w:r>
+        <w:t xml:space="preserve">, SetStackFrame, </w:t>
+      </w:r>
       <w:r>
         <w:t>UpdateRootStackFrame</w:t>
       </w:r>
-      <w:proofErr w:type="spellEnd"/>
       <w:r>
         <w:t>) to maintain this.  Updated the emulator’s interpretation code to invoke the new helpers.</w:t>
       </w:r>
@@ -13863,13 +13110,8 @@
       <w:r>
         <w:t xml:space="preserve">Added helper to get the emulator’s call stack: </w:t>
       </w:r>
-      <w:proofErr w:type="spellStart"/>
-      <w:r>
-        <w:t>GetStackFrames</w:t>
-      </w:r>
-      <w:proofErr w:type="spellEnd"/>
-      <w:r>
-        <w:t xml:space="preserve"> </w:t>
+      <w:r>
+        <w:t xml:space="preserve">GetStackFrames </w:t>
       </w:r>
       <w:r>
         <w:t xml:space="preserve">(…).  This is called during snapshot chunk serialization.  </w:t>
@@ -13885,20 +13127,7 @@
       </w:pPr>
       <w:r>
         <w:lastRenderedPageBreak/>
-        <w:t xml:space="preserve">Added helper to get the emulator’s registers: </w:t>
-      </w:r>
-      <w:proofErr w:type="spellStart"/>
-      <w:proofErr w:type="gramStart"/>
-      <w:r>
-        <w:t>GetRegisters</w:t>
-      </w:r>
-      <w:proofErr w:type="spellEnd"/>
-      <w:r>
-        <w:t>(</w:t>
-      </w:r>
-      <w:proofErr w:type="gramEnd"/>
-      <w:r>
-        <w:t>…).  This is called during snapshot chunk serialization.</w:t>
+        <w:t>Added helper to get the emulator’s registers: GetRegisters(…).  This is called during snapshot chunk serialization.</w:t>
       </w:r>
     </w:p>
     <w:p>
@@ -13912,7 +13141,6 @@
       <w:r>
         <w:t xml:space="preserve">Removed </w:t>
       </w:r>
-      <w:proofErr w:type="spellStart"/>
       <w:r>
         <w:rPr>
           <w:b/>
@@ -13920,11 +13148,9 @@
         </w:rPr>
         <w:t>ReadPaged</w:t>
       </w:r>
-      <w:proofErr w:type="spellEnd"/>
       <w:r>
         <w:t xml:space="preserve"> and </w:t>
       </w:r>
-      <w:proofErr w:type="spellStart"/>
       <w:r>
         <w:rPr>
           <w:b/>
@@ -13932,7 +13158,6 @@
         </w:rPr>
         <w:t>WritePaged</w:t>
       </w:r>
-      <w:proofErr w:type="spellEnd"/>
       <w:r>
         <w:t xml:space="preserve"> </w:t>
       </w:r>
@@ -13956,31 +13181,13 @@
           <w:bCs/>
         </w:rPr>
       </w:pPr>
-      <w:proofErr w:type="spellStart"/>
-      <w:r>
-        <w:rPr>
-          <w:b/>
-          <w:bCs/>
-        </w:rPr>
-        <w:t>BeepMem.h</w:t>
-      </w:r>
-      <w:proofErr w:type="spellEnd"/>
-      <w:r>
-        <w:rPr>
-          <w:b/>
-          <w:bCs/>
-        </w:rPr>
-        <w:t>/</w:t>
-      </w:r>
-      <w:proofErr w:type="spellStart"/>
-      <w:r>
-        <w:rPr>
-          <w:b/>
-          <w:bCs/>
-        </w:rPr>
-        <w:t>cpp</w:t>
-      </w:r>
-      <w:proofErr w:type="spellEnd"/>
+      <w:r>
+        <w:rPr>
+          <w:b/>
+          <w:bCs/>
+        </w:rPr>
+        <w:t>BeepMem.h/cpp</w:t>
+      </w:r>
     </w:p>
     <w:p>
       <w:pPr>
@@ -13991,42 +13198,22 @@
         </w:numPr>
       </w:pPr>
       <w:r>
-        <w:t xml:space="preserve">Defined new </w:t>
-      </w:r>
-      <w:proofErr w:type="gramStart"/>
-      <w:r>
-        <w:t>struct</w:t>
-      </w:r>
-      <w:proofErr w:type="gramEnd"/>
-      <w:r>
-        <w:t xml:space="preserve"> (</w:t>
-      </w:r>
-      <w:proofErr w:type="spellStart"/>
+        <w:t>Defined new struct (</w:t>
+      </w:r>
       <w:r>
         <w:t>MemPageType</w:t>
       </w:r>
-      <w:proofErr w:type="spellEnd"/>
       <w:r>
         <w:t>) and function (</w:t>
       </w:r>
-      <w:proofErr w:type="spellStart"/>
       <w:r>
         <w:t>BeebMemPage</w:t>
       </w:r>
-      <w:proofErr w:type="spellEnd"/>
-      <w:r>
-        <w:t xml:space="preserve">) that returns the page associated with an address.  This is invoked by </w:t>
-      </w:r>
-      <w:proofErr w:type="spellStart"/>
-      <w:r>
-        <w:t>Set</w:t>
-      </w:r>
-      <w:r>
-        <w:t>StackFrame</w:t>
-      </w:r>
-      <w:proofErr w:type="spellEnd"/>
-      <w:r>
-        <w:t xml:space="preserve"> </w:t>
+      <w:r>
+        <w:t>) that returns the page associated with an address.  This is invoked by Set</w:t>
+      </w:r>
+      <w:r>
+        <w:t xml:space="preserve">StackFrame </w:t>
       </w:r>
       <w:r>
         <w:t>(see 6502.cpp).</w:t>
@@ -14074,7 +13261,6 @@
       <w:r>
         <w:t xml:space="preserve">, </w:t>
       </w:r>
-      <w:proofErr w:type="spellStart"/>
       <w:r>
         <w:rPr>
           <w:b/>
@@ -14082,7 +13268,6 @@
         </w:rPr>
         <w:t>HidAdd</w:t>
       </w:r>
-      <w:proofErr w:type="spellEnd"/>
       <w:r>
         <w:rPr>
           <w:b/>
@@ -14098,17 +13283,8 @@
           <w:b/>
           <w:bCs/>
         </w:rPr>
-        <w:t xml:space="preserve"> </w:t>
-      </w:r>
-      <w:proofErr w:type="spellStart"/>
-      <w:r>
-        <w:rPr>
-          <w:b/>
-          <w:bCs/>
-        </w:rPr>
-        <w:t>ShadowRam</w:t>
-      </w:r>
-      <w:proofErr w:type="spellEnd"/>
+        <w:t xml:space="preserve"> ShadowRam</w:t>
+      </w:r>
       <w:r>
         <w:rPr>
           <w:b/>
@@ -14179,7 +13355,6 @@
           <w:bCs/>
         </w:rPr>
       </w:pPr>
-      <w:proofErr w:type="spellStart"/>
       <w:r>
         <w:rPr>
           <w:b/>
@@ -14192,25 +13367,8 @@
           <w:b/>
           <w:bCs/>
         </w:rPr>
-        <w:t>.h</w:t>
-      </w:r>
-      <w:proofErr w:type="spellEnd"/>
-      <w:r>
-        <w:rPr>
-          <w:b/>
-          <w:bCs/>
-        </w:rPr>
-        <w:t>/</w:t>
-      </w:r>
-      <w:proofErr w:type="spellStart"/>
-      <w:r>
-        <w:rPr>
-          <w:b/>
-          <w:bCs/>
-        </w:rPr>
-        <w:t>cpp</w:t>
-      </w:r>
-      <w:proofErr w:type="spellEnd"/>
+        <w:t>.h/cpp</w:t>
+      </w:r>
     </w:p>
     <w:p>
       <w:pPr>
@@ -14223,13 +13381,8 @@
       <w:r>
         <w:t xml:space="preserve">Added call to </w:t>
       </w:r>
-      <w:proofErr w:type="spellStart"/>
-      <w:r>
-        <w:t>PerfWriter_</w:t>
-      </w:r>
-      <w:proofErr w:type="gramStart"/>
-      <w:r>
-        <w:t>Write</w:t>
+      <w:r>
+        <w:t>PerfWriter_Write</w:t>
       </w:r>
       <w:r>
         <w:t>FrameStart</w:t>
@@ -14237,13 +13390,8 @@
       <w:r>
         <w:t>Event</w:t>
       </w:r>
-      <w:proofErr w:type="spellEnd"/>
-      <w:r>
-        <w:t>(</w:t>
-      </w:r>
-      <w:proofErr w:type="gramEnd"/>
-      <w:r>
-        <w:t>)</w:t>
+      <w:r>
+        <w:t>()</w:t>
       </w:r>
       <w:r>
         <w:t xml:space="preserve"> to log </w:t>
@@ -14274,31 +13422,16 @@
         <w:t xml:space="preserve"> </w:t>
       </w:r>
       <w:r>
-        <w:t xml:space="preserve"> This wrapper function only invokes the </w:t>
-      </w:r>
-      <w:proofErr w:type="spellStart"/>
-      <w:r>
-        <w:t>PerfWriter</w:t>
-      </w:r>
-      <w:proofErr w:type="spellEnd"/>
-      <w:r>
-        <w:t xml:space="preserve"> instance during a performance capture.</w:t>
+        <w:t xml:space="preserve"> This wrapper function only invokes the PerfWriter instance during a performance capture.</w:t>
       </w:r>
       <w:r>
         <w:t xml:space="preserve">  The function is called from inside </w:t>
       </w:r>
-      <w:proofErr w:type="spellStart"/>
-      <w:proofErr w:type="gramStart"/>
       <w:r>
         <w:t>VideoDoScanLine</w:t>
       </w:r>
-      <w:proofErr w:type="spellEnd"/>
-      <w:r>
-        <w:t>(</w:t>
-      </w:r>
-      <w:proofErr w:type="gramEnd"/>
-      <w:r>
-        <w:t>)</w:t>
+      <w:r>
+        <w:t>()</w:t>
       </w:r>
       <w:r>
         <w:t>.</w:t>
@@ -14313,39 +13446,19 @@
         </w:numPr>
       </w:pPr>
       <w:r>
-        <w:t xml:space="preserve">Added </w:t>
-      </w:r>
-      <w:proofErr w:type="spellStart"/>
-      <w:r>
-        <w:t>Video.SplitScreen</w:t>
-      </w:r>
-      <w:proofErr w:type="spellEnd"/>
-      <w:r>
-        <w:t xml:space="preserve"> variable which captures if the frame is positioned beneath another one.  The value is assigned in </w:t>
-      </w:r>
-      <w:proofErr w:type="spellStart"/>
-      <w:proofErr w:type="gramStart"/>
+        <w:t xml:space="preserve">Added Video.SplitScreen variable which captures if the frame is positioned beneath another one.  The value is assigned in </w:t>
+      </w:r>
       <w:r>
         <w:t>VideoStartOfFrame</w:t>
       </w:r>
-      <w:proofErr w:type="spellEnd"/>
-      <w:r>
-        <w:t>(</w:t>
-      </w:r>
-      <w:proofErr w:type="gramEnd"/>
-      <w:r>
-        <w:t>)</w:t>
+      <w:r>
+        <w:t>()</w:t>
       </w:r>
       <w:r>
         <w:t xml:space="preserve"> and passed to </w:t>
       </w:r>
-      <w:proofErr w:type="spellStart"/>
-      <w:r>
-        <w:t>PerfWriter_</w:t>
-      </w:r>
-      <w:proofErr w:type="gramStart"/>
-      <w:r>
-        <w:t>Write</w:t>
+      <w:r>
+        <w:t>PerfWriter_Write</w:t>
       </w:r>
       <w:r>
         <w:t>FrameStart</w:t>
@@ -14353,13 +13466,8 @@
       <w:r>
         <w:t>Event</w:t>
       </w:r>
-      <w:proofErr w:type="spellEnd"/>
-      <w:r>
-        <w:t>(</w:t>
-      </w:r>
-      <w:proofErr w:type="gramEnd"/>
-      <w:r>
-        <w:t>)</w:t>
+      <w:r>
+        <w:t>()</w:t>
       </w:r>
       <w:r>
         <w:t xml:space="preserve">.  </w:t>
@@ -14376,73 +13484,33 @@
       <w:r>
         <w:t xml:space="preserve">Updated </w:t>
       </w:r>
-      <w:proofErr w:type="spellStart"/>
-      <w:proofErr w:type="gramStart"/>
       <w:r>
         <w:t>SaveVideoUEF</w:t>
       </w:r>
-      <w:proofErr w:type="spellEnd"/>
-      <w:r>
-        <w:t>(</w:t>
-      </w:r>
-      <w:proofErr w:type="gramEnd"/>
-      <w:r>
-        <w:t xml:space="preserve">) and </w:t>
-      </w:r>
-      <w:proofErr w:type="spellStart"/>
-      <w:proofErr w:type="gramStart"/>
+      <w:r>
+        <w:t xml:space="preserve">() and </w:t>
+      </w:r>
       <w:r>
         <w:t>LoadVideoUEF</w:t>
       </w:r>
-      <w:proofErr w:type="spellEnd"/>
-      <w:r>
-        <w:t>(</w:t>
-      </w:r>
-      <w:proofErr w:type="gramEnd"/>
-      <w:r>
-        <w:t xml:space="preserve">) to serialize </w:t>
-      </w:r>
-      <w:proofErr w:type="spellStart"/>
-      <w:r>
-        <w:t>Video.SplitScreen</w:t>
-      </w:r>
-      <w:proofErr w:type="spellEnd"/>
-      <w:r>
-        <w:t>.</w:t>
-      </w:r>
-    </w:p>
-    <w:p>
-      <w:pPr>
-        <w:rPr>
-          <w:b/>
-          <w:bCs/>
-        </w:rPr>
-      </w:pPr>
-      <w:proofErr w:type="spellStart"/>
-      <w:r>
-        <w:rPr>
-          <w:b/>
-          <w:bCs/>
-        </w:rPr>
-        <w:t>Debug.h</w:t>
-      </w:r>
-      <w:proofErr w:type="spellEnd"/>
-      <w:r>
-        <w:rPr>
-          <w:b/>
-          <w:bCs/>
-        </w:rPr>
-        <w:t>/</w:t>
-      </w:r>
-      <w:proofErr w:type="spellStart"/>
-      <w:r>
-        <w:rPr>
-          <w:b/>
-          <w:bCs/>
-        </w:rPr>
-        <w:t>cpp</w:t>
-      </w:r>
-      <w:proofErr w:type="spellEnd"/>
+      <w:r>
+        <w:t>() to serialize Video.SplitScreen.</w:t>
+      </w:r>
+    </w:p>
+    <w:p>
+      <w:pPr>
+        <w:rPr>
+          <w:b/>
+          <w:bCs/>
+        </w:rPr>
+      </w:pPr>
+      <w:r>
+        <w:rPr>
+          <w:b/>
+          <w:bCs/>
+        </w:rPr>
+        <w:t>Debug.h/cpp</w:t>
+      </w:r>
     </w:p>
     <w:p>
       <w:pPr>
@@ -14477,37 +13545,12 @@
           <w:bCs/>
         </w:rPr>
       </w:pPr>
-      <w:proofErr w:type="spellStart"/>
-      <w:r>
-        <w:rPr>
-          <w:b/>
-          <w:bCs/>
-        </w:rPr>
-        <w:t>BeebWin.h</w:t>
-      </w:r>
-      <w:proofErr w:type="spellEnd"/>
-      <w:r>
-        <w:rPr>
-          <w:b/>
-          <w:bCs/>
-        </w:rPr>
-        <w:t>/</w:t>
-      </w:r>
-      <w:proofErr w:type="spellStart"/>
-      <w:r>
-        <w:rPr>
-          <w:b/>
-          <w:bCs/>
-        </w:rPr>
-        <w:t>cpp</w:t>
-      </w:r>
-      <w:proofErr w:type="spellEnd"/>
-      <w:r>
-        <w:rPr>
-          <w:b/>
-          <w:bCs/>
-        </w:rPr>
-        <w:t>, BeebWinIo.cpp</w:t>
+      <w:r>
+        <w:rPr>
+          <w:b/>
+          <w:bCs/>
+        </w:rPr>
+        <w:t>BeebWin.h/cpp, BeebWinIo.cpp</w:t>
       </w:r>
     </w:p>
     <w:p>
@@ -14535,78 +13578,52 @@
         </w:rPr>
         <w:t xml:space="preserve"> </w:t>
       </w:r>
-      <w:proofErr w:type="spellStart"/>
-      <w:proofErr w:type="gramStart"/>
       <w:r>
         <w:t>UpdatePerfCaptureMenu</w:t>
       </w:r>
-      <w:proofErr w:type="spellEnd"/>
-      <w:r>
-        <w:t>(</w:t>
-      </w:r>
-      <w:proofErr w:type="gramEnd"/>
-      <w:r>
-        <w:t>)</w:t>
-      </w:r>
-      <w:r>
-        <w:t xml:space="preserve">, </w:t>
-      </w:r>
-      <w:proofErr w:type="spellStart"/>
-      <w:proofErr w:type="gramStart"/>
+      <w:r>
+        <w:t>()</w:t>
+      </w:r>
+      <w:r>
+        <w:t>, CapturePerf</w:t>
+      </w:r>
+      <w:r>
+        <w:t>()</w:t>
+      </w:r>
+      <w:r>
+        <w:t>, EndPerfCapture</w:t>
+      </w:r>
+      <w:r>
+        <w:t>()</w:t>
+      </w:r>
+      <w:r>
+        <w:t>, and IsCapturingPerf</w:t>
+      </w:r>
+      <w:r>
+        <w:t>()</w:t>
+      </w:r>
+      <w:r>
+        <w:t xml:space="preserve"> functions</w:t>
+      </w:r>
+      <w:r>
+        <w:t xml:space="preserve"> (modelled from the existing video capture functionality) and invoked these in a similar way to how video capture is implemented.  The only notable differences are that </w:t>
+      </w:r>
       <w:r>
         <w:t>CapturePerf</w:t>
       </w:r>
-      <w:proofErr w:type="spellEnd"/>
-      <w:r>
-        <w:t>(</w:t>
-      </w:r>
-      <w:proofErr w:type="gramEnd"/>
-      <w:r>
-        <w:t>)</w:t>
-      </w:r>
-      <w:r>
-        <w:t xml:space="preserve">, </w:t>
-      </w:r>
-      <w:proofErr w:type="spellStart"/>
-      <w:proofErr w:type="gramStart"/>
+      <w:r>
+        <w:rPr>
+          <w:b/>
+          <w:bCs/>
+        </w:rPr>
+        <w:t xml:space="preserve"> </w:t>
+      </w:r>
+      <w:r>
+        <w:t xml:space="preserve">creates an instance of the PerfWriter class, initializes it, and </w:t>
+      </w:r>
       <w:r>
         <w:t>EndPerfCapture</w:t>
       </w:r>
-      <w:proofErr w:type="spellEnd"/>
-      <w:r>
-        <w:t>(</w:t>
-      </w:r>
-      <w:proofErr w:type="gramEnd"/>
-      <w:r>
-        <w:t>)</w:t>
-      </w:r>
-      <w:r>
-        <w:t xml:space="preserve">, and </w:t>
-      </w:r>
-      <w:proofErr w:type="spellStart"/>
-      <w:proofErr w:type="gramStart"/>
-      <w:r>
-        <w:t>IsCapturingPerf</w:t>
-      </w:r>
-      <w:proofErr w:type="spellEnd"/>
-      <w:r>
-        <w:t>(</w:t>
-      </w:r>
-      <w:proofErr w:type="gramEnd"/>
-      <w:r>
-        <w:t>)</w:t>
-      </w:r>
-      <w:r>
-        <w:t xml:space="preserve"> functions</w:t>
-      </w:r>
-      <w:r>
-        <w:t xml:space="preserve"> (modelled from the existing video capture functionality) and invoked these in a similar way to how video capture is implemented.  The only notable differences are that </w:t>
-      </w:r>
-      <w:proofErr w:type="spellStart"/>
-      <w:r>
-        <w:t>CapturePerf</w:t>
-      </w:r>
-      <w:proofErr w:type="spellEnd"/>
       <w:r>
         <w:rPr>
           <w:b/>
@@ -14615,72 +13632,23 @@
         <w:t xml:space="preserve"> </w:t>
       </w:r>
       <w:r>
-        <w:t xml:space="preserve">creates an instance of the </w:t>
-      </w:r>
-      <w:proofErr w:type="spellStart"/>
-      <w:r>
-        <w:t>PerfWriter</w:t>
-      </w:r>
-      <w:proofErr w:type="spellEnd"/>
-      <w:r>
-        <w:t xml:space="preserve"> class, initializes it, and </w:t>
-      </w:r>
-      <w:proofErr w:type="spellStart"/>
-      <w:r>
-        <w:t>EndPerfCapture</w:t>
-      </w:r>
-      <w:proofErr w:type="spellEnd"/>
-      <w:r>
-        <w:rPr>
-          <w:b/>
-          <w:bCs/>
-        </w:rPr>
-        <w:t xml:space="preserve"> </w:t>
-      </w:r>
-      <w:r>
-        <w:t xml:space="preserve">closes the capture, and deletes the </w:t>
-      </w:r>
-      <w:proofErr w:type="spellStart"/>
-      <w:r>
-        <w:t>PerfWriter</w:t>
-      </w:r>
-      <w:proofErr w:type="spellEnd"/>
-      <w:r>
-        <w:t xml:space="preserve"> instance.</w:t>
-      </w:r>
-    </w:p>
-    <w:p>
-      <w:pPr>
-        <w:rPr>
-          <w:b/>
-          <w:bCs/>
-        </w:rPr>
-      </w:pPr>
-      <w:proofErr w:type="spellStart"/>
-      <w:r>
-        <w:rPr>
-          <w:b/>
-          <w:bCs/>
-        </w:rPr>
-        <w:t>BeebWinPrefs.h</w:t>
-      </w:r>
-      <w:proofErr w:type="spellEnd"/>
-      <w:r>
-        <w:rPr>
-          <w:b/>
-          <w:bCs/>
-        </w:rPr>
-        <w:t>/</w:t>
-      </w:r>
-      <w:proofErr w:type="spellStart"/>
-      <w:r>
-        <w:rPr>
-          <w:b/>
-          <w:bCs/>
-        </w:rPr>
-        <w:t>cpp</w:t>
-      </w:r>
-      <w:proofErr w:type="spellEnd"/>
+        <w:t>closes the capture, and deletes the PerfWriter instance.</w:t>
+      </w:r>
+    </w:p>
+    <w:p>
+      <w:pPr>
+        <w:rPr>
+          <w:b/>
+          <w:bCs/>
+        </w:rPr>
+      </w:pPr>
+      <w:r>
+        <w:rPr>
+          <w:b/>
+          <w:bCs/>
+        </w:rPr>
+        <w:t>BeebWinPrefs.h/cpp</w:t>
+      </w:r>
     </w:p>
     <w:p>
       <w:pPr>
@@ -14694,15 +13662,7 @@
         <w:t xml:space="preserve">Added a </w:t>
       </w:r>
       <w:r>
-        <w:t xml:space="preserve">performance </w:t>
-      </w:r>
-      <w:proofErr w:type="gramStart"/>
-      <w:r>
-        <w:t>capture</w:t>
-      </w:r>
-      <w:proofErr w:type="gramEnd"/>
-      <w:r>
-        <w:t xml:space="preserve"> file path preference, used to remember the location of the last written </w:t>
+        <w:t xml:space="preserve">performance capture file path preference, used to remember the location of the last written </w:t>
       </w:r>
       <w:r>
         <w:rPr>
@@ -14776,32 +13736,14 @@
           <w:bCs/>
         </w:rPr>
       </w:pPr>
-      <w:proofErr w:type="spellStart"/>
       <w:r>
         <w:rPr>
           <w:b/>
           <w:bCs/>
         </w:rPr>
         <w:lastRenderedPageBreak/>
-        <w:t>BeebEm.rc</w:t>
-      </w:r>
-      <w:proofErr w:type="spellEnd"/>
-      <w:r>
-        <w:rPr>
-          <w:b/>
-          <w:bCs/>
-        </w:rPr>
-        <w:t xml:space="preserve">, </w:t>
-      </w:r>
-      <w:proofErr w:type="spellStart"/>
-      <w:r>
-        <w:rPr>
-          <w:b/>
-          <w:bCs/>
-        </w:rPr>
-        <w:t>Resource.h</w:t>
-      </w:r>
-      <w:proofErr w:type="spellEnd"/>
+        <w:t>BeebEm.rc, Resource.h</w:t>
+      </w:r>
     </w:p>
     <w:p>
       <w:pPr>
@@ -14849,8 +13791,6 @@
         </w:rPr>
         <w:t>*</w:t>
       </w:r>
-      <w:proofErr w:type="spellStart"/>
-      <w:proofErr w:type="gramStart"/>
       <w:r>
         <w:rPr>
           <w:b/>
@@ -14886,8 +13826,6 @@
         </w:rPr>
         <w:t>.filters</w:t>
       </w:r>
-      <w:proofErr w:type="spellEnd"/>
-      <w:proofErr w:type="gramEnd"/>
     </w:p>
     <w:p>
       <w:pPr>
@@ -14913,17 +13851,8 @@
           <w:b/>
           <w:bCs/>
         </w:rPr>
-        <w:t>*.</w:t>
-      </w:r>
-      <w:proofErr w:type="spellStart"/>
-      <w:r>
-        <w:rPr>
-          <w:b/>
-          <w:bCs/>
-        </w:rPr>
-        <w:t>vcxproj</w:t>
-      </w:r>
-      <w:proofErr w:type="spellEnd"/>
+        <w:t>*.vcxproj</w:t>
+      </w:r>
     </w:p>
     <w:p>
       <w:pPr>
@@ -14934,15 +13863,7 @@
         </w:numPr>
       </w:pPr>
       <w:r>
-        <w:t xml:space="preserve">Updated </w:t>
-      </w:r>
-      <w:proofErr w:type="spellStart"/>
-      <w:r>
-        <w:t>WindowsTargetPlatformVersion</w:t>
-      </w:r>
-      <w:proofErr w:type="spellEnd"/>
-      <w:r>
-        <w:t xml:space="preserve"> to 10.0</w:t>
+        <w:t>Updated WindowsTargetPlatformVersion to 10.0</w:t>
       </w:r>
       <w:r>
         <w:t>.</w:t>
@@ -14957,15 +13878,7 @@
         </w:numPr>
       </w:pPr>
       <w:r>
-        <w:t xml:space="preserve">Updated </w:t>
-      </w:r>
-      <w:proofErr w:type="spellStart"/>
-      <w:r>
-        <w:t>PlatformToolset</w:t>
-      </w:r>
-      <w:proofErr w:type="spellEnd"/>
-      <w:r>
-        <w:t xml:space="preserve"> to v14</w:t>
+        <w:t>Updated PlatformToolset to v14</w:t>
       </w:r>
       <w:r>
         <w:t>5</w:t>
@@ -14988,21 +13901,8 @@
       <w:r>
         <w:t xml:space="preserve">configuration </w:t>
       </w:r>
-      <w:proofErr w:type="spellStart"/>
-      <w:r>
-        <w:t>OutDir</w:t>
-      </w:r>
-      <w:proofErr w:type="spellEnd"/>
-      <w:r>
-        <w:t xml:space="preserve"> &amp; </w:t>
-      </w:r>
-      <w:proofErr w:type="spellStart"/>
-      <w:r>
-        <w:t>IntDir</w:t>
-      </w:r>
-      <w:proofErr w:type="spellEnd"/>
-      <w:r>
-        <w:t xml:space="preserve"> location</w:t>
+      <w:r>
+        <w:t>OutDir &amp; IntDir location</w:t>
       </w:r>
       <w:r>
         <w:t>s</w:t>
@@ -15148,47 +14048,11 @@
         </w:rPr>
         <w:t xml:space="preserve">git add -N </w:t>
       </w:r>
-      <w:proofErr w:type="spellStart"/>
       <w:r>
         <w:rPr>
           <w:color w:val="FFFFFF" w:themeColor="background1"/>
         </w:rPr>
-        <w:t>src</w:t>
-      </w:r>
-      <w:proofErr w:type="spellEnd"/>
-      <w:r>
-        <w:rPr>
-          <w:color w:val="FFFFFF" w:themeColor="background1"/>
-        </w:rPr>
-        <w:t>\</w:t>
-      </w:r>
-      <w:proofErr w:type="spellStart"/>
-      <w:r>
-        <w:rPr>
-          <w:color w:val="FFFFFF" w:themeColor="background1"/>
-        </w:rPr>
-        <w:t>PerfWriter.h</w:t>
-      </w:r>
-      <w:proofErr w:type="spellEnd"/>
-      <w:r>
-        <w:rPr>
-          <w:color w:val="FFFFFF" w:themeColor="background1"/>
-        </w:rPr>
-        <w:t xml:space="preserve"> </w:t>
-      </w:r>
-      <w:proofErr w:type="spellStart"/>
-      <w:r>
-        <w:rPr>
-          <w:color w:val="FFFFFF" w:themeColor="background1"/>
-        </w:rPr>
-        <w:t>src</w:t>
-      </w:r>
-      <w:proofErr w:type="spellEnd"/>
-      <w:r>
-        <w:rPr>
-          <w:color w:val="FFFFFF" w:themeColor="background1"/>
-        </w:rPr>
-        <w:t>\PerfWriter.cpp</w:t>
+        <w:t>src\PerfWriter.h src\PerfWriter.cpp</w:t>
       </w:r>
       <w:r>
         <w:rPr>
@@ -15203,28 +14067,12 @@
         </w:rPr>
         <w:t xml:space="preserve"> &gt; ..\</w:t>
       </w:r>
-      <w:proofErr w:type="spellStart"/>
       <w:r>
         <w:rPr>
           <w:color w:val="FFFFFF" w:themeColor="background1"/>
         </w:rPr>
-        <w:t>beebperf</w:t>
-      </w:r>
-      <w:proofErr w:type="spellEnd"/>
-      <w:r>
-        <w:rPr>
-          <w:color w:val="FFFFFF" w:themeColor="background1"/>
-        </w:rPr>
-        <w:t>\</w:t>
-      </w:r>
-      <w:proofErr w:type="spellStart"/>
-      <w:r>
-        <w:rPr>
-          <w:color w:val="FFFFFF" w:themeColor="background1"/>
-        </w:rPr>
-        <w:t>beebem_changelist.diff</w:t>
-      </w:r>
-      <w:proofErr w:type="spellEnd"/>
+        <w:t>beebperf\beebem_changelist.diff</w:t>
+      </w:r>
     </w:p>
     <w:p/>
     <w:p>
@@ -15244,48 +14092,24 @@
           <w:color w:val="FFFFFF" w:themeColor="background1"/>
         </w:rPr>
       </w:pPr>
-      <w:proofErr w:type="gramStart"/>
       <w:r>
         <w:rPr>
           <w:color w:val="FFFFFF" w:themeColor="background1"/>
         </w:rPr>
-        <w:t>git</w:t>
-      </w:r>
-      <w:proofErr w:type="gramEnd"/>
+        <w:t xml:space="preserve">git </w:t>
+      </w:r>
       <w:r>
         <w:rPr>
           <w:color w:val="FFFFFF" w:themeColor="background1"/>
         </w:rPr>
-        <w:t xml:space="preserve"> </w:t>
+        <w:t>apply ..\</w:t>
       </w:r>
       <w:r>
         <w:rPr>
           <w:color w:val="FFFFFF" w:themeColor="background1"/>
         </w:rPr>
-        <w:t>apply ..\</w:t>
-      </w:r>
-      <w:proofErr w:type="spellStart"/>
-      <w:r>
-        <w:rPr>
-          <w:color w:val="FFFFFF" w:themeColor="background1"/>
-        </w:rPr>
-        <w:t>beebperf</w:t>
-      </w:r>
-      <w:proofErr w:type="spellEnd"/>
-      <w:r>
-        <w:rPr>
-          <w:color w:val="FFFFFF" w:themeColor="background1"/>
-        </w:rPr>
-        <w:t>\</w:t>
-      </w:r>
-      <w:proofErr w:type="spellStart"/>
-      <w:r>
-        <w:rPr>
-          <w:color w:val="FFFFFF" w:themeColor="background1"/>
-        </w:rPr>
-        <w:t>beebem_changelist.diff</w:t>
-      </w:r>
-      <w:proofErr w:type="spellEnd"/>
+        <w:t>beebperf\beebem_changelist.diff</w:t>
+      </w:r>
     </w:p>
     <w:p/>
     <w:sectPr>

</xml_diff>